<commit_message>
added information about new functions to the user's manual
</commit_message>
<xml_diff>
--- a/Users_manual.docx
+++ b/Users_manual.docx
@@ -1,23 +1,41 @@
 
 <file path=word/document.xml><?xml version="1.0" encoding="utf-8"?>
-<w:document xmlns:wpc="http://schemas.microsoft.com/office/word/2010/wordprocessingCanvas" xmlns:cx="http://schemas.microsoft.com/office/drawing/2014/chartex" xmlns:cx1="http://schemas.microsoft.com/office/drawing/2015/9/8/chartex" xmlns:cx2="http://schemas.microsoft.com/office/drawing/2015/10/21/chartex" xmlns:cx3="http://schemas.microsoft.com/office/drawing/2016/5/9/chartex" xmlns:cx4="http://schemas.microsoft.com/office/drawing/2016/5/10/chartex" xmlns:cx5="http://schemas.microsoft.com/office/drawing/2016/5/11/chartex" xmlns:cx6="http://schemas.microsoft.com/office/drawing/2016/5/12/chartex" xmlns:cx7="http://schemas.microsoft.com/office/drawing/2016/5/13/chartex" xmlns:cx8="http://schemas.microsoft.com/office/drawing/2016/5/14/chartex" xmlns:mc="http://schemas.openxmlformats.org/markup-compatibility/2006" xmlns:aink="http://schemas.microsoft.com/office/drawing/2016/ink" xmlns:am3d="http://schemas.microsoft.com/office/drawing/2017/model3d" xmlns:o="urn:schemas-microsoft-com:office:office" xmlns:oel="http://schemas.microsoft.com/office/2019/extlst" xmlns:r="http://schemas.openxmlformats.org/officeDocument/2006/relationships" xmlns:m="http://schemas.openxmlformats.org/officeDocument/2006/math" xmlns:v="urn:schemas-microsoft-com:vml" xmlns:wp14="http://schemas.microsoft.com/office/word/2010/wordprocessingDrawing" xmlns:wp="http://schemas.openxmlformats.org/drawingml/2006/wordprocessingDrawing" xmlns:w10="urn:schemas-microsoft-com:office:word" xmlns:w="http://schemas.openxmlformats.org/wordprocessingml/2006/main" xmlns:w14="http://schemas.microsoft.com/office/word/2010/wordml" xmlns:w15="http://schemas.microsoft.com/office/word/2012/wordml" xmlns:w16cex="http://schemas.microsoft.com/office/word/2018/wordml/cex" xmlns:w16cid="http://schemas.microsoft.com/office/word/2016/wordml/cid" xmlns:w16="http://schemas.microsoft.com/office/word/2018/wordml" xmlns:w16du="http://schemas.microsoft.com/office/word/2023/wordml/word16du" xmlns:w16sdtdh="http://schemas.microsoft.com/office/word/2020/wordml/sdtdatahash" xmlns:w16sdtfl="http://schemas.microsoft.com/office/word/2024/wordml/sdtformatlock" xmlns:w16se="http://schemas.microsoft.com/office/word/2015/wordml/symex" xmlns:wpg="http://schemas.microsoft.com/office/word/2010/wordprocessingGroup" xmlns:wpi="http://schemas.microsoft.com/office/word/2010/wordprocessingInk" xmlns:wne="http://schemas.microsoft.com/office/word/2006/wordml" xmlns:wps="http://schemas.microsoft.com/office/word/2010/wordprocessingShape" mc:Ignorable="w14 w15 w16se w16cid w16 w16cex w16sdtdh w16sdtfl w16du wp14">
+<w:document xmlns:wpc="http://schemas.microsoft.com/office/word/2010/wordprocessingCanvas" xmlns:cx="http://schemas.microsoft.com/office/drawing/2014/chartex" xmlns:cx1="http://schemas.microsoft.com/office/drawing/2015/9/8/chartex" xmlns:mc="http://schemas.openxmlformats.org/markup-compatibility/2006" xmlns:o="urn:schemas-microsoft-com:office:office" xmlns:r="http://schemas.openxmlformats.org/officeDocument/2006/relationships" xmlns:m="http://schemas.openxmlformats.org/officeDocument/2006/math" xmlns:v="urn:schemas-microsoft-com:vml" xmlns:wp14="http://schemas.microsoft.com/office/word/2010/wordprocessingDrawing" xmlns:wp="http://schemas.openxmlformats.org/drawingml/2006/wordprocessingDrawing" xmlns:w10="urn:schemas-microsoft-com:office:word" xmlns:w="http://schemas.openxmlformats.org/wordprocessingml/2006/main" xmlns:w14="http://schemas.microsoft.com/office/word/2010/wordml" xmlns:w15="http://schemas.microsoft.com/office/word/2012/wordml" xmlns:w16se="http://schemas.microsoft.com/office/word/2015/wordml/symex" xmlns:wpg="http://schemas.microsoft.com/office/word/2010/wordprocessingGroup" xmlns:wpi="http://schemas.microsoft.com/office/word/2010/wordprocessingInk" xmlns:wne="http://schemas.microsoft.com/office/word/2006/wordml" xmlns:wps="http://schemas.microsoft.com/office/word/2010/wordprocessingShape" mc:Ignorable="w14 w15 w16se wp14">
   <w:body>
     <w:p>
       <w:pPr>
         <w:jc w:val="center"/>
         <w:rPr>
-          <w:rStyle w:val="Textoennegrita"/>
+          <w:rStyle w:val="Strong"/>
           <w:sz w:val="56"/>
           <w:szCs w:val="56"/>
         </w:rPr>
       </w:pPr>
       <w:r>
         <w:rPr>
-          <w:rStyle w:val="Textoennegrita"/>
+          <w:rStyle w:val="Strong"/>
           <w:sz w:val="56"/>
           <w:szCs w:val="56"/>
         </w:rPr>
-        <w:t>How to train you AI: your usual pipeline to use Stridulant.</w:t>
+        <w:t xml:space="preserve">How to train you AI: your usual pipeline to use </w:t>
+      </w:r>
+      <w:proofErr w:type="spellStart"/>
+      <w:r>
+        <w:rPr>
+          <w:rStyle w:val="Strong"/>
+          <w:sz w:val="56"/>
+          <w:szCs w:val="56"/>
+        </w:rPr>
+        <w:t>Stridulant</w:t>
+      </w:r>
+      <w:proofErr w:type="spellEnd"/>
+      <w:r>
+        <w:rPr>
+          <w:rStyle w:val="Strong"/>
+          <w:sz w:val="56"/>
+          <w:szCs w:val="56"/>
+        </w:rPr>
+        <w:t>.</w:t>
       </w:r>
     </w:p>
     <w:p>
@@ -35,7 +53,7 @@
     </w:p>
     <w:p>
       <w:pPr>
-        <w:pStyle w:val="Ttulo1"/>
+        <w:pStyle w:val="Heading1"/>
       </w:pPr>
       <w:r>
         <w:lastRenderedPageBreak/>
@@ -52,7 +70,21 @@
         <w:rPr>
           <w:rFonts w:ascii="Times New Roman" w:hAnsi="Times New Roman" w:cs="Times New Roman"/>
         </w:rPr>
-        <w:t>You can use the package without installing it, but it is more uncomfortable, so I will make this whole guide assuming you did install it to your pythonpath. All necessary dependencies should self-install when doing this as well. The best way to do it is via pip install.</w:t>
+        <w:t xml:space="preserve">You can use the package without installing it, but it is more uncomfortable, so I will make this whole guide assuming you did install it to your </w:t>
+      </w:r>
+      <w:proofErr w:type="spellStart"/>
+      <w:r>
+        <w:rPr>
+          <w:rFonts w:ascii="Times New Roman" w:hAnsi="Times New Roman" w:cs="Times New Roman"/>
+        </w:rPr>
+        <w:t>pythonpath</w:t>
+      </w:r>
+      <w:proofErr w:type="spellEnd"/>
+      <w:r>
+        <w:rPr>
+          <w:rFonts w:ascii="Times New Roman" w:hAnsi="Times New Roman" w:cs="Times New Roman"/>
+        </w:rPr>
+        <w:t>. All necessary dependencies should self-install when doing this as well. The best way to do it is via pip install.</w:t>
       </w:r>
     </w:p>
     <w:p>
@@ -62,11 +94,33 @@
           <w:rFonts w:ascii="Times New Roman" w:hAnsi="Times New Roman" w:cs="Times New Roman"/>
         </w:rPr>
       </w:pPr>
-      <w:r>
-        <w:rPr>
-          <w:rFonts w:ascii="Times New Roman" w:hAnsi="Times New Roman" w:cs="Times New Roman"/>
-        </w:rPr>
-        <w:t xml:space="preserve">1.- with a python interpreter (bash, spyder or whichever you are using) navigate to the folder you have the package in. </w:t>
+      <w:proofErr w:type="gramStart"/>
+      <w:r>
+        <w:rPr>
+          <w:rFonts w:ascii="Times New Roman" w:hAnsi="Times New Roman" w:cs="Times New Roman"/>
+        </w:rPr>
+        <w:t>1.-</w:t>
+      </w:r>
+      <w:proofErr w:type="gramEnd"/>
+      <w:r>
+        <w:rPr>
+          <w:rFonts w:ascii="Times New Roman" w:hAnsi="Times New Roman" w:cs="Times New Roman"/>
+        </w:rPr>
+        <w:t xml:space="preserve"> with a python interpreter (bash, </w:t>
+      </w:r>
+      <w:proofErr w:type="spellStart"/>
+      <w:r>
+        <w:rPr>
+          <w:rFonts w:ascii="Times New Roman" w:hAnsi="Times New Roman" w:cs="Times New Roman"/>
+        </w:rPr>
+        <w:t>spyder</w:t>
+      </w:r>
+      <w:proofErr w:type="spellEnd"/>
+      <w:r>
+        <w:rPr>
+          <w:rFonts w:ascii="Times New Roman" w:hAnsi="Times New Roman" w:cs="Times New Roman"/>
+        </w:rPr>
+        <w:t xml:space="preserve"> or whichever you are using) navigate to the folder you have the package in. </w:t>
       </w:r>
     </w:p>
     <w:p>
@@ -80,16 +134,62 @@
           <w:iCs/>
         </w:rPr>
       </w:pPr>
-      <w:r>
-        <w:rPr>
-          <w:rFonts w:ascii="Times New Roman" w:hAnsi="Times New Roman" w:cs="Times New Roman"/>
-          <w:b/>
-          <w:bCs/>
-          <w:i/>
-          <w:iCs/>
-        </w:rPr>
-        <w:t>cd directory/stridulant</w:t>
-      </w:r>
+      <w:proofErr w:type="gramStart"/>
+      <w:r>
+        <w:rPr>
+          <w:rFonts w:ascii="Times New Roman" w:hAnsi="Times New Roman" w:cs="Times New Roman"/>
+          <w:b/>
+          <w:bCs/>
+          <w:i/>
+          <w:iCs/>
+        </w:rPr>
+        <w:t>cd</w:t>
+      </w:r>
+      <w:proofErr w:type="gramEnd"/>
+      <w:r>
+        <w:rPr>
+          <w:rFonts w:ascii="Times New Roman" w:hAnsi="Times New Roman" w:cs="Times New Roman"/>
+          <w:b/>
+          <w:bCs/>
+          <w:i/>
+          <w:iCs/>
+        </w:rPr>
+        <w:t xml:space="preserve"> </w:t>
+      </w:r>
+      <w:proofErr w:type="spellStart"/>
+      <w:r>
+        <w:rPr>
+          <w:rFonts w:ascii="Times New Roman" w:hAnsi="Times New Roman" w:cs="Times New Roman"/>
+          <w:b/>
+          <w:bCs/>
+          <w:i/>
+          <w:iCs/>
+        </w:rPr>
+        <w:t>path_to_folder</w:t>
+      </w:r>
+      <w:proofErr w:type="spellEnd"/>
+      <w:r>
+        <w:rPr>
+          <w:rFonts w:ascii="Times New Roman" w:hAnsi="Times New Roman" w:cs="Times New Roman"/>
+          <w:b/>
+          <w:bCs/>
+          <w:i/>
+          <w:iCs/>
+        </w:rPr>
+        <w:t>/</w:t>
+      </w:r>
+      <w:proofErr w:type="spellStart"/>
+      <w:r>
+        <w:rPr>
+          <w:rFonts w:ascii="Times New Roman" w:hAnsi="Times New Roman" w:cs="Times New Roman"/>
+          <w:b/>
+          <w:bCs/>
+          <w:i/>
+          <w:iCs/>
+        </w:rPr>
+        <w:t>stridulant</w:t>
+      </w:r>
+      <w:proofErr w:type="spellEnd"/>
     </w:p>
     <w:p>
       <w:pPr>
@@ -98,33 +198,65 @@
           <w:rFonts w:ascii="Times New Roman" w:hAnsi="Times New Roman" w:cs="Times New Roman"/>
         </w:rPr>
       </w:pPr>
-      <w:r>
-        <w:rPr>
-          <w:rFonts w:ascii="Times New Roman" w:hAnsi="Times New Roman" w:cs="Times New Roman"/>
-        </w:rPr>
-        <w:t>2.- execute this line:</w:t>
-      </w:r>
-    </w:p>
-    <w:p>
-      <w:pPr>
-        <w:rPr>
-          <w:rFonts w:ascii="Times New Roman" w:hAnsi="Times New Roman" w:cs="Times New Roman"/>
-          <w:b/>
-          <w:bCs/>
-          <w:i/>
-          <w:iCs/>
-        </w:rPr>
-      </w:pPr>
-      <w:r>
-        <w:rPr>
-          <w:rFonts w:ascii="Times New Roman" w:hAnsi="Times New Roman" w:cs="Times New Roman"/>
-          <w:b/>
-          <w:bCs/>
-          <w:i/>
-          <w:iCs/>
-        </w:rPr>
-        <w:t>pip install stridulant</w:t>
-      </w:r>
+      <w:proofErr w:type="gramStart"/>
+      <w:r>
+        <w:rPr>
+          <w:rFonts w:ascii="Times New Roman" w:hAnsi="Times New Roman" w:cs="Times New Roman"/>
+        </w:rPr>
+        <w:t>2.-</w:t>
+      </w:r>
+      <w:proofErr w:type="gramEnd"/>
+      <w:r>
+        <w:rPr>
+          <w:rFonts w:ascii="Times New Roman" w:hAnsi="Times New Roman" w:cs="Times New Roman"/>
+        </w:rPr>
+        <w:t xml:space="preserve"> execute this line:</w:t>
+      </w:r>
+    </w:p>
+    <w:p>
+      <w:pPr>
+        <w:rPr>
+          <w:rFonts w:ascii="Times New Roman" w:hAnsi="Times New Roman" w:cs="Times New Roman"/>
+          <w:b/>
+          <w:bCs/>
+          <w:i/>
+          <w:iCs/>
+        </w:rPr>
+      </w:pPr>
+      <w:proofErr w:type="gramStart"/>
+      <w:r>
+        <w:rPr>
+          <w:rFonts w:ascii="Times New Roman" w:hAnsi="Times New Roman" w:cs="Times New Roman"/>
+          <w:b/>
+          <w:bCs/>
+          <w:i/>
+          <w:iCs/>
+        </w:rPr>
+        <w:t>pip</w:t>
+      </w:r>
+      <w:proofErr w:type="gramEnd"/>
+      <w:r>
+        <w:rPr>
+          <w:rFonts w:ascii="Times New Roman" w:hAnsi="Times New Roman" w:cs="Times New Roman"/>
+          <w:b/>
+          <w:bCs/>
+          <w:i/>
+          <w:iCs/>
+        </w:rPr>
+        <w:t xml:space="preserve"> install </w:t>
+      </w:r>
+      <w:proofErr w:type="spellStart"/>
+      <w:r>
+        <w:rPr>
+          <w:rFonts w:ascii="Times New Roman" w:hAnsi="Times New Roman" w:cs="Times New Roman"/>
+          <w:b/>
+          <w:bCs/>
+          <w:i/>
+          <w:iCs/>
+        </w:rPr>
+        <w:t>stridulant</w:t>
+      </w:r>
+      <w:proofErr w:type="spellEnd"/>
     </w:p>
     <w:p>
       <w:pPr>
@@ -137,46 +269,119 @@
         <w:rPr>
           <w:rFonts w:ascii="Times New Roman" w:hAnsi="Times New Roman" w:cs="Times New Roman"/>
         </w:rPr>
-        <w:t>while in development, you may have to do this after each update, you may uninstall if before each reinstall to refresh everything with the command:</w:t>
-      </w:r>
-    </w:p>
-    <w:p>
-      <w:pPr>
-        <w:rPr>
-          <w:rFonts w:ascii="Times New Roman" w:hAnsi="Times New Roman" w:cs="Times New Roman"/>
-          <w:b/>
-          <w:bCs/>
-          <w:i/>
-          <w:iCs/>
-        </w:rPr>
-      </w:pPr>
-      <w:r>
-        <w:rPr>
-          <w:rFonts w:ascii="Times New Roman" w:hAnsi="Times New Roman" w:cs="Times New Roman"/>
-          <w:b/>
-          <w:bCs/>
-          <w:i/>
-          <w:iCs/>
-        </w:rPr>
-        <w:t>pip uninstall stridulant</w:t>
-      </w:r>
-    </w:p>
-    <w:p>
-      <w:pPr>
-        <w:rPr>
-          <w:rFonts w:ascii="Times New Roman" w:hAnsi="Times New Roman" w:cs="Times New Roman"/>
-          <w:b/>
-          <w:bCs/>
-        </w:rPr>
-      </w:pPr>
-      <w:r>
-        <w:rPr>
-          <w:rFonts w:ascii="Times New Roman" w:hAnsi="Times New Roman" w:cs="Times New Roman"/>
-          <w:b/>
-          <w:bCs/>
-        </w:rPr>
-        <w:t>Starting stridulant</w:t>
-      </w:r>
+        <w:t>W</w:t>
+      </w:r>
+      <w:r>
+        <w:rPr>
+          <w:rFonts w:ascii="Times New Roman" w:hAnsi="Times New Roman" w:cs="Times New Roman"/>
+        </w:rPr>
+        <w:t>hile in development, you may have to do this after each update, you may uninstall if before each reinstall to refresh everything with the command:</w:t>
+      </w:r>
+    </w:p>
+    <w:p>
+      <w:pPr>
+        <w:rPr>
+          <w:rFonts w:ascii="Times New Roman" w:hAnsi="Times New Roman" w:cs="Times New Roman"/>
+          <w:b/>
+          <w:bCs/>
+          <w:i/>
+          <w:iCs/>
+        </w:rPr>
+      </w:pPr>
+      <w:proofErr w:type="gramStart"/>
+      <w:r>
+        <w:rPr>
+          <w:rFonts w:ascii="Times New Roman" w:hAnsi="Times New Roman" w:cs="Times New Roman"/>
+          <w:b/>
+          <w:bCs/>
+          <w:i/>
+          <w:iCs/>
+        </w:rPr>
+        <w:t>pip</w:t>
+      </w:r>
+      <w:proofErr w:type="gramEnd"/>
+      <w:r>
+        <w:rPr>
+          <w:rFonts w:ascii="Times New Roman" w:hAnsi="Times New Roman" w:cs="Times New Roman"/>
+          <w:b/>
+          <w:bCs/>
+          <w:i/>
+          <w:iCs/>
+        </w:rPr>
+        <w:t xml:space="preserve"> uninstall </w:t>
+      </w:r>
+      <w:proofErr w:type="spellStart"/>
+      <w:r>
+        <w:rPr>
+          <w:rFonts w:ascii="Times New Roman" w:hAnsi="Times New Roman" w:cs="Times New Roman"/>
+          <w:b/>
+          <w:bCs/>
+          <w:i/>
+          <w:iCs/>
+        </w:rPr>
+        <w:t>stridulant</w:t>
+      </w:r>
+      <w:proofErr w:type="spellEnd"/>
+    </w:p>
+    <w:p>
+      <w:pPr>
+        <w:rPr>
+          <w:rFonts w:ascii="Times New Roman" w:hAnsi="Times New Roman" w:cs="Times New Roman"/>
+          <w:bCs/>
+          <w:iCs/>
+        </w:rPr>
+      </w:pPr>
+      <w:r>
+        <w:rPr>
+          <w:rFonts w:ascii="Times New Roman" w:hAnsi="Times New Roman" w:cs="Times New Roman"/>
+          <w:bCs/>
+          <w:iCs/>
+        </w:rPr>
+        <w:t>T</w:t>
+      </w:r>
+      <w:r>
+        <w:rPr>
+          <w:rFonts w:ascii="Times New Roman" w:hAnsi="Times New Roman" w:cs="Times New Roman"/>
+          <w:bCs/>
+          <w:iCs/>
+        </w:rPr>
+        <w:t>hen repeat the 2 steps above</w:t>
+      </w:r>
+      <w:r>
+        <w:rPr>
+          <w:rFonts w:ascii="Times New Roman" w:hAnsi="Times New Roman" w:cs="Times New Roman"/>
+          <w:bCs/>
+          <w:iCs/>
+        </w:rPr>
+        <w:t>.</w:t>
+      </w:r>
+    </w:p>
+    <w:p>
+      <w:pPr>
+        <w:rPr>
+          <w:rFonts w:ascii="Times New Roman" w:hAnsi="Times New Roman" w:cs="Times New Roman"/>
+          <w:b/>
+          <w:bCs/>
+        </w:rPr>
+      </w:pPr>
+      <w:r>
+        <w:rPr>
+          <w:rFonts w:ascii="Times New Roman" w:hAnsi="Times New Roman" w:cs="Times New Roman"/>
+          <w:b/>
+          <w:bCs/>
+        </w:rPr>
+        <w:t xml:space="preserve">Starting </w:t>
+      </w:r>
+      <w:proofErr w:type="spellStart"/>
+      <w:r>
+        <w:rPr>
+          <w:rFonts w:ascii="Times New Roman" w:hAnsi="Times New Roman" w:cs="Times New Roman"/>
+          <w:b/>
+          <w:bCs/>
+        </w:rPr>
+        <w:t>stridulant</w:t>
+      </w:r>
+      <w:proofErr w:type="spellEnd"/>
     </w:p>
     <w:p>
       <w:pPr>
@@ -210,8 +415,42 @@
           <w:i/>
           <w:iCs/>
         </w:rPr>
-        <w:t>Import stridulant as st</w:t>
-      </w:r>
+        <w:t xml:space="preserve">Import </w:t>
+      </w:r>
+      <w:proofErr w:type="spellStart"/>
+      <w:r>
+        <w:rPr>
+          <w:rFonts w:ascii="Times New Roman" w:hAnsi="Times New Roman" w:cs="Times New Roman"/>
+          <w:b/>
+          <w:bCs/>
+          <w:i/>
+          <w:iCs/>
+        </w:rPr>
+        <w:t>stridulant</w:t>
+      </w:r>
+      <w:proofErr w:type="spellEnd"/>
+      <w:r>
+        <w:rPr>
+          <w:rFonts w:ascii="Times New Roman" w:hAnsi="Times New Roman" w:cs="Times New Roman"/>
+          <w:b/>
+          <w:bCs/>
+          <w:i/>
+          <w:iCs/>
+        </w:rPr>
+        <w:t xml:space="preserve"> as </w:t>
+      </w:r>
+      <w:proofErr w:type="spellStart"/>
+      <w:r>
+        <w:rPr>
+          <w:rFonts w:ascii="Times New Roman" w:hAnsi="Times New Roman" w:cs="Times New Roman"/>
+          <w:b/>
+          <w:bCs/>
+          <w:i/>
+          <w:iCs/>
+        </w:rPr>
+        <w:t>st</w:t>
+      </w:r>
+      <w:proofErr w:type="spellEnd"/>
     </w:p>
     <w:p>
       <w:pPr>
@@ -241,7 +480,7 @@
     </w:p>
     <w:p>
       <w:pPr>
-        <w:pStyle w:val="Ttulo1"/>
+        <w:pStyle w:val="Heading1"/>
       </w:pPr>
       <w:r>
         <w:lastRenderedPageBreak/>
@@ -267,11 +506,19 @@
           <w:rFonts w:ascii="Times New Roman" w:hAnsi="Times New Roman" w:cs="Times New Roman"/>
         </w:rPr>
       </w:pPr>
-      <w:r>
-        <w:rPr>
-          <w:rFonts w:ascii="Times New Roman" w:hAnsi="Times New Roman" w:cs="Times New Roman"/>
-        </w:rPr>
-        <w:t>Stridulant works as an easy way to handle sound, that’s the main task, to ease the work on the sound files in a way that they are useful for AI training. As far as I understand, for the AI to pick up on details, the spectrograms must be consistent with one another and consistent with the real problem that will be presented later. So, what I did to confront that issue is creating sound snippets. These snippets are fragments of the sound file of a defined length that can then be easily handled (augmented, played or Fourier transformed…) and saved. Let’s take a look at how to use them.</w:t>
+      <w:proofErr w:type="spellStart"/>
+      <w:r>
+        <w:rPr>
+          <w:rFonts w:ascii="Times New Roman" w:hAnsi="Times New Roman" w:cs="Times New Roman"/>
+        </w:rPr>
+        <w:t>Stridulant</w:t>
+      </w:r>
+      <w:proofErr w:type="spellEnd"/>
+      <w:r>
+        <w:rPr>
+          <w:rFonts w:ascii="Times New Roman" w:hAnsi="Times New Roman" w:cs="Times New Roman"/>
+        </w:rPr>
+        <w:t xml:space="preserve"> works as an easy way to handle sound, that’s the main task, to ease the work on the sound files in a way that they are useful for AI training. As far as I understand, for the AI to pick up on details, the spectrograms must be consistent with one another and consistent with the real problem that will be presented later. So, what I did to confront that issue is creating sound snippets. These snippets are fragments of the sound file of a defined length that can then be easily handled (augmented, played or Fourier transformed…) and saved. Let’s take a look at how to use them.</w:t>
       </w:r>
       <w:r>
         <w:rPr>
@@ -291,29 +538,67 @@
         <w:rPr>
           <w:rFonts w:ascii="Times New Roman" w:hAnsi="Times New Roman" w:cs="Times New Roman"/>
         </w:rPr>
-        <w:t>You must load an audio file. Use the following line to obtain the wave and the sampling rate loaded to 2 variables, audio and sr:</w:t>
-      </w:r>
-    </w:p>
-    <w:p>
-      <w:pPr>
-        <w:rPr>
-          <w:rFonts w:ascii="Times New Roman" w:hAnsi="Times New Roman" w:cs="Times New Roman"/>
-          <w:b/>
-          <w:bCs/>
-          <w:i/>
-          <w:iCs/>
-        </w:rPr>
-      </w:pPr>
-      <w:r>
-        <w:rPr>
-          <w:rFonts w:ascii="Times New Roman" w:hAnsi="Times New Roman" w:cs="Times New Roman"/>
-          <w:b/>
-          <w:bCs/>
-          <w:i/>
-          <w:iCs/>
-        </w:rPr>
-        <w:t>audio, sr</w:t>
-      </w:r>
+        <w:t xml:space="preserve">You must load an audio file. Use the following line to obtain the wave and the sampling rate loaded to 2 variables, audio and </w:t>
+      </w:r>
+      <w:proofErr w:type="spellStart"/>
+      <w:r>
+        <w:rPr>
+          <w:rFonts w:ascii="Times New Roman" w:hAnsi="Times New Roman" w:cs="Times New Roman"/>
+        </w:rPr>
+        <w:t>sr</w:t>
+      </w:r>
+      <w:proofErr w:type="spellEnd"/>
+      <w:r>
+        <w:rPr>
+          <w:rFonts w:ascii="Times New Roman" w:hAnsi="Times New Roman" w:cs="Times New Roman"/>
+        </w:rPr>
+        <w:t>:</w:t>
+      </w:r>
+    </w:p>
+    <w:p>
+      <w:pPr>
+        <w:rPr>
+          <w:rFonts w:ascii="Times New Roman" w:hAnsi="Times New Roman" w:cs="Times New Roman"/>
+          <w:b/>
+          <w:bCs/>
+          <w:i/>
+          <w:iCs/>
+        </w:rPr>
+      </w:pPr>
+      <w:proofErr w:type="gramStart"/>
+      <w:r>
+        <w:rPr>
+          <w:rFonts w:ascii="Times New Roman" w:hAnsi="Times New Roman" w:cs="Times New Roman"/>
+          <w:b/>
+          <w:bCs/>
+          <w:i/>
+          <w:iCs/>
+        </w:rPr>
+        <w:t>audio</w:t>
+      </w:r>
+      <w:proofErr w:type="gramEnd"/>
+      <w:r>
+        <w:rPr>
+          <w:rFonts w:ascii="Times New Roman" w:hAnsi="Times New Roman" w:cs="Times New Roman"/>
+          <w:b/>
+          <w:bCs/>
+          <w:i/>
+          <w:iCs/>
+        </w:rPr>
+        <w:t xml:space="preserve">, </w:t>
+      </w:r>
+      <w:proofErr w:type="spellStart"/>
+      <w:r>
+        <w:rPr>
+          <w:rFonts w:ascii="Times New Roman" w:hAnsi="Times New Roman" w:cs="Times New Roman"/>
+          <w:b/>
+          <w:bCs/>
+          <w:i/>
+          <w:iCs/>
+        </w:rPr>
+        <w:t>sr</w:t>
+      </w:r>
+      <w:proofErr w:type="spellEnd"/>
       <w:r>
         <w:rPr>
           <w:rFonts w:ascii="Times New Roman" w:hAnsi="Times New Roman" w:cs="Times New Roman"/>
@@ -342,22 +627,78 @@
           <w:i/>
           <w:iCs/>
         </w:rPr>
-        <w:t xml:space="preserve"> st.</w:t>
-      </w:r>
-      <w:r>
-        <w:rPr>
-          <w:rFonts w:ascii="Times New Roman" w:hAnsi="Times New Roman" w:cs="Times New Roman"/>
-          <w:b/>
-          <w:bCs/>
-          <w:i/>
-          <w:iCs/>
-        </w:rPr>
-        <w:t xml:space="preserve"> load_audio (path_to_audio)</w:t>
-      </w:r>
-    </w:p>
-    <w:p>
-      <w:pPr>
-        <w:pStyle w:val="Ttulo2"/>
+        <w:t xml:space="preserve"> </w:t>
+      </w:r>
+      <w:proofErr w:type="spellStart"/>
+      <w:r>
+        <w:rPr>
+          <w:rFonts w:ascii="Times New Roman" w:hAnsi="Times New Roman" w:cs="Times New Roman"/>
+          <w:b/>
+          <w:bCs/>
+          <w:i/>
+          <w:iCs/>
+        </w:rPr>
+        <w:t>st.</w:t>
+      </w:r>
+      <w:proofErr w:type="spellEnd"/>
+      <w:r>
+        <w:rPr>
+          <w:rFonts w:ascii="Times New Roman" w:hAnsi="Times New Roman" w:cs="Times New Roman"/>
+          <w:b/>
+          <w:bCs/>
+          <w:i/>
+          <w:iCs/>
+        </w:rPr>
+        <w:t xml:space="preserve"> </w:t>
+      </w:r>
+      <w:proofErr w:type="spellStart"/>
+      <w:r>
+        <w:rPr>
+          <w:rFonts w:ascii="Times New Roman" w:hAnsi="Times New Roman" w:cs="Times New Roman"/>
+          <w:b/>
+          <w:bCs/>
+          <w:i/>
+          <w:iCs/>
+        </w:rPr>
+        <w:t>load_audio</w:t>
+      </w:r>
+      <w:proofErr w:type="spellEnd"/>
+      <w:r>
+        <w:rPr>
+          <w:rFonts w:ascii="Times New Roman" w:hAnsi="Times New Roman" w:cs="Times New Roman"/>
+          <w:b/>
+          <w:bCs/>
+          <w:i/>
+          <w:iCs/>
+        </w:rPr>
+        <w:t xml:space="preserve"> (</w:t>
+      </w:r>
+      <w:proofErr w:type="spellStart"/>
+      <w:r>
+        <w:rPr>
+          <w:rFonts w:ascii="Times New Roman" w:hAnsi="Times New Roman" w:cs="Times New Roman"/>
+          <w:b/>
+          <w:bCs/>
+          <w:i/>
+          <w:iCs/>
+        </w:rPr>
+        <w:t>path_to_audio</w:t>
+      </w:r>
+      <w:proofErr w:type="spellEnd"/>
+      <w:r>
+        <w:rPr>
+          <w:rFonts w:ascii="Times New Roman" w:hAnsi="Times New Roman" w:cs="Times New Roman"/>
+          <w:b/>
+          <w:bCs/>
+          <w:i/>
+          <w:iCs/>
+        </w:rPr>
+        <w:t>)</w:t>
+      </w:r>
+    </w:p>
+    <w:p>
+      <w:pPr>
+        <w:pStyle w:val="Heading2"/>
       </w:pPr>
       <w:r>
         <w:t>Audio snippets</w:t>
@@ -380,7 +721,47 @@
         <w:rPr>
           <w:rFonts w:ascii="Times New Roman" w:hAnsi="Times New Roman" w:cs="Times New Roman"/>
         </w:rPr>
-        <w:t xml:space="preserve"> you can create snippets from it. Use code like this. Audio and sr you just created, start_time is the time in seconds of the audio file you want your snippet to be cut and duration is the time in seconds you want your snippet to last.</w:t>
+        <w:t xml:space="preserve"> you can create snippets from it. Use code like this. Audio and </w:t>
+      </w:r>
+      <w:proofErr w:type="spellStart"/>
+      <w:r>
+        <w:rPr>
+          <w:rFonts w:ascii="Times New Roman" w:hAnsi="Times New Roman" w:cs="Times New Roman"/>
+        </w:rPr>
+        <w:t>sr</w:t>
+      </w:r>
+      <w:proofErr w:type="spellEnd"/>
+      <w:r>
+        <w:rPr>
+          <w:rFonts w:ascii="Times New Roman" w:hAnsi="Times New Roman" w:cs="Times New Roman"/>
+        </w:rPr>
+        <w:t xml:space="preserve"> you just created</w:t>
+      </w:r>
+      <w:r>
+        <w:rPr>
+          <w:rFonts w:ascii="Times New Roman" w:hAnsi="Times New Roman" w:cs="Times New Roman"/>
+        </w:rPr>
+        <w:t xml:space="preserve"> with the audio loading function</w:t>
+      </w:r>
+      <w:r>
+        <w:rPr>
+          <w:rFonts w:ascii="Times New Roman" w:hAnsi="Times New Roman" w:cs="Times New Roman"/>
+        </w:rPr>
+        <w:t xml:space="preserve">, </w:t>
+      </w:r>
+      <w:proofErr w:type="spellStart"/>
+      <w:r>
+        <w:rPr>
+          <w:rFonts w:ascii="Times New Roman" w:hAnsi="Times New Roman" w:cs="Times New Roman"/>
+        </w:rPr>
+        <w:t>start_time</w:t>
+      </w:r>
+      <w:proofErr w:type="spellEnd"/>
+      <w:r>
+        <w:rPr>
+          <w:rFonts w:ascii="Times New Roman" w:hAnsi="Times New Roman" w:cs="Times New Roman"/>
+        </w:rPr>
+        <w:t xml:space="preserve"> is the time in seconds of the audio file you want your snippet to be cut and duration is the time in seconds you want your snippet to last.</w:t>
       </w:r>
     </w:p>
     <w:p>
@@ -403,6 +784,7 @@
         </w:rPr>
         <w:t xml:space="preserve">Snippet_1 = </w:t>
       </w:r>
+      <w:proofErr w:type="spellStart"/>
       <w:r>
         <w:rPr>
           <w:rFonts w:ascii="Times New Roman" w:hAnsi="Times New Roman" w:cs="Times New Roman"/>
@@ -421,8 +803,75 @@
           <w:i/>
           <w:iCs/>
         </w:rPr>
-        <w:t>create_snippet(audio, sr, start_time</w:t>
-      </w:r>
+        <w:t>create_</w:t>
+      </w:r>
+      <w:proofErr w:type="gramStart"/>
+      <w:r>
+        <w:rPr>
+          <w:rFonts w:ascii="Times New Roman" w:hAnsi="Times New Roman" w:cs="Times New Roman"/>
+          <w:b/>
+          <w:bCs/>
+          <w:i/>
+          <w:iCs/>
+        </w:rPr>
+        <w:t>snippet</w:t>
+      </w:r>
+      <w:proofErr w:type="spellEnd"/>
+      <w:r>
+        <w:rPr>
+          <w:rFonts w:ascii="Times New Roman" w:hAnsi="Times New Roman" w:cs="Times New Roman"/>
+          <w:b/>
+          <w:bCs/>
+          <w:i/>
+          <w:iCs/>
+        </w:rPr>
+        <w:t>(</w:t>
+      </w:r>
+      <w:proofErr w:type="gramEnd"/>
+      <w:r>
+        <w:rPr>
+          <w:rFonts w:ascii="Times New Roman" w:hAnsi="Times New Roman" w:cs="Times New Roman"/>
+          <w:b/>
+          <w:bCs/>
+          <w:i/>
+          <w:iCs/>
+        </w:rPr>
+        <w:t xml:space="preserve">audio, </w:t>
+      </w:r>
+      <w:proofErr w:type="spellStart"/>
+      <w:r>
+        <w:rPr>
+          <w:rFonts w:ascii="Times New Roman" w:hAnsi="Times New Roman" w:cs="Times New Roman"/>
+          <w:b/>
+          <w:bCs/>
+          <w:i/>
+          <w:iCs/>
+        </w:rPr>
+        <w:t>sr</w:t>
+      </w:r>
+      <w:proofErr w:type="spellEnd"/>
+      <w:r>
+        <w:rPr>
+          <w:rFonts w:ascii="Times New Roman" w:hAnsi="Times New Roman" w:cs="Times New Roman"/>
+          <w:b/>
+          <w:bCs/>
+          <w:i/>
+          <w:iCs/>
+        </w:rPr>
+        <w:t xml:space="preserve">, </w:t>
+      </w:r>
+      <w:proofErr w:type="spellStart"/>
+      <w:r>
+        <w:rPr>
+          <w:rFonts w:ascii="Times New Roman" w:hAnsi="Times New Roman" w:cs="Times New Roman"/>
+          <w:b/>
+          <w:bCs/>
+          <w:i/>
+          <w:iCs/>
+        </w:rPr>
+        <w:t>start_time</w:t>
+      </w:r>
+      <w:proofErr w:type="spellEnd"/>
       <w:r>
         <w:rPr>
           <w:rFonts w:ascii="Times New Roman" w:hAnsi="Times New Roman" w:cs="Times New Roman"/>
@@ -455,7 +904,35 @@
         <w:rPr>
           <w:rFonts w:ascii="Times New Roman" w:hAnsi="Times New Roman" w:cs="Times New Roman"/>
         </w:rPr>
-        <w:t xml:space="preserve">This creates an object of the class audio_snippet. Handling this object should be fairly easy. All functions will pop as a list if you tipe </w:t>
+        <w:t xml:space="preserve">This creates an object of the class </w:t>
+      </w:r>
+      <w:proofErr w:type="spellStart"/>
+      <w:r>
+        <w:rPr>
+          <w:rFonts w:ascii="Times New Roman" w:hAnsi="Times New Roman" w:cs="Times New Roman"/>
+        </w:rPr>
+        <w:t>audio_snippet</w:t>
+      </w:r>
+      <w:proofErr w:type="spellEnd"/>
+      <w:r>
+        <w:rPr>
+          <w:rFonts w:ascii="Times New Roman" w:hAnsi="Times New Roman" w:cs="Times New Roman"/>
+        </w:rPr>
+        <w:t xml:space="preserve">. Handling this object should be fairly easy. All functions will pop as a list if you </w:t>
+      </w:r>
+      <w:proofErr w:type="spellStart"/>
+      <w:r>
+        <w:rPr>
+          <w:rFonts w:ascii="Times New Roman" w:hAnsi="Times New Roman" w:cs="Times New Roman"/>
+        </w:rPr>
+        <w:t>tipe</w:t>
+      </w:r>
+      <w:proofErr w:type="spellEnd"/>
+      <w:r>
+        <w:rPr>
+          <w:rFonts w:ascii="Times New Roman" w:hAnsi="Times New Roman" w:cs="Times New Roman"/>
+        </w:rPr>
+        <w:t xml:space="preserve"> </w:t>
       </w:r>
       <w:r>
         <w:rPr>
@@ -469,7 +946,21 @@
         <w:rPr>
           <w:rFonts w:ascii="Times New Roman" w:hAnsi="Times New Roman" w:cs="Times New Roman"/>
         </w:rPr>
-        <w:t xml:space="preserve"> and press tab (or any name you give to the snippet…) But what can you do? </w:t>
+        <w:t xml:space="preserve"> </w:t>
+      </w:r>
+      <w:proofErr w:type="gramStart"/>
+      <w:r>
+        <w:rPr>
+          <w:rFonts w:ascii="Times New Roman" w:hAnsi="Times New Roman" w:cs="Times New Roman"/>
+        </w:rPr>
+        <w:t>and</w:t>
+      </w:r>
+      <w:proofErr w:type="gramEnd"/>
+      <w:r>
+        <w:rPr>
+          <w:rFonts w:ascii="Times New Roman" w:hAnsi="Times New Roman" w:cs="Times New Roman"/>
+        </w:rPr>
+        <w:t xml:space="preserve"> press tab (or any name you give to the snippet…) But what can you do? </w:t>
       </w:r>
       <w:r>
         <w:rPr>
@@ -485,11 +976,19 @@
           <w:rFonts w:ascii="Times New Roman" w:hAnsi="Times New Roman" w:cs="Times New Roman"/>
         </w:rPr>
       </w:pPr>
-      <w:r>
-        <w:rPr>
-          <w:rFonts w:ascii="Times New Roman" w:hAnsi="Times New Roman" w:cs="Times New Roman"/>
-        </w:rPr>
-        <w:t xml:space="preserve">1.- play the snippet with </w:t>
+      <w:proofErr w:type="gramStart"/>
+      <w:r>
+        <w:rPr>
+          <w:rFonts w:ascii="Times New Roman" w:hAnsi="Times New Roman" w:cs="Times New Roman"/>
+        </w:rPr>
+        <w:t>1.-</w:t>
+      </w:r>
+      <w:proofErr w:type="gramEnd"/>
+      <w:r>
+        <w:rPr>
+          <w:rFonts w:ascii="Times New Roman" w:hAnsi="Times New Roman" w:cs="Times New Roman"/>
+        </w:rPr>
+        <w:t xml:space="preserve"> play the snippet with </w:t>
       </w:r>
       <w:r>
         <w:rPr>
@@ -523,7 +1022,51 @@
           <w:i/>
           <w:iCs/>
         </w:rPr>
-        <w:t>Snippet_1.save(name, dir)</w:t>
+        <w:t>Snippet_</w:t>
+      </w:r>
+      <w:proofErr w:type="gramStart"/>
+      <w:r>
+        <w:rPr>
+          <w:rFonts w:ascii="Times New Roman" w:hAnsi="Times New Roman" w:cs="Times New Roman"/>
+          <w:b/>
+          <w:bCs/>
+          <w:i/>
+          <w:iCs/>
+        </w:rPr>
+        <w:t>1.save(</w:t>
+      </w:r>
+      <w:proofErr w:type="gramEnd"/>
+      <w:r>
+        <w:rPr>
+          <w:rFonts w:ascii="Times New Roman" w:hAnsi="Times New Roman" w:cs="Times New Roman"/>
+          <w:b/>
+          <w:bCs/>
+          <w:i/>
+          <w:iCs/>
+        </w:rPr>
+        <w:t xml:space="preserve">name, </w:t>
+      </w:r>
+      <w:proofErr w:type="spellStart"/>
+      <w:r>
+        <w:rPr>
+          <w:rFonts w:ascii="Times New Roman" w:hAnsi="Times New Roman" w:cs="Times New Roman"/>
+          <w:b/>
+          <w:bCs/>
+          <w:i/>
+          <w:iCs/>
+        </w:rPr>
+        <w:t>dir</w:t>
+      </w:r>
+      <w:proofErr w:type="spellEnd"/>
+      <w:r>
+        <w:rPr>
+          <w:rFonts w:ascii="Times New Roman" w:hAnsi="Times New Roman" w:cs="Times New Roman"/>
+          <w:b/>
+          <w:bCs/>
+          <w:i/>
+          <w:iCs/>
+        </w:rPr>
+        <w:t>)</w:t>
       </w:r>
       <w:r>
         <w:rPr>
@@ -539,21 +1082,39 @@
           <w:rFonts w:ascii="Times New Roman" w:hAnsi="Times New Roman" w:cs="Times New Roman"/>
         </w:rPr>
       </w:pPr>
-      <w:r>
-        <w:rPr>
-          <w:rFonts w:ascii="Times New Roman" w:hAnsi="Times New Roman" w:cs="Times New Roman"/>
-        </w:rPr>
-        <w:t xml:space="preserve">3.- augment it with </w:t>
-      </w:r>
-      <w:r>
-        <w:rPr>
-          <w:rFonts w:ascii="Times New Roman" w:hAnsi="Times New Roman" w:cs="Times New Roman"/>
-          <w:b/>
-          <w:bCs/>
-          <w:i/>
-          <w:iCs/>
-        </w:rPr>
-        <w:t>Snippet_1.Fun()</w:t>
+      <w:proofErr w:type="gramStart"/>
+      <w:r>
+        <w:rPr>
+          <w:rFonts w:ascii="Times New Roman" w:hAnsi="Times New Roman" w:cs="Times New Roman"/>
+        </w:rPr>
+        <w:t>3.-</w:t>
+      </w:r>
+      <w:proofErr w:type="gramEnd"/>
+      <w:r>
+        <w:rPr>
+          <w:rFonts w:ascii="Times New Roman" w:hAnsi="Times New Roman" w:cs="Times New Roman"/>
+        </w:rPr>
+        <w:t xml:space="preserve"> augment it with </w:t>
+      </w:r>
+      <w:r>
+        <w:rPr>
+          <w:rFonts w:ascii="Times New Roman" w:hAnsi="Times New Roman" w:cs="Times New Roman"/>
+          <w:b/>
+          <w:bCs/>
+          <w:i/>
+          <w:iCs/>
+        </w:rPr>
+        <w:t>Snippet_1.f</w:t>
+      </w:r>
+      <w:r>
+        <w:rPr>
+          <w:rFonts w:ascii="Times New Roman" w:hAnsi="Times New Roman" w:cs="Times New Roman"/>
+          <w:b/>
+          <w:bCs/>
+          <w:i/>
+          <w:iCs/>
+        </w:rPr>
+        <w:t>un()</w:t>
       </w:r>
       <w:r>
         <w:rPr>
@@ -569,20 +1130,71 @@
         <w:rPr>
           <w:rFonts w:ascii="Times New Roman" w:hAnsi="Times New Roman" w:cs="Times New Roman"/>
         </w:rPr>
-        <w:t>where fun is one of the augmentations like time_strecth or add_gaussian_noise… They have defaults that you can change as kwargs. More about this in the documentation. If you saved a transformed snippet, it will automatically get a transformed flag, so there should be no overwriting either. These augmentation can be extended later with more things that you want, but their general purpose is to create alterations of the sounds to enlarge the training datasets.</w:t>
-      </w:r>
-    </w:p>
-    <w:p>
-      <w:pPr>
-        <w:rPr>
-          <w:rFonts w:ascii="Times New Roman" w:hAnsi="Times New Roman" w:cs="Times New Roman"/>
-        </w:rPr>
-      </w:pPr>
-      <w:r>
-        <w:rPr>
-          <w:rFonts w:ascii="Times New Roman" w:hAnsi="Times New Roman" w:cs="Times New Roman"/>
-        </w:rPr>
-        <w:t xml:space="preserve">4.- create spectrograms with </w:t>
+        <w:t xml:space="preserve">where fun is one of the augmentations like </w:t>
+      </w:r>
+      <w:proofErr w:type="spellStart"/>
+      <w:r>
+        <w:rPr>
+          <w:rFonts w:ascii="Times New Roman" w:hAnsi="Times New Roman" w:cs="Times New Roman"/>
+        </w:rPr>
+        <w:t>time_strecth</w:t>
+      </w:r>
+      <w:proofErr w:type="spellEnd"/>
+      <w:r>
+        <w:rPr>
+          <w:rFonts w:ascii="Times New Roman" w:hAnsi="Times New Roman" w:cs="Times New Roman"/>
+        </w:rPr>
+        <w:t xml:space="preserve"> or </w:t>
+      </w:r>
+      <w:proofErr w:type="spellStart"/>
+      <w:r>
+        <w:rPr>
+          <w:rFonts w:ascii="Times New Roman" w:hAnsi="Times New Roman" w:cs="Times New Roman"/>
+        </w:rPr>
+        <w:t>add_gaussian_noise</w:t>
+      </w:r>
+      <w:proofErr w:type="spellEnd"/>
+      <w:r>
+        <w:rPr>
+          <w:rFonts w:ascii="Times New Roman" w:hAnsi="Times New Roman" w:cs="Times New Roman"/>
+        </w:rPr>
+        <w:t xml:space="preserve">… They have defaults that you can change as </w:t>
+      </w:r>
+      <w:proofErr w:type="spellStart"/>
+      <w:r>
+        <w:rPr>
+          <w:rFonts w:ascii="Times New Roman" w:hAnsi="Times New Roman" w:cs="Times New Roman"/>
+        </w:rPr>
+        <w:t>kwargs</w:t>
+      </w:r>
+      <w:proofErr w:type="spellEnd"/>
+      <w:r>
+        <w:rPr>
+          <w:rFonts w:ascii="Times New Roman" w:hAnsi="Times New Roman" w:cs="Times New Roman"/>
+        </w:rPr>
+        <w:t>. More about this in the documentation. If you saved a transformed snippet, it will automatically get a transformed flag, so there should be no overwriting either. These augmentation can be extended later with more things that you want, but their general purpose is to create alterations of the sounds to enlarge the training datasets.</w:t>
+      </w:r>
+    </w:p>
+    <w:p>
+      <w:pPr>
+        <w:spacing w:after="0"/>
+        <w:rPr>
+          <w:rFonts w:ascii="Times New Roman" w:hAnsi="Times New Roman" w:cs="Times New Roman"/>
+        </w:rPr>
+      </w:pPr>
+      <w:proofErr w:type="gramStart"/>
+      <w:r>
+        <w:rPr>
+          <w:rFonts w:ascii="Times New Roman" w:hAnsi="Times New Roman" w:cs="Times New Roman"/>
+        </w:rPr>
+        <w:t>4.-</w:t>
+      </w:r>
+      <w:proofErr w:type="gramEnd"/>
+      <w:r>
+        <w:rPr>
+          <w:rFonts w:ascii="Times New Roman" w:hAnsi="Times New Roman" w:cs="Times New Roman"/>
+        </w:rPr>
+        <w:t xml:space="preserve"> create spectrograms with </w:t>
       </w:r>
       <w:r>
         <w:rPr>
@@ -598,7 +1210,21 @@
         <w:rPr>
           <w:rFonts w:ascii="Times New Roman" w:hAnsi="Times New Roman" w:cs="Times New Roman"/>
         </w:rPr>
-        <w:t>. Types can be ‘mel’</w:t>
+        <w:t>. Types can be ‘</w:t>
+      </w:r>
+      <w:proofErr w:type="spellStart"/>
+      <w:r>
+        <w:rPr>
+          <w:rFonts w:ascii="Times New Roman" w:hAnsi="Times New Roman" w:cs="Times New Roman"/>
+        </w:rPr>
+        <w:t>mel</w:t>
+      </w:r>
+      <w:proofErr w:type="spellEnd"/>
+      <w:r>
+        <w:rPr>
+          <w:rFonts w:ascii="Times New Roman" w:hAnsi="Times New Roman" w:cs="Times New Roman"/>
+        </w:rPr>
+        <w:t>’</w:t>
       </w:r>
       <w:r>
         <w:rPr>
@@ -616,7 +1242,23 @@
         <w:rPr>
           <w:rFonts w:ascii="Times New Roman" w:hAnsi="Times New Roman" w:cs="Times New Roman"/>
         </w:rPr>
-        <w:t xml:space="preserve"> for mel spectrograms;</w:t>
+        <w:t xml:space="preserve"> for </w:t>
+      </w:r>
+      <w:proofErr w:type="spellStart"/>
+      <w:proofErr w:type="gramStart"/>
+      <w:r>
+        <w:rPr>
+          <w:rFonts w:ascii="Times New Roman" w:hAnsi="Times New Roman" w:cs="Times New Roman"/>
+        </w:rPr>
+        <w:t>mel</w:t>
+      </w:r>
+      <w:proofErr w:type="spellEnd"/>
+      <w:proofErr w:type="gramEnd"/>
+      <w:r>
+        <w:rPr>
+          <w:rFonts w:ascii="Times New Roman" w:hAnsi="Times New Roman" w:cs="Times New Roman"/>
+        </w:rPr>
+        <w:t xml:space="preserve"> spectrograms;</w:t>
       </w:r>
       <w:r>
         <w:rPr>
@@ -628,13 +1270,99 @@
         <w:rPr>
           <w:rFonts w:ascii="Times New Roman" w:hAnsi="Times New Roman" w:cs="Times New Roman"/>
         </w:rPr>
-        <w:t xml:space="preserve">‘fft’, for the regular fast fourier; or ‘hilbert’ for the Hilbert transform. I have read that, for this task, mel is the one to go, but you can experiment. </w:t>
-      </w:r>
-      <w:r>
-        <w:rPr>
-          <w:rFonts w:ascii="Times New Roman" w:hAnsi="Times New Roman" w:cs="Times New Roman"/>
-        </w:rPr>
-        <w:t>This function creates new object, spectrogram, independent of the snippet codewise.</w:t>
+        <w:t>‘</w:t>
+      </w:r>
+      <w:proofErr w:type="spellStart"/>
+      <w:r>
+        <w:rPr>
+          <w:rFonts w:ascii="Times New Roman" w:hAnsi="Times New Roman" w:cs="Times New Roman"/>
+        </w:rPr>
+        <w:t>fft</w:t>
+      </w:r>
+      <w:proofErr w:type="spellEnd"/>
+      <w:r>
+        <w:rPr>
+          <w:rFonts w:ascii="Times New Roman" w:hAnsi="Times New Roman" w:cs="Times New Roman"/>
+        </w:rPr>
+        <w:t xml:space="preserve">’, for the regular fast </w:t>
+      </w:r>
+      <w:proofErr w:type="spellStart"/>
+      <w:r>
+        <w:rPr>
+          <w:rFonts w:ascii="Times New Roman" w:hAnsi="Times New Roman" w:cs="Times New Roman"/>
+        </w:rPr>
+        <w:t>fourier</w:t>
+      </w:r>
+      <w:proofErr w:type="spellEnd"/>
+      <w:r>
+        <w:rPr>
+          <w:rFonts w:ascii="Times New Roman" w:hAnsi="Times New Roman" w:cs="Times New Roman"/>
+        </w:rPr>
+        <w:t>; or ‘</w:t>
+      </w:r>
+      <w:proofErr w:type="spellStart"/>
+      <w:r>
+        <w:rPr>
+          <w:rFonts w:ascii="Times New Roman" w:hAnsi="Times New Roman" w:cs="Times New Roman"/>
+        </w:rPr>
+        <w:t>hilbert</w:t>
+      </w:r>
+      <w:proofErr w:type="spellEnd"/>
+      <w:r>
+        <w:rPr>
+          <w:rFonts w:ascii="Times New Roman" w:hAnsi="Times New Roman" w:cs="Times New Roman"/>
+        </w:rPr>
+        <w:t xml:space="preserve">’ for the Hilbert transform. I have read that, for this task, </w:t>
+      </w:r>
+      <w:proofErr w:type="spellStart"/>
+      <w:proofErr w:type="gramStart"/>
+      <w:r>
+        <w:rPr>
+          <w:rFonts w:ascii="Times New Roman" w:hAnsi="Times New Roman" w:cs="Times New Roman"/>
+        </w:rPr>
+        <w:t>mel</w:t>
+      </w:r>
+      <w:proofErr w:type="spellEnd"/>
+      <w:proofErr w:type="gramEnd"/>
+      <w:r>
+        <w:rPr>
+          <w:rFonts w:ascii="Times New Roman" w:hAnsi="Times New Roman" w:cs="Times New Roman"/>
+        </w:rPr>
+        <w:t xml:space="preserve"> is the one to go, but you can experiment. </w:t>
+      </w:r>
+      <w:r>
+        <w:rPr>
+          <w:rFonts w:ascii="Times New Roman" w:hAnsi="Times New Roman" w:cs="Times New Roman"/>
+        </w:rPr>
+        <w:t xml:space="preserve">This function creates new object, spectrogram, </w:t>
+      </w:r>
+      <w:proofErr w:type="gramStart"/>
+      <w:r>
+        <w:rPr>
+          <w:rFonts w:ascii="Times New Roman" w:hAnsi="Times New Roman" w:cs="Times New Roman"/>
+        </w:rPr>
+        <w:t>independent</w:t>
+      </w:r>
+      <w:proofErr w:type="gramEnd"/>
+      <w:r>
+        <w:rPr>
+          <w:rFonts w:ascii="Times New Roman" w:hAnsi="Times New Roman" w:cs="Times New Roman"/>
+        </w:rPr>
+        <w:t xml:space="preserve"> of the snippet </w:t>
+      </w:r>
+      <w:proofErr w:type="spellStart"/>
+      <w:r>
+        <w:rPr>
+          <w:rFonts w:ascii="Times New Roman" w:hAnsi="Times New Roman" w:cs="Times New Roman"/>
+        </w:rPr>
+        <w:t>codewise</w:t>
+      </w:r>
+      <w:proofErr w:type="spellEnd"/>
+      <w:r>
+        <w:rPr>
+          <w:rFonts w:ascii="Times New Roman" w:hAnsi="Times New Roman" w:cs="Times New Roman"/>
+        </w:rPr>
+        <w:t>.</w:t>
       </w:r>
       <w:r>
         <w:rPr>
@@ -645,7 +1373,71 @@
     </w:p>
     <w:p>
       <w:pPr>
-        <w:pStyle w:val="Ttulo2"/>
+        <w:rPr>
+          <w:rFonts w:ascii="Times New Roman" w:hAnsi="Times New Roman" w:cs="Times New Roman"/>
+        </w:rPr>
+      </w:pPr>
+      <w:proofErr w:type="gramStart"/>
+      <w:r>
+        <w:rPr>
+          <w:rFonts w:ascii="Times New Roman" w:hAnsi="Times New Roman" w:cs="Times New Roman"/>
+        </w:rPr>
+        <w:t>5.-</w:t>
+      </w:r>
+      <w:proofErr w:type="gramEnd"/>
+      <w:r>
+        <w:rPr>
+          <w:rFonts w:ascii="Times New Roman" w:hAnsi="Times New Roman" w:cs="Times New Roman"/>
+        </w:rPr>
+        <w:t xml:space="preserve"> normalize the snippet with </w:t>
+      </w:r>
+      <w:proofErr w:type="spellStart"/>
+      <w:r>
+        <w:rPr>
+          <w:rFonts w:ascii="Times New Roman" w:hAnsi="Times New Roman" w:cs="Times New Roman"/>
+          <w:b/>
+        </w:rPr>
+        <w:t>snippet.normalize</w:t>
+      </w:r>
+      <w:proofErr w:type="spellEnd"/>
+      <w:r>
+        <w:rPr>
+          <w:rFonts w:ascii="Times New Roman" w:hAnsi="Times New Roman" w:cs="Times New Roman"/>
+          <w:b/>
+        </w:rPr>
+        <w:t>()</w:t>
+      </w:r>
+      <w:r>
+        <w:rPr>
+          <w:rFonts w:ascii="Times New Roman" w:hAnsi="Times New Roman" w:cs="Times New Roman"/>
+          <w:b/>
+        </w:rPr>
+        <w:t xml:space="preserve"> </w:t>
+      </w:r>
+      <w:r>
+        <w:rPr>
+          <w:rFonts w:ascii="Times New Roman" w:hAnsi="Times New Roman" w:cs="Times New Roman"/>
+        </w:rPr>
+        <w:t xml:space="preserve">this will do a peak normalization following Sara’s instructions. We have discussed some caveats of these approach, so we will see if it gets any use. I have to implement a prevention for double normalization as well, that’s in </w:t>
+      </w:r>
+      <w:proofErr w:type="gramStart"/>
+      <w:r>
+        <w:rPr>
+          <w:rFonts w:ascii="Times New Roman" w:hAnsi="Times New Roman" w:cs="Times New Roman"/>
+        </w:rPr>
+        <w:t>the to</w:t>
+      </w:r>
+      <w:proofErr w:type="gramEnd"/>
+      <w:r>
+        <w:rPr>
+          <w:rFonts w:ascii="Times New Roman" w:hAnsi="Times New Roman" w:cs="Times New Roman"/>
+        </w:rPr>
+        <w:t xml:space="preserve"> do pile.</w:t>
+      </w:r>
+    </w:p>
+    <w:p>
+      <w:pPr>
+        <w:pStyle w:val="Heading2"/>
       </w:pPr>
       <w:r>
         <w:t>Spectrograms</w:t>
@@ -678,11 +1470,19 @@
           <w:rFonts w:ascii="Times New Roman" w:hAnsi="Times New Roman" w:cs="Times New Roman"/>
         </w:rPr>
       </w:pPr>
-      <w:r>
-        <w:rPr>
-          <w:rFonts w:ascii="Times New Roman" w:hAnsi="Times New Roman" w:cs="Times New Roman"/>
-        </w:rPr>
-        <w:t xml:space="preserve">1.- you can visualize it with </w:t>
+      <w:proofErr w:type="gramStart"/>
+      <w:r>
+        <w:rPr>
+          <w:rFonts w:ascii="Times New Roman" w:hAnsi="Times New Roman" w:cs="Times New Roman"/>
+        </w:rPr>
+        <w:t>1.-</w:t>
+      </w:r>
+      <w:proofErr w:type="gramEnd"/>
+      <w:r>
+        <w:rPr>
+          <w:rFonts w:ascii="Times New Roman" w:hAnsi="Times New Roman" w:cs="Times New Roman"/>
+        </w:rPr>
+        <w:t xml:space="preserve"> you can visualize it with </w:t>
       </w:r>
       <w:r>
         <w:rPr>
@@ -703,26 +1503,90 @@
     </w:p>
     <w:p>
       <w:pPr>
-        <w:rPr>
-          <w:rFonts w:ascii="Times New Roman" w:hAnsi="Times New Roman" w:cs="Times New Roman"/>
-        </w:rPr>
-      </w:pPr>
-      <w:r>
-        <w:rPr>
-          <w:rFonts w:ascii="Times New Roman" w:hAnsi="Times New Roman" w:cs="Times New Roman"/>
-        </w:rPr>
-        <w:t xml:space="preserve">2.- you can save it with </w:t>
-      </w:r>
-      <w:r>
-        <w:rPr>
-          <w:rFonts w:ascii="Times New Roman" w:hAnsi="Times New Roman" w:cs="Times New Roman"/>
-          <w:b/>
-          <w:bCs/>
-          <w:i/>
-          <w:iCs/>
-        </w:rPr>
-        <w:t>spectrogram_1.save(name, dir, with_labels</w:t>
-      </w:r>
+        <w:spacing w:after="0"/>
+        <w:rPr>
+          <w:rFonts w:ascii="Times New Roman" w:hAnsi="Times New Roman" w:cs="Times New Roman"/>
+        </w:rPr>
+      </w:pPr>
+      <w:proofErr w:type="gramStart"/>
+      <w:r>
+        <w:rPr>
+          <w:rFonts w:ascii="Times New Roman" w:hAnsi="Times New Roman" w:cs="Times New Roman"/>
+        </w:rPr>
+        <w:lastRenderedPageBreak/>
+        <w:t>2.-</w:t>
+      </w:r>
+      <w:proofErr w:type="gramEnd"/>
+      <w:r>
+        <w:rPr>
+          <w:rFonts w:ascii="Times New Roman" w:hAnsi="Times New Roman" w:cs="Times New Roman"/>
+        </w:rPr>
+        <w:t xml:space="preserve"> you can save it with </w:t>
+      </w:r>
+      <w:r>
+        <w:rPr>
+          <w:rFonts w:ascii="Times New Roman" w:hAnsi="Times New Roman" w:cs="Times New Roman"/>
+          <w:b/>
+          <w:bCs/>
+          <w:i/>
+          <w:iCs/>
+        </w:rPr>
+        <w:t>spectrogram_1.save</w:t>
+      </w:r>
+      <w:r>
+        <w:rPr>
+          <w:rFonts w:ascii="Times New Roman" w:hAnsi="Times New Roman" w:cs="Times New Roman"/>
+          <w:b/>
+          <w:bCs/>
+          <w:i/>
+          <w:iCs/>
+        </w:rPr>
+        <w:t>_img</w:t>
+      </w:r>
+      <w:r>
+        <w:rPr>
+          <w:rFonts w:ascii="Times New Roman" w:hAnsi="Times New Roman" w:cs="Times New Roman"/>
+          <w:b/>
+          <w:bCs/>
+          <w:i/>
+          <w:iCs/>
+        </w:rPr>
+        <w:t xml:space="preserve">(name, </w:t>
+      </w:r>
+      <w:proofErr w:type="spellStart"/>
+      <w:r>
+        <w:rPr>
+          <w:rFonts w:ascii="Times New Roman" w:hAnsi="Times New Roman" w:cs="Times New Roman"/>
+          <w:b/>
+          <w:bCs/>
+          <w:i/>
+          <w:iCs/>
+        </w:rPr>
+        <w:t>dir</w:t>
+      </w:r>
+      <w:proofErr w:type="spellEnd"/>
+      <w:r>
+        <w:rPr>
+          <w:rFonts w:ascii="Times New Roman" w:hAnsi="Times New Roman" w:cs="Times New Roman"/>
+          <w:b/>
+          <w:bCs/>
+          <w:i/>
+          <w:iCs/>
+        </w:rPr>
+        <w:t xml:space="preserve">, </w:t>
+      </w:r>
+      <w:proofErr w:type="spellStart"/>
+      <w:r>
+        <w:rPr>
+          <w:rFonts w:ascii="Times New Roman" w:hAnsi="Times New Roman" w:cs="Times New Roman"/>
+          <w:b/>
+          <w:bCs/>
+          <w:i/>
+          <w:iCs/>
+        </w:rPr>
+        <w:t>with_labels</w:t>
+      </w:r>
+      <w:proofErr w:type="spellEnd"/>
       <w:r>
         <w:rPr>
           <w:rFonts w:ascii="Times New Roman" w:hAnsi="Times New Roman" w:cs="Times New Roman"/>
@@ -747,231 +1611,750 @@
         <w:rPr>
           <w:rFonts w:ascii="Times New Roman" w:hAnsi="Times New Roman" w:cs="Times New Roman"/>
         </w:rPr>
-        <w:t xml:space="preserve">. I suggest you follow the same naming conventions explained for snippets. The spectrogram will automatically receive time stamps and other flags from the snippet they come from. The with_labels kwarg </w:t>
+        <w:t xml:space="preserve">. I suggest you follow the same naming conventions explained for snippets. The spectrogram will automatically receive time stamps and other flags from the snippet they come from. The </w:t>
+      </w:r>
+      <w:proofErr w:type="spellStart"/>
+      <w:r>
+        <w:rPr>
+          <w:rFonts w:ascii="Times New Roman" w:hAnsi="Times New Roman" w:cs="Times New Roman"/>
+        </w:rPr>
+        <w:t>with_labels</w:t>
+      </w:r>
+      <w:proofErr w:type="spellEnd"/>
+      <w:r>
+        <w:rPr>
+          <w:rFonts w:ascii="Times New Roman" w:hAnsi="Times New Roman" w:cs="Times New Roman"/>
+        </w:rPr>
+        <w:t xml:space="preserve"> </w:t>
+      </w:r>
+      <w:proofErr w:type="spellStart"/>
+      <w:r>
+        <w:rPr>
+          <w:rFonts w:ascii="Times New Roman" w:hAnsi="Times New Roman" w:cs="Times New Roman"/>
+        </w:rPr>
+        <w:t>kwarg</w:t>
+      </w:r>
+      <w:proofErr w:type="spellEnd"/>
+      <w:r>
+        <w:rPr>
+          <w:rFonts w:ascii="Times New Roman" w:hAnsi="Times New Roman" w:cs="Times New Roman"/>
+        </w:rPr>
+        <w:t xml:space="preserve"> will default to false (you don’t have write it unless you want it True). This means that the spectrogram will be saved without axis colour codes or other things. That is the way you want them to be in your AI models, but for presentations or papers, you can turn it true and it will give you something more human readable.</w:t>
+      </w:r>
+    </w:p>
+    <w:p>
+      <w:pPr>
+        <w:spacing w:after="0"/>
+        <w:rPr>
+          <w:rFonts w:ascii="Times New Roman" w:hAnsi="Times New Roman" w:cs="Times New Roman"/>
+        </w:rPr>
+      </w:pPr>
+      <w:proofErr w:type="gramStart"/>
+      <w:r>
+        <w:rPr>
+          <w:rFonts w:ascii="Times New Roman" w:hAnsi="Times New Roman" w:cs="Times New Roman"/>
+        </w:rPr>
+        <w:t>3.-</w:t>
+      </w:r>
+      <w:proofErr w:type="gramEnd"/>
+      <w:r>
+        <w:rPr>
+          <w:rFonts w:ascii="Times New Roman" w:hAnsi="Times New Roman" w:cs="Times New Roman"/>
+        </w:rPr>
+        <w:t xml:space="preserve"> you can now save a table with the spectrogram data too with </w:t>
+      </w:r>
+      <w:proofErr w:type="spellStart"/>
+      <w:r>
+        <w:rPr>
+          <w:rFonts w:ascii="Times New Roman" w:hAnsi="Times New Roman" w:cs="Times New Roman"/>
+          <w:b/>
+        </w:rPr>
+        <w:t>spectrogram.s</w:t>
+      </w:r>
+      <w:r>
+        <w:rPr>
+          <w:rFonts w:ascii="Times New Roman" w:hAnsi="Times New Roman" w:cs="Times New Roman"/>
+          <w:b/>
+          <w:i/>
+        </w:rPr>
+        <w:t>ave</w:t>
+      </w:r>
+      <w:r>
+        <w:rPr>
+          <w:rFonts w:ascii="Times New Roman" w:hAnsi="Times New Roman" w:cs="Times New Roman"/>
+          <w:b/>
+          <w:i/>
+        </w:rPr>
+        <w:t>_table</w:t>
+      </w:r>
+      <w:proofErr w:type="spellEnd"/>
+      <w:r>
+        <w:rPr>
+          <w:rFonts w:ascii="Times New Roman" w:hAnsi="Times New Roman" w:cs="Times New Roman"/>
+          <w:b/>
+          <w:i/>
+        </w:rPr>
+        <w:t>(</w:t>
+      </w:r>
+      <w:proofErr w:type="spellStart"/>
+      <w:r>
+        <w:rPr>
+          <w:rFonts w:ascii="Times New Roman" w:hAnsi="Times New Roman" w:cs="Times New Roman"/>
+          <w:b/>
+          <w:i/>
+        </w:rPr>
+        <w:t>source_name</w:t>
+      </w:r>
+      <w:proofErr w:type="spellEnd"/>
+      <w:r>
+        <w:rPr>
+          <w:rFonts w:ascii="Times New Roman" w:hAnsi="Times New Roman" w:cs="Times New Roman"/>
+          <w:b/>
+          <w:i/>
+        </w:rPr>
+        <w:t xml:space="preserve">, </w:t>
+      </w:r>
+      <w:proofErr w:type="spellStart"/>
+      <w:r>
+        <w:rPr>
+          <w:rFonts w:ascii="Times New Roman" w:hAnsi="Times New Roman" w:cs="Times New Roman"/>
+          <w:b/>
+          <w:i/>
+        </w:rPr>
+        <w:t>output_dir</w:t>
+      </w:r>
+      <w:proofErr w:type="spellEnd"/>
+      <w:r>
+        <w:rPr>
+          <w:rFonts w:ascii="Times New Roman" w:hAnsi="Times New Roman" w:cs="Times New Roman"/>
+          <w:b/>
+          <w:i/>
+        </w:rPr>
+        <w:t>)</w:t>
+      </w:r>
+      <w:r>
+        <w:rPr>
+          <w:rFonts w:ascii="Times New Roman" w:hAnsi="Times New Roman" w:cs="Times New Roman"/>
+        </w:rPr>
+        <w:t xml:space="preserve"> I suggest using the same naming convention, although this, for the moment at least, can’t be loaded, so it is not so critical.</w:t>
+      </w:r>
+    </w:p>
+    <w:p>
+      <w:pPr>
+        <w:rPr>
+          <w:rFonts w:ascii="Times New Roman" w:hAnsi="Times New Roman" w:cs="Times New Roman"/>
+        </w:rPr>
+      </w:pPr>
+      <w:proofErr w:type="gramStart"/>
+      <w:r>
+        <w:rPr>
+          <w:rFonts w:ascii="Times New Roman" w:hAnsi="Times New Roman" w:cs="Times New Roman"/>
+        </w:rPr>
+        <w:t>4.-</w:t>
+      </w:r>
+      <w:proofErr w:type="gramEnd"/>
+      <w:r>
+        <w:rPr>
+          <w:rFonts w:ascii="Times New Roman" w:hAnsi="Times New Roman" w:cs="Times New Roman"/>
+        </w:rPr>
+        <w:t xml:space="preserve"> get average power and peak power densities with </w:t>
+      </w:r>
+      <w:proofErr w:type="spellStart"/>
+      <w:r>
+        <w:rPr>
+          <w:rFonts w:ascii="Times New Roman" w:hAnsi="Times New Roman" w:cs="Times New Roman"/>
+          <w:b/>
+        </w:rPr>
+        <w:t>spectrogram.compute_power_metrics</w:t>
+      </w:r>
+      <w:proofErr w:type="spellEnd"/>
+      <w:r>
+        <w:rPr>
+          <w:rFonts w:ascii="Times New Roman" w:hAnsi="Times New Roman" w:cs="Times New Roman"/>
+          <w:b/>
+        </w:rPr>
+        <w:t>()</w:t>
+      </w:r>
+      <w:r>
+        <w:rPr>
+          <w:rFonts w:ascii="Times New Roman" w:hAnsi="Times New Roman" w:cs="Times New Roman"/>
+          <w:b/>
+        </w:rPr>
+        <w:t xml:space="preserve">. </w:t>
+      </w:r>
+      <w:r>
+        <w:rPr>
+          <w:rFonts w:ascii="Times New Roman" w:hAnsi="Times New Roman" w:cs="Times New Roman"/>
+        </w:rPr>
+        <w:t xml:space="preserve">This will return APD and PPD and return them on that order. Units currently are </w:t>
+      </w:r>
+      <w:proofErr w:type="spellStart"/>
+      <w:r>
+        <w:rPr>
+          <w:rFonts w:ascii="Times New Roman" w:hAnsi="Times New Roman" w:cs="Times New Roman"/>
+        </w:rPr>
+        <w:t>dB.</w:t>
+      </w:r>
+      <w:proofErr w:type="spellEnd"/>
+    </w:p>
+    <w:p>
+      <w:pPr>
+        <w:rPr>
+          <w:rFonts w:ascii="Times New Roman" w:hAnsi="Times New Roman" w:cs="Times New Roman"/>
+        </w:rPr>
+      </w:pPr>
+      <w:r>
+        <w:rPr>
+          <w:rFonts w:ascii="Times New Roman" w:hAnsi="Times New Roman" w:cs="Times New Roman"/>
+        </w:rPr>
+        <w:t xml:space="preserve">With these functions, you should be able to cut, your own </w:t>
+      </w:r>
+      <w:proofErr w:type="spellStart"/>
+      <w:r>
+        <w:rPr>
+          <w:rFonts w:ascii="Times New Roman" w:hAnsi="Times New Roman" w:cs="Times New Roman"/>
+        </w:rPr>
+        <w:t>stridulations</w:t>
+      </w:r>
+      <w:proofErr w:type="spellEnd"/>
+      <w:r>
+        <w:rPr>
+          <w:rFonts w:ascii="Times New Roman" w:hAnsi="Times New Roman" w:cs="Times New Roman"/>
+        </w:rPr>
+        <w:t xml:space="preserve">, just remember the time frame is important. You must make a decision at the beginning, how long will snippets be for the model? Then stick to that length to preserve proportions. Then, it is technically possible to just do this by hand and create all the data by yourself. But later on I will explain how to automatically batch-process big files. However this part of the tutorial is relevant for you to understand how your pipeline works and what is happening on the backstage. Also, to sometimes manually cut one particular </w:t>
+      </w:r>
+      <w:proofErr w:type="spellStart"/>
+      <w:r>
+        <w:rPr>
+          <w:rFonts w:ascii="Times New Roman" w:hAnsi="Times New Roman" w:cs="Times New Roman"/>
+        </w:rPr>
+        <w:t>stridulation</w:t>
+      </w:r>
+      <w:proofErr w:type="spellEnd"/>
+      <w:r>
+        <w:rPr>
+          <w:rFonts w:ascii="Times New Roman" w:hAnsi="Times New Roman" w:cs="Times New Roman"/>
+        </w:rPr>
+        <w:t xml:space="preserve"> or make some more augmentations.</w:t>
+      </w:r>
+    </w:p>
+    <w:p>
+      <w:pPr>
+        <w:spacing w:after="0"/>
+        <w:rPr>
+          <w:rFonts w:ascii="Times New Roman" w:hAnsi="Times New Roman" w:cs="Times New Roman"/>
+        </w:rPr>
+      </w:pPr>
+      <w:r>
+        <w:rPr>
+          <w:rFonts w:ascii="Times New Roman" w:hAnsi="Times New Roman" w:cs="Times New Roman"/>
+        </w:rPr>
+        <w:t>Finally, if you are working on already saved snippets, I have added a loading function for them so you don’t have to be cutting the same snippet once and again.</w:t>
+      </w:r>
+    </w:p>
+    <w:p>
+      <w:pPr>
+        <w:spacing w:after="0"/>
+        <w:rPr>
+          <w:rFonts w:ascii="Times New Roman" w:hAnsi="Times New Roman" w:cs="Times New Roman"/>
+        </w:rPr>
+      </w:pPr>
+      <w:r>
+        <w:rPr>
+          <w:rFonts w:ascii="Times New Roman" w:hAnsi="Times New Roman" w:cs="Times New Roman"/>
+          <w:b/>
+          <w:bCs/>
+          <w:i/>
+          <w:iCs/>
+        </w:rPr>
+        <w:t xml:space="preserve">Snippet = </w:t>
+      </w:r>
+      <w:proofErr w:type="spellStart"/>
+      <w:r>
+        <w:rPr>
+          <w:rFonts w:ascii="Times New Roman" w:hAnsi="Times New Roman" w:cs="Times New Roman"/>
+          <w:b/>
+          <w:bCs/>
+          <w:i/>
+          <w:iCs/>
+        </w:rPr>
+        <w:t>st.</w:t>
+      </w:r>
+      <w:r>
+        <w:rPr>
+          <w:rFonts w:ascii="Times New Roman" w:hAnsi="Times New Roman" w:cs="Times New Roman"/>
+          <w:b/>
+          <w:bCs/>
+          <w:i/>
+          <w:iCs/>
+        </w:rPr>
+        <w:t>load_snippet</w:t>
+      </w:r>
+      <w:proofErr w:type="spellEnd"/>
+      <w:r>
+        <w:rPr>
+          <w:rFonts w:ascii="Times New Roman" w:hAnsi="Times New Roman" w:cs="Times New Roman"/>
+          <w:b/>
+          <w:bCs/>
+          <w:i/>
+          <w:iCs/>
+        </w:rPr>
+        <w:t>(</w:t>
+      </w:r>
+      <w:proofErr w:type="spellStart"/>
+      <w:r>
+        <w:rPr>
+          <w:rFonts w:ascii="Times New Roman" w:hAnsi="Times New Roman" w:cs="Times New Roman"/>
+          <w:b/>
+          <w:bCs/>
+          <w:i/>
+          <w:iCs/>
+        </w:rPr>
+        <w:t>file_path</w:t>
+      </w:r>
+      <w:proofErr w:type="spellEnd"/>
+      <w:r>
+        <w:rPr>
+          <w:rFonts w:ascii="Times New Roman" w:hAnsi="Times New Roman" w:cs="Times New Roman"/>
+          <w:b/>
+          <w:bCs/>
+          <w:i/>
+          <w:iCs/>
+        </w:rPr>
+        <w:t>)</w:t>
+      </w:r>
+      <w:r>
+        <w:rPr>
+          <w:rFonts w:ascii="Times New Roman" w:hAnsi="Times New Roman" w:cs="Times New Roman"/>
+        </w:rPr>
+        <w:t xml:space="preserve"> will load the audio snippet file as a snippet already, and will catch from the name the length and other attributes, so you can resume your work on a snippet without loading the file and cutting it again.</w:t>
+      </w:r>
+    </w:p>
+    <w:p>
+      <w:pPr>
+        <w:rPr>
+          <w:rFonts w:ascii="Times New Roman" w:hAnsi="Times New Roman" w:cs="Times New Roman"/>
+          <w:b/>
+          <w:bCs/>
+        </w:rPr>
+      </w:pPr>
+    </w:p>
+    <w:p>
+      <w:pPr>
+        <w:pStyle w:val="Heading1"/>
+      </w:pPr>
+      <w:r>
+        <w:t>Batch processing files</w:t>
+      </w:r>
+    </w:p>
+    <w:p>
+      <w:pPr>
+        <w:rPr>
+          <w:rFonts w:ascii="Times New Roman" w:hAnsi="Times New Roman" w:cs="Times New Roman"/>
+        </w:rPr>
+      </w:pPr>
+      <w:r>
+        <w:rPr>
+          <w:rFonts w:ascii="Times New Roman" w:hAnsi="Times New Roman" w:cs="Times New Roman"/>
+        </w:rPr>
+        <w:t>When you work on big data files, it would be too time consuming to do all of the above manually. So I have given you some functions that will, using the above methodology, process long files and create the adequate folder structures so everything keeps paired. Bear in mind these functions create big amounts of files and quickly go into the GB size folders, you may want to keep it civilized and not have enormous amounts of these on your hard drive. In the pipeline script you will find an easy to reuse code for doing these, although some of the logic of that code will over time become part of the package, for now that is your best way to do all of this. But generally speaking, you have two functions.</w:t>
+      </w:r>
+    </w:p>
+    <w:p>
+      <w:pPr>
+        <w:rPr>
+          <w:rFonts w:ascii="Times New Roman" w:hAnsi="Times New Roman" w:cs="Times New Roman"/>
+        </w:rPr>
+      </w:pPr>
+      <w:proofErr w:type="spellStart"/>
+      <w:r>
+        <w:rPr>
+          <w:rFonts w:ascii="Times New Roman" w:hAnsi="Times New Roman" w:cs="Times New Roman"/>
+          <w:b/>
+          <w:bCs/>
+          <w:i/>
+          <w:iCs/>
+        </w:rPr>
+        <w:t>st.</w:t>
+      </w:r>
+      <w:r>
+        <w:rPr>
+          <w:rFonts w:ascii="Times New Roman" w:hAnsi="Times New Roman" w:cs="Times New Roman"/>
+          <w:b/>
+          <w:bCs/>
+          <w:i/>
+          <w:iCs/>
+        </w:rPr>
+        <w:t>process_audio_</w:t>
+      </w:r>
+      <w:proofErr w:type="gramStart"/>
+      <w:r>
+        <w:rPr>
+          <w:rFonts w:ascii="Times New Roman" w:hAnsi="Times New Roman" w:cs="Times New Roman"/>
+          <w:b/>
+          <w:bCs/>
+          <w:i/>
+          <w:iCs/>
+        </w:rPr>
+        <w:t>file</w:t>
+      </w:r>
+      <w:proofErr w:type="spellEnd"/>
+      <w:r>
+        <w:rPr>
+          <w:rFonts w:ascii="Times New Roman" w:hAnsi="Times New Roman" w:cs="Times New Roman"/>
+          <w:b/>
+          <w:bCs/>
+          <w:i/>
+          <w:iCs/>
+        </w:rPr>
+        <w:t>(</w:t>
+      </w:r>
+      <w:proofErr w:type="spellStart"/>
+      <w:proofErr w:type="gramEnd"/>
+      <w:r>
+        <w:rPr>
+          <w:rFonts w:ascii="Times New Roman" w:hAnsi="Times New Roman" w:cs="Times New Roman"/>
+          <w:b/>
+          <w:bCs/>
+          <w:i/>
+          <w:iCs/>
+        </w:rPr>
+        <w:t>audio_path</w:t>
+      </w:r>
+      <w:proofErr w:type="spellEnd"/>
+      <w:r>
+        <w:rPr>
+          <w:rFonts w:ascii="Times New Roman" w:hAnsi="Times New Roman" w:cs="Times New Roman"/>
+          <w:b/>
+          <w:bCs/>
+          <w:i/>
+          <w:iCs/>
+        </w:rPr>
+        <w:t xml:space="preserve">, </w:t>
+      </w:r>
+      <w:proofErr w:type="spellStart"/>
+      <w:r>
+        <w:rPr>
+          <w:rFonts w:ascii="Times New Roman" w:hAnsi="Times New Roman" w:cs="Times New Roman"/>
+          <w:b/>
+          <w:bCs/>
+          <w:i/>
+          <w:iCs/>
+        </w:rPr>
+        <w:t>snippet_duration</w:t>
+      </w:r>
+      <w:proofErr w:type="spellEnd"/>
+      <w:r>
+        <w:rPr>
+          <w:rFonts w:ascii="Times New Roman" w:hAnsi="Times New Roman" w:cs="Times New Roman"/>
+          <w:b/>
+          <w:bCs/>
+          <w:i/>
+          <w:iCs/>
+        </w:rPr>
+        <w:t xml:space="preserve">=2, </w:t>
+      </w:r>
+      <w:proofErr w:type="spellStart"/>
+      <w:r>
+        <w:rPr>
+          <w:rFonts w:ascii="Times New Roman" w:hAnsi="Times New Roman" w:cs="Times New Roman"/>
+          <w:b/>
+          <w:bCs/>
+          <w:i/>
+          <w:iCs/>
+        </w:rPr>
+        <w:t>output_folder</w:t>
+      </w:r>
+      <w:proofErr w:type="spellEnd"/>
+      <w:r>
+        <w:rPr>
+          <w:rFonts w:ascii="Times New Roman" w:hAnsi="Times New Roman" w:cs="Times New Roman"/>
+          <w:b/>
+          <w:bCs/>
+          <w:i/>
+          <w:iCs/>
+        </w:rPr>
+        <w:t>=None)</w:t>
+      </w:r>
+      <w:r>
+        <w:rPr>
+          <w:rFonts w:ascii="Times New Roman" w:hAnsi="Times New Roman" w:cs="Times New Roman"/>
+        </w:rPr>
+        <w:t xml:space="preserve"> here you type the path to your audio file, and the </w:t>
+      </w:r>
+      <w:proofErr w:type="spellStart"/>
+      <w:r>
+        <w:rPr>
+          <w:rFonts w:ascii="Times New Roman" w:hAnsi="Times New Roman" w:cs="Times New Roman"/>
+        </w:rPr>
+        <w:t>kwargs</w:t>
+      </w:r>
+      <w:proofErr w:type="spellEnd"/>
+      <w:r>
+        <w:rPr>
+          <w:rFonts w:ascii="Times New Roman" w:hAnsi="Times New Roman" w:cs="Times New Roman"/>
+        </w:rPr>
+        <w:t xml:space="preserve"> if you need them. As you see, </w:t>
+      </w:r>
+      <w:proofErr w:type="spellStart"/>
+      <w:r>
+        <w:rPr>
+          <w:rFonts w:ascii="Times New Roman" w:hAnsi="Times New Roman" w:cs="Times New Roman"/>
+        </w:rPr>
+        <w:t>snippet_duration</w:t>
+      </w:r>
+      <w:proofErr w:type="spellEnd"/>
+      <w:r>
+        <w:rPr>
+          <w:rFonts w:ascii="Times New Roman" w:hAnsi="Times New Roman" w:cs="Times New Roman"/>
+        </w:rPr>
+        <w:t xml:space="preserve"> defaults to 2 seconds, and </w:t>
+      </w:r>
+      <w:proofErr w:type="spellStart"/>
+      <w:r>
+        <w:rPr>
+          <w:rFonts w:ascii="Times New Roman" w:hAnsi="Times New Roman" w:cs="Times New Roman"/>
+        </w:rPr>
+        <w:t>output_folder</w:t>
+      </w:r>
+      <w:proofErr w:type="spellEnd"/>
+      <w:r>
+        <w:rPr>
+          <w:rFonts w:ascii="Times New Roman" w:hAnsi="Times New Roman" w:cs="Times New Roman"/>
+        </w:rPr>
+        <w:t xml:space="preserve"> to none, which should create a folder with the name of the sound file and store things there. That folder will be filled in with 2 subfolders, one with the snippets, and one with the spectrograms.</w:t>
+      </w:r>
+    </w:p>
+    <w:p>
+      <w:pPr>
+        <w:rPr>
+          <w:rFonts w:ascii="Times New Roman" w:hAnsi="Times New Roman" w:cs="Times New Roman"/>
+        </w:rPr>
+      </w:pPr>
+      <w:proofErr w:type="spellStart"/>
+      <w:r>
+        <w:rPr>
+          <w:rFonts w:ascii="Times New Roman" w:hAnsi="Times New Roman" w:cs="Times New Roman"/>
+          <w:b/>
+          <w:bCs/>
+          <w:i/>
+          <w:iCs/>
+        </w:rPr>
+        <w:t>st.annotate_</w:t>
+      </w:r>
+      <w:proofErr w:type="gramStart"/>
+      <w:r>
+        <w:rPr>
+          <w:rFonts w:ascii="Times New Roman" w:hAnsi="Times New Roman" w:cs="Times New Roman"/>
+          <w:b/>
+          <w:bCs/>
+          <w:i/>
+          <w:iCs/>
+        </w:rPr>
+        <w:t>data</w:t>
+      </w:r>
+      <w:proofErr w:type="spellEnd"/>
+      <w:r>
+        <w:rPr>
+          <w:rFonts w:ascii="Times New Roman" w:hAnsi="Times New Roman" w:cs="Times New Roman"/>
+          <w:b/>
+          <w:bCs/>
+          <w:i/>
+          <w:iCs/>
+        </w:rPr>
+        <w:t>(</w:t>
+      </w:r>
+      <w:proofErr w:type="gramEnd"/>
+      <w:r>
+        <w:rPr>
+          <w:rFonts w:ascii="Times New Roman" w:hAnsi="Times New Roman" w:cs="Times New Roman"/>
+          <w:b/>
+          <w:bCs/>
+          <w:i/>
+          <w:iCs/>
+        </w:rPr>
+        <w:t xml:space="preserve">notes, </w:t>
+      </w:r>
+      <w:proofErr w:type="spellStart"/>
+      <w:r>
+        <w:rPr>
+          <w:rFonts w:ascii="Times New Roman" w:hAnsi="Times New Roman" w:cs="Times New Roman"/>
+          <w:b/>
+          <w:bCs/>
+          <w:i/>
+          <w:iCs/>
+        </w:rPr>
+        <w:t>snip</w:t>
+      </w:r>
+      <w:r>
+        <w:rPr>
+          <w:rFonts w:ascii="Times New Roman" w:hAnsi="Times New Roman" w:cs="Times New Roman"/>
+          <w:b/>
+          <w:bCs/>
+          <w:i/>
+          <w:iCs/>
+        </w:rPr>
+        <w:t>_path</w:t>
+      </w:r>
+      <w:proofErr w:type="spellEnd"/>
+      <w:r>
+        <w:rPr>
+          <w:rFonts w:ascii="Times New Roman" w:hAnsi="Times New Roman" w:cs="Times New Roman"/>
+          <w:b/>
+          <w:bCs/>
+          <w:i/>
+          <w:iCs/>
+        </w:rPr>
+        <w:t xml:space="preserve">, </w:t>
+      </w:r>
+      <w:proofErr w:type="spellStart"/>
+      <w:r>
+        <w:rPr>
+          <w:rFonts w:ascii="Times New Roman" w:hAnsi="Times New Roman" w:cs="Times New Roman"/>
+          <w:b/>
+          <w:bCs/>
+          <w:i/>
+          <w:iCs/>
+        </w:rPr>
+        <w:t>spec</w:t>
+      </w:r>
+      <w:r>
+        <w:rPr>
+          <w:rFonts w:ascii="Times New Roman" w:hAnsi="Times New Roman" w:cs="Times New Roman"/>
+          <w:b/>
+          <w:bCs/>
+          <w:i/>
+          <w:iCs/>
+        </w:rPr>
+        <w:t>_path</w:t>
+      </w:r>
+      <w:proofErr w:type="spellEnd"/>
+      <w:r>
+        <w:rPr>
+          <w:rFonts w:ascii="Times New Roman" w:hAnsi="Times New Roman" w:cs="Times New Roman"/>
+          <w:b/>
+          <w:bCs/>
+          <w:i/>
+          <w:iCs/>
+        </w:rPr>
+        <w:t xml:space="preserve">, </w:t>
+      </w:r>
+      <w:proofErr w:type="spellStart"/>
+      <w:r>
+        <w:rPr>
+          <w:rFonts w:ascii="Times New Roman" w:hAnsi="Times New Roman" w:cs="Times New Roman"/>
+          <w:b/>
+          <w:bCs/>
+          <w:i/>
+          <w:iCs/>
+        </w:rPr>
+        <w:t>snippet_duration</w:t>
+      </w:r>
+      <w:proofErr w:type="spellEnd"/>
+      <w:r>
+        <w:rPr>
+          <w:rFonts w:ascii="Times New Roman" w:hAnsi="Times New Roman" w:cs="Times New Roman"/>
+          <w:b/>
+          <w:bCs/>
+          <w:i/>
+          <w:iCs/>
+        </w:rPr>
+        <w:t xml:space="preserve">=2.0, </w:t>
+      </w:r>
+      <w:proofErr w:type="spellStart"/>
+      <w:r>
+        <w:rPr>
+          <w:rFonts w:ascii="Times New Roman" w:hAnsi="Times New Roman" w:cs="Times New Roman"/>
+          <w:b/>
+          <w:bCs/>
+          <w:i/>
+          <w:iCs/>
+        </w:rPr>
+        <w:t>csv_delim</w:t>
+      </w:r>
+      <w:proofErr w:type="spellEnd"/>
+      <w:r>
+        <w:rPr>
+          <w:rFonts w:ascii="Times New Roman" w:hAnsi="Times New Roman" w:cs="Times New Roman"/>
+          <w:b/>
+          <w:bCs/>
+          <w:i/>
+          <w:iCs/>
+        </w:rPr>
+        <w:t>='\t')</w:t>
+      </w:r>
+      <w:r>
+        <w:rPr>
+          <w:rFonts w:ascii="Times New Roman" w:hAnsi="Times New Roman" w:cs="Times New Roman"/>
+          <w:b/>
+          <w:bCs/>
+          <w:i/>
+          <w:iCs/>
+        </w:rPr>
+        <w:t xml:space="preserve"> </w:t>
+      </w:r>
+      <w:r>
+        <w:rPr>
+          <w:rFonts w:ascii="Times New Roman" w:hAnsi="Times New Roman" w:cs="Times New Roman"/>
+        </w:rPr>
+        <w:t>once</w:t>
+      </w:r>
+      <w:r>
+        <w:rPr>
+          <w:rFonts w:ascii="Times New Roman" w:hAnsi="Times New Roman" w:cs="Times New Roman"/>
+        </w:rPr>
+        <w:t xml:space="preserve"> you have processed a file, in the case you are working on training data, you can use your annotations to automatically distribute your files for training. These part of the logic is incomplete for the moment and will change soon, for now it is best for you to run it from the pipeline script. You will use the notes, which is a .txt file saved as tab delimited, path to the snippets and spectrograms that belong with that set of notes, and the snippet duration that you used (defaulted to 2, so use as </w:t>
+      </w:r>
+      <w:proofErr w:type="spellStart"/>
+      <w:r>
+        <w:rPr>
+          <w:rFonts w:ascii="Times New Roman" w:hAnsi="Times New Roman" w:cs="Times New Roman"/>
+        </w:rPr>
+        <w:t>kwarg</w:t>
+      </w:r>
+      <w:proofErr w:type="spellEnd"/>
+      <w:r>
+        <w:rPr>
+          <w:rFonts w:ascii="Times New Roman" w:hAnsi="Times New Roman" w:cs="Times New Roman"/>
+        </w:rPr>
+        <w:t xml:space="preserve">). The last </w:t>
+      </w:r>
+      <w:proofErr w:type="spellStart"/>
+      <w:r>
+        <w:rPr>
+          <w:rFonts w:ascii="Times New Roman" w:hAnsi="Times New Roman" w:cs="Times New Roman"/>
+        </w:rPr>
+        <w:t>kwarg</w:t>
+      </w:r>
+      <w:proofErr w:type="spellEnd"/>
+      <w:r>
+        <w:rPr>
+          <w:rFonts w:ascii="Times New Roman" w:hAnsi="Times New Roman" w:cs="Times New Roman"/>
+        </w:rPr>
+        <w:t xml:space="preserve"> is not necessary if you saved your txt as tab delimited, but can be used in case you used comma. This function makes a split into positives </w:t>
+      </w:r>
+      <w:proofErr w:type="spellStart"/>
+      <w:proofErr w:type="gramStart"/>
+      <w:r>
+        <w:rPr>
+          <w:rFonts w:ascii="Times New Roman" w:hAnsi="Times New Roman" w:cs="Times New Roman"/>
+        </w:rPr>
+        <w:t>an</w:t>
+      </w:r>
+      <w:proofErr w:type="spellEnd"/>
+      <w:proofErr w:type="gramEnd"/>
+      <w:r>
+        <w:rPr>
+          <w:rFonts w:ascii="Times New Roman" w:hAnsi="Times New Roman" w:cs="Times New Roman"/>
+        </w:rPr>
+        <w:t xml:space="preserve"> </w:t>
       </w:r>
       <w:r>
         <w:rPr>
           <w:rFonts w:ascii="Times New Roman" w:hAnsi="Times New Roman" w:cs="Times New Roman"/>
         </w:rPr>
         <w:lastRenderedPageBreak/>
-        <w:t>will default to false (you don’t have write it unless you want it True). This means that the spectrogram will be saved without axis colour codes or other things. That is the way you want them to be in your AI models, but for presentations or papers, you can turn it true and it will give you something more human readable.</w:t>
-      </w:r>
-    </w:p>
-    <w:p>
-      <w:pPr>
-        <w:rPr>
-          <w:rFonts w:ascii="Times New Roman" w:hAnsi="Times New Roman" w:cs="Times New Roman"/>
-        </w:rPr>
-      </w:pPr>
-      <w:r>
-        <w:rPr>
-          <w:rFonts w:ascii="Times New Roman" w:hAnsi="Times New Roman" w:cs="Times New Roman"/>
-        </w:rPr>
-        <w:t>With these functions, you should be able to cut, your own stridulations, just remember the time frame is important. You must make a decision at the beginning, how long will snippets be for the model? Then stick to that length to preserve proportions. Then, it is technically possible to just do this by hand and create all the data by yourself. But later on I will explain how to automatically batch-process big files. However this part of the tutorial is relevant for you to understand how your pipeline works and what is happening on the backstage. Also, to sometimes manually cut one particular stridulation or make some more augmentations.</w:t>
-      </w:r>
-    </w:p>
-    <w:p>
-      <w:pPr>
-        <w:spacing w:after="0"/>
-        <w:rPr>
-          <w:rFonts w:ascii="Times New Roman" w:hAnsi="Times New Roman" w:cs="Times New Roman"/>
-        </w:rPr>
-      </w:pPr>
-      <w:r>
-        <w:rPr>
-          <w:rFonts w:ascii="Times New Roman" w:hAnsi="Times New Roman" w:cs="Times New Roman"/>
-        </w:rPr>
-        <w:t>Finally, if you are working on already saved snippets, I have added a loading function for them so you don’t have to be cutting the same snippet once and again.</w:t>
-      </w:r>
-    </w:p>
-    <w:p>
-      <w:pPr>
-        <w:spacing w:after="0"/>
-        <w:rPr>
-          <w:rFonts w:ascii="Times New Roman" w:hAnsi="Times New Roman" w:cs="Times New Roman"/>
-        </w:rPr>
-      </w:pPr>
-      <w:r>
-        <w:rPr>
-          <w:rFonts w:ascii="Times New Roman" w:hAnsi="Times New Roman" w:cs="Times New Roman"/>
-          <w:b/>
-          <w:bCs/>
-          <w:i/>
-          <w:iCs/>
-        </w:rPr>
-        <w:t xml:space="preserve">Snippet = </w:t>
-      </w:r>
-      <w:r>
-        <w:rPr>
-          <w:rFonts w:ascii="Times New Roman" w:hAnsi="Times New Roman" w:cs="Times New Roman"/>
-          <w:b/>
-          <w:bCs/>
-          <w:i/>
-          <w:iCs/>
-        </w:rPr>
-        <w:t>st.</w:t>
-      </w:r>
-      <w:r>
-        <w:rPr>
-          <w:rFonts w:ascii="Times New Roman" w:hAnsi="Times New Roman" w:cs="Times New Roman"/>
-          <w:b/>
-          <w:bCs/>
-          <w:i/>
-          <w:iCs/>
-        </w:rPr>
-        <w:t>load_snippet(file_path)</w:t>
-      </w:r>
-      <w:r>
-        <w:rPr>
-          <w:rFonts w:ascii="Times New Roman" w:hAnsi="Times New Roman" w:cs="Times New Roman"/>
-        </w:rPr>
-        <w:t xml:space="preserve"> will load the audio snippet file as a snippet already, and will catch from the name the length and other attributes, so you can resume your work on a snippet without loading the file and cutting it again.</w:t>
-      </w:r>
-    </w:p>
-    <w:p>
-      <w:pPr>
-        <w:rPr>
-          <w:rFonts w:ascii="Times New Roman" w:hAnsi="Times New Roman" w:cs="Times New Roman"/>
-          <w:b/>
-          <w:bCs/>
-        </w:rPr>
-      </w:pPr>
-    </w:p>
-    <w:p>
-      <w:pPr>
-        <w:pStyle w:val="Ttulo1"/>
-      </w:pPr>
-      <w:r>
-        <w:t>Batch processing files</w:t>
-      </w:r>
-    </w:p>
-    <w:p>
-      <w:pPr>
-        <w:rPr>
-          <w:rFonts w:ascii="Times New Roman" w:hAnsi="Times New Roman" w:cs="Times New Roman"/>
-        </w:rPr>
-      </w:pPr>
-      <w:r>
-        <w:rPr>
-          <w:rFonts w:ascii="Times New Roman" w:hAnsi="Times New Roman" w:cs="Times New Roman"/>
-        </w:rPr>
-        <w:t>When you work on big data files, it would be too time consuming to do all of the above manually. So I have given you some functions that will, using the above methodology, process long files and create the adequate folder structures so everything keeps paired. Bear in mind these functions create big amounts of files and quickly go into the GB size folders, you may want to keep it civilized and not have enormous amounts of these on your hard drive. In the pipeline script you will find an easy to reuse code for doing these, although some of the logic of that code will over time become part of the package, for now that is your best way to do all of this. But generally speaking, you have two functions.</w:t>
-      </w:r>
-    </w:p>
-    <w:p>
-      <w:pPr>
-        <w:rPr>
-          <w:rFonts w:ascii="Times New Roman" w:hAnsi="Times New Roman" w:cs="Times New Roman"/>
-        </w:rPr>
-      </w:pPr>
-      <w:r>
-        <w:rPr>
-          <w:rFonts w:ascii="Times New Roman" w:hAnsi="Times New Roman" w:cs="Times New Roman"/>
-          <w:b/>
-          <w:bCs/>
-          <w:i/>
-          <w:iCs/>
-        </w:rPr>
-        <w:t>st.</w:t>
-      </w:r>
-      <w:r>
-        <w:rPr>
-          <w:rFonts w:ascii="Times New Roman" w:hAnsi="Times New Roman" w:cs="Times New Roman"/>
-          <w:b/>
-          <w:bCs/>
-          <w:i/>
-          <w:iCs/>
-        </w:rPr>
-        <w:t>process_audio_file(audio_path, snippet_duration=2, output_folder=None)</w:t>
-      </w:r>
-      <w:r>
-        <w:rPr>
-          <w:rFonts w:ascii="Times New Roman" w:hAnsi="Times New Roman" w:cs="Times New Roman"/>
-        </w:rPr>
-        <w:t xml:space="preserve"> here you type the path to your audio file, and the kwargs if you need them. As you see, snippet_duration defaults to 2 seconds, and output_folder to none, which should create a folder with the name of the sound file and store things there. That folder will be filled in with 2 subfolders, one with the snippets, and one with the spectrograms.</w:t>
-      </w:r>
-    </w:p>
-    <w:p>
-      <w:pPr>
-        <w:rPr>
-          <w:rFonts w:ascii="Times New Roman" w:hAnsi="Times New Roman" w:cs="Times New Roman"/>
-          <w:b/>
-          <w:bCs/>
-          <w:i/>
-          <w:iCs/>
-        </w:rPr>
-      </w:pPr>
-      <w:r>
-        <w:rPr>
-          <w:rFonts w:ascii="Times New Roman" w:hAnsi="Times New Roman" w:cs="Times New Roman"/>
-          <w:b/>
-          <w:bCs/>
-          <w:i/>
-          <w:iCs/>
-        </w:rPr>
-        <w:t>st.annotate_data(notes, snip</w:t>
-      </w:r>
-      <w:r>
-        <w:rPr>
-          <w:rFonts w:ascii="Times New Roman" w:hAnsi="Times New Roman" w:cs="Times New Roman"/>
-          <w:b/>
-          <w:bCs/>
-          <w:i/>
-          <w:iCs/>
-        </w:rPr>
-        <w:t>_path</w:t>
-      </w:r>
-      <w:r>
-        <w:rPr>
-          <w:rFonts w:ascii="Times New Roman" w:hAnsi="Times New Roman" w:cs="Times New Roman"/>
-          <w:b/>
-          <w:bCs/>
-          <w:i/>
-          <w:iCs/>
-        </w:rPr>
-        <w:t>, spec</w:t>
-      </w:r>
-      <w:r>
-        <w:rPr>
-          <w:rFonts w:ascii="Times New Roman" w:hAnsi="Times New Roman" w:cs="Times New Roman"/>
-          <w:b/>
-          <w:bCs/>
-          <w:i/>
-          <w:iCs/>
-        </w:rPr>
-        <w:t>_path</w:t>
-      </w:r>
-      <w:r>
-        <w:rPr>
-          <w:rFonts w:ascii="Times New Roman" w:hAnsi="Times New Roman" w:cs="Times New Roman"/>
-          <w:b/>
-          <w:bCs/>
-          <w:i/>
-          <w:iCs/>
-        </w:rPr>
-        <w:t>, snippet_duration=2.0, csv_delim='\t')</w:t>
-      </w:r>
-      <w:r>
-        <w:rPr>
-          <w:rFonts w:ascii="Times New Roman" w:hAnsi="Times New Roman" w:cs="Times New Roman"/>
-          <w:b/>
-          <w:bCs/>
-          <w:i/>
-          <w:iCs/>
-        </w:rPr>
-        <w:t xml:space="preserve"> </w:t>
-      </w:r>
-      <w:r>
-        <w:rPr>
-          <w:rFonts w:ascii="Times New Roman" w:hAnsi="Times New Roman" w:cs="Times New Roman"/>
-        </w:rPr>
-        <w:t>once</w:t>
-      </w:r>
-      <w:r>
-        <w:rPr>
-          <w:rFonts w:ascii="Times New Roman" w:hAnsi="Times New Roman" w:cs="Times New Roman"/>
-        </w:rPr>
-        <w:t xml:space="preserve"> you have processed a file, in the case you are working on training data, you can use your annotations to automatically distribute your files for training. These part of the logic is incomplete for the moment and will change soon, for now it is best for you to run it from the pipeline script. You will use the notes, which is a .txt file saved as tab delimited, path to the snippets and spectrograms that belong with that set of notes, and the snippet duration that you used (defaulted to 2, so use as kwarg). The last kwarg is not necessary if you saved your txt as tab delimited, but can be used in case you used comma. This function makes a split into positives an negatives, from there you could use data augmentation, or go into training.</w:t>
+        <w:t>negatives, from there you could use data augmentation, or go into training.</w:t>
       </w:r>
       <w:r>
         <w:rPr>
@@ -990,6 +2373,135 @@
       <w:pPr>
         <w:rPr>
           <w:rFonts w:ascii="Times New Roman" w:hAnsi="Times New Roman" w:cs="Times New Roman"/>
+          <w:bCs/>
+          <w:iCs/>
+        </w:rPr>
+      </w:pPr>
+      <w:proofErr w:type="spellStart"/>
+      <w:r>
+        <w:rPr>
+          <w:rFonts w:ascii="Times New Roman" w:hAnsi="Times New Roman" w:cs="Times New Roman"/>
+          <w:b/>
+          <w:bCs/>
+          <w:i/>
+          <w:iCs/>
+        </w:rPr>
+        <w:t>st.n</w:t>
+      </w:r>
+      <w:r>
+        <w:rPr>
+          <w:rFonts w:ascii="Times New Roman" w:hAnsi="Times New Roman" w:cs="Times New Roman"/>
+          <w:b/>
+          <w:bCs/>
+          <w:i/>
+          <w:iCs/>
+        </w:rPr>
+        <w:t>ormalize_</w:t>
+      </w:r>
+      <w:proofErr w:type="gramStart"/>
+      <w:r>
+        <w:rPr>
+          <w:rFonts w:ascii="Times New Roman" w:hAnsi="Times New Roman" w:cs="Times New Roman"/>
+          <w:b/>
+          <w:bCs/>
+          <w:i/>
+          <w:iCs/>
+        </w:rPr>
+        <w:t>global</w:t>
+      </w:r>
+      <w:proofErr w:type="spellEnd"/>
+      <w:r>
+        <w:rPr>
+          <w:rFonts w:ascii="Times New Roman" w:hAnsi="Times New Roman" w:cs="Times New Roman"/>
+          <w:b/>
+          <w:bCs/>
+          <w:i/>
+          <w:iCs/>
+        </w:rPr>
+        <w:t>(</w:t>
+      </w:r>
+      <w:proofErr w:type="spellStart"/>
+      <w:proofErr w:type="gramEnd"/>
+      <w:r>
+        <w:rPr>
+          <w:rFonts w:ascii="Times New Roman" w:hAnsi="Times New Roman" w:cs="Times New Roman"/>
+          <w:b/>
+          <w:bCs/>
+          <w:i/>
+          <w:iCs/>
+        </w:rPr>
+        <w:t>input_dir</w:t>
+      </w:r>
+      <w:proofErr w:type="spellEnd"/>
+      <w:r>
+        <w:rPr>
+          <w:rFonts w:ascii="Times New Roman" w:hAnsi="Times New Roman" w:cs="Times New Roman"/>
+          <w:b/>
+          <w:bCs/>
+          <w:i/>
+          <w:iCs/>
+        </w:rPr>
+        <w:t xml:space="preserve">, </w:t>
+      </w:r>
+      <w:proofErr w:type="spellStart"/>
+      <w:r>
+        <w:rPr>
+          <w:rFonts w:ascii="Times New Roman" w:hAnsi="Times New Roman" w:cs="Times New Roman"/>
+          <w:b/>
+          <w:bCs/>
+          <w:i/>
+          <w:iCs/>
+        </w:rPr>
+        <w:t>output_dir</w:t>
+      </w:r>
+      <w:proofErr w:type="spellEnd"/>
+      <w:r>
+        <w:rPr>
+          <w:rFonts w:ascii="Times New Roman" w:hAnsi="Times New Roman" w:cs="Times New Roman"/>
+          <w:b/>
+          <w:bCs/>
+          <w:i/>
+          <w:iCs/>
+        </w:rPr>
+        <w:t xml:space="preserve">, </w:t>
+      </w:r>
+      <w:proofErr w:type="spellStart"/>
+      <w:r>
+        <w:rPr>
+          <w:rFonts w:ascii="Times New Roman" w:hAnsi="Times New Roman" w:cs="Times New Roman"/>
+          <w:b/>
+          <w:bCs/>
+          <w:i/>
+          <w:iCs/>
+        </w:rPr>
+        <w:t>target_max</w:t>
+      </w:r>
+      <w:proofErr w:type="spellEnd"/>
+      <w:r>
+        <w:rPr>
+          <w:rFonts w:ascii="Times New Roman" w:hAnsi="Times New Roman" w:cs="Times New Roman"/>
+          <w:b/>
+          <w:bCs/>
+          <w:i/>
+          <w:iCs/>
+        </w:rPr>
+        <w:t xml:space="preserve"> = 0.75):</w:t>
+      </w:r>
+      <w:r>
+        <w:rPr>
+          <w:rFonts w:ascii="Times New Roman" w:hAnsi="Times New Roman" w:cs="Times New Roman"/>
+          <w:bCs/>
+          <w:iCs/>
+        </w:rPr>
+        <w:t xml:space="preserve"> this allows for normalization of several files to one single peak. So, if you wanted to normalize a whole set of files to their overall maximum, you put them in a folder and run this. It should create a new folder with all files normalized. It might be useful to normalize wither by microphone or whole experiments. We will see what Sara thinks later.</w:t>
+      </w:r>
+      <w:bookmarkStart w:id="0" w:name="_GoBack"/>
+      <w:bookmarkEnd w:id="0"/>
+    </w:p>
+    <w:p>
+      <w:pPr>
+        <w:rPr>
+          <w:rFonts w:ascii="Times New Roman" w:hAnsi="Times New Roman" w:cs="Times New Roman"/>
           <w:b/>
           <w:bCs/>
           <w:i/>
@@ -1009,7 +2521,7 @@
     </w:p>
     <w:p>
       <w:pPr>
-        <w:pStyle w:val="Ttulo1"/>
+        <w:pStyle w:val="Heading1"/>
       </w:pPr>
       <w:r>
         <w:lastRenderedPageBreak/>
@@ -1056,16 +2568,73 @@
           <w:rFonts w:ascii="Times New Roman" w:hAnsi="Times New Roman" w:cs="Times New Roman"/>
         </w:rPr>
       </w:pPr>
-      <w:r>
-        <w:rPr>
-          <w:rFonts w:ascii="Times New Roman" w:hAnsi="Times New Roman" w:cs="Times New Roman"/>
-          <w:b/>
-          <w:bCs/>
-          <w:i/>
-          <w:iCs/>
-        </w:rPr>
-        <w:t>mod, hist = st.train_model(</w:t>
-      </w:r>
+      <w:proofErr w:type="gramStart"/>
+      <w:r>
+        <w:rPr>
+          <w:rFonts w:ascii="Times New Roman" w:hAnsi="Times New Roman" w:cs="Times New Roman"/>
+          <w:b/>
+          <w:bCs/>
+          <w:i/>
+          <w:iCs/>
+        </w:rPr>
+        <w:t>mod</w:t>
+      </w:r>
+      <w:proofErr w:type="gramEnd"/>
+      <w:r>
+        <w:rPr>
+          <w:rFonts w:ascii="Times New Roman" w:hAnsi="Times New Roman" w:cs="Times New Roman"/>
+          <w:b/>
+          <w:bCs/>
+          <w:i/>
+          <w:iCs/>
+        </w:rPr>
+        <w:t xml:space="preserve">, </w:t>
+      </w:r>
+      <w:proofErr w:type="spellStart"/>
+      <w:r>
+        <w:rPr>
+          <w:rFonts w:ascii="Times New Roman" w:hAnsi="Times New Roman" w:cs="Times New Roman"/>
+          <w:b/>
+          <w:bCs/>
+          <w:i/>
+          <w:iCs/>
+        </w:rPr>
+        <w:t>hist</w:t>
+      </w:r>
+      <w:proofErr w:type="spellEnd"/>
+      <w:r>
+        <w:rPr>
+          <w:rFonts w:ascii="Times New Roman" w:hAnsi="Times New Roman" w:cs="Times New Roman"/>
+          <w:b/>
+          <w:bCs/>
+          <w:i/>
+          <w:iCs/>
+        </w:rPr>
+        <w:t xml:space="preserve"> = </w:t>
+      </w:r>
+      <w:proofErr w:type="spellStart"/>
+      <w:r>
+        <w:rPr>
+          <w:rFonts w:ascii="Times New Roman" w:hAnsi="Times New Roman" w:cs="Times New Roman"/>
+          <w:b/>
+          <w:bCs/>
+          <w:i/>
+          <w:iCs/>
+        </w:rPr>
+        <w:t>st.train_model</w:t>
+      </w:r>
+      <w:proofErr w:type="spellEnd"/>
+      <w:r>
+        <w:rPr>
+          <w:rFonts w:ascii="Times New Roman" w:hAnsi="Times New Roman" w:cs="Times New Roman"/>
+          <w:b/>
+          <w:bCs/>
+          <w:i/>
+          <w:iCs/>
+        </w:rPr>
+        <w:t>(</w:t>
+      </w:r>
+      <w:proofErr w:type="spellStart"/>
       <w:r>
         <w:rPr>
           <w:rFonts w:ascii="Times New Roman" w:hAnsi="Times New Roman" w:cs="Times New Roman"/>
@@ -1076,21 +2645,124 @@
         </w:rPr>
         <w:t>path_to_training_dir</w:t>
       </w:r>
-      <w:r>
-        <w:rPr>
-          <w:rFonts w:ascii="Times New Roman" w:hAnsi="Times New Roman" w:cs="Times New Roman"/>
-          <w:b/>
-          <w:bCs/>
-          <w:i/>
-          <w:iCs/>
-        </w:rPr>
-        <w:t>, target_size=(128, 128), batch_size=32, epochs=5, learning_rate=0.001, class_weights = None)</w:t>
-      </w:r>
-      <w:r>
-        <w:rPr>
-          <w:rFonts w:ascii="Times New Roman" w:hAnsi="Times New Roman" w:cs="Times New Roman"/>
-        </w:rPr>
-        <w:t xml:space="preserve"> so, path to the folder that contains the positive and negative merged folders and kwargs. About these, well, </w:t>
+      <w:proofErr w:type="spellEnd"/>
+      <w:r>
+        <w:rPr>
+          <w:rFonts w:ascii="Times New Roman" w:hAnsi="Times New Roman" w:cs="Times New Roman"/>
+          <w:b/>
+          <w:bCs/>
+          <w:i/>
+          <w:iCs/>
+        </w:rPr>
+        <w:t xml:space="preserve">, </w:t>
+      </w:r>
+      <w:proofErr w:type="spellStart"/>
+      <w:r>
+        <w:rPr>
+          <w:rFonts w:ascii="Times New Roman" w:hAnsi="Times New Roman" w:cs="Times New Roman"/>
+          <w:b/>
+          <w:bCs/>
+          <w:i/>
+          <w:iCs/>
+        </w:rPr>
+        <w:t>target_size</w:t>
+      </w:r>
+      <w:proofErr w:type="spellEnd"/>
+      <w:r>
+        <w:rPr>
+          <w:rFonts w:ascii="Times New Roman" w:hAnsi="Times New Roman" w:cs="Times New Roman"/>
+          <w:b/>
+          <w:bCs/>
+          <w:i/>
+          <w:iCs/>
+        </w:rPr>
+        <w:t xml:space="preserve">=(128, 128), </w:t>
+      </w:r>
+      <w:proofErr w:type="spellStart"/>
+      <w:r>
+        <w:rPr>
+          <w:rFonts w:ascii="Times New Roman" w:hAnsi="Times New Roman" w:cs="Times New Roman"/>
+          <w:b/>
+          <w:bCs/>
+          <w:i/>
+          <w:iCs/>
+        </w:rPr>
+        <w:t>batch_size</w:t>
+      </w:r>
+      <w:proofErr w:type="spellEnd"/>
+      <w:r>
+        <w:rPr>
+          <w:rFonts w:ascii="Times New Roman" w:hAnsi="Times New Roman" w:cs="Times New Roman"/>
+          <w:b/>
+          <w:bCs/>
+          <w:i/>
+          <w:iCs/>
+        </w:rPr>
+        <w:t xml:space="preserve">=32, epochs=5, </w:t>
+      </w:r>
+      <w:proofErr w:type="spellStart"/>
+      <w:r>
+        <w:rPr>
+          <w:rFonts w:ascii="Times New Roman" w:hAnsi="Times New Roman" w:cs="Times New Roman"/>
+          <w:b/>
+          <w:bCs/>
+          <w:i/>
+          <w:iCs/>
+        </w:rPr>
+        <w:t>learning_rate</w:t>
+      </w:r>
+      <w:proofErr w:type="spellEnd"/>
+      <w:r>
+        <w:rPr>
+          <w:rFonts w:ascii="Times New Roman" w:hAnsi="Times New Roman" w:cs="Times New Roman"/>
+          <w:b/>
+          <w:bCs/>
+          <w:i/>
+          <w:iCs/>
+        </w:rPr>
+        <w:t xml:space="preserve">=0.001, </w:t>
+      </w:r>
+      <w:proofErr w:type="spellStart"/>
+      <w:r>
+        <w:rPr>
+          <w:rFonts w:ascii="Times New Roman" w:hAnsi="Times New Roman" w:cs="Times New Roman"/>
+          <w:b/>
+          <w:bCs/>
+          <w:i/>
+          <w:iCs/>
+        </w:rPr>
+        <w:t>class_weights</w:t>
+      </w:r>
+      <w:proofErr w:type="spellEnd"/>
+      <w:r>
+        <w:rPr>
+          <w:rFonts w:ascii="Times New Roman" w:hAnsi="Times New Roman" w:cs="Times New Roman"/>
+          <w:b/>
+          <w:bCs/>
+          <w:i/>
+          <w:iCs/>
+        </w:rPr>
+        <w:t xml:space="preserve"> = None)</w:t>
+      </w:r>
+      <w:r>
+        <w:rPr>
+          <w:rFonts w:ascii="Times New Roman" w:hAnsi="Times New Roman" w:cs="Times New Roman"/>
+        </w:rPr>
+        <w:t xml:space="preserve"> so, path to the folder that contains the positive and negative merged folders and </w:t>
+      </w:r>
+      <w:proofErr w:type="spellStart"/>
+      <w:r>
+        <w:rPr>
+          <w:rFonts w:ascii="Times New Roman" w:hAnsi="Times New Roman" w:cs="Times New Roman"/>
+        </w:rPr>
+        <w:t>kwargs</w:t>
+      </w:r>
+      <w:proofErr w:type="spellEnd"/>
+      <w:r>
+        <w:rPr>
+          <w:rFonts w:ascii="Times New Roman" w:hAnsi="Times New Roman" w:cs="Times New Roman"/>
+        </w:rPr>
+        <w:t xml:space="preserve">. About these, well, </w:t>
       </w:r>
       <w:r>
         <w:rPr>
@@ -1192,7 +2864,21 @@
         <w:rPr>
           <w:rFonts w:ascii="Times New Roman" w:hAnsi="Times New Roman" w:cs="Times New Roman"/>
         </w:rPr>
-        <w:t xml:space="preserve"> is the number of iterations, 5 is way too low, with the right number of images you should potentially get this to 15-20. </w:t>
+        <w:t xml:space="preserve"> is the number of iterations, 5 is way too low, </w:t>
+      </w:r>
+      <w:proofErr w:type="gramStart"/>
+      <w:r>
+        <w:rPr>
+          <w:rFonts w:ascii="Times New Roman" w:hAnsi="Times New Roman" w:cs="Times New Roman"/>
+        </w:rPr>
+        <w:t>with</w:t>
+      </w:r>
+      <w:proofErr w:type="gramEnd"/>
+      <w:r>
+        <w:rPr>
+          <w:rFonts w:ascii="Times New Roman" w:hAnsi="Times New Roman" w:cs="Times New Roman"/>
+        </w:rPr>
+        <w:t xml:space="preserve"> the right number of images you should potentially get this to 15-20. </w:t>
       </w:r>
     </w:p>
     <w:p>
@@ -1253,7 +2939,35 @@
         <w:rPr>
           <w:rFonts w:ascii="Times New Roman" w:hAnsi="Times New Roman" w:cs="Times New Roman"/>
         </w:rPr>
-        <w:t xml:space="preserve">calculated if you leave it at None, but I will change that as it seems to overfit a lot. What the weights do is balance cases where you have a lot of </w:t>
+        <w:t xml:space="preserve">calculated if you leave it at </w:t>
+      </w:r>
+      <w:proofErr w:type="gramStart"/>
+      <w:r>
+        <w:rPr>
+          <w:rFonts w:ascii="Times New Roman" w:hAnsi="Times New Roman" w:cs="Times New Roman"/>
+        </w:rPr>
+        <w:t>None</w:t>
+      </w:r>
+      <w:proofErr w:type="gramEnd"/>
+      <w:r>
+        <w:rPr>
+          <w:rFonts w:ascii="Times New Roman" w:hAnsi="Times New Roman" w:cs="Times New Roman"/>
+        </w:rPr>
+        <w:t xml:space="preserve">, but I will change that as it seems to </w:t>
+      </w:r>
+      <w:proofErr w:type="spellStart"/>
+      <w:r>
+        <w:rPr>
+          <w:rFonts w:ascii="Times New Roman" w:hAnsi="Times New Roman" w:cs="Times New Roman"/>
+        </w:rPr>
+        <w:t>overfit</w:t>
+      </w:r>
+      <w:proofErr w:type="spellEnd"/>
+      <w:r>
+        <w:rPr>
+          <w:rFonts w:ascii="Times New Roman" w:hAnsi="Times New Roman" w:cs="Times New Roman"/>
+        </w:rPr>
+        <w:t xml:space="preserve"> a lot. What the weights do is balance cases where you have a lot of </w:t>
       </w:r>
       <w:r>
         <w:rPr>
@@ -1265,7 +2979,21 @@
         <w:rPr>
           <w:rFonts w:ascii="Times New Roman" w:hAnsi="Times New Roman" w:cs="Times New Roman"/>
         </w:rPr>
-        <w:t xml:space="preserve"> to few </w:t>
+        <w:t xml:space="preserve"> </w:t>
+      </w:r>
+      <w:proofErr w:type="spellStart"/>
+      <w:r>
+        <w:rPr>
+          <w:rFonts w:ascii="Times New Roman" w:hAnsi="Times New Roman" w:cs="Times New Roman"/>
+        </w:rPr>
+        <w:t>to</w:t>
+      </w:r>
+      <w:proofErr w:type="spellEnd"/>
+      <w:r>
+        <w:rPr>
+          <w:rFonts w:ascii="Times New Roman" w:hAnsi="Times New Roman" w:cs="Times New Roman"/>
+        </w:rPr>
+        <w:t xml:space="preserve"> few </w:t>
       </w:r>
       <w:r>
         <w:rPr>
@@ -1303,7 +3031,25 @@
           <w:b/>
           <w:bCs/>
         </w:rPr>
-        <w:t>{0:1,1:50}</w:t>
+        <w:t>{0:1</w:t>
+      </w:r>
+      <w:proofErr w:type="gramStart"/>
+      <w:r>
+        <w:rPr>
+          <w:rFonts w:ascii="Times New Roman" w:hAnsi="Times New Roman" w:cs="Times New Roman"/>
+          <w:b/>
+          <w:bCs/>
+        </w:rPr>
+        <w:t>,1:50</w:t>
+      </w:r>
+      <w:proofErr w:type="gramEnd"/>
+      <w:r>
+        <w:rPr>
+          <w:rFonts w:ascii="Times New Roman" w:hAnsi="Times New Roman" w:cs="Times New Roman"/>
+          <w:b/>
+          <w:bCs/>
+        </w:rPr>
+        <w:t>}</w:t>
       </w:r>
       <w:r>
         <w:rPr>
@@ -1330,7 +3076,21 @@
         <w:rPr>
           <w:rFonts w:ascii="Times New Roman" w:hAnsi="Times New Roman" w:cs="Times New Roman"/>
         </w:rPr>
-        <w:t>With the above function, you receive both a model and a training history that are also saved to the same directory of your training data. You may look at the history plots (see example on the pipeline script) and test the model on real data (we’ll talk about that later). But first, let’s talk about the model architecture. This has basically endless ways of tweaking, and I am planning to add some more to the standard functionality of stridulant, but for now, I think you may want to know what is going on</w:t>
+        <w:t xml:space="preserve">With the above function, you receive both a model and a training history that are also saved to the same directory of your training data. You may look at the history plots (see example on the pipeline script) and test the model on real data (we’ll talk about that later). But first, let’s talk about the model architecture. This has basically endless ways of tweaking, and I am planning to add some more to the standard functionality of </w:t>
+      </w:r>
+      <w:proofErr w:type="spellStart"/>
+      <w:r>
+        <w:rPr>
+          <w:rFonts w:ascii="Times New Roman" w:hAnsi="Times New Roman" w:cs="Times New Roman"/>
+        </w:rPr>
+        <w:t>stridulant</w:t>
+      </w:r>
+      <w:proofErr w:type="spellEnd"/>
+      <w:r>
+        <w:rPr>
+          <w:rFonts w:ascii="Times New Roman" w:hAnsi="Times New Roman" w:cs="Times New Roman"/>
+        </w:rPr>
+        <w:t>, but for now, I think you may want to know what is going on</w:t>
       </w:r>
       <w:r>
         <w:rPr>
@@ -1383,7 +3143,29 @@
           <w:i/>
           <w:iCs/>
         </w:rPr>
-        <w:t xml:space="preserve">    model = Sequential([</w:t>
+        <w:t xml:space="preserve">    </w:t>
+      </w:r>
+      <w:proofErr w:type="gramStart"/>
+      <w:r>
+        <w:rPr>
+          <w:rFonts w:ascii="Times New Roman" w:hAnsi="Times New Roman" w:cs="Times New Roman"/>
+          <w:b/>
+          <w:bCs/>
+          <w:i/>
+          <w:iCs/>
+        </w:rPr>
+        <w:t>model</w:t>
+      </w:r>
+      <w:proofErr w:type="gramEnd"/>
+      <w:r>
+        <w:rPr>
+          <w:rFonts w:ascii="Times New Roman" w:hAnsi="Times New Roman" w:cs="Times New Roman"/>
+          <w:b/>
+          <w:bCs/>
+          <w:i/>
+          <w:iCs/>
+        </w:rPr>
+        <w:t xml:space="preserve"> = Sequential([</w:t>
       </w:r>
     </w:p>
     <w:p>
@@ -1405,7 +3187,73 @@
           <w:i/>
           <w:iCs/>
         </w:rPr>
-        <w:t xml:space="preserve">        Conv2D(32, (3, 3), activation='relu', input_shape=(128, 128, 3)),</w:t>
+        <w:t xml:space="preserve">        </w:t>
+      </w:r>
+      <w:proofErr w:type="gramStart"/>
+      <w:r>
+        <w:rPr>
+          <w:rFonts w:ascii="Times New Roman" w:hAnsi="Times New Roman" w:cs="Times New Roman"/>
+          <w:b/>
+          <w:bCs/>
+          <w:i/>
+          <w:iCs/>
+        </w:rPr>
+        <w:t>Conv2D(</w:t>
+      </w:r>
+      <w:proofErr w:type="gramEnd"/>
+      <w:r>
+        <w:rPr>
+          <w:rFonts w:ascii="Times New Roman" w:hAnsi="Times New Roman" w:cs="Times New Roman"/>
+          <w:b/>
+          <w:bCs/>
+          <w:i/>
+          <w:iCs/>
+        </w:rPr>
+        <w:t>32, (3, 3), activation='</w:t>
+      </w:r>
+      <w:proofErr w:type="spellStart"/>
+      <w:r>
+        <w:rPr>
+          <w:rFonts w:ascii="Times New Roman" w:hAnsi="Times New Roman" w:cs="Times New Roman"/>
+          <w:b/>
+          <w:bCs/>
+          <w:i/>
+          <w:iCs/>
+        </w:rPr>
+        <w:t>relu</w:t>
+      </w:r>
+      <w:proofErr w:type="spellEnd"/>
+      <w:r>
+        <w:rPr>
+          <w:rFonts w:ascii="Times New Roman" w:hAnsi="Times New Roman" w:cs="Times New Roman"/>
+          <w:b/>
+          <w:bCs/>
+          <w:i/>
+          <w:iCs/>
+        </w:rPr>
+        <w:t xml:space="preserve">', </w:t>
+      </w:r>
+      <w:proofErr w:type="spellStart"/>
+      <w:r>
+        <w:rPr>
+          <w:rFonts w:ascii="Times New Roman" w:hAnsi="Times New Roman" w:cs="Times New Roman"/>
+          <w:b/>
+          <w:bCs/>
+          <w:i/>
+          <w:iCs/>
+        </w:rPr>
+        <w:t>input_shape</w:t>
+      </w:r>
+      <w:proofErr w:type="spellEnd"/>
+      <w:r>
+        <w:rPr>
+          <w:rFonts w:ascii="Times New Roman" w:hAnsi="Times New Roman" w:cs="Times New Roman"/>
+          <w:b/>
+          <w:bCs/>
+          <w:i/>
+          <w:iCs/>
+        </w:rPr>
+        <w:t>=(128, 128, 3)),</w:t>
       </w:r>
     </w:p>
     <w:p>
@@ -1427,7 +3275,29 @@
           <w:i/>
           <w:iCs/>
         </w:rPr>
-        <w:t xml:space="preserve">        MaxPooling2D(2, 2),</w:t>
+        <w:t xml:space="preserve">        </w:t>
+      </w:r>
+      <w:proofErr w:type="gramStart"/>
+      <w:r>
+        <w:rPr>
+          <w:rFonts w:ascii="Times New Roman" w:hAnsi="Times New Roman" w:cs="Times New Roman"/>
+          <w:b/>
+          <w:bCs/>
+          <w:i/>
+          <w:iCs/>
+        </w:rPr>
+        <w:t>MaxPooling2D(</w:t>
+      </w:r>
+      <w:proofErr w:type="gramEnd"/>
+      <w:r>
+        <w:rPr>
+          <w:rFonts w:ascii="Times New Roman" w:hAnsi="Times New Roman" w:cs="Times New Roman"/>
+          <w:b/>
+          <w:bCs/>
+          <w:i/>
+          <w:iCs/>
+        </w:rPr>
+        <w:t>2, 2),</w:t>
       </w:r>
     </w:p>
     <w:p>
@@ -1449,7 +3319,51 @@
           <w:i/>
           <w:iCs/>
         </w:rPr>
-        <w:t xml:space="preserve">        Conv2D(64, (3, 3), activation='relu'),</w:t>
+        <w:t xml:space="preserve">        </w:t>
+      </w:r>
+      <w:proofErr w:type="gramStart"/>
+      <w:r>
+        <w:rPr>
+          <w:rFonts w:ascii="Times New Roman" w:hAnsi="Times New Roman" w:cs="Times New Roman"/>
+          <w:b/>
+          <w:bCs/>
+          <w:i/>
+          <w:iCs/>
+        </w:rPr>
+        <w:t>Conv2D(</w:t>
+      </w:r>
+      <w:proofErr w:type="gramEnd"/>
+      <w:r>
+        <w:rPr>
+          <w:rFonts w:ascii="Times New Roman" w:hAnsi="Times New Roman" w:cs="Times New Roman"/>
+          <w:b/>
+          <w:bCs/>
+          <w:i/>
+          <w:iCs/>
+        </w:rPr>
+        <w:t>64, (3, 3), activation='</w:t>
+      </w:r>
+      <w:proofErr w:type="spellStart"/>
+      <w:r>
+        <w:rPr>
+          <w:rFonts w:ascii="Times New Roman" w:hAnsi="Times New Roman" w:cs="Times New Roman"/>
+          <w:b/>
+          <w:bCs/>
+          <w:i/>
+          <w:iCs/>
+        </w:rPr>
+        <w:t>relu</w:t>
+      </w:r>
+      <w:proofErr w:type="spellEnd"/>
+      <w:r>
+        <w:rPr>
+          <w:rFonts w:ascii="Times New Roman" w:hAnsi="Times New Roman" w:cs="Times New Roman"/>
+          <w:b/>
+          <w:bCs/>
+          <w:i/>
+          <w:iCs/>
+        </w:rPr>
+        <w:t>'),</w:t>
       </w:r>
     </w:p>
     <w:p>
@@ -1471,7 +3385,29 @@
           <w:i/>
           <w:iCs/>
         </w:rPr>
-        <w:t xml:space="preserve">        MaxPooling2D(2, 2),</w:t>
+        <w:t xml:space="preserve">        </w:t>
+      </w:r>
+      <w:proofErr w:type="gramStart"/>
+      <w:r>
+        <w:rPr>
+          <w:rFonts w:ascii="Times New Roman" w:hAnsi="Times New Roman" w:cs="Times New Roman"/>
+          <w:b/>
+          <w:bCs/>
+          <w:i/>
+          <w:iCs/>
+        </w:rPr>
+        <w:t>MaxPooling2D(</w:t>
+      </w:r>
+      <w:proofErr w:type="gramEnd"/>
+      <w:r>
+        <w:rPr>
+          <w:rFonts w:ascii="Times New Roman" w:hAnsi="Times New Roman" w:cs="Times New Roman"/>
+          <w:b/>
+          <w:bCs/>
+          <w:i/>
+          <w:iCs/>
+        </w:rPr>
+        <w:t>2, 2),</w:t>
       </w:r>
     </w:p>
     <w:p>
@@ -1493,7 +3429,51 @@
           <w:i/>
           <w:iCs/>
         </w:rPr>
-        <w:t xml:space="preserve">        Conv2D(128, (3, 3), activation='relu'),</w:t>
+        <w:t xml:space="preserve">        </w:t>
+      </w:r>
+      <w:proofErr w:type="gramStart"/>
+      <w:r>
+        <w:rPr>
+          <w:rFonts w:ascii="Times New Roman" w:hAnsi="Times New Roman" w:cs="Times New Roman"/>
+          <w:b/>
+          <w:bCs/>
+          <w:i/>
+          <w:iCs/>
+        </w:rPr>
+        <w:t>Conv2D(</w:t>
+      </w:r>
+      <w:proofErr w:type="gramEnd"/>
+      <w:r>
+        <w:rPr>
+          <w:rFonts w:ascii="Times New Roman" w:hAnsi="Times New Roman" w:cs="Times New Roman"/>
+          <w:b/>
+          <w:bCs/>
+          <w:i/>
+          <w:iCs/>
+        </w:rPr>
+        <w:t>128, (3, 3), activation='</w:t>
+      </w:r>
+      <w:proofErr w:type="spellStart"/>
+      <w:r>
+        <w:rPr>
+          <w:rFonts w:ascii="Times New Roman" w:hAnsi="Times New Roman" w:cs="Times New Roman"/>
+          <w:b/>
+          <w:bCs/>
+          <w:i/>
+          <w:iCs/>
+        </w:rPr>
+        <w:t>relu</w:t>
+      </w:r>
+      <w:proofErr w:type="spellEnd"/>
+      <w:r>
+        <w:rPr>
+          <w:rFonts w:ascii="Times New Roman" w:hAnsi="Times New Roman" w:cs="Times New Roman"/>
+          <w:b/>
+          <w:bCs/>
+          <w:i/>
+          <w:iCs/>
+        </w:rPr>
+        <w:t>'),</w:t>
       </w:r>
     </w:p>
     <w:p>
@@ -1515,7 +3495,29 @@
           <w:i/>
           <w:iCs/>
         </w:rPr>
-        <w:t xml:space="preserve">        MaxPooling2D(2, 2),</w:t>
+        <w:t xml:space="preserve">        </w:t>
+      </w:r>
+      <w:proofErr w:type="gramStart"/>
+      <w:r>
+        <w:rPr>
+          <w:rFonts w:ascii="Times New Roman" w:hAnsi="Times New Roman" w:cs="Times New Roman"/>
+          <w:b/>
+          <w:bCs/>
+          <w:i/>
+          <w:iCs/>
+        </w:rPr>
+        <w:t>MaxPooling2D(</w:t>
+      </w:r>
+      <w:proofErr w:type="gramEnd"/>
+      <w:r>
+        <w:rPr>
+          <w:rFonts w:ascii="Times New Roman" w:hAnsi="Times New Roman" w:cs="Times New Roman"/>
+          <w:b/>
+          <w:bCs/>
+          <w:i/>
+          <w:iCs/>
+        </w:rPr>
+        <w:t>2, 2),</w:t>
       </w:r>
     </w:p>
     <w:p>
@@ -1537,7 +3539,29 @@
           <w:i/>
           <w:iCs/>
         </w:rPr>
-        <w:t xml:space="preserve">        Flatten(),</w:t>
+        <w:t xml:space="preserve">        </w:t>
+      </w:r>
+      <w:proofErr w:type="gramStart"/>
+      <w:r>
+        <w:rPr>
+          <w:rFonts w:ascii="Times New Roman" w:hAnsi="Times New Roman" w:cs="Times New Roman"/>
+          <w:b/>
+          <w:bCs/>
+          <w:i/>
+          <w:iCs/>
+        </w:rPr>
+        <w:t>Flatten(</w:t>
+      </w:r>
+      <w:proofErr w:type="gramEnd"/>
+      <w:r>
+        <w:rPr>
+          <w:rFonts w:ascii="Times New Roman" w:hAnsi="Times New Roman" w:cs="Times New Roman"/>
+          <w:b/>
+          <w:bCs/>
+          <w:i/>
+          <w:iCs/>
+        </w:rPr>
+        <w:t>),</w:t>
       </w:r>
     </w:p>
     <w:p>
@@ -1559,7 +3583,51 @@
           <w:i/>
           <w:iCs/>
         </w:rPr>
-        <w:t xml:space="preserve">        Dense(512, activation='relu'),</w:t>
+        <w:t xml:space="preserve">        </w:t>
+      </w:r>
+      <w:proofErr w:type="gramStart"/>
+      <w:r>
+        <w:rPr>
+          <w:rFonts w:ascii="Times New Roman" w:hAnsi="Times New Roman" w:cs="Times New Roman"/>
+          <w:b/>
+          <w:bCs/>
+          <w:i/>
+          <w:iCs/>
+        </w:rPr>
+        <w:t>Dense(</w:t>
+      </w:r>
+      <w:proofErr w:type="gramEnd"/>
+      <w:r>
+        <w:rPr>
+          <w:rFonts w:ascii="Times New Roman" w:hAnsi="Times New Roman" w:cs="Times New Roman"/>
+          <w:b/>
+          <w:bCs/>
+          <w:i/>
+          <w:iCs/>
+        </w:rPr>
+        <w:t>512, activation='</w:t>
+      </w:r>
+      <w:proofErr w:type="spellStart"/>
+      <w:r>
+        <w:rPr>
+          <w:rFonts w:ascii="Times New Roman" w:hAnsi="Times New Roman" w:cs="Times New Roman"/>
+          <w:b/>
+          <w:bCs/>
+          <w:i/>
+          <w:iCs/>
+        </w:rPr>
+        <w:t>relu</w:t>
+      </w:r>
+      <w:proofErr w:type="spellEnd"/>
+      <w:r>
+        <w:rPr>
+          <w:rFonts w:ascii="Times New Roman" w:hAnsi="Times New Roman" w:cs="Times New Roman"/>
+          <w:b/>
+          <w:bCs/>
+          <w:i/>
+          <w:iCs/>
+        </w:rPr>
+        <w:t>'),</w:t>
       </w:r>
     </w:p>
     <w:p>
@@ -1581,7 +3649,29 @@
           <w:i/>
           <w:iCs/>
         </w:rPr>
-        <w:t xml:space="preserve">        Dropout(0.5),</w:t>
+        <w:t xml:space="preserve">        </w:t>
+      </w:r>
+      <w:proofErr w:type="gramStart"/>
+      <w:r>
+        <w:rPr>
+          <w:rFonts w:ascii="Times New Roman" w:hAnsi="Times New Roman" w:cs="Times New Roman"/>
+          <w:b/>
+          <w:bCs/>
+          <w:i/>
+          <w:iCs/>
+        </w:rPr>
+        <w:t>Dropout(</w:t>
+      </w:r>
+      <w:proofErr w:type="gramEnd"/>
+      <w:r>
+        <w:rPr>
+          <w:rFonts w:ascii="Times New Roman" w:hAnsi="Times New Roman" w:cs="Times New Roman"/>
+          <w:b/>
+          <w:bCs/>
+          <w:i/>
+          <w:iCs/>
+        </w:rPr>
+        <w:t>0.5),</w:t>
       </w:r>
     </w:p>
     <w:p>
@@ -1603,7 +3693,29 @@
           <w:i/>
           <w:iCs/>
         </w:rPr>
-        <w:t xml:space="preserve">        Dense(1, activation='sigmoid')</w:t>
+        <w:t xml:space="preserve">        </w:t>
+      </w:r>
+      <w:proofErr w:type="gramStart"/>
+      <w:r>
+        <w:rPr>
+          <w:rFonts w:ascii="Times New Roman" w:hAnsi="Times New Roman" w:cs="Times New Roman"/>
+          <w:b/>
+          <w:bCs/>
+          <w:i/>
+          <w:iCs/>
+        </w:rPr>
+        <w:t>Dense(</w:t>
+      </w:r>
+      <w:proofErr w:type="gramEnd"/>
+      <w:r>
+        <w:rPr>
+          <w:rFonts w:ascii="Times New Roman" w:hAnsi="Times New Roman" w:cs="Times New Roman"/>
+          <w:b/>
+          <w:bCs/>
+          <w:i/>
+          <w:iCs/>
+        </w:rPr>
+        <w:t>1, activation='sigmoid')</w:t>
       </w:r>
     </w:p>
     <w:p>
@@ -1786,7 +3898,21 @@
         <w:rPr>
           <w:rFonts w:ascii="Times New Roman" w:hAnsi="Times New Roman" w:cs="Times New Roman"/>
         </w:rPr>
-        <w:t xml:space="preserve"> layers are the actual brain of the model, first one has many neurons to create a probabilistic output, the last dense layer has 1 neuron that gives a binary answer, positive or not.</w:t>
+        <w:t xml:space="preserve"> layers are the actual brain of the model, first one has many neurons to create a probabilistic output, </w:t>
+      </w:r>
+      <w:proofErr w:type="gramStart"/>
+      <w:r>
+        <w:rPr>
+          <w:rFonts w:ascii="Times New Roman" w:hAnsi="Times New Roman" w:cs="Times New Roman"/>
+        </w:rPr>
+        <w:t>the</w:t>
+      </w:r>
+      <w:proofErr w:type="gramEnd"/>
+      <w:r>
+        <w:rPr>
+          <w:rFonts w:ascii="Times New Roman" w:hAnsi="Times New Roman" w:cs="Times New Roman"/>
+        </w:rPr>
+        <w:t xml:space="preserve"> last dense layer has 1 neuron that gives a binary answer, positive or not.</w:t>
       </w:r>
     </w:p>
     <w:p>
@@ -1833,7 +3959,7 @@
     </w:p>
     <w:p>
       <w:pPr>
-        <w:pStyle w:val="Ttulo1"/>
+        <w:pStyle w:val="Heading1"/>
         <w:rPr>
           <w:rFonts w:cs="Times New Roman"/>
         </w:rPr>
@@ -1860,6 +3986,7 @@
         </w:rPr>
         <w:t xml:space="preserve">part you should have an operative model that is worth nothing if you don’t know how to use it. So let’s get to that. When I explained the batch processing of files, I said annotate files when is for training. But when not, you still have to process them. Go back to that section if you need to, you will need to use the </w:t>
       </w:r>
+      <w:proofErr w:type="spellStart"/>
       <w:r>
         <w:rPr>
           <w:rFonts w:ascii="Times New Roman" w:hAnsi="Times New Roman" w:cs="Times New Roman"/>
@@ -1868,6 +3995,7 @@
         </w:rPr>
         <w:t>process_audio_file</w:t>
       </w:r>
+      <w:proofErr w:type="spellEnd"/>
       <w:r>
         <w:rPr>
           <w:rFonts w:ascii="Times New Roman" w:hAnsi="Times New Roman" w:cs="Times New Roman"/>
@@ -1895,15 +4023,72 @@
           <w:rFonts w:ascii="Times New Roman" w:hAnsi="Times New Roman" w:cs="Times New Roman"/>
         </w:rPr>
       </w:pPr>
-      <w:r>
-        <w:rPr>
-          <w:rFonts w:ascii="Times New Roman" w:hAnsi="Times New Roman" w:cs="Times New Roman"/>
-          <w:b/>
-          <w:bCs/>
-          <w:i/>
-          <w:iCs/>
-        </w:rPr>
-        <w:t>st.classify_spectrograms(spec_path, mod</w:t>
+      <w:proofErr w:type="spellStart"/>
+      <w:r>
+        <w:rPr>
+          <w:rFonts w:ascii="Times New Roman" w:hAnsi="Times New Roman" w:cs="Times New Roman"/>
+          <w:b/>
+          <w:bCs/>
+          <w:i/>
+          <w:iCs/>
+        </w:rPr>
+        <w:t>st.classify_</w:t>
+      </w:r>
+      <w:proofErr w:type="gramStart"/>
+      <w:r>
+        <w:rPr>
+          <w:rFonts w:ascii="Times New Roman" w:hAnsi="Times New Roman" w:cs="Times New Roman"/>
+          <w:b/>
+          <w:bCs/>
+          <w:i/>
+          <w:iCs/>
+        </w:rPr>
+        <w:t>spectrograms</w:t>
+      </w:r>
+      <w:proofErr w:type="spellEnd"/>
+      <w:r>
+        <w:rPr>
+          <w:rFonts w:ascii="Times New Roman" w:hAnsi="Times New Roman" w:cs="Times New Roman"/>
+          <w:b/>
+          <w:bCs/>
+          <w:i/>
+          <w:iCs/>
+        </w:rPr>
+        <w:t>(</w:t>
+      </w:r>
+      <w:proofErr w:type="spellStart"/>
+      <w:proofErr w:type="gramEnd"/>
+      <w:r>
+        <w:rPr>
+          <w:rFonts w:ascii="Times New Roman" w:hAnsi="Times New Roman" w:cs="Times New Roman"/>
+          <w:b/>
+          <w:bCs/>
+          <w:i/>
+          <w:iCs/>
+        </w:rPr>
+        <w:t>spec_path</w:t>
+      </w:r>
+      <w:proofErr w:type="spellEnd"/>
+      <w:r>
+        <w:rPr>
+          <w:rFonts w:ascii="Times New Roman" w:hAnsi="Times New Roman" w:cs="Times New Roman"/>
+          <w:b/>
+          <w:bCs/>
+          <w:i/>
+          <w:iCs/>
+        </w:rPr>
+        <w:t xml:space="preserve">, </w:t>
+      </w:r>
+      <w:proofErr w:type="spellStart"/>
+      <w:r>
+        <w:rPr>
+          <w:rFonts w:ascii="Times New Roman" w:hAnsi="Times New Roman" w:cs="Times New Roman"/>
+          <w:b/>
+          <w:bCs/>
+          <w:i/>
+          <w:iCs/>
+        </w:rPr>
+        <w:t>mod</w:t>
       </w:r>
       <w:r>
         <w:rPr>
@@ -1915,6 +4100,7 @@
         </w:rPr>
         <w:t>_path</w:t>
       </w:r>
+      <w:proofErr w:type="spellEnd"/>
       <w:r>
         <w:rPr>
           <w:rFonts w:ascii="Times New Roman" w:hAnsi="Times New Roman" w:cs="Times New Roman"/>
@@ -1966,7 +4152,7 @@
     </w:p>
     <w:p>
       <w:pPr>
-        <w:pStyle w:val="Ttulo1"/>
+        <w:pStyle w:val="Heading1"/>
       </w:pPr>
       <w:r>
         <w:lastRenderedPageBreak/>
@@ -2002,20 +4188,104 @@
         <w:rPr>
           <w:rFonts w:ascii="Times New Roman" w:hAnsi="Times New Roman" w:cs="Times New Roman"/>
         </w:rPr>
-        <w:t>The whole purpose of the AI is counting stridulations, but I haven’t at no point given you that output. Well, I can give you a number, but I think it is on your best interest to not do so. The AI is a classifier, it can only tell you if a snippet is likely to contain a stridulation (or a part, or several) or not. This creates a scenario where you under or over count if you do it automatically. In that regard, I think it is best to revise the output and make some decisions on what is one, or part or many or none stridulation on the positives, which should be few and easy to do. So yes, you may still have to count them, but hopefully they will be selected so the work is much less.</w:t>
-      </w:r>
-    </w:p>
-    <w:p>
-      <w:pPr>
-        <w:rPr>
-          <w:rFonts w:ascii="Times New Roman" w:hAnsi="Times New Roman" w:cs="Times New Roman"/>
-        </w:rPr>
-      </w:pPr>
-      <w:r>
-        <w:rPr>
-          <w:rFonts w:ascii="Times New Roman" w:hAnsi="Times New Roman" w:cs="Times New Roman"/>
-        </w:rPr>
-        <w:t>On that regard, what happens with split stridulations? Well, I am working on the assumption that they will be long enough that half of them is recognizable. If that is the case, splits will be picked up by the model, often more than once (as in two snippets with half a stridulation each will both be classified as positive). If that is not the case, there is a chance that the ai will undercount, when we figure that out, I can implement solutions. For now I think it is best to not sole issues that we don’t have yet and focus on the issues that we have.</w:t>
+        <w:t xml:space="preserve">The whole purpose of the AI is counting </w:t>
+      </w:r>
+      <w:proofErr w:type="spellStart"/>
+      <w:r>
+        <w:rPr>
+          <w:rFonts w:ascii="Times New Roman" w:hAnsi="Times New Roman" w:cs="Times New Roman"/>
+        </w:rPr>
+        <w:t>stridulations</w:t>
+      </w:r>
+      <w:proofErr w:type="spellEnd"/>
+      <w:r>
+        <w:rPr>
+          <w:rFonts w:ascii="Times New Roman" w:hAnsi="Times New Roman" w:cs="Times New Roman"/>
+        </w:rPr>
+        <w:t xml:space="preserve">, but I haven’t at no point given you that output. Well, I can give you a number, but I think it is on your best interest to not do so. The AI is a classifier, it can only tell you if a snippet is likely to contain a </w:t>
+      </w:r>
+      <w:proofErr w:type="spellStart"/>
+      <w:r>
+        <w:rPr>
+          <w:rFonts w:ascii="Times New Roman" w:hAnsi="Times New Roman" w:cs="Times New Roman"/>
+        </w:rPr>
+        <w:t>stridulation</w:t>
+      </w:r>
+      <w:proofErr w:type="spellEnd"/>
+      <w:r>
+        <w:rPr>
+          <w:rFonts w:ascii="Times New Roman" w:hAnsi="Times New Roman" w:cs="Times New Roman"/>
+        </w:rPr>
+        <w:t xml:space="preserve"> (or a part, or several) or not. This creates a scenario where you under or over count if you do it automatically. In that regard, I think it is best to revise the output and make some decisions on what is one, or part or many or none </w:t>
+      </w:r>
+      <w:proofErr w:type="spellStart"/>
+      <w:r>
+        <w:rPr>
+          <w:rFonts w:ascii="Times New Roman" w:hAnsi="Times New Roman" w:cs="Times New Roman"/>
+        </w:rPr>
+        <w:t>stridulation</w:t>
+      </w:r>
+      <w:proofErr w:type="spellEnd"/>
+      <w:r>
+        <w:rPr>
+          <w:rFonts w:ascii="Times New Roman" w:hAnsi="Times New Roman" w:cs="Times New Roman"/>
+        </w:rPr>
+        <w:t xml:space="preserve"> on the positives, which should be few and easy to do. So yes, you may still have to count them, but hopefully they will be selected so the work is much less.</w:t>
+      </w:r>
+    </w:p>
+    <w:p>
+      <w:pPr>
+        <w:rPr>
+          <w:rFonts w:ascii="Times New Roman" w:hAnsi="Times New Roman" w:cs="Times New Roman"/>
+        </w:rPr>
+      </w:pPr>
+      <w:r>
+        <w:rPr>
+          <w:rFonts w:ascii="Times New Roman" w:hAnsi="Times New Roman" w:cs="Times New Roman"/>
+        </w:rPr>
+        <w:t xml:space="preserve">On that regard, what happens with split </w:t>
+      </w:r>
+      <w:proofErr w:type="spellStart"/>
+      <w:r>
+        <w:rPr>
+          <w:rFonts w:ascii="Times New Roman" w:hAnsi="Times New Roman" w:cs="Times New Roman"/>
+        </w:rPr>
+        <w:t>stridulations</w:t>
+      </w:r>
+      <w:proofErr w:type="spellEnd"/>
+      <w:r>
+        <w:rPr>
+          <w:rFonts w:ascii="Times New Roman" w:hAnsi="Times New Roman" w:cs="Times New Roman"/>
+        </w:rPr>
+        <w:t xml:space="preserve">? Well, I am working on the assumption that they will be long enough that half of them is recognizable. If that is the case, splits will be picked up by the model, often more than once (as in two snippets with half a </w:t>
+      </w:r>
+      <w:proofErr w:type="spellStart"/>
+      <w:r>
+        <w:rPr>
+          <w:rFonts w:ascii="Times New Roman" w:hAnsi="Times New Roman" w:cs="Times New Roman"/>
+        </w:rPr>
+        <w:t>stridulation</w:t>
+      </w:r>
+      <w:proofErr w:type="spellEnd"/>
+      <w:r>
+        <w:rPr>
+          <w:rFonts w:ascii="Times New Roman" w:hAnsi="Times New Roman" w:cs="Times New Roman"/>
+        </w:rPr>
+        <w:t xml:space="preserve"> each will both be classified as positive). If that is not the case, there is a chance that the </w:t>
+      </w:r>
+      <w:proofErr w:type="spellStart"/>
+      <w:r>
+        <w:rPr>
+          <w:rFonts w:ascii="Times New Roman" w:hAnsi="Times New Roman" w:cs="Times New Roman"/>
+        </w:rPr>
+        <w:t>ai</w:t>
+      </w:r>
+      <w:proofErr w:type="spellEnd"/>
+      <w:r>
+        <w:rPr>
+          <w:rFonts w:ascii="Times New Roman" w:hAnsi="Times New Roman" w:cs="Times New Roman"/>
+        </w:rPr>
+        <w:t xml:space="preserve"> will undercount, when we figure that out, I can implement solutions. For now I think it is best to not sole issues that we don’t have yet and focus on the issues that we have.</w:t>
       </w:r>
     </w:p>
     <w:p>
@@ -2055,7 +4325,7 @@
 </file>
 
 <file path=word/styles.xml><?xml version="1.0" encoding="utf-8"?>
-<w:styles xmlns:mc="http://schemas.openxmlformats.org/markup-compatibility/2006" xmlns:r="http://schemas.openxmlformats.org/officeDocument/2006/relationships" xmlns:w="http://schemas.openxmlformats.org/wordprocessingml/2006/main" xmlns:w14="http://schemas.microsoft.com/office/word/2010/wordml" xmlns:w15="http://schemas.microsoft.com/office/word/2012/wordml" xmlns:w16cex="http://schemas.microsoft.com/office/word/2018/wordml/cex" xmlns:w16cid="http://schemas.microsoft.com/office/word/2016/wordml/cid" xmlns:w16="http://schemas.microsoft.com/office/word/2018/wordml" xmlns:w16du="http://schemas.microsoft.com/office/word/2023/wordml/word16du" xmlns:w16sdtdh="http://schemas.microsoft.com/office/word/2020/wordml/sdtdatahash" xmlns:w16sdtfl="http://schemas.microsoft.com/office/word/2024/wordml/sdtformatlock" xmlns:w16se="http://schemas.microsoft.com/office/word/2015/wordml/symex" mc:Ignorable="w14 w15 w16se w16cid w16 w16cex w16sdtdh w16sdtfl w16du">
+<w:styles xmlns:mc="http://schemas.openxmlformats.org/markup-compatibility/2006" xmlns:r="http://schemas.openxmlformats.org/officeDocument/2006/relationships" xmlns:w="http://schemas.openxmlformats.org/wordprocessingml/2006/main" xmlns:w14="http://schemas.microsoft.com/office/word/2010/wordml" xmlns:w15="http://schemas.microsoft.com/office/word/2012/wordml" xmlns:w16se="http://schemas.microsoft.com/office/word/2015/wordml/symex" mc:Ignorable="w14 w15 w16se">
   <w:docDefaults>
     <w:rPrDefault>
       <w:rPr>
@@ -2073,7 +4343,7 @@
       </w:pPr>
     </w:pPrDefault>
   </w:docDefaults>
-  <w:latentStyles w:defLockedState="0" w:defUIPriority="99" w:defSemiHidden="0" w:defUnhideWhenUsed="0" w:defQFormat="0" w:count="376">
+  <w:latentStyles w:defLockedState="0" w:defUIPriority="99" w:defSemiHidden="0" w:defUnhideWhenUsed="0" w:defQFormat="0" w:count="371">
     <w:lsdException w:name="Normal" w:uiPriority="0" w:qFormat="1"/>
     <w:lsdException w:name="heading 1" w:uiPriority="9" w:qFormat="1"/>
     <w:lsdException w:name="heading 2" w:semiHidden="1" w:uiPriority="9" w:unhideWhenUsed="1" w:qFormat="1"/>
@@ -2445,21 +4715,16 @@
     <w:lsdException w:name="List Table 5 Dark Accent 6" w:uiPriority="50"/>
     <w:lsdException w:name="List Table 6 Colorful Accent 6" w:uiPriority="51"/>
     <w:lsdException w:name="List Table 7 Colorful Accent 6" w:uiPriority="52"/>
-    <w:lsdException w:name="Mention" w:semiHidden="1" w:unhideWhenUsed="1"/>
-    <w:lsdException w:name="Smart Hyperlink" w:semiHidden="1" w:unhideWhenUsed="1"/>
-    <w:lsdException w:name="Hashtag" w:semiHidden="1" w:unhideWhenUsed="1"/>
-    <w:lsdException w:name="Unresolved Mention" w:semiHidden="1" w:unhideWhenUsed="1"/>
-    <w:lsdException w:name="Smart Link" w:semiHidden="1" w:unhideWhenUsed="1"/>
   </w:latentStyles>
   <w:style w:type="paragraph" w:default="1" w:styleId="Normal">
     <w:name w:val="Normal"/>
     <w:qFormat/>
   </w:style>
-  <w:style w:type="paragraph" w:styleId="Ttulo1">
+  <w:style w:type="paragraph" w:styleId="Heading1">
     <w:name w:val="heading 1"/>
     <w:basedOn w:val="Normal"/>
     <w:next w:val="Normal"/>
-    <w:link w:val="Ttulo1Car"/>
+    <w:link w:val="Heading1Char"/>
     <w:uiPriority w:val="9"/>
     <w:qFormat/>
     <w:rsid w:val="000D0B27"/>
@@ -2477,11 +4742,11 @@
       <w:szCs w:val="40"/>
     </w:rPr>
   </w:style>
-  <w:style w:type="paragraph" w:styleId="Ttulo2">
+  <w:style w:type="paragraph" w:styleId="Heading2">
     <w:name w:val="heading 2"/>
     <w:basedOn w:val="Normal"/>
     <w:next w:val="Normal"/>
-    <w:link w:val="Ttulo2Car"/>
+    <w:link w:val="Heading2Char"/>
     <w:uiPriority w:val="9"/>
     <w:unhideWhenUsed/>
     <w:qFormat/>
@@ -2500,11 +4765,11 @@
       <w:u w:val="single"/>
     </w:rPr>
   </w:style>
-  <w:style w:type="paragraph" w:styleId="Ttulo3">
+  <w:style w:type="paragraph" w:styleId="Heading3">
     <w:name w:val="heading 3"/>
     <w:basedOn w:val="Normal"/>
     <w:next w:val="Normal"/>
-    <w:link w:val="Ttulo3Car"/>
+    <w:link w:val="Heading3Char"/>
     <w:uiPriority w:val="9"/>
     <w:semiHidden/>
     <w:unhideWhenUsed/>
@@ -2523,11 +4788,11 @@
       <w:szCs w:val="28"/>
     </w:rPr>
   </w:style>
-  <w:style w:type="paragraph" w:styleId="Ttulo4">
+  <w:style w:type="paragraph" w:styleId="Heading4">
     <w:name w:val="heading 4"/>
     <w:basedOn w:val="Normal"/>
     <w:next w:val="Normal"/>
-    <w:link w:val="Ttulo4Car"/>
+    <w:link w:val="Heading4Char"/>
     <w:uiPriority w:val="9"/>
     <w:semiHidden/>
     <w:unhideWhenUsed/>
@@ -2546,11 +4811,11 @@
       <w:color w:val="0F4761" w:themeColor="accent1" w:themeShade="BF"/>
     </w:rPr>
   </w:style>
-  <w:style w:type="paragraph" w:styleId="Ttulo5">
+  <w:style w:type="paragraph" w:styleId="Heading5">
     <w:name w:val="heading 5"/>
     <w:basedOn w:val="Normal"/>
     <w:next w:val="Normal"/>
-    <w:link w:val="Ttulo5Car"/>
+    <w:link w:val="Heading5Char"/>
     <w:uiPriority w:val="9"/>
     <w:semiHidden/>
     <w:unhideWhenUsed/>
@@ -2567,11 +4832,11 @@
       <w:color w:val="0F4761" w:themeColor="accent1" w:themeShade="BF"/>
     </w:rPr>
   </w:style>
-  <w:style w:type="paragraph" w:styleId="Ttulo6">
+  <w:style w:type="paragraph" w:styleId="Heading6">
     <w:name w:val="heading 6"/>
     <w:basedOn w:val="Normal"/>
     <w:next w:val="Normal"/>
-    <w:link w:val="Ttulo6Car"/>
+    <w:link w:val="Heading6Char"/>
     <w:uiPriority w:val="9"/>
     <w:semiHidden/>
     <w:unhideWhenUsed/>
@@ -2590,11 +4855,11 @@
       <w:color w:val="595959" w:themeColor="text1" w:themeTint="A6"/>
     </w:rPr>
   </w:style>
-  <w:style w:type="paragraph" w:styleId="Ttulo7">
+  <w:style w:type="paragraph" w:styleId="Heading7">
     <w:name w:val="heading 7"/>
     <w:basedOn w:val="Normal"/>
     <w:next w:val="Normal"/>
-    <w:link w:val="Ttulo7Car"/>
+    <w:link w:val="Heading7Char"/>
     <w:uiPriority w:val="9"/>
     <w:semiHidden/>
     <w:unhideWhenUsed/>
@@ -2611,11 +4876,11 @@
       <w:color w:val="595959" w:themeColor="text1" w:themeTint="A6"/>
     </w:rPr>
   </w:style>
-  <w:style w:type="paragraph" w:styleId="Ttulo8">
+  <w:style w:type="paragraph" w:styleId="Heading8">
     <w:name w:val="heading 8"/>
     <w:basedOn w:val="Normal"/>
     <w:next w:val="Normal"/>
-    <w:link w:val="Ttulo8Car"/>
+    <w:link w:val="Heading8Char"/>
     <w:uiPriority w:val="9"/>
     <w:semiHidden/>
     <w:unhideWhenUsed/>
@@ -2634,11 +4899,11 @@
       <w:color w:val="272727" w:themeColor="text1" w:themeTint="D8"/>
     </w:rPr>
   </w:style>
-  <w:style w:type="paragraph" w:styleId="Ttulo9">
+  <w:style w:type="paragraph" w:styleId="Heading9">
     <w:name w:val="heading 9"/>
     <w:basedOn w:val="Normal"/>
     <w:next w:val="Normal"/>
-    <w:link w:val="Ttulo9Car"/>
+    <w:link w:val="Heading9Char"/>
     <w:uiPriority w:val="9"/>
     <w:semiHidden/>
     <w:unhideWhenUsed/>
@@ -2655,13 +4920,13 @@
       <w:color w:val="272727" w:themeColor="text1" w:themeTint="D8"/>
     </w:rPr>
   </w:style>
-  <w:style w:type="character" w:default="1" w:styleId="Fuentedeprrafopredeter">
+  <w:style w:type="character" w:default="1" w:styleId="DefaultParagraphFont">
     <w:name w:val="Default Paragraph Font"/>
     <w:uiPriority w:val="1"/>
     <w:semiHidden/>
     <w:unhideWhenUsed/>
   </w:style>
-  <w:style w:type="table" w:default="1" w:styleId="Tablanormal">
+  <w:style w:type="table" w:default="1" w:styleId="TableNormal">
     <w:name w:val="Normal Table"/>
     <w:uiPriority w:val="99"/>
     <w:semiHidden/>
@@ -2676,16 +4941,16 @@
       </w:tblCellMar>
     </w:tblPr>
   </w:style>
-  <w:style w:type="numbering" w:default="1" w:styleId="Sinlista">
+  <w:style w:type="numbering" w:default="1" w:styleId="NoList">
     <w:name w:val="No List"/>
     <w:uiPriority w:val="99"/>
     <w:semiHidden/>
     <w:unhideWhenUsed/>
   </w:style>
-  <w:style w:type="character" w:customStyle="1" w:styleId="Ttulo1Car">
-    <w:name w:val="Título 1 Car"/>
-    <w:basedOn w:val="Fuentedeprrafopredeter"/>
-    <w:link w:val="Ttulo1"/>
+  <w:style w:type="character" w:customStyle="1" w:styleId="Heading1Char">
+    <w:name w:val="Heading 1 Char"/>
+    <w:basedOn w:val="DefaultParagraphFont"/>
+    <w:link w:val="Heading1"/>
     <w:uiPriority w:val="9"/>
     <w:rsid w:val="000D0B27"/>
     <w:rPr>
@@ -2696,10 +4961,10 @@
       <w:szCs w:val="40"/>
     </w:rPr>
   </w:style>
-  <w:style w:type="character" w:customStyle="1" w:styleId="Ttulo2Car">
-    <w:name w:val="Título 2 Car"/>
-    <w:basedOn w:val="Fuentedeprrafopredeter"/>
-    <w:link w:val="Ttulo2"/>
+  <w:style w:type="character" w:customStyle="1" w:styleId="Heading2Char">
+    <w:name w:val="Heading 2 Char"/>
+    <w:basedOn w:val="DefaultParagraphFont"/>
+    <w:link w:val="Heading2"/>
     <w:uiPriority w:val="9"/>
     <w:rsid w:val="000D0B27"/>
     <w:rPr>
@@ -2710,10 +4975,10 @@
       <w:u w:val="single"/>
     </w:rPr>
   </w:style>
-  <w:style w:type="character" w:customStyle="1" w:styleId="Ttulo3Car">
-    <w:name w:val="Título 3 Car"/>
-    <w:basedOn w:val="Fuentedeprrafopredeter"/>
-    <w:link w:val="Ttulo3"/>
+  <w:style w:type="character" w:customStyle="1" w:styleId="Heading3Char">
+    <w:name w:val="Heading 3 Char"/>
+    <w:basedOn w:val="DefaultParagraphFont"/>
+    <w:link w:val="Heading3"/>
     <w:uiPriority w:val="9"/>
     <w:semiHidden/>
     <w:rsid w:val="00900EA5"/>
@@ -2724,10 +4989,10 @@
       <w:szCs w:val="28"/>
     </w:rPr>
   </w:style>
-  <w:style w:type="character" w:customStyle="1" w:styleId="Ttulo4Car">
-    <w:name w:val="Título 4 Car"/>
-    <w:basedOn w:val="Fuentedeprrafopredeter"/>
-    <w:link w:val="Ttulo4"/>
+  <w:style w:type="character" w:customStyle="1" w:styleId="Heading4Char">
+    <w:name w:val="Heading 4 Char"/>
+    <w:basedOn w:val="DefaultParagraphFont"/>
+    <w:link w:val="Heading4"/>
     <w:uiPriority w:val="9"/>
     <w:semiHidden/>
     <w:rsid w:val="00900EA5"/>
@@ -2738,10 +5003,10 @@
       <w:color w:val="0F4761" w:themeColor="accent1" w:themeShade="BF"/>
     </w:rPr>
   </w:style>
-  <w:style w:type="character" w:customStyle="1" w:styleId="Ttulo5Car">
-    <w:name w:val="Título 5 Car"/>
-    <w:basedOn w:val="Fuentedeprrafopredeter"/>
-    <w:link w:val="Ttulo5"/>
+  <w:style w:type="character" w:customStyle="1" w:styleId="Heading5Char">
+    <w:name w:val="Heading 5 Char"/>
+    <w:basedOn w:val="DefaultParagraphFont"/>
+    <w:link w:val="Heading5"/>
     <w:uiPriority w:val="9"/>
     <w:semiHidden/>
     <w:rsid w:val="00900EA5"/>
@@ -2750,10 +5015,10 @@
       <w:color w:val="0F4761" w:themeColor="accent1" w:themeShade="BF"/>
     </w:rPr>
   </w:style>
-  <w:style w:type="character" w:customStyle="1" w:styleId="Ttulo6Car">
-    <w:name w:val="Título 6 Car"/>
-    <w:basedOn w:val="Fuentedeprrafopredeter"/>
-    <w:link w:val="Ttulo6"/>
+  <w:style w:type="character" w:customStyle="1" w:styleId="Heading6Char">
+    <w:name w:val="Heading 6 Char"/>
+    <w:basedOn w:val="DefaultParagraphFont"/>
+    <w:link w:val="Heading6"/>
     <w:uiPriority w:val="9"/>
     <w:semiHidden/>
     <w:rsid w:val="00900EA5"/>
@@ -2764,10 +5029,10 @@
       <w:color w:val="595959" w:themeColor="text1" w:themeTint="A6"/>
     </w:rPr>
   </w:style>
-  <w:style w:type="character" w:customStyle="1" w:styleId="Ttulo7Car">
-    <w:name w:val="Título 7 Car"/>
-    <w:basedOn w:val="Fuentedeprrafopredeter"/>
-    <w:link w:val="Ttulo7"/>
+  <w:style w:type="character" w:customStyle="1" w:styleId="Heading7Char">
+    <w:name w:val="Heading 7 Char"/>
+    <w:basedOn w:val="DefaultParagraphFont"/>
+    <w:link w:val="Heading7"/>
     <w:uiPriority w:val="9"/>
     <w:semiHidden/>
     <w:rsid w:val="00900EA5"/>
@@ -2776,10 +5041,10 @@
       <w:color w:val="595959" w:themeColor="text1" w:themeTint="A6"/>
     </w:rPr>
   </w:style>
-  <w:style w:type="character" w:customStyle="1" w:styleId="Ttulo8Car">
-    <w:name w:val="Título 8 Car"/>
-    <w:basedOn w:val="Fuentedeprrafopredeter"/>
-    <w:link w:val="Ttulo8"/>
+  <w:style w:type="character" w:customStyle="1" w:styleId="Heading8Char">
+    <w:name w:val="Heading 8 Char"/>
+    <w:basedOn w:val="DefaultParagraphFont"/>
+    <w:link w:val="Heading8"/>
     <w:uiPriority w:val="9"/>
     <w:semiHidden/>
     <w:rsid w:val="00900EA5"/>
@@ -2790,10 +5055,10 @@
       <w:color w:val="272727" w:themeColor="text1" w:themeTint="D8"/>
     </w:rPr>
   </w:style>
-  <w:style w:type="character" w:customStyle="1" w:styleId="Ttulo9Car">
-    <w:name w:val="Título 9 Car"/>
-    <w:basedOn w:val="Fuentedeprrafopredeter"/>
-    <w:link w:val="Ttulo9"/>
+  <w:style w:type="character" w:customStyle="1" w:styleId="Heading9Char">
+    <w:name w:val="Heading 9 Char"/>
+    <w:basedOn w:val="DefaultParagraphFont"/>
+    <w:link w:val="Heading9"/>
     <w:uiPriority w:val="9"/>
     <w:semiHidden/>
     <w:rsid w:val="00900EA5"/>
@@ -2802,11 +5067,11 @@
       <w:color w:val="272727" w:themeColor="text1" w:themeTint="D8"/>
     </w:rPr>
   </w:style>
-  <w:style w:type="paragraph" w:styleId="Ttulo">
+  <w:style w:type="paragraph" w:styleId="Title">
     <w:name w:val="Title"/>
     <w:basedOn w:val="Normal"/>
     <w:next w:val="Normal"/>
-    <w:link w:val="TtuloCar"/>
+    <w:link w:val="TitleChar"/>
     <w:uiPriority w:val="10"/>
     <w:qFormat/>
     <w:rsid w:val="00900EA5"/>
@@ -2822,10 +5087,10 @@
       <w:szCs w:val="56"/>
     </w:rPr>
   </w:style>
-  <w:style w:type="character" w:customStyle="1" w:styleId="TtuloCar">
-    <w:name w:val="Título Car"/>
-    <w:basedOn w:val="Fuentedeprrafopredeter"/>
-    <w:link w:val="Ttulo"/>
+  <w:style w:type="character" w:customStyle="1" w:styleId="TitleChar">
+    <w:name w:val="Title Char"/>
+    <w:basedOn w:val="DefaultParagraphFont"/>
+    <w:link w:val="Title"/>
     <w:uiPriority w:val="10"/>
     <w:rsid w:val="00900EA5"/>
     <w:rPr>
@@ -2836,11 +5101,11 @@
       <w:szCs w:val="56"/>
     </w:rPr>
   </w:style>
-  <w:style w:type="paragraph" w:styleId="Subttulo">
+  <w:style w:type="paragraph" w:styleId="Subtitle">
     <w:name w:val="Subtitle"/>
     <w:basedOn w:val="Normal"/>
     <w:next w:val="Normal"/>
-    <w:link w:val="SubttuloCar"/>
+    <w:link w:val="SubtitleChar"/>
     <w:uiPriority w:val="11"/>
     <w:qFormat/>
     <w:rsid w:val="00900EA5"/>
@@ -2857,10 +5122,10 @@
       <w:szCs w:val="28"/>
     </w:rPr>
   </w:style>
-  <w:style w:type="character" w:customStyle="1" w:styleId="SubttuloCar">
-    <w:name w:val="Subtítulo Car"/>
-    <w:basedOn w:val="Fuentedeprrafopredeter"/>
-    <w:link w:val="Subttulo"/>
+  <w:style w:type="character" w:customStyle="1" w:styleId="SubtitleChar">
+    <w:name w:val="Subtitle Char"/>
+    <w:basedOn w:val="DefaultParagraphFont"/>
+    <w:link w:val="Subtitle"/>
     <w:uiPriority w:val="11"/>
     <w:rsid w:val="00900EA5"/>
     <w:rPr>
@@ -2871,11 +5136,11 @@
       <w:szCs w:val="28"/>
     </w:rPr>
   </w:style>
-  <w:style w:type="paragraph" w:styleId="Cita">
+  <w:style w:type="paragraph" w:styleId="Quote">
     <w:name w:val="Quote"/>
     <w:basedOn w:val="Normal"/>
     <w:next w:val="Normal"/>
-    <w:link w:val="CitaCar"/>
+    <w:link w:val="QuoteChar"/>
     <w:uiPriority w:val="29"/>
     <w:qFormat/>
     <w:rsid w:val="00900EA5"/>
@@ -2889,10 +5154,10 @@
       <w:color w:val="404040" w:themeColor="text1" w:themeTint="BF"/>
     </w:rPr>
   </w:style>
-  <w:style w:type="character" w:customStyle="1" w:styleId="CitaCar">
-    <w:name w:val="Cita Car"/>
-    <w:basedOn w:val="Fuentedeprrafopredeter"/>
-    <w:link w:val="Cita"/>
+  <w:style w:type="character" w:customStyle="1" w:styleId="QuoteChar">
+    <w:name w:val="Quote Char"/>
+    <w:basedOn w:val="DefaultParagraphFont"/>
+    <w:link w:val="Quote"/>
     <w:uiPriority w:val="29"/>
     <w:rsid w:val="00900EA5"/>
     <w:rPr>
@@ -2901,7 +5166,7 @@
       <w:color w:val="404040" w:themeColor="text1" w:themeTint="BF"/>
     </w:rPr>
   </w:style>
-  <w:style w:type="paragraph" w:styleId="Prrafodelista">
+  <w:style w:type="paragraph" w:styleId="ListParagraph">
     <w:name w:val="List Paragraph"/>
     <w:basedOn w:val="Normal"/>
     <w:uiPriority w:val="34"/>
@@ -2912,9 +5177,9 @@
       <w:contextualSpacing/>
     </w:pPr>
   </w:style>
-  <w:style w:type="character" w:styleId="nfasisintenso">
+  <w:style w:type="character" w:styleId="IntenseEmphasis">
     <w:name w:val="Intense Emphasis"/>
-    <w:basedOn w:val="Fuentedeprrafopredeter"/>
+    <w:basedOn w:val="DefaultParagraphFont"/>
     <w:uiPriority w:val="21"/>
     <w:qFormat/>
     <w:rsid w:val="00900EA5"/>
@@ -2924,11 +5189,11 @@
       <w:color w:val="0F4761" w:themeColor="accent1" w:themeShade="BF"/>
     </w:rPr>
   </w:style>
-  <w:style w:type="paragraph" w:styleId="Citadestacada">
+  <w:style w:type="paragraph" w:styleId="IntenseQuote">
     <w:name w:val="Intense Quote"/>
     <w:basedOn w:val="Normal"/>
     <w:next w:val="Normal"/>
-    <w:link w:val="CitadestacadaCar"/>
+    <w:link w:val="IntenseQuoteChar"/>
     <w:uiPriority w:val="30"/>
     <w:qFormat/>
     <w:rsid w:val="00900EA5"/>
@@ -2947,10 +5212,10 @@
       <w:color w:val="0F4761" w:themeColor="accent1" w:themeShade="BF"/>
     </w:rPr>
   </w:style>
-  <w:style w:type="character" w:customStyle="1" w:styleId="CitadestacadaCar">
-    <w:name w:val="Cita destacada Car"/>
-    <w:basedOn w:val="Fuentedeprrafopredeter"/>
-    <w:link w:val="Citadestacada"/>
+  <w:style w:type="character" w:customStyle="1" w:styleId="IntenseQuoteChar">
+    <w:name w:val="Intense Quote Char"/>
+    <w:basedOn w:val="DefaultParagraphFont"/>
+    <w:link w:val="IntenseQuote"/>
     <w:uiPriority w:val="30"/>
     <w:rsid w:val="00900EA5"/>
     <w:rPr>
@@ -2959,9 +5224,9 @@
       <w:color w:val="0F4761" w:themeColor="accent1" w:themeShade="BF"/>
     </w:rPr>
   </w:style>
-  <w:style w:type="character" w:styleId="Referenciaintensa">
+  <w:style w:type="character" w:styleId="IntenseReference">
     <w:name w:val="Intense Reference"/>
-    <w:basedOn w:val="Fuentedeprrafopredeter"/>
+    <w:basedOn w:val="DefaultParagraphFont"/>
     <w:uiPriority w:val="32"/>
     <w:qFormat/>
     <w:rsid w:val="00900EA5"/>
@@ -2973,9 +5238,9 @@
       <w:spacing w:val="5"/>
     </w:rPr>
   </w:style>
-  <w:style w:type="character" w:styleId="Textoennegrita">
+  <w:style w:type="character" w:styleId="Strong">
     <w:name w:val="Strong"/>
-    <w:basedOn w:val="Fuentedeprrafopredeter"/>
+    <w:basedOn w:val="DefaultParagraphFont"/>
     <w:uiPriority w:val="22"/>
     <w:qFormat/>
     <w:rsid w:val="00900EA5"/>

</xml_diff>

<commit_message>
Fixed bug in dependencies
</commit_message>
<xml_diff>
--- a/Users_manual.docx
+++ b/Users_manual.docx
@@ -183,43 +183,7 @@
           <w:b/>
           <w:i/>
         </w:rPr>
-        <w:t>https://bitbucket.org/Saul_Rgu</w:t>
-      </w:r>
-      <w:r>
-        <w:rPr>
-          <w:rStyle w:val="Hyperlink"/>
-          <w:rFonts w:ascii="Times New Roman" w:hAnsi="Times New Roman" w:cs="Times New Roman"/>
-          <w:b/>
-          <w:i/>
-        </w:rPr>
-        <w:t>e</w:t>
-      </w:r>
-      <w:r>
-        <w:rPr>
-          <w:rStyle w:val="Hyperlink"/>
-          <w:rFonts w:ascii="Times New Roman" w:hAnsi="Times New Roman" w:cs="Times New Roman"/>
-          <w:b/>
-          <w:i/>
-        </w:rPr>
-        <w:t>z/strid</w:t>
-      </w:r>
-      <w:r>
-        <w:rPr>
-          <w:rStyle w:val="Hyperlink"/>
-          <w:rFonts w:ascii="Times New Roman" w:hAnsi="Times New Roman" w:cs="Times New Roman"/>
-          <w:b/>
-          <w:i/>
-        </w:rPr>
-        <w:t>u</w:t>
-      </w:r>
-      <w:r>
-        <w:rPr>
-          <w:rStyle w:val="Hyperlink"/>
-          <w:rFonts w:ascii="Times New Roman" w:hAnsi="Times New Roman" w:cs="Times New Roman"/>
-          <w:b/>
-          <w:i/>
-        </w:rPr>
-        <w:t>lant.git</w:t>
+        <w:t>https://bitbucket.org/Saul_Rguez/stridulant.git</w:t>
       </w:r>
     </w:p>
     <w:p>
@@ -232,8 +196,6 @@
       <w:r>
         <w:fldChar w:fldCharType="end"/>
       </w:r>
-      <w:bookmarkStart w:id="0" w:name="_GoBack"/>
-      <w:bookmarkEnd w:id="0"/>
       <w:r>
         <w:rPr>
           <w:rFonts w:ascii="Times New Roman" w:hAnsi="Times New Roman" w:cs="Times New Roman"/>
@@ -313,25 +275,7 @@
             <w:b/>
             <w:i/>
           </w:rPr>
-          <w:t>https://bitbucket.org/Saul</w:t>
-        </w:r>
-        <w:r>
-          <w:rPr>
-            <w:rStyle w:val="Hyperlink"/>
-            <w:rFonts w:ascii="Times New Roman" w:hAnsi="Times New Roman" w:cs="Times New Roman"/>
-            <w:b/>
-            <w:i/>
-          </w:rPr>
-          <w:t>_</w:t>
-        </w:r>
-        <w:r>
-          <w:rPr>
-            <w:rStyle w:val="Hyperlink"/>
-            <w:rFonts w:ascii="Times New Roman" w:hAnsi="Times New Roman" w:cs="Times New Roman"/>
-            <w:b/>
-            <w:i/>
-          </w:rPr>
-          <w:t>Rguez/pysound.git</w:t>
+          <w:t>https://bitbucket.org/Saul_Rguez/pysound.git</w:t>
         </w:r>
       </w:hyperlink>
     </w:p>
@@ -663,28 +607,28 @@
           <w:iCs/>
         </w:rPr>
       </w:pPr>
-      <w:proofErr w:type="gramStart"/>
-      <w:r>
-        <w:rPr>
-          <w:rFonts w:ascii="Times New Roman" w:hAnsi="Times New Roman" w:cs="Times New Roman"/>
-          <w:b/>
-          <w:bCs/>
-          <w:i/>
-          <w:iCs/>
-        </w:rPr>
-        <w:t>pip</w:t>
-      </w:r>
-      <w:proofErr w:type="gramEnd"/>
-      <w:r>
-        <w:rPr>
-          <w:rFonts w:ascii="Times New Roman" w:hAnsi="Times New Roman" w:cs="Times New Roman"/>
-          <w:b/>
-          <w:bCs/>
-          <w:i/>
-          <w:iCs/>
-        </w:rPr>
-        <w:t xml:space="preserve"> uninstall </w:t>
-      </w:r>
+      <w:r>
+        <w:rPr>
+          <w:rFonts w:ascii="Times New Roman" w:hAnsi="Times New Roman" w:cs="Times New Roman"/>
+          <w:b/>
+          <w:bCs/>
+          <w:i/>
+          <w:iCs/>
+        </w:rPr>
+        <w:t xml:space="preserve">pip uninstall </w:t>
+      </w:r>
+      <w:r>
+        <w:rPr>
+          <w:rFonts w:ascii="Times New Roman" w:hAnsi="Times New Roman" w:cs="Times New Roman"/>
+          <w:b/>
+          <w:bCs/>
+          <w:i/>
+          <w:iCs/>
+        </w:rPr>
+        <w:t xml:space="preserve">–y </w:t>
+      </w:r>
+      <w:bookmarkStart w:id="0" w:name="_GoBack"/>
+      <w:bookmarkEnd w:id="0"/>
       <w:proofErr w:type="spellStart"/>
       <w:r>
         <w:rPr>
@@ -5335,6 +5279,7 @@
   <w:style w:type="character" w:default="1" w:styleId="DefaultParagraphFont">
     <w:name w:val="Default Paragraph Font"/>
     <w:uiPriority w:val="1"/>
+    <w:semiHidden/>
     <w:unhideWhenUsed/>
   </w:style>
   <w:style w:type="table" w:default="1" w:styleId="TableNormal">

</xml_diff>

<commit_message>
Revamped the plotting system with a bunch of QOL stuff. Change batch processing accordingly.
</commit_message>
<xml_diff>
--- a/Users_manual.docx
+++ b/Users_manual.docx
@@ -1274,21 +1274,7 @@
         <w:rPr>
           <w:rFonts w:ascii="Times New Roman" w:hAnsi="Times New Roman" w:cs="Times New Roman"/>
         </w:rPr>
-        <w:t xml:space="preserve"> here, I suggest you use for </w:t>
-      </w:r>
-      <w:proofErr w:type="gramStart"/>
-      <w:r>
-        <w:rPr>
-          <w:rFonts w:ascii="Times New Roman" w:hAnsi="Times New Roman" w:cs="Times New Roman"/>
-        </w:rPr>
-        <w:t>name</w:t>
-      </w:r>
-      <w:proofErr w:type="gramEnd"/>
-      <w:r>
-        <w:rPr>
-          <w:rFonts w:ascii="Times New Roman" w:hAnsi="Times New Roman" w:cs="Times New Roman"/>
-        </w:rPr>
-        <w:t xml:space="preserve"> the same name of the file of origin, but you do you. The name will be automatically altered so there should be no overwriting of the file, or between different snippets. Also set a directory where you want to send it.</w:t>
+        <w:t xml:space="preserve"> here, I suggest you use for name the same name of the file of origin, but you do you. The name will be automatically altered so there should be no overwriting of the file, or between different snippets. Also set a directory where you want to send it.</w:t>
       </w:r>
     </w:p>
     <w:p>
@@ -1695,38 +1681,915 @@
           <w:i/>
           <w:iCs/>
         </w:rPr>
+        <w:t>(</w:t>
+      </w:r>
+      <w:proofErr w:type="spellStart"/>
+      <w:r>
+        <w:rPr>
+          <w:rFonts w:ascii="Times New Roman" w:hAnsi="Times New Roman" w:cs="Times New Roman"/>
+          <w:b/>
+          <w:bCs/>
+          <w:i/>
+          <w:iCs/>
+        </w:rPr>
+        <w:t>color</w:t>
+      </w:r>
+      <w:proofErr w:type="spellEnd"/>
+      <w:r>
+        <w:rPr>
+          <w:rFonts w:ascii="Times New Roman" w:hAnsi="Times New Roman" w:cs="Times New Roman"/>
+          <w:b/>
+          <w:bCs/>
+          <w:i/>
+          <w:iCs/>
+        </w:rPr>
+        <w:t xml:space="preserve"> = “inferno”</w:t>
+      </w:r>
+      <w:r>
+        <w:rPr>
+          <w:rFonts w:ascii="Times New Roman" w:hAnsi="Times New Roman" w:cs="Times New Roman"/>
+          <w:b/>
+          <w:bCs/>
+          <w:i/>
+          <w:iCs/>
+        </w:rPr>
+        <w:t>)</w:t>
+      </w:r>
+      <w:r>
+        <w:rPr>
+          <w:rFonts w:ascii="Times New Roman" w:hAnsi="Times New Roman" w:cs="Times New Roman"/>
+        </w:rPr>
+        <w:t>. This will only show it on screen for you to inspect.</w:t>
+      </w:r>
+      <w:r>
+        <w:rPr>
+          <w:rFonts w:ascii="Times New Roman" w:hAnsi="Times New Roman" w:cs="Times New Roman"/>
+        </w:rPr>
+        <w:t xml:space="preserve"> I have added a </w:t>
+      </w:r>
+      <w:proofErr w:type="spellStart"/>
+      <w:r>
+        <w:rPr>
+          <w:rFonts w:ascii="Times New Roman" w:hAnsi="Times New Roman" w:cs="Times New Roman"/>
+        </w:rPr>
+        <w:t>color</w:t>
+      </w:r>
+      <w:proofErr w:type="spellEnd"/>
+      <w:r>
+        <w:rPr>
+          <w:rFonts w:ascii="Times New Roman" w:hAnsi="Times New Roman" w:cs="Times New Roman"/>
+        </w:rPr>
+        <w:t xml:space="preserve"> argument because I got sick of looking at the base one and thought you might too. Use </w:t>
+      </w:r>
+      <w:proofErr w:type="spellStart"/>
+      <w:proofErr w:type="gramStart"/>
+      <w:r>
+        <w:rPr>
+          <w:rFonts w:ascii="Times New Roman" w:hAnsi="Times New Roman" w:cs="Times New Roman"/>
+        </w:rPr>
+        <w:t>plt.colormaps</w:t>
+      </w:r>
+      <w:proofErr w:type="spellEnd"/>
+      <w:proofErr w:type="gramEnd"/>
+      <w:r>
+        <w:rPr>
+          <w:rFonts w:ascii="Times New Roman" w:hAnsi="Times New Roman" w:cs="Times New Roman"/>
+        </w:rPr>
+        <w:t>() to see options</w:t>
+      </w:r>
+    </w:p>
+    <w:p>
+      <w:pPr>
+        <w:spacing w:after="0"/>
+        <w:rPr>
+          <w:rFonts w:ascii="Times New Roman" w:hAnsi="Times New Roman" w:cs="Times New Roman"/>
+        </w:rPr>
+      </w:pPr>
+      <w:r>
+        <w:rPr>
+          <w:rFonts w:ascii="Times New Roman" w:hAnsi="Times New Roman" w:cs="Times New Roman"/>
+        </w:rPr>
+        <w:t xml:space="preserve">2.- you can save it with </w:t>
+      </w:r>
+      <w:r>
+        <w:rPr>
+          <w:rFonts w:ascii="Times New Roman" w:hAnsi="Times New Roman" w:cs="Times New Roman"/>
+          <w:b/>
+          <w:bCs/>
+          <w:i/>
+          <w:iCs/>
+        </w:rPr>
+        <w:t>spectrogram_</w:t>
+      </w:r>
+      <w:proofErr w:type="gramStart"/>
+      <w:r>
+        <w:rPr>
+          <w:rFonts w:ascii="Times New Roman" w:hAnsi="Times New Roman" w:cs="Times New Roman"/>
+          <w:b/>
+          <w:bCs/>
+          <w:i/>
+          <w:iCs/>
+        </w:rPr>
+        <w:t>1.save</w:t>
+      </w:r>
+      <w:proofErr w:type="gramEnd"/>
+      <w:r>
+        <w:rPr>
+          <w:rFonts w:ascii="Times New Roman" w:hAnsi="Times New Roman" w:cs="Times New Roman"/>
+          <w:b/>
+          <w:bCs/>
+          <w:i/>
+          <w:iCs/>
+        </w:rPr>
+        <w:t>_</w:t>
+      </w:r>
+      <w:proofErr w:type="gramStart"/>
+      <w:r>
+        <w:rPr>
+          <w:rFonts w:ascii="Times New Roman" w:hAnsi="Times New Roman" w:cs="Times New Roman"/>
+          <w:b/>
+          <w:bCs/>
+          <w:i/>
+          <w:iCs/>
+        </w:rPr>
+        <w:t>img</w:t>
+      </w:r>
+      <w:r>
+        <w:rPr>
+          <w:rFonts w:ascii="Times New Roman" w:hAnsi="Times New Roman" w:cs="Times New Roman"/>
+          <w:b/>
+          <w:bCs/>
+          <w:i/>
+          <w:iCs/>
+        </w:rPr>
+        <w:t>(</w:t>
+      </w:r>
+      <w:proofErr w:type="gramEnd"/>
+      <w:r>
+        <w:rPr>
+          <w:rFonts w:ascii="Times New Roman" w:hAnsi="Times New Roman" w:cs="Times New Roman"/>
+          <w:b/>
+          <w:bCs/>
+          <w:i/>
+          <w:iCs/>
+        </w:rPr>
+        <w:t xml:space="preserve">name, </w:t>
+      </w:r>
+      <w:proofErr w:type="spellStart"/>
+      <w:r>
+        <w:rPr>
+          <w:rFonts w:ascii="Times New Roman" w:hAnsi="Times New Roman" w:cs="Times New Roman"/>
+          <w:b/>
+          <w:bCs/>
+          <w:i/>
+          <w:iCs/>
+        </w:rPr>
+        <w:t>dir</w:t>
+      </w:r>
+      <w:proofErr w:type="spellEnd"/>
+      <w:r>
+        <w:rPr>
+          <w:rFonts w:ascii="Times New Roman" w:hAnsi="Times New Roman" w:cs="Times New Roman"/>
+          <w:b/>
+          <w:bCs/>
+          <w:i/>
+          <w:iCs/>
+        </w:rPr>
+        <w:t xml:space="preserve">, </w:t>
+      </w:r>
+      <w:proofErr w:type="spellStart"/>
+      <w:r>
+        <w:rPr>
+          <w:rFonts w:ascii="Times New Roman" w:hAnsi="Times New Roman" w:cs="Times New Roman"/>
+          <w:b/>
+          <w:bCs/>
+          <w:i/>
+          <w:iCs/>
+        </w:rPr>
+        <w:t>with_labels</w:t>
+      </w:r>
+      <w:proofErr w:type="spellEnd"/>
+      <w:r>
+        <w:rPr>
+          <w:rFonts w:ascii="Times New Roman" w:hAnsi="Times New Roman" w:cs="Times New Roman"/>
+          <w:b/>
+          <w:bCs/>
+          <w:i/>
+          <w:iCs/>
+        </w:rPr>
+        <w:t xml:space="preserve"> = False</w:t>
+      </w:r>
+      <w:r>
+        <w:rPr>
+          <w:rFonts w:ascii="Times New Roman" w:hAnsi="Times New Roman" w:cs="Times New Roman"/>
+          <w:b/>
+          <w:bCs/>
+          <w:i/>
+          <w:iCs/>
+        </w:rPr>
+        <w:t>)</w:t>
+      </w:r>
+      <w:r>
+        <w:rPr>
+          <w:rFonts w:ascii="Times New Roman" w:hAnsi="Times New Roman" w:cs="Times New Roman"/>
+        </w:rPr>
+        <w:t xml:space="preserve">. I suggest you follow the same naming conventions explained for snippets. The spectrogram will automatically receive time stamps and other flags from the snippet they come from. The </w:t>
+      </w:r>
+      <w:proofErr w:type="spellStart"/>
+      <w:r>
+        <w:rPr>
+          <w:rFonts w:ascii="Times New Roman" w:hAnsi="Times New Roman" w:cs="Times New Roman"/>
+        </w:rPr>
+        <w:t>with_labels</w:t>
+      </w:r>
+      <w:proofErr w:type="spellEnd"/>
+      <w:r>
+        <w:rPr>
+          <w:rFonts w:ascii="Times New Roman" w:hAnsi="Times New Roman" w:cs="Times New Roman"/>
+        </w:rPr>
+        <w:t xml:space="preserve"> </w:t>
+      </w:r>
+      <w:proofErr w:type="spellStart"/>
+      <w:r>
+        <w:rPr>
+          <w:rFonts w:ascii="Times New Roman" w:hAnsi="Times New Roman" w:cs="Times New Roman"/>
+        </w:rPr>
+        <w:t>kwarg</w:t>
+      </w:r>
+      <w:proofErr w:type="spellEnd"/>
+      <w:r>
+        <w:rPr>
+          <w:rFonts w:ascii="Times New Roman" w:hAnsi="Times New Roman" w:cs="Times New Roman"/>
+        </w:rPr>
+        <w:t xml:space="preserve"> will default to false (you don’t have write it unless you want it True). This means that the spectrogram will be saved without axis colour codes or other things. That is the way you want them to be in your AI models, but for presentations or papers, you can turn it </w:t>
+      </w:r>
+      <w:proofErr w:type="gramStart"/>
+      <w:r>
+        <w:rPr>
+          <w:rFonts w:ascii="Times New Roman" w:hAnsi="Times New Roman" w:cs="Times New Roman"/>
+        </w:rPr>
+        <w:t>true</w:t>
+      </w:r>
+      <w:proofErr w:type="gramEnd"/>
+      <w:r>
+        <w:rPr>
+          <w:rFonts w:ascii="Times New Roman" w:hAnsi="Times New Roman" w:cs="Times New Roman"/>
+        </w:rPr>
+        <w:t xml:space="preserve"> and it will give you something more human readable.</w:t>
+      </w:r>
+      <w:r>
+        <w:rPr>
+          <w:rFonts w:ascii="Times New Roman" w:hAnsi="Times New Roman" w:cs="Times New Roman"/>
+        </w:rPr>
+        <w:t xml:space="preserve"> As with the plot, now you can choose a colormap. See plot function for details.</w:t>
+      </w:r>
+    </w:p>
+    <w:p>
+      <w:pPr>
+        <w:spacing w:after="0"/>
+        <w:rPr>
+          <w:rFonts w:ascii="Times New Roman" w:hAnsi="Times New Roman" w:cs="Times New Roman"/>
+        </w:rPr>
+      </w:pPr>
+      <w:r>
+        <w:rPr>
+          <w:rFonts w:ascii="Times New Roman" w:hAnsi="Times New Roman" w:cs="Times New Roman"/>
+        </w:rPr>
+        <w:t xml:space="preserve">3.- you can now save a table with the spectrogram data too with </w:t>
+      </w:r>
+      <w:proofErr w:type="spellStart"/>
+      <w:proofErr w:type="gramStart"/>
+      <w:r>
+        <w:rPr>
+          <w:rFonts w:ascii="Times New Roman" w:hAnsi="Times New Roman" w:cs="Times New Roman"/>
+          <w:b/>
+        </w:rPr>
+        <w:t>spectrogram.s</w:t>
+      </w:r>
+      <w:r>
+        <w:rPr>
+          <w:rFonts w:ascii="Times New Roman" w:hAnsi="Times New Roman" w:cs="Times New Roman"/>
+          <w:b/>
+          <w:i/>
+        </w:rPr>
+        <w:t>ave</w:t>
+      </w:r>
+      <w:proofErr w:type="gramEnd"/>
+      <w:r>
+        <w:rPr>
+          <w:rFonts w:ascii="Times New Roman" w:hAnsi="Times New Roman" w:cs="Times New Roman"/>
+          <w:b/>
+          <w:i/>
+        </w:rPr>
+        <w:t>_</w:t>
+      </w:r>
+      <w:proofErr w:type="gramStart"/>
+      <w:r>
+        <w:rPr>
+          <w:rFonts w:ascii="Times New Roman" w:hAnsi="Times New Roman" w:cs="Times New Roman"/>
+          <w:b/>
+          <w:i/>
+        </w:rPr>
+        <w:t>table</w:t>
+      </w:r>
+      <w:proofErr w:type="spellEnd"/>
+      <w:r>
+        <w:rPr>
+          <w:rFonts w:ascii="Times New Roman" w:hAnsi="Times New Roman" w:cs="Times New Roman"/>
+          <w:b/>
+          <w:i/>
+        </w:rPr>
+        <w:t>(</w:t>
+      </w:r>
+      <w:proofErr w:type="spellStart"/>
+      <w:proofErr w:type="gramEnd"/>
+      <w:r>
+        <w:rPr>
+          <w:rFonts w:ascii="Times New Roman" w:hAnsi="Times New Roman" w:cs="Times New Roman"/>
+          <w:b/>
+          <w:i/>
+        </w:rPr>
+        <w:t>source_name</w:t>
+      </w:r>
+      <w:proofErr w:type="spellEnd"/>
+      <w:r>
+        <w:rPr>
+          <w:rFonts w:ascii="Times New Roman" w:hAnsi="Times New Roman" w:cs="Times New Roman"/>
+          <w:b/>
+          <w:i/>
+        </w:rPr>
+        <w:t xml:space="preserve">, </w:t>
+      </w:r>
+      <w:proofErr w:type="spellStart"/>
+      <w:r>
+        <w:rPr>
+          <w:rFonts w:ascii="Times New Roman" w:hAnsi="Times New Roman" w:cs="Times New Roman"/>
+          <w:b/>
+          <w:i/>
+        </w:rPr>
+        <w:t>output_dir</w:t>
+      </w:r>
+      <w:proofErr w:type="spellEnd"/>
+      <w:r>
+        <w:rPr>
+          <w:rFonts w:ascii="Times New Roman" w:hAnsi="Times New Roman" w:cs="Times New Roman"/>
+          <w:b/>
+          <w:i/>
+        </w:rPr>
+        <w:t>)</w:t>
+      </w:r>
+      <w:r>
+        <w:rPr>
+          <w:rFonts w:ascii="Times New Roman" w:hAnsi="Times New Roman" w:cs="Times New Roman"/>
+        </w:rPr>
+        <w:t xml:space="preserve"> I suggest using the same naming convention, although this, for the moment at least, can’t be loaded, so it is not so critical.</w:t>
+      </w:r>
+    </w:p>
+    <w:p>
+      <w:pPr>
+        <w:rPr>
+          <w:rFonts w:ascii="Times New Roman" w:hAnsi="Times New Roman" w:cs="Times New Roman"/>
+        </w:rPr>
+      </w:pPr>
+      <w:r>
+        <w:rPr>
+          <w:rFonts w:ascii="Times New Roman" w:hAnsi="Times New Roman" w:cs="Times New Roman"/>
+        </w:rPr>
+        <w:t xml:space="preserve">4.- get average power and peak power densities with </w:t>
+      </w:r>
+      <w:proofErr w:type="spellStart"/>
+      <w:proofErr w:type="gramStart"/>
+      <w:r>
+        <w:rPr>
+          <w:rFonts w:ascii="Times New Roman" w:hAnsi="Times New Roman" w:cs="Times New Roman"/>
+          <w:b/>
+        </w:rPr>
+        <w:t>spectrogram.compute</w:t>
+      </w:r>
+      <w:proofErr w:type="gramEnd"/>
+      <w:r>
+        <w:rPr>
+          <w:rFonts w:ascii="Times New Roman" w:hAnsi="Times New Roman" w:cs="Times New Roman"/>
+          <w:b/>
+        </w:rPr>
+        <w:t>_power_</w:t>
+      </w:r>
+      <w:proofErr w:type="gramStart"/>
+      <w:r>
+        <w:rPr>
+          <w:rFonts w:ascii="Times New Roman" w:hAnsi="Times New Roman" w:cs="Times New Roman"/>
+          <w:b/>
+        </w:rPr>
+        <w:t>metrics</w:t>
+      </w:r>
+      <w:proofErr w:type="spellEnd"/>
+      <w:r>
+        <w:rPr>
+          <w:rFonts w:ascii="Times New Roman" w:hAnsi="Times New Roman" w:cs="Times New Roman"/>
+          <w:b/>
+        </w:rPr>
+        <w:t>(</w:t>
+      </w:r>
+      <w:proofErr w:type="gramEnd"/>
+      <w:r>
+        <w:rPr>
+          <w:rFonts w:ascii="Times New Roman" w:hAnsi="Times New Roman" w:cs="Times New Roman"/>
+          <w:b/>
+        </w:rPr>
+        <w:t>)</w:t>
+      </w:r>
+      <w:r>
+        <w:rPr>
+          <w:rFonts w:ascii="Times New Roman" w:hAnsi="Times New Roman" w:cs="Times New Roman"/>
+          <w:b/>
+        </w:rPr>
+        <w:t xml:space="preserve">. </w:t>
+      </w:r>
+      <w:r>
+        <w:rPr>
+          <w:rFonts w:ascii="Times New Roman" w:hAnsi="Times New Roman" w:cs="Times New Roman"/>
+        </w:rPr>
+        <w:t xml:space="preserve">This will return APD and PPD and return them on that order. Units currently are </w:t>
+      </w:r>
+      <w:proofErr w:type="spellStart"/>
+      <w:r>
+        <w:rPr>
+          <w:rFonts w:ascii="Times New Roman" w:hAnsi="Times New Roman" w:cs="Times New Roman"/>
+        </w:rPr>
+        <w:t>dB.</w:t>
+      </w:r>
+      <w:proofErr w:type="spellEnd"/>
+    </w:p>
+    <w:p>
+      <w:pPr>
+        <w:rPr>
+          <w:rFonts w:ascii="Times New Roman" w:hAnsi="Times New Roman" w:cs="Times New Roman"/>
+        </w:rPr>
+      </w:pPr>
+      <w:r>
+        <w:rPr>
+          <w:rFonts w:ascii="Times New Roman" w:hAnsi="Times New Roman" w:cs="Times New Roman"/>
+        </w:rPr>
+        <w:t>With these functions, you should be able to cut, your own stridulations, just remember the time frame is important. You must make a decision at the beginning, how long will snippets be for the model? Then stick to that length to preserve proportions. Then, it is technically possible to just do this by hand and create all the data by yourself. But later on I will explain how to automatically batch-process big files. However this part of the tutorial is relevant for you to understand how your pipeline works and what is happening on the backstage. Also, to sometimes manually cut one particular stridulation or make some more augmentations.</w:t>
+      </w:r>
+    </w:p>
+    <w:p>
+      <w:pPr>
+        <w:spacing w:after="0"/>
+        <w:rPr>
+          <w:rFonts w:ascii="Times New Roman" w:hAnsi="Times New Roman" w:cs="Times New Roman"/>
+        </w:rPr>
+      </w:pPr>
+      <w:r>
+        <w:rPr>
+          <w:rFonts w:ascii="Times New Roman" w:hAnsi="Times New Roman" w:cs="Times New Roman"/>
+        </w:rPr>
+        <w:t>Finally, if you are working on already saved snippets, I have added a loading function for them so you don’t have to be cutting the same snippet once and again.</w:t>
+      </w:r>
+    </w:p>
+    <w:p>
+      <w:pPr>
+        <w:spacing w:after="0"/>
+        <w:rPr>
+          <w:rFonts w:ascii="Times New Roman" w:hAnsi="Times New Roman" w:cs="Times New Roman"/>
+        </w:rPr>
+      </w:pPr>
+      <w:r>
+        <w:rPr>
+          <w:rFonts w:ascii="Times New Roman" w:hAnsi="Times New Roman" w:cs="Times New Roman"/>
+          <w:b/>
+          <w:bCs/>
+          <w:i/>
+          <w:iCs/>
+        </w:rPr>
+        <w:t xml:space="preserve">Snippet = </w:t>
+      </w:r>
+      <w:proofErr w:type="spellStart"/>
+      <w:r>
+        <w:rPr>
+          <w:rFonts w:ascii="Times New Roman" w:hAnsi="Times New Roman" w:cs="Times New Roman"/>
+          <w:b/>
+          <w:bCs/>
+          <w:i/>
+          <w:iCs/>
+        </w:rPr>
+        <w:t>st.</w:t>
+      </w:r>
+      <w:r>
+        <w:rPr>
+          <w:rFonts w:ascii="Times New Roman" w:hAnsi="Times New Roman" w:cs="Times New Roman"/>
+          <w:b/>
+          <w:bCs/>
+          <w:i/>
+          <w:iCs/>
+        </w:rPr>
+        <w:t>load_snippet</w:t>
+      </w:r>
+      <w:proofErr w:type="spellEnd"/>
+      <w:r>
+        <w:rPr>
+          <w:rFonts w:ascii="Times New Roman" w:hAnsi="Times New Roman" w:cs="Times New Roman"/>
+          <w:b/>
+          <w:bCs/>
+          <w:i/>
+          <w:iCs/>
+        </w:rPr>
+        <w:t>(</w:t>
+      </w:r>
+      <w:proofErr w:type="spellStart"/>
+      <w:r>
+        <w:rPr>
+          <w:rFonts w:ascii="Times New Roman" w:hAnsi="Times New Roman" w:cs="Times New Roman"/>
+          <w:b/>
+          <w:bCs/>
+          <w:i/>
+          <w:iCs/>
+        </w:rPr>
+        <w:t>file_path</w:t>
+      </w:r>
+      <w:proofErr w:type="spellEnd"/>
+      <w:r>
+        <w:rPr>
+          <w:rFonts w:ascii="Times New Roman" w:hAnsi="Times New Roman" w:cs="Times New Roman"/>
+          <w:b/>
+          <w:bCs/>
+          <w:i/>
+          <w:iCs/>
+        </w:rPr>
+        <w:t>)</w:t>
+      </w:r>
+      <w:r>
+        <w:rPr>
+          <w:rFonts w:ascii="Times New Roman" w:hAnsi="Times New Roman" w:cs="Times New Roman"/>
+        </w:rPr>
+        <w:t xml:space="preserve"> will load the audio snippet file as a snippet already, and will catch from the name the length and other attributes, so you can resume your work on a snippet without loading the file and cutting it again.</w:t>
+      </w:r>
+    </w:p>
+    <w:p>
+      <w:pPr>
+        <w:rPr>
+          <w:rFonts w:ascii="Times New Roman" w:hAnsi="Times New Roman" w:cs="Times New Roman"/>
+          <w:b/>
+          <w:bCs/>
+        </w:rPr>
+      </w:pPr>
+    </w:p>
+    <w:p>
+      <w:pPr>
+        <w:pStyle w:val="Ttulo1"/>
+      </w:pPr>
+      <w:r>
+        <w:t>Batch processing files</w:t>
+      </w:r>
+    </w:p>
+    <w:p>
+      <w:pPr>
+        <w:rPr>
+          <w:rFonts w:ascii="Times New Roman" w:hAnsi="Times New Roman" w:cs="Times New Roman"/>
+        </w:rPr>
+      </w:pPr>
+      <w:r>
+        <w:rPr>
+          <w:rFonts w:ascii="Times New Roman" w:hAnsi="Times New Roman" w:cs="Times New Roman"/>
+        </w:rPr>
+        <w:t>When you work on big data files, it would be too time consuming to do all of the above manually. So I have given you some functions that will, using the above methodology, process long files and create the adequate folder structures so everything keeps paired. Bear in mind these functions create big amounts of files and quickly go into the GB size folders, you may want to keep it civilized and not have enormous amounts of these on your hard drive. In the pipeline script you will find an easy to reuse code for doing these, although some of the logic of that code will over time become part of the package, for now that is your best way to do all of this. But generally speaking, you have two functions.</w:t>
+      </w:r>
+    </w:p>
+    <w:p>
+      <w:pPr>
+        <w:rPr>
+          <w:rFonts w:ascii="Times New Roman" w:hAnsi="Times New Roman" w:cs="Times New Roman"/>
+        </w:rPr>
+      </w:pPr>
+      <w:proofErr w:type="spellStart"/>
+      <w:r>
+        <w:rPr>
+          <w:rFonts w:ascii="Times New Roman" w:hAnsi="Times New Roman" w:cs="Times New Roman"/>
+          <w:b/>
+          <w:bCs/>
+          <w:i/>
+          <w:iCs/>
+        </w:rPr>
+        <w:t>process_audio_</w:t>
+      </w:r>
+      <w:proofErr w:type="gramStart"/>
+      <w:r>
+        <w:rPr>
+          <w:rFonts w:ascii="Times New Roman" w:hAnsi="Times New Roman" w:cs="Times New Roman"/>
+          <w:b/>
+          <w:bCs/>
+          <w:i/>
+          <w:iCs/>
+        </w:rPr>
+        <w:t>file</w:t>
+      </w:r>
+      <w:proofErr w:type="spellEnd"/>
+      <w:r>
+        <w:rPr>
+          <w:rFonts w:ascii="Times New Roman" w:hAnsi="Times New Roman" w:cs="Times New Roman"/>
+          <w:b/>
+          <w:bCs/>
+          <w:i/>
+          <w:iCs/>
+        </w:rPr>
+        <w:t>(</w:t>
+      </w:r>
+      <w:proofErr w:type="spellStart"/>
+      <w:proofErr w:type="gramEnd"/>
+      <w:r>
+        <w:rPr>
+          <w:rFonts w:ascii="Times New Roman" w:hAnsi="Times New Roman" w:cs="Times New Roman"/>
+          <w:b/>
+          <w:bCs/>
+          <w:i/>
+          <w:iCs/>
+        </w:rPr>
+        <w:t>audio_path</w:t>
+      </w:r>
+      <w:proofErr w:type="spellEnd"/>
+      <w:r>
+        <w:rPr>
+          <w:rFonts w:ascii="Times New Roman" w:hAnsi="Times New Roman" w:cs="Times New Roman"/>
+          <w:b/>
+          <w:bCs/>
+          <w:i/>
+          <w:iCs/>
+        </w:rPr>
+        <w:t xml:space="preserve">, </w:t>
+      </w:r>
+      <w:proofErr w:type="spellStart"/>
+      <w:r>
+        <w:rPr>
+          <w:rFonts w:ascii="Times New Roman" w:hAnsi="Times New Roman" w:cs="Times New Roman"/>
+          <w:b/>
+          <w:bCs/>
+          <w:i/>
+          <w:iCs/>
+        </w:rPr>
+        <w:t>snippet_duration</w:t>
+      </w:r>
+      <w:proofErr w:type="spellEnd"/>
+      <w:r>
+        <w:rPr>
+          <w:rFonts w:ascii="Times New Roman" w:hAnsi="Times New Roman" w:cs="Times New Roman"/>
+          <w:b/>
+          <w:bCs/>
+          <w:i/>
+          <w:iCs/>
+        </w:rPr>
+        <w:t xml:space="preserve">=2, </w:t>
+      </w:r>
+      <w:proofErr w:type="spellStart"/>
+      <w:r>
+        <w:rPr>
+          <w:rFonts w:ascii="Times New Roman" w:hAnsi="Times New Roman" w:cs="Times New Roman"/>
+          <w:b/>
+          <w:bCs/>
+          <w:i/>
+          <w:iCs/>
+        </w:rPr>
+        <w:t>with_labels</w:t>
+      </w:r>
+      <w:proofErr w:type="spellEnd"/>
+      <w:r>
+        <w:rPr>
+          <w:rFonts w:ascii="Times New Roman" w:hAnsi="Times New Roman" w:cs="Times New Roman"/>
+          <w:b/>
+          <w:bCs/>
+          <w:i/>
+          <w:iCs/>
+        </w:rPr>
+        <w:t xml:space="preserve">=False, </w:t>
+      </w:r>
+      <w:proofErr w:type="spellStart"/>
+      <w:r>
+        <w:rPr>
+          <w:rFonts w:ascii="Times New Roman" w:hAnsi="Times New Roman" w:cs="Times New Roman"/>
+          <w:b/>
+          <w:bCs/>
+          <w:i/>
+          <w:iCs/>
+        </w:rPr>
+        <w:t>spec_type</w:t>
+      </w:r>
+      <w:proofErr w:type="spellEnd"/>
+      <w:r>
+        <w:rPr>
+          <w:rFonts w:ascii="Times New Roman" w:hAnsi="Times New Roman" w:cs="Times New Roman"/>
+          <w:b/>
+          <w:bCs/>
+          <w:i/>
+          <w:iCs/>
+        </w:rPr>
+        <w:t xml:space="preserve">="mel", </w:t>
+      </w:r>
+      <w:proofErr w:type="spellStart"/>
+      <w:r>
+        <w:rPr>
+          <w:rFonts w:ascii="Times New Roman" w:hAnsi="Times New Roman" w:cs="Times New Roman"/>
+          <w:b/>
+          <w:bCs/>
+          <w:i/>
+          <w:iCs/>
+        </w:rPr>
+        <w:t>color</w:t>
+      </w:r>
+      <w:proofErr w:type="spellEnd"/>
+      <w:r>
+        <w:rPr>
+          <w:rFonts w:ascii="Times New Roman" w:hAnsi="Times New Roman" w:cs="Times New Roman"/>
+          <w:b/>
+          <w:bCs/>
+          <w:i/>
+          <w:iCs/>
+        </w:rPr>
+        <w:t xml:space="preserve"> = "inferno", </w:t>
+      </w:r>
+      <w:proofErr w:type="spellStart"/>
+      <w:r>
+        <w:rPr>
+          <w:rFonts w:ascii="Times New Roman" w:hAnsi="Times New Roman" w:cs="Times New Roman"/>
+          <w:b/>
+          <w:bCs/>
+          <w:i/>
+          <w:iCs/>
+        </w:rPr>
+        <w:t>output_folder</w:t>
+      </w:r>
+      <w:proofErr w:type="spellEnd"/>
+      <w:r>
+        <w:rPr>
+          <w:rFonts w:ascii="Times New Roman" w:hAnsi="Times New Roman" w:cs="Times New Roman"/>
+          <w:b/>
+          <w:bCs/>
+          <w:i/>
+          <w:iCs/>
+        </w:rPr>
+        <w:t xml:space="preserve">=None, </w:t>
+      </w:r>
+      <w:proofErr w:type="spellStart"/>
+      <w:r>
+        <w:rPr>
+          <w:rFonts w:ascii="Times New Roman" w:hAnsi="Times New Roman" w:cs="Times New Roman"/>
+          <w:b/>
+          <w:bCs/>
+          <w:i/>
+          <w:iCs/>
+        </w:rPr>
+        <w:t>update_freq</w:t>
+      </w:r>
+      <w:proofErr w:type="spellEnd"/>
+      <w:r>
+        <w:rPr>
+          <w:rFonts w:ascii="Times New Roman" w:hAnsi="Times New Roman" w:cs="Times New Roman"/>
+          <w:b/>
+          <w:bCs/>
+          <w:i/>
+          <w:iCs/>
+        </w:rPr>
+        <w:t>=10):</w:t>
+      </w:r>
+      <w:r>
+        <w:rPr>
+          <w:rFonts w:ascii="Times New Roman" w:hAnsi="Times New Roman" w:cs="Times New Roman"/>
+          <w:b/>
+          <w:bCs/>
+          <w:i/>
+          <w:iCs/>
+        </w:rPr>
+        <w:t xml:space="preserve"> </w:t>
+      </w:r>
+      <w:r>
+        <w:rPr>
+          <w:rFonts w:ascii="Times New Roman" w:hAnsi="Times New Roman" w:cs="Times New Roman"/>
+        </w:rPr>
+        <w:t xml:space="preserve">here you type the path to your audio file, and the </w:t>
+      </w:r>
+      <w:proofErr w:type="spellStart"/>
+      <w:r>
+        <w:rPr>
+          <w:rFonts w:ascii="Times New Roman" w:hAnsi="Times New Roman" w:cs="Times New Roman"/>
+        </w:rPr>
+        <w:t>kwargs</w:t>
+      </w:r>
+      <w:proofErr w:type="spellEnd"/>
+      <w:r>
+        <w:rPr>
+          <w:rFonts w:ascii="Times New Roman" w:hAnsi="Times New Roman" w:cs="Times New Roman"/>
+        </w:rPr>
+        <w:t xml:space="preserve"> if you need them. As you see, </w:t>
+      </w:r>
+      <w:proofErr w:type="spellStart"/>
+      <w:r>
+        <w:rPr>
+          <w:rFonts w:ascii="Times New Roman" w:hAnsi="Times New Roman" w:cs="Times New Roman"/>
+        </w:rPr>
+        <w:t>snippet_duration</w:t>
+      </w:r>
+      <w:proofErr w:type="spellEnd"/>
+      <w:r>
+        <w:rPr>
+          <w:rFonts w:ascii="Times New Roman" w:hAnsi="Times New Roman" w:cs="Times New Roman"/>
+        </w:rPr>
+        <w:t xml:space="preserve"> defaults to 2 seconds, and </w:t>
+      </w:r>
+      <w:proofErr w:type="spellStart"/>
+      <w:r>
+        <w:rPr>
+          <w:rFonts w:ascii="Times New Roman" w:hAnsi="Times New Roman" w:cs="Times New Roman"/>
+        </w:rPr>
+        <w:lastRenderedPageBreak/>
+        <w:t>output_folder</w:t>
+      </w:r>
+      <w:proofErr w:type="spellEnd"/>
+      <w:r>
+        <w:rPr>
+          <w:rFonts w:ascii="Times New Roman" w:hAnsi="Times New Roman" w:cs="Times New Roman"/>
+        </w:rPr>
+        <w:t xml:space="preserve"> to none, which should create a folder with the name of the sound file and store things there. That folder will be filled in with 2 subfolders, one with the snippets, and one with the spectrograms.</w:t>
+      </w:r>
+      <w:r>
+        <w:rPr>
+          <w:rFonts w:ascii="Times New Roman" w:hAnsi="Times New Roman" w:cs="Times New Roman"/>
+        </w:rPr>
+        <w:t xml:space="preserve"> I have just now added ad labels toggle, make it true for visualization, but keep it off for AI training purposes. You can also change the spectrogram type between the three options available (</w:t>
+      </w:r>
+      <w:proofErr w:type="spellStart"/>
+      <w:r>
+        <w:rPr>
+          <w:rFonts w:ascii="Times New Roman" w:hAnsi="Times New Roman" w:cs="Times New Roman"/>
+        </w:rPr>
+        <w:t>fft</w:t>
+      </w:r>
+      <w:proofErr w:type="spellEnd"/>
+      <w:r>
+        <w:rPr>
+          <w:rFonts w:ascii="Times New Roman" w:hAnsi="Times New Roman" w:cs="Times New Roman"/>
+        </w:rPr>
+        <w:t xml:space="preserve">, mel, or Hilbert, but be aware Hilbert can be very slow). And since I was at it, I added a </w:t>
+      </w:r>
+      <w:proofErr w:type="spellStart"/>
+      <w:r>
+        <w:rPr>
+          <w:rFonts w:ascii="Times New Roman" w:hAnsi="Times New Roman" w:cs="Times New Roman"/>
+        </w:rPr>
+        <w:t>color</w:t>
+      </w:r>
+      <w:proofErr w:type="spellEnd"/>
+      <w:r>
+        <w:rPr>
+          <w:rFonts w:ascii="Times New Roman" w:hAnsi="Times New Roman" w:cs="Times New Roman"/>
+        </w:rPr>
+        <w:t xml:space="preserve"> option. It will draw colormaps from matplotlib, so you can use </w:t>
+      </w:r>
+      <w:proofErr w:type="spellStart"/>
+      <w:proofErr w:type="gramStart"/>
+      <w:r>
+        <w:rPr>
+          <w:rFonts w:ascii="Times New Roman" w:hAnsi="Times New Roman" w:cs="Times New Roman"/>
+          <w:b/>
+          <w:bCs/>
+        </w:rPr>
+        <w:t>plt.colormaps</w:t>
+      </w:r>
+      <w:proofErr w:type="spellEnd"/>
+      <w:proofErr w:type="gramEnd"/>
+      <w:r>
+        <w:rPr>
+          <w:rFonts w:ascii="Times New Roman" w:hAnsi="Times New Roman" w:cs="Times New Roman"/>
+          <w:b/>
+          <w:bCs/>
+        </w:rPr>
         <w:t>()</w:t>
       </w:r>
       <w:r>
         <w:rPr>
           <w:rFonts w:ascii="Times New Roman" w:hAnsi="Times New Roman" w:cs="Times New Roman"/>
-        </w:rPr>
-        <w:t>. This will only show it on screen for you to inspect.</w:t>
-      </w:r>
-    </w:p>
-    <w:p>
-      <w:pPr>
-        <w:spacing w:after="0"/>
-        <w:rPr>
-          <w:rFonts w:ascii="Times New Roman" w:hAnsi="Times New Roman" w:cs="Times New Roman"/>
-        </w:rPr>
-      </w:pPr>
-      <w:r>
-        <w:rPr>
-          <w:rFonts w:ascii="Times New Roman" w:hAnsi="Times New Roman" w:cs="Times New Roman"/>
-        </w:rPr>
-        <w:t xml:space="preserve">2.- you can save it with </w:t>
-      </w:r>
-      <w:r>
-        <w:rPr>
-          <w:rFonts w:ascii="Times New Roman" w:hAnsi="Times New Roman" w:cs="Times New Roman"/>
-          <w:b/>
-          <w:bCs/>
-          <w:i/>
-          <w:iCs/>
-        </w:rPr>
-        <w:t>spectrogram_</w:t>
-      </w:r>
+          <w:b/>
+          <w:bCs/>
+        </w:rPr>
+        <w:t xml:space="preserve"> </w:t>
+      </w:r>
+      <w:r>
+        <w:rPr>
+          <w:rFonts w:ascii="Times New Roman" w:hAnsi="Times New Roman" w:cs="Times New Roman"/>
+        </w:rPr>
+        <w:t>to</w:t>
+      </w:r>
+      <w:r>
+        <w:rPr>
+          <w:rFonts w:ascii="Times New Roman" w:hAnsi="Times New Roman" w:cs="Times New Roman"/>
+        </w:rPr>
+        <w:t xml:space="preserve"> see your options.</w:t>
+      </w:r>
+    </w:p>
+    <w:p>
+      <w:pPr>
+        <w:rPr>
+          <w:rFonts w:ascii="Times New Roman" w:hAnsi="Times New Roman" w:cs="Times New Roman"/>
+        </w:rPr>
+      </w:pPr>
+      <w:proofErr w:type="spellStart"/>
       <w:proofErr w:type="gramStart"/>
       <w:r>
         <w:rPr>
@@ -1736,7 +2599,7 @@
           <w:i/>
           <w:iCs/>
         </w:rPr>
-        <w:t>1.save</w:t>
+        <w:t>st.annotate</w:t>
       </w:r>
       <w:proofErr w:type="gramEnd"/>
       <w:r>
@@ -1758,8 +2621,9 @@
           <w:i/>
           <w:iCs/>
         </w:rPr>
-        <w:t>img</w:t>
-      </w:r>
+        <w:t>data</w:t>
+      </w:r>
+      <w:proofErr w:type="spellEnd"/>
       <w:r>
         <w:rPr>
           <w:rFonts w:ascii="Times New Roman" w:hAnsi="Times New Roman" w:cs="Times New Roman"/>
@@ -1779,18 +2643,28 @@
           <w:i/>
           <w:iCs/>
         </w:rPr>
-        <w:t xml:space="preserve">name, </w:t>
-      </w:r>
-      <w:proofErr w:type="spellStart"/>
-      <w:r>
-        <w:rPr>
-          <w:rFonts w:ascii="Times New Roman" w:hAnsi="Times New Roman" w:cs="Times New Roman"/>
-          <w:b/>
-          <w:bCs/>
-          <w:i/>
-          <w:iCs/>
-        </w:rPr>
-        <w:t>dir</w:t>
+        <w:t xml:space="preserve">notes, </w:t>
+      </w:r>
+      <w:proofErr w:type="spellStart"/>
+      <w:r>
+        <w:rPr>
+          <w:rFonts w:ascii="Times New Roman" w:hAnsi="Times New Roman" w:cs="Times New Roman"/>
+          <w:b/>
+          <w:bCs/>
+          <w:i/>
+          <w:iCs/>
+        </w:rPr>
+        <w:t>snip</w:t>
+      </w:r>
+      <w:r>
+        <w:rPr>
+          <w:rFonts w:ascii="Times New Roman" w:hAnsi="Times New Roman" w:cs="Times New Roman"/>
+          <w:b/>
+          <w:bCs/>
+          <w:i/>
+          <w:iCs/>
+        </w:rPr>
+        <w:t>_path</w:t>
       </w:r>
       <w:proofErr w:type="spellEnd"/>
       <w:r>
@@ -1812,49 +2686,95 @@
           <w:i/>
           <w:iCs/>
         </w:rPr>
-        <w:t>with_labels</w:t>
-      </w:r>
-      <w:proofErr w:type="spellEnd"/>
-      <w:r>
-        <w:rPr>
-          <w:rFonts w:ascii="Times New Roman" w:hAnsi="Times New Roman" w:cs="Times New Roman"/>
-          <w:b/>
-          <w:bCs/>
-          <w:i/>
-          <w:iCs/>
-        </w:rPr>
-        <w:t xml:space="preserve"> = False</w:t>
-      </w:r>
-      <w:r>
-        <w:rPr>
-          <w:rFonts w:ascii="Times New Roman" w:hAnsi="Times New Roman" w:cs="Times New Roman"/>
-          <w:b/>
-          <w:bCs/>
-          <w:i/>
-          <w:iCs/>
-        </w:rPr>
-        <w:t>)</w:t>
-      </w:r>
-      <w:r>
-        <w:rPr>
-          <w:rFonts w:ascii="Times New Roman" w:hAnsi="Times New Roman" w:cs="Times New Roman"/>
-        </w:rPr>
-        <w:t xml:space="preserve">. I suggest you follow the same naming conventions explained for snippets. The spectrogram will automatically receive time stamps and other flags from the snippet they come from. The </w:t>
-      </w:r>
-      <w:proofErr w:type="spellStart"/>
-      <w:r>
-        <w:rPr>
-          <w:rFonts w:ascii="Times New Roman" w:hAnsi="Times New Roman" w:cs="Times New Roman"/>
-        </w:rPr>
-        <w:t>with_labels</w:t>
-      </w:r>
-      <w:proofErr w:type="spellEnd"/>
-      <w:r>
-        <w:rPr>
-          <w:rFonts w:ascii="Times New Roman" w:hAnsi="Times New Roman" w:cs="Times New Roman"/>
+        <w:t>spec</w:t>
+      </w:r>
+      <w:r>
+        <w:rPr>
+          <w:rFonts w:ascii="Times New Roman" w:hAnsi="Times New Roman" w:cs="Times New Roman"/>
+          <w:b/>
+          <w:bCs/>
+          <w:i/>
+          <w:iCs/>
+        </w:rPr>
+        <w:t>_path</w:t>
+      </w:r>
+      <w:proofErr w:type="spellEnd"/>
+      <w:r>
+        <w:rPr>
+          <w:rFonts w:ascii="Times New Roman" w:hAnsi="Times New Roman" w:cs="Times New Roman"/>
+          <w:b/>
+          <w:bCs/>
+          <w:i/>
+          <w:iCs/>
+        </w:rPr>
+        <w:t xml:space="preserve">, </w:t>
+      </w:r>
+      <w:proofErr w:type="spellStart"/>
+      <w:r>
+        <w:rPr>
+          <w:rFonts w:ascii="Times New Roman" w:hAnsi="Times New Roman" w:cs="Times New Roman"/>
+          <w:b/>
+          <w:bCs/>
+          <w:i/>
+          <w:iCs/>
+        </w:rPr>
+        <w:t>snippet_duration</w:t>
+      </w:r>
+      <w:proofErr w:type="spellEnd"/>
+      <w:r>
+        <w:rPr>
+          <w:rFonts w:ascii="Times New Roman" w:hAnsi="Times New Roman" w:cs="Times New Roman"/>
+          <w:b/>
+          <w:bCs/>
+          <w:i/>
+          <w:iCs/>
+        </w:rPr>
+        <w:t xml:space="preserve">=2.0, </w:t>
+      </w:r>
+      <w:proofErr w:type="spellStart"/>
+      <w:r>
+        <w:rPr>
+          <w:rFonts w:ascii="Times New Roman" w:hAnsi="Times New Roman" w:cs="Times New Roman"/>
+          <w:b/>
+          <w:bCs/>
+          <w:i/>
+          <w:iCs/>
+        </w:rPr>
+        <w:t>csv_delim</w:t>
+      </w:r>
+      <w:proofErr w:type="spellEnd"/>
+      <w:r>
+        <w:rPr>
+          <w:rFonts w:ascii="Times New Roman" w:hAnsi="Times New Roman" w:cs="Times New Roman"/>
+          <w:b/>
+          <w:bCs/>
+          <w:i/>
+          <w:iCs/>
+        </w:rPr>
+        <w:t>='\t')</w:t>
+      </w:r>
+      <w:r>
+        <w:rPr>
+          <w:rFonts w:ascii="Times New Roman" w:hAnsi="Times New Roman" w:cs="Times New Roman"/>
+          <w:b/>
+          <w:bCs/>
+          <w:i/>
+          <w:iCs/>
         </w:rPr>
         <w:t xml:space="preserve"> </w:t>
       </w:r>
+      <w:r>
+        <w:rPr>
+          <w:rFonts w:ascii="Times New Roman" w:hAnsi="Times New Roman" w:cs="Times New Roman"/>
+        </w:rPr>
+        <w:t>once</w:t>
+      </w:r>
+      <w:r>
+        <w:rPr>
+          <w:rFonts w:ascii="Times New Roman" w:hAnsi="Times New Roman" w:cs="Times New Roman"/>
+        </w:rPr>
+        <w:t xml:space="preserve"> you have processed a file, in the case you are working on training data, you can use your annotations to automatically distribute your files for training. These part of the logic is incomplete for the moment and will change soon, for now it is best for you to run it from the pipeline script. You will use the notes, which is a .txt file saved as tab delimited, path to the snippets and spectrograms that belong with that set of notes, and the snippet duration that you used (defaulted to 2, so use as </w:t>
+      </w:r>
       <w:proofErr w:type="spellStart"/>
       <w:r>
         <w:rPr>
@@ -1867,45 +2787,103 @@
         <w:rPr>
           <w:rFonts w:ascii="Times New Roman" w:hAnsi="Times New Roman" w:cs="Times New Roman"/>
         </w:rPr>
-        <w:t xml:space="preserve"> will default to false (you don’t have write it unless you want it True). This means that the spectrogram will be saved without axis colour codes or other things. That is the way you want them to be in your AI models, but for presentations or papers, you can turn it true and it will give you something more human readable.</w:t>
-      </w:r>
-    </w:p>
-    <w:p>
-      <w:pPr>
-        <w:spacing w:after="0"/>
-        <w:rPr>
-          <w:rFonts w:ascii="Times New Roman" w:hAnsi="Times New Roman" w:cs="Times New Roman"/>
-        </w:rPr>
-      </w:pPr>
-      <w:r>
-        <w:rPr>
-          <w:rFonts w:ascii="Times New Roman" w:hAnsi="Times New Roman" w:cs="Times New Roman"/>
-        </w:rPr>
-        <w:t xml:space="preserve">3.- you can now save a table with the spectrogram data too with </w:t>
+        <w:t xml:space="preserve">). The last </w:t>
+      </w:r>
+      <w:proofErr w:type="spellStart"/>
+      <w:r>
+        <w:rPr>
+          <w:rFonts w:ascii="Times New Roman" w:hAnsi="Times New Roman" w:cs="Times New Roman"/>
+        </w:rPr>
+        <w:t>kwarg</w:t>
+      </w:r>
+      <w:proofErr w:type="spellEnd"/>
+      <w:r>
+        <w:rPr>
+          <w:rFonts w:ascii="Times New Roman" w:hAnsi="Times New Roman" w:cs="Times New Roman"/>
+        </w:rPr>
+        <w:t xml:space="preserve"> is not necessary if you saved your txt as tab delimited, but can be used in case you used comma. This function makes a split into positives </w:t>
       </w:r>
       <w:proofErr w:type="spellStart"/>
       <w:proofErr w:type="gramStart"/>
       <w:r>
         <w:rPr>
           <w:rFonts w:ascii="Times New Roman" w:hAnsi="Times New Roman" w:cs="Times New Roman"/>
-          <w:b/>
-        </w:rPr>
-        <w:t>spectrogram.s</w:t>
-      </w:r>
-      <w:r>
-        <w:rPr>
-          <w:rFonts w:ascii="Times New Roman" w:hAnsi="Times New Roman" w:cs="Times New Roman"/>
-          <w:b/>
-          <w:i/>
-        </w:rPr>
-        <w:t>ave</w:t>
-      </w:r>
+        </w:rPr>
+        <w:t>an</w:t>
+      </w:r>
+      <w:proofErr w:type="spellEnd"/>
       <w:proofErr w:type="gramEnd"/>
       <w:r>
         <w:rPr>
           <w:rFonts w:ascii="Times New Roman" w:hAnsi="Times New Roman" w:cs="Times New Roman"/>
-          <w:b/>
-          <w:i/>
+        </w:rPr>
+        <w:t xml:space="preserve"> negatives, from there you could use data augmentation, or go into training.</w:t>
+      </w:r>
+      <w:r>
+        <w:rPr>
+          <w:rFonts w:ascii="Times New Roman" w:hAnsi="Times New Roman" w:cs="Times New Roman"/>
+        </w:rPr>
+        <w:t xml:space="preserve"> It will split all the files on each of the separate files directories and (using the pipeline logic) create merged folders for training.</w:t>
+      </w:r>
+      <w:r>
+        <w:rPr>
+          <w:rFonts w:ascii="Times New Roman" w:hAnsi="Times New Roman" w:cs="Times New Roman"/>
+        </w:rPr>
+        <w:t xml:space="preserve"> </w:t>
+      </w:r>
+      <w:r>
+        <w:rPr>
+          <w:rFonts w:ascii="Times New Roman" w:hAnsi="Times New Roman" w:cs="Times New Roman"/>
+          <w:b/>
+          <w:bCs/>
+        </w:rPr>
+        <w:t>WARNING!</w:t>
+      </w:r>
+      <w:r>
+        <w:rPr>
+          <w:rFonts w:ascii="Times New Roman" w:hAnsi="Times New Roman" w:cs="Times New Roman"/>
+        </w:rPr>
+        <w:t xml:space="preserve"> This function assumes all that is not positive is negative. That is, for simplicity of the annotation, you only have to annotate positives. Be careful to add and filter out (if needed) dubious things so you don’t have positives on the negative training set.</w:t>
+      </w:r>
+    </w:p>
+    <w:p>
+      <w:pPr>
+        <w:rPr>
+          <w:rFonts w:ascii="Times New Roman" w:hAnsi="Times New Roman" w:cs="Times New Roman"/>
+          <w:bCs/>
+          <w:iCs/>
+        </w:rPr>
+      </w:pPr>
+      <w:proofErr w:type="spellStart"/>
+      <w:proofErr w:type="gramStart"/>
+      <w:r>
+        <w:rPr>
+          <w:rFonts w:ascii="Times New Roman" w:hAnsi="Times New Roman" w:cs="Times New Roman"/>
+          <w:b/>
+          <w:bCs/>
+          <w:i/>
+          <w:iCs/>
+        </w:rPr>
+        <w:t>st.n</w:t>
+      </w:r>
+      <w:r>
+        <w:rPr>
+          <w:rFonts w:ascii="Times New Roman" w:hAnsi="Times New Roman" w:cs="Times New Roman"/>
+          <w:b/>
+          <w:bCs/>
+          <w:i/>
+          <w:iCs/>
+        </w:rPr>
+        <w:t>ormalize</w:t>
+      </w:r>
+      <w:proofErr w:type="gramEnd"/>
+      <w:r>
+        <w:rPr>
+          <w:rFonts w:ascii="Times New Roman" w:hAnsi="Times New Roman" w:cs="Times New Roman"/>
+          <w:b/>
+          <w:bCs/>
+          <w:i/>
+          <w:iCs/>
         </w:rPr>
         <w:t>_</w:t>
       </w:r>
@@ -1914,16 +2892,20 @@
         <w:rPr>
           <w:rFonts w:ascii="Times New Roman" w:hAnsi="Times New Roman" w:cs="Times New Roman"/>
           <w:b/>
-          <w:i/>
-        </w:rPr>
-        <w:t>table</w:t>
-      </w:r>
-      <w:proofErr w:type="spellEnd"/>
-      <w:r>
-        <w:rPr>
-          <w:rFonts w:ascii="Times New Roman" w:hAnsi="Times New Roman" w:cs="Times New Roman"/>
-          <w:b/>
-          <w:i/>
+          <w:bCs/>
+          <w:i/>
+          <w:iCs/>
+        </w:rPr>
+        <w:t>global</w:t>
+      </w:r>
+      <w:proofErr w:type="spellEnd"/>
+      <w:r>
+        <w:rPr>
+          <w:rFonts w:ascii="Times New Roman" w:hAnsi="Times New Roman" w:cs="Times New Roman"/>
+          <w:b/>
+          <w:bCs/>
+          <w:i/>
+          <w:iCs/>
         </w:rPr>
         <w:t>(</w:t>
       </w:r>
@@ -1933,16 +2915,20 @@
         <w:rPr>
           <w:rFonts w:ascii="Times New Roman" w:hAnsi="Times New Roman" w:cs="Times New Roman"/>
           <w:b/>
-          <w:i/>
-        </w:rPr>
-        <w:t>source_name</w:t>
-      </w:r>
-      <w:proofErr w:type="spellEnd"/>
-      <w:r>
-        <w:rPr>
-          <w:rFonts w:ascii="Times New Roman" w:hAnsi="Times New Roman" w:cs="Times New Roman"/>
-          <w:b/>
-          <w:i/>
+          <w:bCs/>
+          <w:i/>
+          <w:iCs/>
+        </w:rPr>
+        <w:t>input_dir</w:t>
+      </w:r>
+      <w:proofErr w:type="spellEnd"/>
+      <w:r>
+        <w:rPr>
+          <w:rFonts w:ascii="Times New Roman" w:hAnsi="Times New Roman" w:cs="Times New Roman"/>
+          <w:b/>
+          <w:bCs/>
+          <w:i/>
+          <w:iCs/>
         </w:rPr>
         <w:t xml:space="preserve">, </w:t>
       </w:r>
@@ -1951,7 +2937,9 @@
         <w:rPr>
           <w:rFonts w:ascii="Times New Roman" w:hAnsi="Times New Roman" w:cs="Times New Roman"/>
           <w:b/>
-          <w:i/>
+          <w:bCs/>
+          <w:i/>
+          <w:iCs/>
         </w:rPr>
         <w:t>output_dir</w:t>
       </w:r>
@@ -1960,919 +2948,193 @@
         <w:rPr>
           <w:rFonts w:ascii="Times New Roman" w:hAnsi="Times New Roman" w:cs="Times New Roman"/>
           <w:b/>
-          <w:i/>
-        </w:rPr>
-        <w:t>)</w:t>
-      </w:r>
-      <w:r>
-        <w:rPr>
-          <w:rFonts w:ascii="Times New Roman" w:hAnsi="Times New Roman" w:cs="Times New Roman"/>
-        </w:rPr>
-        <w:t xml:space="preserve"> I suggest using the same naming convention, although this, for the moment at least, can’t be loaded, so it is not so critical.</w:t>
-      </w:r>
-    </w:p>
-    <w:p>
-      <w:pPr>
-        <w:rPr>
-          <w:rFonts w:ascii="Times New Roman" w:hAnsi="Times New Roman" w:cs="Times New Roman"/>
-        </w:rPr>
-      </w:pPr>
-      <w:r>
-        <w:rPr>
-          <w:rFonts w:ascii="Times New Roman" w:hAnsi="Times New Roman" w:cs="Times New Roman"/>
-        </w:rPr>
-        <w:t xml:space="preserve">4.- get average power and peak power densities with </w:t>
-      </w:r>
-      <w:proofErr w:type="spellStart"/>
+          <w:bCs/>
+          <w:i/>
+          <w:iCs/>
+        </w:rPr>
+        <w:t xml:space="preserve">, </w:t>
+      </w:r>
+      <w:proofErr w:type="spellStart"/>
+      <w:r>
+        <w:rPr>
+          <w:rFonts w:ascii="Times New Roman" w:hAnsi="Times New Roman" w:cs="Times New Roman"/>
+          <w:b/>
+          <w:bCs/>
+          <w:i/>
+          <w:iCs/>
+        </w:rPr>
+        <w:t>target_max</w:t>
+      </w:r>
+      <w:proofErr w:type="spellEnd"/>
+      <w:r>
+        <w:rPr>
+          <w:rFonts w:ascii="Times New Roman" w:hAnsi="Times New Roman" w:cs="Times New Roman"/>
+          <w:b/>
+          <w:bCs/>
+          <w:i/>
+          <w:iCs/>
+        </w:rPr>
+        <w:t xml:space="preserve"> = 0.75):</w:t>
+      </w:r>
+      <w:r>
+        <w:rPr>
+          <w:rFonts w:ascii="Times New Roman" w:hAnsi="Times New Roman" w:cs="Times New Roman"/>
+          <w:bCs/>
+          <w:iCs/>
+        </w:rPr>
+        <w:t xml:space="preserve"> this allows for normalization of several files to one single peak. So, if you wanted to normalize a whole set of files to their overall maximum, you put them in a folder and run this. It should create a new folder with all files normalized. It might be useful to normalize by microphone or whole experiments. We will see what Sara thinks later.</w:t>
+      </w:r>
+    </w:p>
+    <w:p>
+      <w:pPr>
+        <w:rPr>
+          <w:rFonts w:ascii="Times New Roman" w:hAnsi="Times New Roman" w:cs="Times New Roman"/>
+        </w:rPr>
+      </w:pPr>
+      <w:proofErr w:type="spellStart"/>
+      <w:r>
+        <w:rPr>
+          <w:rFonts w:ascii="Times New Roman" w:hAnsi="Times New Roman" w:cs="Times New Roman"/>
+          <w:b/>
+          <w:bCs/>
+          <w:i/>
+          <w:iCs/>
+        </w:rPr>
+        <w:t>st.</w:t>
+      </w:r>
+      <w:proofErr w:type="spellEnd"/>
+      <w:r>
+        <w:t xml:space="preserve"> </w:t>
+      </w:r>
+      <w:proofErr w:type="spellStart"/>
+      <w:r>
+        <w:rPr>
+          <w:rFonts w:ascii="Times New Roman" w:hAnsi="Times New Roman" w:cs="Times New Roman"/>
+          <w:b/>
+          <w:bCs/>
+          <w:i/>
+          <w:iCs/>
+        </w:rPr>
+        <w:t>highpass_</w:t>
+      </w:r>
       <w:proofErr w:type="gramStart"/>
       <w:r>
         <w:rPr>
           <w:rFonts w:ascii="Times New Roman" w:hAnsi="Times New Roman" w:cs="Times New Roman"/>
           <w:b/>
-        </w:rPr>
-        <w:t>spectrogram.compute</w:t>
+          <w:bCs/>
+          <w:i/>
+          <w:iCs/>
+        </w:rPr>
+        <w:t>filter</w:t>
+      </w:r>
+      <w:proofErr w:type="spellEnd"/>
+      <w:r>
+        <w:rPr>
+          <w:rFonts w:ascii="Times New Roman" w:hAnsi="Times New Roman" w:cs="Times New Roman"/>
+          <w:b/>
+          <w:bCs/>
+          <w:i/>
+          <w:iCs/>
+        </w:rPr>
+        <w:t>(</w:t>
       </w:r>
       <w:proofErr w:type="gramEnd"/>
       <w:r>
         <w:rPr>
           <w:rFonts w:ascii="Times New Roman" w:hAnsi="Times New Roman" w:cs="Times New Roman"/>
           <w:b/>
-        </w:rPr>
-        <w:t>_power_</w:t>
-      </w:r>
-      <w:proofErr w:type="gramStart"/>
-      <w:r>
-        <w:rPr>
-          <w:rFonts w:ascii="Times New Roman" w:hAnsi="Times New Roman" w:cs="Times New Roman"/>
-          <w:b/>
-        </w:rPr>
-        <w:t>metrics</w:t>
-      </w:r>
-      <w:proofErr w:type="spellEnd"/>
-      <w:r>
-        <w:rPr>
-          <w:rFonts w:ascii="Times New Roman" w:hAnsi="Times New Roman" w:cs="Times New Roman"/>
-          <w:b/>
-        </w:rPr>
-        <w:t>(</w:t>
-      </w:r>
-      <w:proofErr w:type="gramEnd"/>
-      <w:r>
-        <w:rPr>
-          <w:rFonts w:ascii="Times New Roman" w:hAnsi="Times New Roman" w:cs="Times New Roman"/>
-          <w:b/>
-        </w:rPr>
-        <w:t>)</w:t>
-      </w:r>
-      <w:r>
-        <w:rPr>
-          <w:rFonts w:ascii="Times New Roman" w:hAnsi="Times New Roman" w:cs="Times New Roman"/>
-          <w:b/>
+          <w:bCs/>
+          <w:i/>
+          <w:iCs/>
+        </w:rPr>
+        <w:t xml:space="preserve">audio, </w:t>
+      </w:r>
+      <w:proofErr w:type="spellStart"/>
+      <w:r>
+        <w:rPr>
+          <w:rFonts w:ascii="Times New Roman" w:hAnsi="Times New Roman" w:cs="Times New Roman"/>
+          <w:b/>
+          <w:bCs/>
+          <w:i/>
+          <w:iCs/>
+        </w:rPr>
+        <w:t>sr</w:t>
+      </w:r>
+      <w:proofErr w:type="spellEnd"/>
+      <w:r>
+        <w:rPr>
+          <w:rFonts w:ascii="Times New Roman" w:hAnsi="Times New Roman" w:cs="Times New Roman"/>
+          <w:b/>
+          <w:bCs/>
+          <w:i/>
+          <w:iCs/>
+        </w:rPr>
+        <w:t>, cutoff=3000, order=8):</w:t>
+      </w:r>
+      <w:r>
+        <w:rPr>
+          <w:rFonts w:ascii="Times New Roman" w:hAnsi="Times New Roman" w:cs="Times New Roman"/>
+        </w:rPr>
+        <w:t xml:space="preserve"> on Jeremy’s request, I added a function to apply a high pass filter to audio files. The default is Mario’s anti-rain filter. H</w:t>
+      </w:r>
+      <w:r>
+        <w:rPr>
+          <w:rFonts w:ascii="Times New Roman" w:hAnsi="Times New Roman" w:cs="Times New Roman"/>
+        </w:rPr>
+        <w:t xml:space="preserve">ere you can use the </w:t>
+      </w:r>
+      <w:proofErr w:type="spellStart"/>
+      <w:r>
+        <w:rPr>
+          <w:rFonts w:ascii="Times New Roman" w:hAnsi="Times New Roman" w:cs="Times New Roman"/>
+        </w:rPr>
+        <w:t>kwargs</w:t>
+      </w:r>
+      <w:proofErr w:type="spellEnd"/>
+      <w:r>
+        <w:rPr>
+          <w:rFonts w:ascii="Times New Roman" w:hAnsi="Times New Roman" w:cs="Times New Roman"/>
+        </w:rPr>
+        <w:t xml:space="preserve"> cutoff to set the </w:t>
+      </w:r>
+      <w:r>
+        <w:rPr>
+          <w:rFonts w:ascii="Times New Roman" w:hAnsi="Times New Roman" w:cs="Times New Roman"/>
+        </w:rPr>
+        <w:t xml:space="preserve">level below which you want to apply the filter (will remove </w:t>
+      </w:r>
+      <w:proofErr w:type="spellStart"/>
+      <w:r>
+        <w:rPr>
+          <w:rFonts w:ascii="Times New Roman" w:hAnsi="Times New Roman" w:cs="Times New Roman"/>
+        </w:rPr>
+        <w:t>freqs</w:t>
+      </w:r>
+      <w:proofErr w:type="spellEnd"/>
+      <w:r>
+        <w:rPr>
+          <w:rFonts w:ascii="Times New Roman" w:hAnsi="Times New Roman" w:cs="Times New Roman"/>
+        </w:rPr>
+        <w:t xml:space="preserve"> below this threshold)</w:t>
+      </w:r>
+      <w:r>
+        <w:rPr>
+          <w:rFonts w:ascii="Times New Roman" w:hAnsi="Times New Roman" w:cs="Times New Roman"/>
+        </w:rPr>
+        <w:t xml:space="preserve"> and order for the roll-off</w:t>
+      </w:r>
+      <w:r>
+        <w:rPr>
+          <w:rFonts w:ascii="Times New Roman" w:hAnsi="Times New Roman" w:cs="Times New Roman"/>
+        </w:rPr>
+        <w:t xml:space="preserve"> (which is how hard you want the filter to be, higher order, harder removal)</w:t>
+      </w:r>
+      <w:r>
+        <w:rPr>
+          <w:rFonts w:ascii="Times New Roman" w:hAnsi="Times New Roman" w:cs="Times New Roman"/>
         </w:rPr>
         <w:t xml:space="preserve">. </w:t>
-      </w:r>
-      <w:r>
-        <w:rPr>
-          <w:rFonts w:ascii="Times New Roman" w:hAnsi="Times New Roman" w:cs="Times New Roman"/>
-        </w:rPr>
-        <w:t xml:space="preserve">This will return APD and PPD and return them on that order. Units currently are </w:t>
-      </w:r>
-      <w:proofErr w:type="spellStart"/>
-      <w:r>
-        <w:rPr>
-          <w:rFonts w:ascii="Times New Roman" w:hAnsi="Times New Roman" w:cs="Times New Roman"/>
-        </w:rPr>
-        <w:t>dB.</w:t>
-      </w:r>
-      <w:proofErr w:type="spellEnd"/>
-    </w:p>
-    <w:p>
-      <w:pPr>
-        <w:rPr>
-          <w:rFonts w:ascii="Times New Roman" w:hAnsi="Times New Roman" w:cs="Times New Roman"/>
-        </w:rPr>
-      </w:pPr>
-      <w:r>
-        <w:rPr>
-          <w:rFonts w:ascii="Times New Roman" w:hAnsi="Times New Roman" w:cs="Times New Roman"/>
-        </w:rPr>
-        <w:t>With these functions, you should be able to cut, your own stridulations, just remember the time frame is important. You must make a decision at the beginning, how long will snippets be for the model? Then stick to that length to preserve proportions. Then, it is technically possible to just do this by hand and create all the data by yourself. But later on I will explain how to automatically batch-process big files. However this part of the tutorial is relevant for you to understand how your pipeline works and what is happening on the backstage. Also, to sometimes manually cut one particular stridulation or make some more augmentations.</w:t>
-      </w:r>
-    </w:p>
-    <w:p>
-      <w:pPr>
-        <w:spacing w:after="0"/>
-        <w:rPr>
-          <w:rFonts w:ascii="Times New Roman" w:hAnsi="Times New Roman" w:cs="Times New Roman"/>
-        </w:rPr>
-      </w:pPr>
-      <w:r>
-        <w:rPr>
-          <w:rFonts w:ascii="Times New Roman" w:hAnsi="Times New Roman" w:cs="Times New Roman"/>
-        </w:rPr>
-        <w:t>Finally, if you are working on already saved snippets, I have added a loading function for them so you don’t have to be cutting the same snippet once and again.</w:t>
-      </w:r>
-    </w:p>
-    <w:p>
-      <w:pPr>
-        <w:spacing w:after="0"/>
-        <w:rPr>
-          <w:rFonts w:ascii="Times New Roman" w:hAnsi="Times New Roman" w:cs="Times New Roman"/>
-        </w:rPr>
-      </w:pPr>
-      <w:r>
-        <w:rPr>
-          <w:rFonts w:ascii="Times New Roman" w:hAnsi="Times New Roman" w:cs="Times New Roman"/>
-          <w:b/>
-          <w:bCs/>
-          <w:i/>
-          <w:iCs/>
-        </w:rPr>
-        <w:t xml:space="preserve">Snippet = </w:t>
-      </w:r>
-      <w:proofErr w:type="spellStart"/>
-      <w:r>
-        <w:rPr>
-          <w:rFonts w:ascii="Times New Roman" w:hAnsi="Times New Roman" w:cs="Times New Roman"/>
-          <w:b/>
-          <w:bCs/>
-          <w:i/>
-          <w:iCs/>
-        </w:rPr>
-        <w:t>st.</w:t>
-      </w:r>
-      <w:r>
-        <w:rPr>
-          <w:rFonts w:ascii="Times New Roman" w:hAnsi="Times New Roman" w:cs="Times New Roman"/>
-          <w:b/>
-          <w:bCs/>
-          <w:i/>
-          <w:iCs/>
-        </w:rPr>
-        <w:t>load_snippet</w:t>
-      </w:r>
-      <w:proofErr w:type="spellEnd"/>
-      <w:r>
-        <w:rPr>
-          <w:rFonts w:ascii="Times New Roman" w:hAnsi="Times New Roman" w:cs="Times New Roman"/>
-          <w:b/>
-          <w:bCs/>
-          <w:i/>
-          <w:iCs/>
-        </w:rPr>
-        <w:t>(</w:t>
-      </w:r>
-      <w:proofErr w:type="spellStart"/>
-      <w:r>
-        <w:rPr>
-          <w:rFonts w:ascii="Times New Roman" w:hAnsi="Times New Roman" w:cs="Times New Roman"/>
-          <w:b/>
-          <w:bCs/>
-          <w:i/>
-          <w:iCs/>
-        </w:rPr>
-        <w:t>file_path</w:t>
-      </w:r>
-      <w:proofErr w:type="spellEnd"/>
-      <w:r>
-        <w:rPr>
-          <w:rFonts w:ascii="Times New Roman" w:hAnsi="Times New Roman" w:cs="Times New Roman"/>
-          <w:b/>
-          <w:bCs/>
-          <w:i/>
-          <w:iCs/>
-        </w:rPr>
-        <w:t>)</w:t>
-      </w:r>
-      <w:r>
-        <w:rPr>
-          <w:rFonts w:ascii="Times New Roman" w:hAnsi="Times New Roman" w:cs="Times New Roman"/>
-        </w:rPr>
-        <w:t xml:space="preserve"> will load the audio snippet file as a snippet already, and will catch from the name the length and other attributes, so you can resume your work on a snippet without loading the file and cutting it again.</w:t>
-      </w:r>
-    </w:p>
-    <w:p>
-      <w:pPr>
-        <w:rPr>
-          <w:rFonts w:ascii="Times New Roman" w:hAnsi="Times New Roman" w:cs="Times New Roman"/>
-          <w:b/>
-          <w:bCs/>
-        </w:rPr>
-      </w:pPr>
-    </w:p>
-    <w:p>
-      <w:pPr>
-        <w:pStyle w:val="Ttulo1"/>
-      </w:pPr>
-      <w:r>
-        <w:t>Batch processing files</w:t>
-      </w:r>
-    </w:p>
-    <w:p>
-      <w:pPr>
-        <w:rPr>
-          <w:rFonts w:ascii="Times New Roman" w:hAnsi="Times New Roman" w:cs="Times New Roman"/>
-        </w:rPr>
-      </w:pPr>
-      <w:r>
-        <w:rPr>
-          <w:rFonts w:ascii="Times New Roman" w:hAnsi="Times New Roman" w:cs="Times New Roman"/>
-        </w:rPr>
-        <w:t>When you work on big data files, it would be too time consuming to do all of the above manually. So I have given you some functions that will, using the above methodology, process long files and create the adequate folder structures so everything keeps paired. Bear in mind these functions create big amounts of files and quickly go into the GB size folders, you may want to keep it civilized and not have enormous amounts of these on your hard drive. In the pipeline script you will find an easy to reuse code for doing these, although some of the logic of that code will over time become part of the package, for now that is your best way to do all of this. But generally speaking, you have two functions.</w:t>
-      </w:r>
-    </w:p>
-    <w:p>
-      <w:pPr>
-        <w:rPr>
-          <w:rFonts w:ascii="Times New Roman" w:hAnsi="Times New Roman" w:cs="Times New Roman"/>
-        </w:rPr>
-      </w:pPr>
-      <w:proofErr w:type="spellStart"/>
-      <w:proofErr w:type="gramStart"/>
-      <w:r>
-        <w:rPr>
-          <w:rFonts w:ascii="Times New Roman" w:hAnsi="Times New Roman" w:cs="Times New Roman"/>
-          <w:b/>
-          <w:bCs/>
-          <w:i/>
-          <w:iCs/>
-        </w:rPr>
-        <w:t>st.</w:t>
-      </w:r>
-      <w:r>
-        <w:rPr>
-          <w:rFonts w:ascii="Times New Roman" w:hAnsi="Times New Roman" w:cs="Times New Roman"/>
-          <w:b/>
-          <w:bCs/>
-          <w:i/>
-          <w:iCs/>
-        </w:rPr>
-        <w:t>process</w:t>
-      </w:r>
-      <w:proofErr w:type="gramEnd"/>
-      <w:r>
-        <w:rPr>
-          <w:rFonts w:ascii="Times New Roman" w:hAnsi="Times New Roman" w:cs="Times New Roman"/>
-          <w:b/>
-          <w:bCs/>
-          <w:i/>
-          <w:iCs/>
-        </w:rPr>
-        <w:t>_audio_</w:t>
-      </w:r>
-      <w:proofErr w:type="gramStart"/>
-      <w:r>
-        <w:rPr>
-          <w:rFonts w:ascii="Times New Roman" w:hAnsi="Times New Roman" w:cs="Times New Roman"/>
-          <w:b/>
-          <w:bCs/>
-          <w:i/>
-          <w:iCs/>
-        </w:rPr>
-        <w:t>file</w:t>
-      </w:r>
-      <w:proofErr w:type="spellEnd"/>
-      <w:r>
-        <w:rPr>
-          <w:rFonts w:ascii="Times New Roman" w:hAnsi="Times New Roman" w:cs="Times New Roman"/>
-          <w:b/>
-          <w:bCs/>
-          <w:i/>
-          <w:iCs/>
-        </w:rPr>
-        <w:t>(</w:t>
-      </w:r>
-      <w:proofErr w:type="spellStart"/>
-      <w:proofErr w:type="gramEnd"/>
-      <w:r>
-        <w:rPr>
-          <w:rFonts w:ascii="Times New Roman" w:hAnsi="Times New Roman" w:cs="Times New Roman"/>
-          <w:b/>
-          <w:bCs/>
-          <w:i/>
-          <w:iCs/>
-        </w:rPr>
-        <w:t>audio_path</w:t>
-      </w:r>
-      <w:proofErr w:type="spellEnd"/>
-      <w:r>
-        <w:rPr>
-          <w:rFonts w:ascii="Times New Roman" w:hAnsi="Times New Roman" w:cs="Times New Roman"/>
-          <w:b/>
-          <w:bCs/>
-          <w:i/>
-          <w:iCs/>
-        </w:rPr>
-        <w:t xml:space="preserve">, </w:t>
-      </w:r>
-      <w:proofErr w:type="spellStart"/>
-      <w:r>
-        <w:rPr>
-          <w:rFonts w:ascii="Times New Roman" w:hAnsi="Times New Roman" w:cs="Times New Roman"/>
-          <w:b/>
-          <w:bCs/>
-          <w:i/>
-          <w:iCs/>
-        </w:rPr>
-        <w:t>snippet_duration</w:t>
-      </w:r>
-      <w:proofErr w:type="spellEnd"/>
-      <w:r>
-        <w:rPr>
-          <w:rFonts w:ascii="Times New Roman" w:hAnsi="Times New Roman" w:cs="Times New Roman"/>
-          <w:b/>
-          <w:bCs/>
-          <w:i/>
-          <w:iCs/>
-        </w:rPr>
-        <w:t xml:space="preserve">=2, </w:t>
-      </w:r>
-      <w:proofErr w:type="spellStart"/>
-      <w:r>
-        <w:rPr>
-          <w:rFonts w:ascii="Times New Roman" w:hAnsi="Times New Roman" w:cs="Times New Roman"/>
-          <w:b/>
-          <w:bCs/>
-          <w:i/>
-          <w:iCs/>
-        </w:rPr>
-        <w:t>output_folder</w:t>
-      </w:r>
-      <w:proofErr w:type="spellEnd"/>
-      <w:r>
-        <w:rPr>
-          <w:rFonts w:ascii="Times New Roman" w:hAnsi="Times New Roman" w:cs="Times New Roman"/>
-          <w:b/>
-          <w:bCs/>
-          <w:i/>
-          <w:iCs/>
-        </w:rPr>
-        <w:t>=None)</w:t>
-      </w:r>
-      <w:r>
-        <w:rPr>
-          <w:rFonts w:ascii="Times New Roman" w:hAnsi="Times New Roman" w:cs="Times New Roman"/>
-        </w:rPr>
-        <w:t xml:space="preserve"> here you type the path to your audio file, and the </w:t>
-      </w:r>
-      <w:proofErr w:type="spellStart"/>
-      <w:r>
-        <w:rPr>
-          <w:rFonts w:ascii="Times New Roman" w:hAnsi="Times New Roman" w:cs="Times New Roman"/>
-        </w:rPr>
-        <w:t>kwargs</w:t>
-      </w:r>
-      <w:proofErr w:type="spellEnd"/>
-      <w:r>
-        <w:rPr>
-          <w:rFonts w:ascii="Times New Roman" w:hAnsi="Times New Roman" w:cs="Times New Roman"/>
-        </w:rPr>
-        <w:t xml:space="preserve"> if you need them. As you see, </w:t>
-      </w:r>
-      <w:proofErr w:type="spellStart"/>
-      <w:r>
-        <w:rPr>
-          <w:rFonts w:ascii="Times New Roman" w:hAnsi="Times New Roman" w:cs="Times New Roman"/>
-        </w:rPr>
-        <w:t>snippet_duration</w:t>
-      </w:r>
-      <w:proofErr w:type="spellEnd"/>
-      <w:r>
-        <w:rPr>
-          <w:rFonts w:ascii="Times New Roman" w:hAnsi="Times New Roman" w:cs="Times New Roman"/>
-        </w:rPr>
-        <w:t xml:space="preserve"> defaults to 2 seconds, and </w:t>
-      </w:r>
-      <w:proofErr w:type="spellStart"/>
-      <w:r>
-        <w:rPr>
-          <w:rFonts w:ascii="Times New Roman" w:hAnsi="Times New Roman" w:cs="Times New Roman"/>
-        </w:rPr>
-        <w:t>output_folder</w:t>
-      </w:r>
-      <w:proofErr w:type="spellEnd"/>
-      <w:r>
-        <w:rPr>
-          <w:rFonts w:ascii="Times New Roman" w:hAnsi="Times New Roman" w:cs="Times New Roman"/>
-        </w:rPr>
-        <w:t xml:space="preserve"> to none, which should create a folder with the name of the sound file and store things there. That folder will be filled in with 2 subfolders, one with the snippets, and one with the spectrograms.</w:t>
-      </w:r>
-    </w:p>
-    <w:p>
-      <w:pPr>
-        <w:rPr>
-          <w:rFonts w:ascii="Times New Roman" w:hAnsi="Times New Roman" w:cs="Times New Roman"/>
-        </w:rPr>
-      </w:pPr>
-      <w:proofErr w:type="spellStart"/>
-      <w:proofErr w:type="gramStart"/>
-      <w:r>
-        <w:rPr>
-          <w:rFonts w:ascii="Times New Roman" w:hAnsi="Times New Roman" w:cs="Times New Roman"/>
-          <w:b/>
-          <w:bCs/>
-          <w:i/>
-          <w:iCs/>
-        </w:rPr>
-        <w:lastRenderedPageBreak/>
-        <w:t>st.annotate</w:t>
-      </w:r>
-      <w:proofErr w:type="gramEnd"/>
-      <w:r>
-        <w:rPr>
-          <w:rFonts w:ascii="Times New Roman" w:hAnsi="Times New Roman" w:cs="Times New Roman"/>
-          <w:b/>
-          <w:bCs/>
-          <w:i/>
-          <w:iCs/>
-        </w:rPr>
-        <w:t>_</w:t>
-      </w:r>
-      <w:proofErr w:type="gramStart"/>
-      <w:r>
-        <w:rPr>
-          <w:rFonts w:ascii="Times New Roman" w:hAnsi="Times New Roman" w:cs="Times New Roman"/>
-          <w:b/>
-          <w:bCs/>
-          <w:i/>
-          <w:iCs/>
-        </w:rPr>
-        <w:t>data</w:t>
-      </w:r>
-      <w:proofErr w:type="spellEnd"/>
-      <w:r>
-        <w:rPr>
-          <w:rFonts w:ascii="Times New Roman" w:hAnsi="Times New Roman" w:cs="Times New Roman"/>
-          <w:b/>
-          <w:bCs/>
-          <w:i/>
-          <w:iCs/>
-        </w:rPr>
-        <w:t>(</w:t>
-      </w:r>
-      <w:proofErr w:type="gramEnd"/>
-      <w:r>
-        <w:rPr>
-          <w:rFonts w:ascii="Times New Roman" w:hAnsi="Times New Roman" w:cs="Times New Roman"/>
-          <w:b/>
-          <w:bCs/>
-          <w:i/>
-          <w:iCs/>
-        </w:rPr>
-        <w:t xml:space="preserve">notes, </w:t>
-      </w:r>
-      <w:proofErr w:type="spellStart"/>
-      <w:r>
-        <w:rPr>
-          <w:rFonts w:ascii="Times New Roman" w:hAnsi="Times New Roman" w:cs="Times New Roman"/>
-          <w:b/>
-          <w:bCs/>
-          <w:i/>
-          <w:iCs/>
-        </w:rPr>
-        <w:t>snip</w:t>
-      </w:r>
-      <w:r>
-        <w:rPr>
-          <w:rFonts w:ascii="Times New Roman" w:hAnsi="Times New Roman" w:cs="Times New Roman"/>
-          <w:b/>
-          <w:bCs/>
-          <w:i/>
-          <w:iCs/>
-        </w:rPr>
-        <w:t>_path</w:t>
-      </w:r>
-      <w:proofErr w:type="spellEnd"/>
-      <w:r>
-        <w:rPr>
-          <w:rFonts w:ascii="Times New Roman" w:hAnsi="Times New Roman" w:cs="Times New Roman"/>
-          <w:b/>
-          <w:bCs/>
-          <w:i/>
-          <w:iCs/>
-        </w:rPr>
-        <w:t xml:space="preserve">, </w:t>
-      </w:r>
-      <w:proofErr w:type="spellStart"/>
-      <w:r>
-        <w:rPr>
-          <w:rFonts w:ascii="Times New Roman" w:hAnsi="Times New Roman" w:cs="Times New Roman"/>
-          <w:b/>
-          <w:bCs/>
-          <w:i/>
-          <w:iCs/>
-        </w:rPr>
-        <w:t>spec</w:t>
-      </w:r>
-      <w:r>
-        <w:rPr>
-          <w:rFonts w:ascii="Times New Roman" w:hAnsi="Times New Roman" w:cs="Times New Roman"/>
-          <w:b/>
-          <w:bCs/>
-          <w:i/>
-          <w:iCs/>
-        </w:rPr>
-        <w:t>_path</w:t>
-      </w:r>
-      <w:proofErr w:type="spellEnd"/>
-      <w:r>
-        <w:rPr>
-          <w:rFonts w:ascii="Times New Roman" w:hAnsi="Times New Roman" w:cs="Times New Roman"/>
-          <w:b/>
-          <w:bCs/>
-          <w:i/>
-          <w:iCs/>
-        </w:rPr>
-        <w:t xml:space="preserve">, </w:t>
-      </w:r>
-      <w:proofErr w:type="spellStart"/>
-      <w:r>
-        <w:rPr>
-          <w:rFonts w:ascii="Times New Roman" w:hAnsi="Times New Roman" w:cs="Times New Roman"/>
-          <w:b/>
-          <w:bCs/>
-          <w:i/>
-          <w:iCs/>
-        </w:rPr>
-        <w:t>snippet_duration</w:t>
-      </w:r>
-      <w:proofErr w:type="spellEnd"/>
-      <w:r>
-        <w:rPr>
-          <w:rFonts w:ascii="Times New Roman" w:hAnsi="Times New Roman" w:cs="Times New Roman"/>
-          <w:b/>
-          <w:bCs/>
-          <w:i/>
-          <w:iCs/>
-        </w:rPr>
-        <w:t xml:space="preserve">=2.0, </w:t>
-      </w:r>
-      <w:proofErr w:type="spellStart"/>
-      <w:r>
-        <w:rPr>
-          <w:rFonts w:ascii="Times New Roman" w:hAnsi="Times New Roman" w:cs="Times New Roman"/>
-          <w:b/>
-          <w:bCs/>
-          <w:i/>
-          <w:iCs/>
-        </w:rPr>
-        <w:t>csv_delim</w:t>
-      </w:r>
-      <w:proofErr w:type="spellEnd"/>
-      <w:r>
-        <w:rPr>
-          <w:rFonts w:ascii="Times New Roman" w:hAnsi="Times New Roman" w:cs="Times New Roman"/>
-          <w:b/>
-          <w:bCs/>
-          <w:i/>
-          <w:iCs/>
-        </w:rPr>
-        <w:t>='\t')</w:t>
-      </w:r>
-      <w:r>
-        <w:rPr>
-          <w:rFonts w:ascii="Times New Roman" w:hAnsi="Times New Roman" w:cs="Times New Roman"/>
-          <w:b/>
-          <w:bCs/>
-          <w:i/>
-          <w:iCs/>
-        </w:rPr>
-        <w:t xml:space="preserve"> </w:t>
-      </w:r>
-      <w:r>
-        <w:rPr>
-          <w:rFonts w:ascii="Times New Roman" w:hAnsi="Times New Roman" w:cs="Times New Roman"/>
-        </w:rPr>
-        <w:t>once</w:t>
-      </w:r>
-      <w:r>
-        <w:rPr>
-          <w:rFonts w:ascii="Times New Roman" w:hAnsi="Times New Roman" w:cs="Times New Roman"/>
-        </w:rPr>
-        <w:t xml:space="preserve"> you have processed a file, in the case you are working on training data, you can use your annotations to automatically distribute your files for training. These part of the logic is incomplete for the moment and will change soon, for now it is best for you to run it from the pipeline script. You will use the notes, which is a .txt file saved as tab delimited, path to the snippets and spectrograms that belong with that set of notes, and the snippet duration that you used (defaulted to 2, so use as </w:t>
-      </w:r>
-      <w:proofErr w:type="spellStart"/>
-      <w:r>
-        <w:rPr>
-          <w:rFonts w:ascii="Times New Roman" w:hAnsi="Times New Roman" w:cs="Times New Roman"/>
-        </w:rPr>
-        <w:t>kwarg</w:t>
-      </w:r>
-      <w:proofErr w:type="spellEnd"/>
-      <w:r>
-        <w:rPr>
-          <w:rFonts w:ascii="Times New Roman" w:hAnsi="Times New Roman" w:cs="Times New Roman"/>
-        </w:rPr>
-        <w:t xml:space="preserve">). The last </w:t>
-      </w:r>
-      <w:proofErr w:type="spellStart"/>
-      <w:r>
-        <w:rPr>
-          <w:rFonts w:ascii="Times New Roman" w:hAnsi="Times New Roman" w:cs="Times New Roman"/>
-        </w:rPr>
-        <w:t>kwarg</w:t>
-      </w:r>
-      <w:proofErr w:type="spellEnd"/>
-      <w:r>
-        <w:rPr>
-          <w:rFonts w:ascii="Times New Roman" w:hAnsi="Times New Roman" w:cs="Times New Roman"/>
-        </w:rPr>
-        <w:t xml:space="preserve"> is not necessary if you saved your txt as tab delimited, but can be used in case you used comma. This function makes a split into positives </w:t>
-      </w:r>
-      <w:proofErr w:type="spellStart"/>
-      <w:proofErr w:type="gramStart"/>
-      <w:r>
-        <w:rPr>
-          <w:rFonts w:ascii="Times New Roman" w:hAnsi="Times New Roman" w:cs="Times New Roman"/>
-        </w:rPr>
-        <w:t>an</w:t>
-      </w:r>
-      <w:proofErr w:type="spellEnd"/>
-      <w:proofErr w:type="gramEnd"/>
-      <w:r>
-        <w:rPr>
-          <w:rFonts w:ascii="Times New Roman" w:hAnsi="Times New Roman" w:cs="Times New Roman"/>
-        </w:rPr>
-        <w:t xml:space="preserve"> negatives, from there you could use data augmentation, or go into training.</w:t>
-      </w:r>
-      <w:r>
-        <w:rPr>
-          <w:rFonts w:ascii="Times New Roman" w:hAnsi="Times New Roman" w:cs="Times New Roman"/>
-        </w:rPr>
-        <w:t xml:space="preserve"> It will split all the files on each of the separate files directories and (using the pipeline logic) create merged folders for training.</w:t>
-      </w:r>
-      <w:r>
-        <w:rPr>
-          <w:rFonts w:ascii="Times New Roman" w:hAnsi="Times New Roman" w:cs="Times New Roman"/>
-        </w:rPr>
-        <w:t xml:space="preserve"> </w:t>
-      </w:r>
-      <w:r>
-        <w:rPr>
-          <w:rFonts w:ascii="Times New Roman" w:hAnsi="Times New Roman" w:cs="Times New Roman"/>
-          <w:b/>
-          <w:bCs/>
-        </w:rPr>
-        <w:t>WARNING!</w:t>
-      </w:r>
-      <w:r>
-        <w:rPr>
-          <w:rFonts w:ascii="Times New Roman" w:hAnsi="Times New Roman" w:cs="Times New Roman"/>
-        </w:rPr>
-        <w:t xml:space="preserve"> This function assumes all that is not positive is negative. That is, for simplicity of the annotation, you only have to annotate positives. Be careful to add and filter out (if needed) dubious things so you don’t have positives on the negative training set.</w:t>
-      </w:r>
-    </w:p>
-    <w:p>
-      <w:pPr>
-        <w:rPr>
-          <w:rFonts w:ascii="Times New Roman" w:hAnsi="Times New Roman" w:cs="Times New Roman"/>
-          <w:bCs/>
-          <w:iCs/>
-        </w:rPr>
-      </w:pPr>
-      <w:proofErr w:type="spellStart"/>
-      <w:proofErr w:type="gramStart"/>
-      <w:r>
-        <w:rPr>
-          <w:rFonts w:ascii="Times New Roman" w:hAnsi="Times New Roman" w:cs="Times New Roman"/>
-          <w:b/>
-          <w:bCs/>
-          <w:i/>
-          <w:iCs/>
-        </w:rPr>
-        <w:t>st.n</w:t>
-      </w:r>
-      <w:r>
-        <w:rPr>
-          <w:rFonts w:ascii="Times New Roman" w:hAnsi="Times New Roman" w:cs="Times New Roman"/>
-          <w:b/>
-          <w:bCs/>
-          <w:i/>
-          <w:iCs/>
-        </w:rPr>
-        <w:t>ormalize</w:t>
-      </w:r>
-      <w:proofErr w:type="gramEnd"/>
-      <w:r>
-        <w:rPr>
-          <w:rFonts w:ascii="Times New Roman" w:hAnsi="Times New Roman" w:cs="Times New Roman"/>
-          <w:b/>
-          <w:bCs/>
-          <w:i/>
-          <w:iCs/>
-        </w:rPr>
-        <w:t>_</w:t>
-      </w:r>
-      <w:proofErr w:type="gramStart"/>
-      <w:r>
-        <w:rPr>
-          <w:rFonts w:ascii="Times New Roman" w:hAnsi="Times New Roman" w:cs="Times New Roman"/>
-          <w:b/>
-          <w:bCs/>
-          <w:i/>
-          <w:iCs/>
-        </w:rPr>
-        <w:t>global</w:t>
-      </w:r>
-      <w:proofErr w:type="spellEnd"/>
-      <w:r>
-        <w:rPr>
-          <w:rFonts w:ascii="Times New Roman" w:hAnsi="Times New Roman" w:cs="Times New Roman"/>
-          <w:b/>
-          <w:bCs/>
-          <w:i/>
-          <w:iCs/>
-        </w:rPr>
-        <w:t>(</w:t>
-      </w:r>
-      <w:proofErr w:type="spellStart"/>
-      <w:proofErr w:type="gramEnd"/>
-      <w:r>
-        <w:rPr>
-          <w:rFonts w:ascii="Times New Roman" w:hAnsi="Times New Roman" w:cs="Times New Roman"/>
-          <w:b/>
-          <w:bCs/>
-          <w:i/>
-          <w:iCs/>
-        </w:rPr>
-        <w:t>input_dir</w:t>
-      </w:r>
-      <w:proofErr w:type="spellEnd"/>
-      <w:r>
-        <w:rPr>
-          <w:rFonts w:ascii="Times New Roman" w:hAnsi="Times New Roman" w:cs="Times New Roman"/>
-          <w:b/>
-          <w:bCs/>
-          <w:i/>
-          <w:iCs/>
-        </w:rPr>
-        <w:t xml:space="preserve">, </w:t>
-      </w:r>
-      <w:proofErr w:type="spellStart"/>
-      <w:r>
-        <w:rPr>
-          <w:rFonts w:ascii="Times New Roman" w:hAnsi="Times New Roman" w:cs="Times New Roman"/>
-          <w:b/>
-          <w:bCs/>
-          <w:i/>
-          <w:iCs/>
-        </w:rPr>
-        <w:t>output_dir</w:t>
-      </w:r>
-      <w:proofErr w:type="spellEnd"/>
-      <w:r>
-        <w:rPr>
-          <w:rFonts w:ascii="Times New Roman" w:hAnsi="Times New Roman" w:cs="Times New Roman"/>
-          <w:b/>
-          <w:bCs/>
-          <w:i/>
-          <w:iCs/>
-        </w:rPr>
-        <w:t xml:space="preserve">, </w:t>
-      </w:r>
-      <w:proofErr w:type="spellStart"/>
-      <w:r>
-        <w:rPr>
-          <w:rFonts w:ascii="Times New Roman" w:hAnsi="Times New Roman" w:cs="Times New Roman"/>
-          <w:b/>
-          <w:bCs/>
-          <w:i/>
-          <w:iCs/>
-        </w:rPr>
-        <w:t>target_max</w:t>
-      </w:r>
-      <w:proofErr w:type="spellEnd"/>
-      <w:r>
-        <w:rPr>
-          <w:rFonts w:ascii="Times New Roman" w:hAnsi="Times New Roman" w:cs="Times New Roman"/>
-          <w:b/>
-          <w:bCs/>
-          <w:i/>
-          <w:iCs/>
-        </w:rPr>
-        <w:t xml:space="preserve"> = 0.75):</w:t>
-      </w:r>
-      <w:r>
-        <w:rPr>
-          <w:rFonts w:ascii="Times New Roman" w:hAnsi="Times New Roman" w:cs="Times New Roman"/>
-          <w:bCs/>
-          <w:iCs/>
-        </w:rPr>
-        <w:t xml:space="preserve"> this allows for normalization of several files to one single peak. So, if you wanted to normalize a whole set of files to their overall maximum, you put them in a folder and run this. It should create a new folder with all files normalized. It might be useful to normalize by microphone or whole experiments. We will see what Sara thinks later.</w:t>
-      </w:r>
-    </w:p>
-    <w:p>
-      <w:pPr>
-        <w:rPr>
-          <w:rFonts w:ascii="Times New Roman" w:hAnsi="Times New Roman" w:cs="Times New Roman"/>
-        </w:rPr>
-      </w:pPr>
-      <w:proofErr w:type="spellStart"/>
-      <w:r>
-        <w:rPr>
-          <w:rFonts w:ascii="Times New Roman" w:hAnsi="Times New Roman" w:cs="Times New Roman"/>
-          <w:b/>
-          <w:bCs/>
-          <w:i/>
-          <w:iCs/>
-        </w:rPr>
-        <w:t>st.</w:t>
-      </w:r>
-      <w:proofErr w:type="spellEnd"/>
-      <w:r>
-        <w:t xml:space="preserve"> </w:t>
-      </w:r>
-      <w:proofErr w:type="spellStart"/>
-      <w:r>
-        <w:rPr>
-          <w:rFonts w:ascii="Times New Roman" w:hAnsi="Times New Roman" w:cs="Times New Roman"/>
-          <w:b/>
-          <w:bCs/>
-          <w:i/>
-          <w:iCs/>
-        </w:rPr>
-        <w:t>highpass_</w:t>
-      </w:r>
-      <w:proofErr w:type="gramStart"/>
-      <w:r>
-        <w:rPr>
-          <w:rFonts w:ascii="Times New Roman" w:hAnsi="Times New Roman" w:cs="Times New Roman"/>
-          <w:b/>
-          <w:bCs/>
-          <w:i/>
-          <w:iCs/>
-        </w:rPr>
-        <w:t>filter</w:t>
-      </w:r>
-      <w:proofErr w:type="spellEnd"/>
-      <w:r>
-        <w:rPr>
-          <w:rFonts w:ascii="Times New Roman" w:hAnsi="Times New Roman" w:cs="Times New Roman"/>
-          <w:b/>
-          <w:bCs/>
-          <w:i/>
-          <w:iCs/>
-        </w:rPr>
-        <w:t>(</w:t>
-      </w:r>
-      <w:proofErr w:type="gramEnd"/>
-      <w:r>
-        <w:rPr>
-          <w:rFonts w:ascii="Times New Roman" w:hAnsi="Times New Roman" w:cs="Times New Roman"/>
-          <w:b/>
-          <w:bCs/>
-          <w:i/>
-          <w:iCs/>
-        </w:rPr>
-        <w:t xml:space="preserve">audio, </w:t>
-      </w:r>
-      <w:proofErr w:type="spellStart"/>
-      <w:r>
-        <w:rPr>
-          <w:rFonts w:ascii="Times New Roman" w:hAnsi="Times New Roman" w:cs="Times New Roman"/>
-          <w:b/>
-          <w:bCs/>
-          <w:i/>
-          <w:iCs/>
-        </w:rPr>
-        <w:t>sr</w:t>
-      </w:r>
-      <w:proofErr w:type="spellEnd"/>
-      <w:r>
-        <w:rPr>
-          <w:rFonts w:ascii="Times New Roman" w:hAnsi="Times New Roman" w:cs="Times New Roman"/>
-          <w:b/>
-          <w:bCs/>
-          <w:i/>
-          <w:iCs/>
-        </w:rPr>
-        <w:t>, cutoff=3000, order=8):</w:t>
-      </w:r>
-      <w:r>
-        <w:rPr>
-          <w:rFonts w:ascii="Times New Roman" w:hAnsi="Times New Roman" w:cs="Times New Roman"/>
-        </w:rPr>
-        <w:t xml:space="preserve"> on Jeremy’s request, I added a function to apply a high pass filter to audio files. The default is Mario’s anti-rain filter. H</w:t>
-      </w:r>
-      <w:r>
-        <w:rPr>
-          <w:rFonts w:ascii="Times New Roman" w:hAnsi="Times New Roman" w:cs="Times New Roman"/>
-        </w:rPr>
-        <w:t xml:space="preserve">ere you can use the </w:t>
-      </w:r>
-      <w:proofErr w:type="spellStart"/>
-      <w:r>
-        <w:rPr>
-          <w:rFonts w:ascii="Times New Roman" w:hAnsi="Times New Roman" w:cs="Times New Roman"/>
-        </w:rPr>
-        <w:t>kwargs</w:t>
-      </w:r>
-      <w:proofErr w:type="spellEnd"/>
-      <w:r>
-        <w:rPr>
-          <w:rFonts w:ascii="Times New Roman" w:hAnsi="Times New Roman" w:cs="Times New Roman"/>
-        </w:rPr>
-        <w:t xml:space="preserve"> cutoff to set the hertz cutoff and order for the roll-off. </w:t>
       </w:r>
       <w:r>
         <w:rPr>
@@ -5437,6 +5699,7 @@
   <w:style w:type="character" w:default="1" w:styleId="Fuentedeprrafopredeter">
     <w:name w:val="Default Paragraph Font"/>
     <w:uiPriority w:val="1"/>
+    <w:semiHidden/>
     <w:unhideWhenUsed/>
   </w:style>
   <w:style w:type="table" w:default="1" w:styleId="Tablanormal">

</xml_diff>

<commit_message>
Added customizations to the FFT algrithms allowin final users to control window size, overlap and shape.
</commit_message>
<xml_diff>
--- a/Users_manual.docx
+++ b/Users_manual.docx
@@ -1424,21 +1424,102 @@
           <w:i/>
           <w:iCs/>
         </w:rPr>
-        <w:t xml:space="preserve"> (type)</w:t>
-      </w:r>
-      <w:r>
-        <w:rPr>
-          <w:rFonts w:ascii="Times New Roman" w:hAnsi="Times New Roman" w:cs="Times New Roman"/>
-        </w:rPr>
-        <w:t>. Types can be ‘mel’</w:t>
-      </w:r>
-      <w:r>
-        <w:rPr>
-          <w:rFonts w:ascii="Times New Roman" w:hAnsi="Times New Roman" w:cs="Times New Roman"/>
+        <w:t xml:space="preserve"> (type</w:t>
+      </w:r>
+      <w:r>
+        <w:rPr>
+          <w:rFonts w:ascii="Times New Roman" w:hAnsi="Times New Roman" w:cs="Times New Roman"/>
+          <w:b/>
+          <w:bCs/>
+          <w:i/>
+          <w:iCs/>
         </w:rPr>
         <w:t>,</w:t>
       </w:r>
       <w:r>
+        <w:t xml:space="preserve"> </w:t>
+      </w:r>
+      <w:proofErr w:type="spellStart"/>
+      <w:r>
+        <w:rPr>
+          <w:rFonts w:ascii="Times New Roman" w:hAnsi="Times New Roman" w:cs="Times New Roman"/>
+          <w:b/>
+          <w:bCs/>
+          <w:i/>
+          <w:iCs/>
+        </w:rPr>
+        <w:t>n_fft</w:t>
+      </w:r>
+      <w:proofErr w:type="spellEnd"/>
+      <w:r>
+        <w:rPr>
+          <w:rFonts w:ascii="Times New Roman" w:hAnsi="Times New Roman" w:cs="Times New Roman"/>
+          <w:b/>
+          <w:bCs/>
+          <w:i/>
+          <w:iCs/>
+        </w:rPr>
+        <w:t xml:space="preserve"> = 256, </w:t>
+      </w:r>
+      <w:proofErr w:type="spellStart"/>
+      <w:r>
+        <w:rPr>
+          <w:rFonts w:ascii="Times New Roman" w:hAnsi="Times New Roman" w:cs="Times New Roman"/>
+          <w:b/>
+          <w:bCs/>
+          <w:i/>
+          <w:iCs/>
+        </w:rPr>
+        <w:t>hop_length</w:t>
+      </w:r>
+      <w:proofErr w:type="spellEnd"/>
+      <w:r>
+        <w:rPr>
+          <w:rFonts w:ascii="Times New Roman" w:hAnsi="Times New Roman" w:cs="Times New Roman"/>
+          <w:b/>
+          <w:bCs/>
+          <w:i/>
+          <w:iCs/>
+        </w:rPr>
+        <w:t xml:space="preserve"> = 224, window = "boxcar"</w:t>
+      </w:r>
+      <w:r>
+        <w:rPr>
+          <w:rFonts w:ascii="Times New Roman" w:hAnsi="Times New Roman" w:cs="Times New Roman"/>
+          <w:b/>
+          <w:bCs/>
+          <w:i/>
+          <w:iCs/>
+        </w:rPr>
+        <w:t>)</w:t>
+      </w:r>
+      <w:r>
+        <w:rPr>
+          <w:rFonts w:ascii="Times New Roman" w:hAnsi="Times New Roman" w:cs="Times New Roman"/>
+        </w:rPr>
+        <w:t xml:space="preserve">. </w:t>
+      </w:r>
+    </w:p>
+    <w:p>
+      <w:pPr>
+        <w:spacing w:after="0"/>
+        <w:rPr>
+          <w:rFonts w:ascii="Times New Roman" w:hAnsi="Times New Roman" w:cs="Times New Roman"/>
+        </w:rPr>
+      </w:pPr>
+      <w:r>
+        <w:rPr>
+          <w:rFonts w:ascii="Times New Roman" w:hAnsi="Times New Roman" w:cs="Times New Roman"/>
+        </w:rPr>
+        <w:t>Types can be ‘mel’</w:t>
+      </w:r>
+      <w:r>
+        <w:rPr>
+          <w:rFonts w:ascii="Times New Roman" w:hAnsi="Times New Roman" w:cs="Times New Roman"/>
+        </w:rPr>
+        <w:t>,</w:t>
+      </w:r>
+      <w:r>
         <w:rPr>
           <w:rFonts w:ascii="Times New Roman" w:hAnsi="Times New Roman" w:cs="Times New Roman"/>
         </w:rPr>
@@ -1533,6 +1614,389 @@
     </w:p>
     <w:p>
       <w:pPr>
+        <w:spacing w:after="0"/>
+        <w:rPr>
+          <w:rFonts w:ascii="Times New Roman" w:hAnsi="Times New Roman" w:cs="Times New Roman"/>
+        </w:rPr>
+      </w:pPr>
+      <w:r>
+        <w:rPr>
+          <w:rFonts w:ascii="Times New Roman" w:hAnsi="Times New Roman" w:cs="Times New Roman"/>
+        </w:rPr>
+        <w:lastRenderedPageBreak/>
+        <w:t xml:space="preserve">When working on the ultrasounds I have realized that this function needed more flexibility. I have now implemented methods for you to change the parameters for the </w:t>
+      </w:r>
+      <w:proofErr w:type="spellStart"/>
+      <w:r>
+        <w:rPr>
+          <w:rFonts w:ascii="Times New Roman" w:hAnsi="Times New Roman" w:cs="Times New Roman"/>
+        </w:rPr>
+        <w:t>fft</w:t>
+      </w:r>
+      <w:proofErr w:type="spellEnd"/>
+      <w:r>
+        <w:rPr>
+          <w:rFonts w:ascii="Times New Roman" w:hAnsi="Times New Roman" w:cs="Times New Roman"/>
+        </w:rPr>
+        <w:t xml:space="preserve">. The implementation should respect all the code written for the power analysis as the parameters default to the legacy parameters we have been using for reproducibility. Here’s a short explanation of the parameters, but to get full understanding and insight it is best to look at </w:t>
+      </w:r>
+      <w:proofErr w:type="spellStart"/>
+      <w:r>
+        <w:rPr>
+          <w:rFonts w:ascii="Times New Roman" w:hAnsi="Times New Roman" w:cs="Times New Roman"/>
+        </w:rPr>
+        <w:t>fft</w:t>
+      </w:r>
+      <w:proofErr w:type="spellEnd"/>
+      <w:r>
+        <w:rPr>
+          <w:rFonts w:ascii="Times New Roman" w:hAnsi="Times New Roman" w:cs="Times New Roman"/>
+        </w:rPr>
+        <w:t xml:space="preserve"> maths.</w:t>
+      </w:r>
+      <w:r>
+        <w:rPr>
+          <w:rFonts w:ascii="Times New Roman" w:hAnsi="Times New Roman" w:cs="Times New Roman"/>
+        </w:rPr>
+        <w:t xml:space="preserve"> The important bit is, there is a trade-off in-between the resolution in the frequencies and the resolution in the time. It is up to you to figure out what is more relevant for each case and adjust accordingly.</w:t>
+      </w:r>
+    </w:p>
+    <w:p>
+      <w:pPr>
+        <w:spacing w:after="0"/>
+        <w:rPr>
+          <w:rFonts w:ascii="Times New Roman" w:hAnsi="Times New Roman" w:cs="Times New Roman"/>
+        </w:rPr>
+      </w:pPr>
+      <w:proofErr w:type="spellStart"/>
+      <w:r>
+        <w:rPr>
+          <w:rFonts w:ascii="Times New Roman" w:hAnsi="Times New Roman" w:cs="Times New Roman"/>
+          <w:b/>
+          <w:bCs/>
+        </w:rPr>
+        <w:t>n_fft</w:t>
+      </w:r>
+      <w:proofErr w:type="spellEnd"/>
+      <w:r>
+        <w:rPr>
+          <w:rFonts w:ascii="Times New Roman" w:hAnsi="Times New Roman" w:cs="Times New Roman"/>
+          <w:b/>
+          <w:bCs/>
+        </w:rPr>
+        <w:t xml:space="preserve"> </w:t>
+      </w:r>
+      <w:r>
+        <w:rPr>
+          <w:rFonts w:ascii="Times New Roman" w:hAnsi="Times New Roman" w:cs="Times New Roman"/>
+        </w:rPr>
+        <w:t>is the size of the</w:t>
+      </w:r>
+      <w:r>
+        <w:rPr>
+          <w:rFonts w:ascii="Times New Roman" w:hAnsi="Times New Roman" w:cs="Times New Roman"/>
+          <w:b/>
+          <w:bCs/>
+        </w:rPr>
+        <w:t xml:space="preserve"> </w:t>
+      </w:r>
+      <w:r>
+        <w:rPr>
+          <w:rFonts w:ascii="Times New Roman" w:hAnsi="Times New Roman" w:cs="Times New Roman"/>
+        </w:rPr>
+        <w:t>of the window</w:t>
+      </w:r>
+      <w:r>
+        <w:rPr>
+          <w:rFonts w:ascii="Times New Roman" w:hAnsi="Times New Roman" w:cs="Times New Roman"/>
+        </w:rPr>
+        <w:t xml:space="preserve"> analysed.</w:t>
+      </w:r>
+      <w:r>
+        <w:rPr>
+          <w:rFonts w:ascii="Times New Roman" w:hAnsi="Times New Roman" w:cs="Times New Roman"/>
+        </w:rPr>
+        <w:t xml:space="preserve"> To not complicate this, bigger numbers increase resolution in frequencies and small numbers increase resolution in time. So, there is an obvious trade-off on the features that you will have to explore to figure out the best set for you. </w:t>
+      </w:r>
+      <w:r>
+        <w:rPr>
+          <w:rFonts w:ascii="Times New Roman" w:hAnsi="Times New Roman" w:cs="Times New Roman"/>
+          <w:b/>
+          <w:bCs/>
+        </w:rPr>
+        <w:t>IMPORTANT:</w:t>
+      </w:r>
+      <w:r>
+        <w:rPr>
+          <w:rFonts w:ascii="Times New Roman" w:hAnsi="Times New Roman" w:cs="Times New Roman"/>
+        </w:rPr>
+        <w:t xml:space="preserve"> t</w:t>
+      </w:r>
+      <w:r>
+        <w:rPr>
+          <w:rFonts w:ascii="Times New Roman" w:hAnsi="Times New Roman" w:cs="Times New Roman"/>
+        </w:rPr>
+        <w:t xml:space="preserve">he </w:t>
+      </w:r>
+      <w:proofErr w:type="spellStart"/>
+      <w:r>
+        <w:rPr>
+          <w:rFonts w:ascii="Times New Roman" w:hAnsi="Times New Roman" w:cs="Times New Roman"/>
+        </w:rPr>
+        <w:t>fft</w:t>
+      </w:r>
+      <w:proofErr w:type="spellEnd"/>
+      <w:r>
+        <w:rPr>
+          <w:rFonts w:ascii="Times New Roman" w:hAnsi="Times New Roman" w:cs="Times New Roman"/>
+        </w:rPr>
+        <w:t xml:space="preserve"> is considerably more efficient if this number is a power of 2.</w:t>
+      </w:r>
+    </w:p>
+    <w:p>
+      <w:pPr>
+        <w:spacing w:after="0"/>
+        <w:rPr>
+          <w:rFonts w:ascii="Times New Roman" w:hAnsi="Times New Roman" w:cs="Times New Roman"/>
+        </w:rPr>
+      </w:pPr>
+      <w:proofErr w:type="spellStart"/>
+      <w:r>
+        <w:rPr>
+          <w:rFonts w:ascii="Times New Roman" w:hAnsi="Times New Roman" w:cs="Times New Roman"/>
+          <w:b/>
+          <w:bCs/>
+        </w:rPr>
+        <w:t>hop_lenght</w:t>
+      </w:r>
+      <w:proofErr w:type="spellEnd"/>
+      <w:r>
+        <w:rPr>
+          <w:rFonts w:ascii="Times New Roman" w:hAnsi="Times New Roman" w:cs="Times New Roman"/>
+          <w:b/>
+          <w:bCs/>
+        </w:rPr>
+        <w:t>:</w:t>
+      </w:r>
+      <w:r>
+        <w:rPr>
+          <w:rFonts w:ascii="Times New Roman" w:hAnsi="Times New Roman" w:cs="Times New Roman"/>
+          <w:b/>
+          <w:bCs/>
+        </w:rPr>
+        <w:t xml:space="preserve"> </w:t>
+      </w:r>
+      <w:r>
+        <w:rPr>
+          <w:rFonts w:ascii="Times New Roman" w:hAnsi="Times New Roman" w:cs="Times New Roman"/>
+        </w:rPr>
+        <w:t xml:space="preserve">this is the </w:t>
+      </w:r>
+      <w:proofErr w:type="gramStart"/>
+      <w:r>
+        <w:rPr>
+          <w:rFonts w:ascii="Times New Roman" w:hAnsi="Times New Roman" w:cs="Times New Roman"/>
+        </w:rPr>
+        <w:t>amount</w:t>
+      </w:r>
+      <w:proofErr w:type="gramEnd"/>
+      <w:r>
+        <w:rPr>
+          <w:rFonts w:ascii="Times New Roman" w:hAnsi="Times New Roman" w:cs="Times New Roman"/>
+        </w:rPr>
+        <w:t xml:space="preserve"> of samples that one window is moved with respect to the last. So, this number </w:t>
+      </w:r>
+      <w:proofErr w:type="gramStart"/>
+      <w:r>
+        <w:rPr>
+          <w:rFonts w:ascii="Times New Roman" w:hAnsi="Times New Roman" w:cs="Times New Roman"/>
+        </w:rPr>
+        <w:t>has to</w:t>
+      </w:r>
+      <w:proofErr w:type="gramEnd"/>
+      <w:r>
+        <w:rPr>
+          <w:rFonts w:ascii="Times New Roman" w:hAnsi="Times New Roman" w:cs="Times New Roman"/>
+        </w:rPr>
+        <w:t xml:space="preserve"> be smaller than the window size (</w:t>
+      </w:r>
+      <w:proofErr w:type="spellStart"/>
+      <w:r>
+        <w:rPr>
+          <w:rFonts w:ascii="Times New Roman" w:hAnsi="Times New Roman" w:cs="Times New Roman"/>
+        </w:rPr>
+        <w:t>n_fft</w:t>
+      </w:r>
+      <w:proofErr w:type="spellEnd"/>
+      <w:r>
+        <w:rPr>
+          <w:rFonts w:ascii="Times New Roman" w:hAnsi="Times New Roman" w:cs="Times New Roman"/>
+        </w:rPr>
+        <w:t>). And you can think of it as a measurement of overlap between contiguous windows. Here, big numbers are better for the power analysis because they keep the windows more independent, but smaller numbers are best for higher temporal resolution improving visualization and potentially CNN training.</w:t>
+      </w:r>
+    </w:p>
+    <w:p>
+      <w:pPr>
+        <w:spacing w:after="0"/>
+        <w:rPr>
+          <w:rFonts w:ascii="Times New Roman" w:hAnsi="Times New Roman" w:cs="Times New Roman"/>
+        </w:rPr>
+      </w:pPr>
+      <w:r>
+        <w:rPr>
+          <w:rFonts w:ascii="Times New Roman" w:hAnsi="Times New Roman" w:cs="Times New Roman"/>
+          <w:b/>
+          <w:bCs/>
+        </w:rPr>
+        <w:t>window:</w:t>
+      </w:r>
+      <w:r>
+        <w:rPr>
+          <w:rFonts w:ascii="Times New Roman" w:hAnsi="Times New Roman" w:cs="Times New Roman"/>
+          <w:b/>
+          <w:bCs/>
+        </w:rPr>
+        <w:t xml:space="preserve"> </w:t>
+      </w:r>
+      <w:r>
+        <w:rPr>
+          <w:rFonts w:ascii="Times New Roman" w:hAnsi="Times New Roman" w:cs="Times New Roman"/>
+        </w:rPr>
+        <w:t xml:space="preserve">this is the shape of the window. Different shapes produce different amounts of leakage, which is </w:t>
+      </w:r>
+      <w:proofErr w:type="gramStart"/>
+      <w:r>
+        <w:rPr>
+          <w:rFonts w:ascii="Times New Roman" w:hAnsi="Times New Roman" w:cs="Times New Roman"/>
+        </w:rPr>
+        <w:t>a</w:t>
+      </w:r>
+      <w:proofErr w:type="gramEnd"/>
+      <w:r>
+        <w:rPr>
+          <w:rFonts w:ascii="Times New Roman" w:hAnsi="Times New Roman" w:cs="Times New Roman"/>
+        </w:rPr>
+        <w:t xml:space="preserve"> interference from a frequency bin into the </w:t>
+      </w:r>
+      <w:proofErr w:type="spellStart"/>
+      <w:r>
+        <w:rPr>
+          <w:rFonts w:ascii="Times New Roman" w:hAnsi="Times New Roman" w:cs="Times New Roman"/>
+        </w:rPr>
+        <w:t>adyacent</w:t>
+      </w:r>
+      <w:proofErr w:type="spellEnd"/>
+      <w:r>
+        <w:rPr>
+          <w:rFonts w:ascii="Times New Roman" w:hAnsi="Times New Roman" w:cs="Times New Roman"/>
+        </w:rPr>
+        <w:t xml:space="preserve">. You can think of it as a “spill” of energy between frequencies. We have been using boxcar for the power analysis, which has a lot of leakage but also more frequency resolution. </w:t>
+      </w:r>
+      <w:proofErr w:type="gramStart"/>
+      <w:r>
+        <w:rPr>
+          <w:rFonts w:ascii="Times New Roman" w:hAnsi="Times New Roman" w:cs="Times New Roman"/>
+        </w:rPr>
+        <w:t>Again</w:t>
+      </w:r>
+      <w:proofErr w:type="gramEnd"/>
+      <w:r>
+        <w:rPr>
+          <w:rFonts w:ascii="Times New Roman" w:hAnsi="Times New Roman" w:cs="Times New Roman"/>
+        </w:rPr>
+        <w:t xml:space="preserve"> this is a trade-off. You can check </w:t>
+      </w:r>
+      <w:proofErr w:type="spellStart"/>
+      <w:r>
+        <w:rPr>
+          <w:rFonts w:ascii="Times New Roman" w:hAnsi="Times New Roman" w:cs="Times New Roman"/>
+        </w:rPr>
+        <w:t>Librosa</w:t>
+      </w:r>
+      <w:proofErr w:type="spellEnd"/>
+      <w:r>
+        <w:rPr>
+          <w:rFonts w:ascii="Times New Roman" w:hAnsi="Times New Roman" w:cs="Times New Roman"/>
+        </w:rPr>
+        <w:t xml:space="preserve"> documentation to know your options, but a few very common ones are “boxcar”, “hamming”, “</w:t>
+      </w:r>
+      <w:proofErr w:type="spellStart"/>
+      <w:r>
+        <w:rPr>
+          <w:rFonts w:ascii="Times New Roman" w:hAnsi="Times New Roman" w:cs="Times New Roman"/>
+        </w:rPr>
+        <w:t>hann</w:t>
+      </w:r>
+      <w:proofErr w:type="spellEnd"/>
+      <w:r>
+        <w:rPr>
+          <w:rFonts w:ascii="Times New Roman" w:hAnsi="Times New Roman" w:cs="Times New Roman"/>
+        </w:rPr>
+        <w:t xml:space="preserve">” and “bartlett”. Most of the </w:t>
+      </w:r>
+      <w:proofErr w:type="spellStart"/>
+      <w:r>
+        <w:rPr>
+          <w:rFonts w:ascii="Times New Roman" w:hAnsi="Times New Roman" w:cs="Times New Roman"/>
+        </w:rPr>
+        <w:t>librosa</w:t>
+      </w:r>
+      <w:proofErr w:type="spellEnd"/>
+      <w:r>
+        <w:rPr>
+          <w:rFonts w:ascii="Times New Roman" w:hAnsi="Times New Roman" w:cs="Times New Roman"/>
+        </w:rPr>
+        <w:t xml:space="preserve"> optio</w:t>
+      </w:r>
+      <w:r>
+        <w:rPr>
+          <w:rFonts w:ascii="Times New Roman" w:hAnsi="Times New Roman" w:cs="Times New Roman"/>
+        </w:rPr>
+        <w:t>n</w:t>
+      </w:r>
+      <w:r>
+        <w:rPr>
+          <w:rFonts w:ascii="Times New Roman" w:hAnsi="Times New Roman" w:cs="Times New Roman"/>
+        </w:rPr>
+        <w:t xml:space="preserve">s, including these ones, will work on stridulant, but not absolutely </w:t>
+      </w:r>
+      <w:proofErr w:type="gramStart"/>
+      <w:r>
+        <w:rPr>
+          <w:rFonts w:ascii="Times New Roman" w:hAnsi="Times New Roman" w:cs="Times New Roman"/>
+        </w:rPr>
+        <w:t>all</w:t>
+      </w:r>
+      <w:proofErr w:type="gramEnd"/>
+      <w:r>
+        <w:rPr>
+          <w:rFonts w:ascii="Times New Roman" w:hAnsi="Times New Roman" w:cs="Times New Roman"/>
+        </w:rPr>
+        <w:t xml:space="preserve"> the</w:t>
+      </w:r>
+      <w:r>
+        <w:rPr>
+          <w:rFonts w:ascii="Times New Roman" w:hAnsi="Times New Roman" w:cs="Times New Roman"/>
+        </w:rPr>
+        <w:t xml:space="preserve">m </w:t>
+      </w:r>
+      <w:r>
+        <w:rPr>
+          <w:rFonts w:ascii="Times New Roman" w:hAnsi="Times New Roman" w:cs="Times New Roman"/>
+        </w:rPr>
+        <w:t>are possible without big modifications of the stridulant base code at this point. But if needed I can make it work too.</w:t>
+      </w:r>
+    </w:p>
+    <w:p>
+      <w:pPr>
+        <w:spacing w:after="0"/>
+        <w:rPr>
+          <w:rFonts w:ascii="Times New Roman" w:hAnsi="Times New Roman" w:cs="Times New Roman"/>
+        </w:rPr>
+      </w:pPr>
+    </w:p>
+    <w:p>
+      <w:pPr>
         <w:rPr>
           <w:rFonts w:ascii="Times New Roman" w:hAnsi="Times New Roman" w:cs="Times New Roman"/>
         </w:rPr>
@@ -1572,95 +2036,1017 @@
         <w:rPr>
           <w:rFonts w:ascii="Times New Roman" w:hAnsi="Times New Roman" w:cs="Times New Roman"/>
         </w:rPr>
-        <w:t xml:space="preserve">this will do a peak normalization following Sara’s instructions. We have discussed some caveats of these approach, so we will see if it gets </w:t>
-      </w:r>
+        <w:t xml:space="preserve">this will do a peak normalization following Sara’s instructions. We have discussed some caveats of these approach, so we will see if it gets any use. I </w:t>
+      </w:r>
+      <w:proofErr w:type="gramStart"/>
+      <w:r>
+        <w:rPr>
+          <w:rFonts w:ascii="Times New Roman" w:hAnsi="Times New Roman" w:cs="Times New Roman"/>
+        </w:rPr>
+        <w:t>have to</w:t>
+      </w:r>
+      <w:proofErr w:type="gramEnd"/>
+      <w:r>
+        <w:rPr>
+          <w:rFonts w:ascii="Times New Roman" w:hAnsi="Times New Roman" w:cs="Times New Roman"/>
+        </w:rPr>
+        <w:t xml:space="preserve"> implement a prevention for double normalization as </w:t>
+      </w:r>
+      <w:proofErr w:type="gramStart"/>
+      <w:r>
+        <w:rPr>
+          <w:rFonts w:ascii="Times New Roman" w:hAnsi="Times New Roman" w:cs="Times New Roman"/>
+        </w:rPr>
+        <w:t>well,</w:t>
+      </w:r>
+      <w:proofErr w:type="gramEnd"/>
+      <w:r>
+        <w:rPr>
+          <w:rFonts w:ascii="Times New Roman" w:hAnsi="Times New Roman" w:cs="Times New Roman"/>
+        </w:rPr>
+        <w:t xml:space="preserve"> that’s in the to do pile.</w:t>
+      </w:r>
+    </w:p>
+    <w:p>
+      <w:pPr>
+        <w:pStyle w:val="Ttulo2"/>
+      </w:pPr>
+      <w:r>
+        <w:t>Spectrograms</w:t>
+      </w:r>
+    </w:p>
+    <w:p>
+      <w:pPr>
+        <w:spacing w:after="0"/>
+        <w:rPr>
+          <w:rFonts w:ascii="Times New Roman" w:hAnsi="Times New Roman" w:cs="Times New Roman"/>
+        </w:rPr>
+      </w:pPr>
+      <w:r>
+        <w:rPr>
+          <w:rFonts w:ascii="Times New Roman" w:hAnsi="Times New Roman" w:cs="Times New Roman"/>
+        </w:rPr>
+        <w:t xml:space="preserve">Spectrograms </w:t>
+      </w:r>
+      <w:r>
+        <w:rPr>
+          <w:rFonts w:ascii="Times New Roman" w:hAnsi="Times New Roman" w:cs="Times New Roman"/>
+        </w:rPr>
+        <w:t>are a bit easier than snippets in the sense that they have less functions, but their usage is the same.</w:t>
+      </w:r>
+    </w:p>
+    <w:p>
+      <w:pPr>
+        <w:spacing w:after="0"/>
+        <w:rPr>
+          <w:rFonts w:ascii="Times New Roman" w:hAnsi="Times New Roman" w:cs="Times New Roman"/>
+        </w:rPr>
+      </w:pPr>
+      <w:r>
+        <w:rPr>
+          <w:rFonts w:ascii="Times New Roman" w:hAnsi="Times New Roman" w:cs="Times New Roman"/>
+        </w:rPr>
+        <w:t xml:space="preserve">1.- you can visualize it with </w:t>
+      </w:r>
+      <w:r>
+        <w:rPr>
+          <w:rFonts w:ascii="Times New Roman" w:hAnsi="Times New Roman" w:cs="Times New Roman"/>
+          <w:b/>
+          <w:bCs/>
+          <w:i/>
+          <w:iCs/>
+        </w:rPr>
+        <w:t>spectrogram_</w:t>
+      </w:r>
+      <w:proofErr w:type="gramStart"/>
+      <w:r>
+        <w:rPr>
+          <w:rFonts w:ascii="Times New Roman" w:hAnsi="Times New Roman" w:cs="Times New Roman"/>
+          <w:b/>
+          <w:bCs/>
+          <w:i/>
+          <w:iCs/>
+        </w:rPr>
+        <w:t>1.plot</w:t>
+      </w:r>
+      <w:proofErr w:type="gramEnd"/>
+      <w:r>
+        <w:rPr>
+          <w:rFonts w:ascii="Times New Roman" w:hAnsi="Times New Roman" w:cs="Times New Roman"/>
+          <w:b/>
+          <w:bCs/>
+          <w:i/>
+          <w:iCs/>
+        </w:rPr>
+        <w:t>(</w:t>
+      </w:r>
+      <w:proofErr w:type="spellStart"/>
+      <w:r>
+        <w:rPr>
+          <w:rFonts w:ascii="Times New Roman" w:hAnsi="Times New Roman" w:cs="Times New Roman"/>
+          <w:b/>
+          <w:bCs/>
+          <w:i/>
+          <w:iCs/>
+        </w:rPr>
+        <w:t>color</w:t>
+      </w:r>
+      <w:proofErr w:type="spellEnd"/>
+      <w:r>
+        <w:rPr>
+          <w:rFonts w:ascii="Times New Roman" w:hAnsi="Times New Roman" w:cs="Times New Roman"/>
+          <w:b/>
+          <w:bCs/>
+          <w:i/>
+          <w:iCs/>
+        </w:rPr>
+        <w:t xml:space="preserve"> = “inferno”</w:t>
+      </w:r>
+      <w:r>
+        <w:rPr>
+          <w:rFonts w:ascii="Times New Roman" w:hAnsi="Times New Roman" w:cs="Times New Roman"/>
+          <w:b/>
+          <w:bCs/>
+          <w:i/>
+          <w:iCs/>
+        </w:rPr>
+        <w:t>)</w:t>
+      </w:r>
+      <w:r>
+        <w:rPr>
+          <w:rFonts w:ascii="Times New Roman" w:hAnsi="Times New Roman" w:cs="Times New Roman"/>
+        </w:rPr>
+        <w:t>. This will only show it on screen for you to inspect.</w:t>
+      </w:r>
+      <w:r>
+        <w:rPr>
+          <w:rFonts w:ascii="Times New Roman" w:hAnsi="Times New Roman" w:cs="Times New Roman"/>
+        </w:rPr>
+        <w:t xml:space="preserve"> I have added a </w:t>
+      </w:r>
+      <w:proofErr w:type="spellStart"/>
+      <w:r>
+        <w:rPr>
+          <w:rFonts w:ascii="Times New Roman" w:hAnsi="Times New Roman" w:cs="Times New Roman"/>
+        </w:rPr>
+        <w:t>color</w:t>
+      </w:r>
+      <w:proofErr w:type="spellEnd"/>
+      <w:r>
+        <w:rPr>
+          <w:rFonts w:ascii="Times New Roman" w:hAnsi="Times New Roman" w:cs="Times New Roman"/>
+        </w:rPr>
+        <w:t xml:space="preserve"> argument because I got sick of looking at the base one and thought you might too. Use </w:t>
+      </w:r>
+      <w:proofErr w:type="spellStart"/>
+      <w:proofErr w:type="gramStart"/>
+      <w:r>
+        <w:rPr>
+          <w:rFonts w:ascii="Times New Roman" w:hAnsi="Times New Roman" w:cs="Times New Roman"/>
+        </w:rPr>
+        <w:t>plt.colormaps</w:t>
+      </w:r>
+      <w:proofErr w:type="spellEnd"/>
+      <w:proofErr w:type="gramEnd"/>
+      <w:r>
+        <w:rPr>
+          <w:rFonts w:ascii="Times New Roman" w:hAnsi="Times New Roman" w:cs="Times New Roman"/>
+        </w:rPr>
+        <w:t>() to see options</w:t>
+      </w:r>
+    </w:p>
+    <w:p>
+      <w:pPr>
+        <w:spacing w:after="0"/>
+        <w:rPr>
+          <w:rFonts w:ascii="Times New Roman" w:hAnsi="Times New Roman" w:cs="Times New Roman"/>
+        </w:rPr>
+      </w:pPr>
+      <w:r>
+        <w:rPr>
+          <w:rFonts w:ascii="Times New Roman" w:hAnsi="Times New Roman" w:cs="Times New Roman"/>
+        </w:rPr>
+        <w:t xml:space="preserve">2.- you can save it with </w:t>
+      </w:r>
+      <w:r>
+        <w:rPr>
+          <w:rFonts w:ascii="Times New Roman" w:hAnsi="Times New Roman" w:cs="Times New Roman"/>
+          <w:b/>
+          <w:bCs/>
+          <w:i/>
+          <w:iCs/>
+        </w:rPr>
+        <w:t>spectrogram_</w:t>
+      </w:r>
+      <w:proofErr w:type="gramStart"/>
+      <w:r>
+        <w:rPr>
+          <w:rFonts w:ascii="Times New Roman" w:hAnsi="Times New Roman" w:cs="Times New Roman"/>
+          <w:b/>
+          <w:bCs/>
+          <w:i/>
+          <w:iCs/>
+        </w:rPr>
+        <w:t>1.save</w:t>
+      </w:r>
+      <w:proofErr w:type="gramEnd"/>
+      <w:r>
+        <w:rPr>
+          <w:rFonts w:ascii="Times New Roman" w:hAnsi="Times New Roman" w:cs="Times New Roman"/>
+          <w:b/>
+          <w:bCs/>
+          <w:i/>
+          <w:iCs/>
+        </w:rPr>
+        <w:t>_</w:t>
+      </w:r>
+      <w:proofErr w:type="gramStart"/>
+      <w:r>
+        <w:rPr>
+          <w:rFonts w:ascii="Times New Roman" w:hAnsi="Times New Roman" w:cs="Times New Roman"/>
+          <w:b/>
+          <w:bCs/>
+          <w:i/>
+          <w:iCs/>
+        </w:rPr>
+        <w:t>img</w:t>
+      </w:r>
+      <w:r>
+        <w:rPr>
+          <w:rFonts w:ascii="Times New Roman" w:hAnsi="Times New Roman" w:cs="Times New Roman"/>
+          <w:b/>
+          <w:bCs/>
+          <w:i/>
+          <w:iCs/>
+        </w:rPr>
+        <w:t>(</w:t>
+      </w:r>
+      <w:proofErr w:type="gramEnd"/>
+      <w:r>
+        <w:rPr>
+          <w:rFonts w:ascii="Times New Roman" w:hAnsi="Times New Roman" w:cs="Times New Roman"/>
+          <w:b/>
+          <w:bCs/>
+          <w:i/>
+          <w:iCs/>
+        </w:rPr>
+        <w:t xml:space="preserve">name, </w:t>
+      </w:r>
+      <w:proofErr w:type="spellStart"/>
+      <w:r>
+        <w:rPr>
+          <w:rFonts w:ascii="Times New Roman" w:hAnsi="Times New Roman" w:cs="Times New Roman"/>
+          <w:b/>
+          <w:bCs/>
+          <w:i/>
+          <w:iCs/>
+        </w:rPr>
+        <w:t>dir</w:t>
+      </w:r>
+      <w:proofErr w:type="spellEnd"/>
+      <w:r>
+        <w:rPr>
+          <w:rFonts w:ascii="Times New Roman" w:hAnsi="Times New Roman" w:cs="Times New Roman"/>
+          <w:b/>
+          <w:bCs/>
+          <w:i/>
+          <w:iCs/>
+        </w:rPr>
+        <w:t xml:space="preserve">, </w:t>
+      </w:r>
+      <w:proofErr w:type="spellStart"/>
+      <w:r>
+        <w:rPr>
+          <w:rFonts w:ascii="Times New Roman" w:hAnsi="Times New Roman" w:cs="Times New Roman"/>
+          <w:b/>
+          <w:bCs/>
+          <w:i/>
+          <w:iCs/>
+        </w:rPr>
+        <w:t>with_labels</w:t>
+      </w:r>
+      <w:proofErr w:type="spellEnd"/>
+      <w:r>
+        <w:rPr>
+          <w:rFonts w:ascii="Times New Roman" w:hAnsi="Times New Roman" w:cs="Times New Roman"/>
+          <w:b/>
+          <w:bCs/>
+          <w:i/>
+          <w:iCs/>
+        </w:rPr>
+        <w:t xml:space="preserve"> = False</w:t>
+      </w:r>
+      <w:r>
+        <w:rPr>
+          <w:rFonts w:ascii="Times New Roman" w:hAnsi="Times New Roman" w:cs="Times New Roman"/>
+          <w:b/>
+          <w:bCs/>
+          <w:i/>
+          <w:iCs/>
+        </w:rPr>
+        <w:t>)</w:t>
+      </w:r>
+      <w:r>
+        <w:rPr>
+          <w:rFonts w:ascii="Times New Roman" w:hAnsi="Times New Roman" w:cs="Times New Roman"/>
+        </w:rPr>
+        <w:t xml:space="preserve">. I suggest you follow the same naming conventions explained for snippets. The spectrogram will automatically receive time stamps and other flags from the snippet they come from. The </w:t>
+      </w:r>
+      <w:proofErr w:type="spellStart"/>
+      <w:r>
+        <w:rPr>
+          <w:rFonts w:ascii="Times New Roman" w:hAnsi="Times New Roman" w:cs="Times New Roman"/>
+        </w:rPr>
+        <w:t>with_labels</w:t>
+      </w:r>
+      <w:proofErr w:type="spellEnd"/>
+      <w:r>
+        <w:rPr>
+          <w:rFonts w:ascii="Times New Roman" w:hAnsi="Times New Roman" w:cs="Times New Roman"/>
+        </w:rPr>
+        <w:t xml:space="preserve"> </w:t>
+      </w:r>
+      <w:proofErr w:type="spellStart"/>
+      <w:r>
+        <w:rPr>
+          <w:rFonts w:ascii="Times New Roman" w:hAnsi="Times New Roman" w:cs="Times New Roman"/>
+        </w:rPr>
+        <w:t>kwarg</w:t>
+      </w:r>
+      <w:proofErr w:type="spellEnd"/>
+      <w:r>
+        <w:rPr>
+          <w:rFonts w:ascii="Times New Roman" w:hAnsi="Times New Roman" w:cs="Times New Roman"/>
+        </w:rPr>
+        <w:t xml:space="preserve"> will default to false (you don’t have write it unless you want it True). This means that the spectrogram will be saved without axis colour codes or other things. That is the way you want them to be in your AI models, but for presentations or papers, you can turn it </w:t>
+      </w:r>
+      <w:proofErr w:type="gramStart"/>
+      <w:r>
+        <w:rPr>
+          <w:rFonts w:ascii="Times New Roman" w:hAnsi="Times New Roman" w:cs="Times New Roman"/>
+        </w:rPr>
+        <w:t>true</w:t>
+      </w:r>
+      <w:proofErr w:type="gramEnd"/>
+      <w:r>
+        <w:rPr>
+          <w:rFonts w:ascii="Times New Roman" w:hAnsi="Times New Roman" w:cs="Times New Roman"/>
+        </w:rPr>
+        <w:t xml:space="preserve"> and it will give you something more human readable.</w:t>
+      </w:r>
+      <w:r>
+        <w:rPr>
+          <w:rFonts w:ascii="Times New Roman" w:hAnsi="Times New Roman" w:cs="Times New Roman"/>
+        </w:rPr>
+        <w:t xml:space="preserve"> As with the plot, now you can choose a colormap. See plot function for details.</w:t>
+      </w:r>
+    </w:p>
+    <w:p>
+      <w:pPr>
+        <w:spacing w:after="0"/>
+        <w:rPr>
+          <w:rFonts w:ascii="Times New Roman" w:hAnsi="Times New Roman" w:cs="Times New Roman"/>
+        </w:rPr>
+      </w:pPr>
+      <w:r>
+        <w:rPr>
+          <w:rFonts w:ascii="Times New Roman" w:hAnsi="Times New Roman" w:cs="Times New Roman"/>
+        </w:rPr>
+        <w:t xml:space="preserve">3.- you can now save a table with the spectrogram data too with </w:t>
+      </w:r>
+      <w:proofErr w:type="spellStart"/>
+      <w:proofErr w:type="gramStart"/>
+      <w:r>
+        <w:rPr>
+          <w:rFonts w:ascii="Times New Roman" w:hAnsi="Times New Roman" w:cs="Times New Roman"/>
+          <w:b/>
+        </w:rPr>
+        <w:t>spectrogram.s</w:t>
+      </w:r>
+      <w:r>
+        <w:rPr>
+          <w:rFonts w:ascii="Times New Roman" w:hAnsi="Times New Roman" w:cs="Times New Roman"/>
+          <w:b/>
+          <w:i/>
+        </w:rPr>
+        <w:t>ave</w:t>
+      </w:r>
+      <w:proofErr w:type="gramEnd"/>
+      <w:r>
+        <w:rPr>
+          <w:rFonts w:ascii="Times New Roman" w:hAnsi="Times New Roman" w:cs="Times New Roman"/>
+          <w:b/>
+          <w:i/>
+        </w:rPr>
+        <w:t>_</w:t>
+      </w:r>
+      <w:proofErr w:type="gramStart"/>
+      <w:r>
+        <w:rPr>
+          <w:rFonts w:ascii="Times New Roman" w:hAnsi="Times New Roman" w:cs="Times New Roman"/>
+          <w:b/>
+          <w:i/>
+        </w:rPr>
+        <w:t>table</w:t>
+      </w:r>
+      <w:proofErr w:type="spellEnd"/>
+      <w:r>
+        <w:rPr>
+          <w:rFonts w:ascii="Times New Roman" w:hAnsi="Times New Roman" w:cs="Times New Roman"/>
+          <w:b/>
+          <w:i/>
+        </w:rPr>
+        <w:t>(</w:t>
+      </w:r>
+      <w:proofErr w:type="spellStart"/>
+      <w:proofErr w:type="gramEnd"/>
+      <w:r>
+        <w:rPr>
+          <w:rFonts w:ascii="Times New Roman" w:hAnsi="Times New Roman" w:cs="Times New Roman"/>
+          <w:b/>
+          <w:i/>
+        </w:rPr>
+        <w:t>source_name</w:t>
+      </w:r>
+      <w:proofErr w:type="spellEnd"/>
+      <w:r>
+        <w:rPr>
+          <w:rFonts w:ascii="Times New Roman" w:hAnsi="Times New Roman" w:cs="Times New Roman"/>
+          <w:b/>
+          <w:i/>
+        </w:rPr>
+        <w:t xml:space="preserve">, </w:t>
+      </w:r>
+      <w:proofErr w:type="spellStart"/>
+      <w:r>
+        <w:rPr>
+          <w:rFonts w:ascii="Times New Roman" w:hAnsi="Times New Roman" w:cs="Times New Roman"/>
+          <w:b/>
+          <w:i/>
+        </w:rPr>
+        <w:t>output_dir</w:t>
+      </w:r>
+      <w:proofErr w:type="spellEnd"/>
+      <w:r>
+        <w:rPr>
+          <w:rFonts w:ascii="Times New Roman" w:hAnsi="Times New Roman" w:cs="Times New Roman"/>
+          <w:b/>
+          <w:i/>
+        </w:rPr>
+        <w:t>)</w:t>
+      </w:r>
+      <w:r>
+        <w:rPr>
+          <w:rFonts w:ascii="Times New Roman" w:hAnsi="Times New Roman" w:cs="Times New Roman"/>
+        </w:rPr>
+        <w:t xml:space="preserve"> I suggest using the same naming convention, although this, for the moment at least, can’t be loaded, so it is not so critical.</w:t>
+      </w:r>
+    </w:p>
+    <w:p>
+      <w:pPr>
+        <w:rPr>
+          <w:rFonts w:ascii="Times New Roman" w:hAnsi="Times New Roman" w:cs="Times New Roman"/>
+        </w:rPr>
+      </w:pPr>
+      <w:r>
+        <w:rPr>
+          <w:rFonts w:ascii="Times New Roman" w:hAnsi="Times New Roman" w:cs="Times New Roman"/>
+        </w:rPr>
+        <w:t xml:space="preserve">4.- get average power and peak power densities with </w:t>
+      </w:r>
+      <w:proofErr w:type="spellStart"/>
+      <w:proofErr w:type="gramStart"/>
+      <w:r>
+        <w:rPr>
+          <w:rFonts w:ascii="Times New Roman" w:hAnsi="Times New Roman" w:cs="Times New Roman"/>
+          <w:b/>
+        </w:rPr>
+        <w:t>spectrogram.compute</w:t>
+      </w:r>
+      <w:proofErr w:type="gramEnd"/>
+      <w:r>
+        <w:rPr>
+          <w:rFonts w:ascii="Times New Roman" w:hAnsi="Times New Roman" w:cs="Times New Roman"/>
+          <w:b/>
+        </w:rPr>
+        <w:t>_power_</w:t>
+      </w:r>
+      <w:proofErr w:type="gramStart"/>
+      <w:r>
+        <w:rPr>
+          <w:rFonts w:ascii="Times New Roman" w:hAnsi="Times New Roman" w:cs="Times New Roman"/>
+          <w:b/>
+        </w:rPr>
+        <w:t>metrics</w:t>
+      </w:r>
+      <w:proofErr w:type="spellEnd"/>
+      <w:r>
+        <w:rPr>
+          <w:rFonts w:ascii="Times New Roman" w:hAnsi="Times New Roman" w:cs="Times New Roman"/>
+          <w:b/>
+        </w:rPr>
+        <w:t>(</w:t>
+      </w:r>
+      <w:proofErr w:type="gramEnd"/>
+      <w:r>
+        <w:rPr>
+          <w:rFonts w:ascii="Times New Roman" w:hAnsi="Times New Roman" w:cs="Times New Roman"/>
+          <w:b/>
+        </w:rPr>
+        <w:t>)</w:t>
+      </w:r>
+      <w:r>
+        <w:rPr>
+          <w:rFonts w:ascii="Times New Roman" w:hAnsi="Times New Roman" w:cs="Times New Roman"/>
+          <w:b/>
+        </w:rPr>
+        <w:t xml:space="preserve">. </w:t>
+      </w:r>
+      <w:r>
+        <w:rPr>
+          <w:rFonts w:ascii="Times New Roman" w:hAnsi="Times New Roman" w:cs="Times New Roman"/>
+        </w:rPr>
+        <w:t xml:space="preserve">This will return APD and PPD and return them on that order. Units currently are </w:t>
+      </w:r>
+      <w:proofErr w:type="spellStart"/>
+      <w:r>
+        <w:rPr>
+          <w:rFonts w:ascii="Times New Roman" w:hAnsi="Times New Roman" w:cs="Times New Roman"/>
+        </w:rPr>
+        <w:t>dB.</w:t>
+      </w:r>
+      <w:proofErr w:type="spellEnd"/>
+    </w:p>
+    <w:p>
+      <w:pPr>
+        <w:rPr>
+          <w:rFonts w:ascii="Times New Roman" w:hAnsi="Times New Roman" w:cs="Times New Roman"/>
+        </w:rPr>
+      </w:pPr>
       <w:r>
         <w:rPr>
           <w:rFonts w:ascii="Times New Roman" w:hAnsi="Times New Roman" w:cs="Times New Roman"/>
         </w:rPr>
         <w:lastRenderedPageBreak/>
-        <w:t xml:space="preserve">any use. I </w:t>
+        <w:t>With these functions, you should be able to cut, your own stridulations, just remember the time frame is important. You must make a decision at the beginning, how long will snippets be for the model? Then stick to that length to preserve proportions. Then, it is technically possible to just do this by hand and create all the data by yourself. But later on I will explain how to automatically batch-process big files. However this part of the tutorial is relevant for you to understand how your pipeline works and what is happening on the backstage. Also, to sometimes manually cut one particular stridulation or make some more augmentations.</w:t>
+      </w:r>
+    </w:p>
+    <w:p>
+      <w:pPr>
+        <w:spacing w:after="0"/>
+        <w:rPr>
+          <w:rFonts w:ascii="Times New Roman" w:hAnsi="Times New Roman" w:cs="Times New Roman"/>
+        </w:rPr>
+      </w:pPr>
+      <w:r>
+        <w:rPr>
+          <w:rFonts w:ascii="Times New Roman" w:hAnsi="Times New Roman" w:cs="Times New Roman"/>
+        </w:rPr>
+        <w:t>Finally, if you are working on already saved snippets, I have added a loading function for them so you don’t have to be cutting the same snippet once and again.</w:t>
+      </w:r>
+    </w:p>
+    <w:p>
+      <w:pPr>
+        <w:spacing w:after="0"/>
+        <w:rPr>
+          <w:rFonts w:ascii="Times New Roman" w:hAnsi="Times New Roman" w:cs="Times New Roman"/>
+        </w:rPr>
+      </w:pPr>
+      <w:r>
+        <w:rPr>
+          <w:rFonts w:ascii="Times New Roman" w:hAnsi="Times New Roman" w:cs="Times New Roman"/>
+          <w:b/>
+          <w:bCs/>
+          <w:i/>
+          <w:iCs/>
+        </w:rPr>
+        <w:t xml:space="preserve">Snippet = </w:t>
+      </w:r>
+      <w:proofErr w:type="spellStart"/>
+      <w:r>
+        <w:rPr>
+          <w:rFonts w:ascii="Times New Roman" w:hAnsi="Times New Roman" w:cs="Times New Roman"/>
+          <w:b/>
+          <w:bCs/>
+          <w:i/>
+          <w:iCs/>
+        </w:rPr>
+        <w:t>st.</w:t>
+      </w:r>
+      <w:r>
+        <w:rPr>
+          <w:rFonts w:ascii="Times New Roman" w:hAnsi="Times New Roman" w:cs="Times New Roman"/>
+          <w:b/>
+          <w:bCs/>
+          <w:i/>
+          <w:iCs/>
+        </w:rPr>
+        <w:t>load_snippet</w:t>
+      </w:r>
+      <w:proofErr w:type="spellEnd"/>
+      <w:r>
+        <w:rPr>
+          <w:rFonts w:ascii="Times New Roman" w:hAnsi="Times New Roman" w:cs="Times New Roman"/>
+          <w:b/>
+          <w:bCs/>
+          <w:i/>
+          <w:iCs/>
+        </w:rPr>
+        <w:t>(</w:t>
+      </w:r>
+      <w:proofErr w:type="spellStart"/>
+      <w:r>
+        <w:rPr>
+          <w:rFonts w:ascii="Times New Roman" w:hAnsi="Times New Roman" w:cs="Times New Roman"/>
+          <w:b/>
+          <w:bCs/>
+          <w:i/>
+          <w:iCs/>
+        </w:rPr>
+        <w:t>file_path</w:t>
+      </w:r>
+      <w:proofErr w:type="spellEnd"/>
+      <w:r>
+        <w:rPr>
+          <w:rFonts w:ascii="Times New Roman" w:hAnsi="Times New Roman" w:cs="Times New Roman"/>
+          <w:b/>
+          <w:bCs/>
+          <w:i/>
+          <w:iCs/>
+        </w:rPr>
+        <w:t>)</w:t>
+      </w:r>
+      <w:r>
+        <w:rPr>
+          <w:rFonts w:ascii="Times New Roman" w:hAnsi="Times New Roman" w:cs="Times New Roman"/>
+        </w:rPr>
+        <w:t xml:space="preserve"> will load the audio snippet file as a snippet already, and will catch from the name the length and other attributes, so you can resume your work on a snippet without loading the file and cutting it again.</w:t>
+      </w:r>
+    </w:p>
+    <w:p>
+      <w:pPr>
+        <w:rPr>
+          <w:rFonts w:ascii="Times New Roman" w:hAnsi="Times New Roman" w:cs="Times New Roman"/>
+          <w:b/>
+          <w:bCs/>
+        </w:rPr>
+      </w:pPr>
+    </w:p>
+    <w:p>
+      <w:pPr>
+        <w:pStyle w:val="Ttulo1"/>
+      </w:pPr>
+      <w:r>
+        <w:t>Batch processing files</w:t>
+      </w:r>
+    </w:p>
+    <w:p>
+      <w:pPr>
+        <w:rPr>
+          <w:rFonts w:ascii="Times New Roman" w:hAnsi="Times New Roman" w:cs="Times New Roman"/>
+        </w:rPr>
+      </w:pPr>
+      <w:r>
+        <w:rPr>
+          <w:rFonts w:ascii="Times New Roman" w:hAnsi="Times New Roman" w:cs="Times New Roman"/>
+        </w:rPr>
+        <w:t>When you work on big data files, it would be too time consuming to do all of the above manually. So I have given you some functions that will, using the above methodology, process long files and create the adequate folder structures so everything keeps paired. Bear in mind these functions create big amounts of files and quickly go into the GB size folders, you may want to keep it civilized and not have enormous amounts of these on your hard drive. In the pipeline script you will find an easy to reuse code for doing these, although some of the logic of that code will over time become part of the package, for now that is your best way to do all of this. But generally speaking, you have two functions.</w:t>
+      </w:r>
+    </w:p>
+    <w:p>
+      <w:pPr>
+        <w:rPr>
+          <w:rFonts w:ascii="Times New Roman" w:hAnsi="Times New Roman" w:cs="Times New Roman"/>
+        </w:rPr>
+      </w:pPr>
+      <w:proofErr w:type="spellStart"/>
+      <w:r>
+        <w:rPr>
+          <w:rFonts w:ascii="Times New Roman" w:hAnsi="Times New Roman" w:cs="Times New Roman"/>
+          <w:b/>
+          <w:bCs/>
+          <w:i/>
+          <w:iCs/>
+        </w:rPr>
+        <w:t>process_audio_</w:t>
       </w:r>
       <w:proofErr w:type="gramStart"/>
       <w:r>
         <w:rPr>
           <w:rFonts w:ascii="Times New Roman" w:hAnsi="Times New Roman" w:cs="Times New Roman"/>
-        </w:rPr>
-        <w:t>have to</w:t>
-      </w:r>
+          <w:b/>
+          <w:bCs/>
+          <w:i/>
+          <w:iCs/>
+        </w:rPr>
+        <w:t>file</w:t>
+      </w:r>
+      <w:proofErr w:type="spellEnd"/>
+      <w:r>
+        <w:rPr>
+          <w:rFonts w:ascii="Times New Roman" w:hAnsi="Times New Roman" w:cs="Times New Roman"/>
+          <w:b/>
+          <w:bCs/>
+          <w:i/>
+          <w:iCs/>
+        </w:rPr>
+        <w:t>(</w:t>
+      </w:r>
+      <w:proofErr w:type="spellStart"/>
       <w:proofErr w:type="gramEnd"/>
       <w:r>
         <w:rPr>
           <w:rFonts w:ascii="Times New Roman" w:hAnsi="Times New Roman" w:cs="Times New Roman"/>
-        </w:rPr>
-        <w:t xml:space="preserve"> implement a prevention for double normalization as </w:t>
-      </w:r>
+          <w:b/>
+          <w:bCs/>
+          <w:i/>
+          <w:iCs/>
+        </w:rPr>
+        <w:t>audio_path</w:t>
+      </w:r>
+      <w:proofErr w:type="spellEnd"/>
+      <w:r>
+        <w:rPr>
+          <w:rFonts w:ascii="Times New Roman" w:hAnsi="Times New Roman" w:cs="Times New Roman"/>
+          <w:b/>
+          <w:bCs/>
+          <w:i/>
+          <w:iCs/>
+        </w:rPr>
+        <w:t xml:space="preserve">, </w:t>
+      </w:r>
+      <w:proofErr w:type="spellStart"/>
+      <w:r>
+        <w:rPr>
+          <w:rFonts w:ascii="Times New Roman" w:hAnsi="Times New Roman" w:cs="Times New Roman"/>
+          <w:b/>
+          <w:bCs/>
+          <w:i/>
+          <w:iCs/>
+        </w:rPr>
+        <w:t>snippet_duration</w:t>
+      </w:r>
+      <w:proofErr w:type="spellEnd"/>
+      <w:r>
+        <w:rPr>
+          <w:rFonts w:ascii="Times New Roman" w:hAnsi="Times New Roman" w:cs="Times New Roman"/>
+          <w:b/>
+          <w:bCs/>
+          <w:i/>
+          <w:iCs/>
+        </w:rPr>
+        <w:t xml:space="preserve">=2, </w:t>
+      </w:r>
+      <w:proofErr w:type="spellStart"/>
+      <w:r>
+        <w:rPr>
+          <w:rFonts w:ascii="Times New Roman" w:hAnsi="Times New Roman" w:cs="Times New Roman"/>
+          <w:b/>
+          <w:bCs/>
+          <w:i/>
+          <w:iCs/>
+        </w:rPr>
+        <w:t>with_labels</w:t>
+      </w:r>
+      <w:proofErr w:type="spellEnd"/>
+      <w:r>
+        <w:rPr>
+          <w:rFonts w:ascii="Times New Roman" w:hAnsi="Times New Roman" w:cs="Times New Roman"/>
+          <w:b/>
+          <w:bCs/>
+          <w:i/>
+          <w:iCs/>
+        </w:rPr>
+        <w:t xml:space="preserve">=False, </w:t>
+      </w:r>
+      <w:proofErr w:type="spellStart"/>
+      <w:r>
+        <w:rPr>
+          <w:rFonts w:ascii="Times New Roman" w:hAnsi="Times New Roman" w:cs="Times New Roman"/>
+          <w:b/>
+          <w:bCs/>
+          <w:i/>
+          <w:iCs/>
+        </w:rPr>
+        <w:t>spec_type</w:t>
+      </w:r>
+      <w:proofErr w:type="spellEnd"/>
+      <w:r>
+        <w:rPr>
+          <w:rFonts w:ascii="Times New Roman" w:hAnsi="Times New Roman" w:cs="Times New Roman"/>
+          <w:b/>
+          <w:bCs/>
+          <w:i/>
+          <w:iCs/>
+        </w:rPr>
+        <w:t xml:space="preserve">="mel", </w:t>
+      </w:r>
+      <w:proofErr w:type="spellStart"/>
+      <w:r>
+        <w:rPr>
+          <w:rFonts w:ascii="Times New Roman" w:hAnsi="Times New Roman" w:cs="Times New Roman"/>
+          <w:b/>
+          <w:bCs/>
+          <w:i/>
+          <w:iCs/>
+        </w:rPr>
+        <w:t>color</w:t>
+      </w:r>
+      <w:proofErr w:type="spellEnd"/>
+      <w:r>
+        <w:rPr>
+          <w:rFonts w:ascii="Times New Roman" w:hAnsi="Times New Roman" w:cs="Times New Roman"/>
+          <w:b/>
+          <w:bCs/>
+          <w:i/>
+          <w:iCs/>
+        </w:rPr>
+        <w:t xml:space="preserve"> = "inferno", </w:t>
+      </w:r>
+      <w:proofErr w:type="spellStart"/>
+      <w:r>
+        <w:rPr>
+          <w:rFonts w:ascii="Times New Roman" w:hAnsi="Times New Roman" w:cs="Times New Roman"/>
+          <w:b/>
+          <w:bCs/>
+          <w:i/>
+          <w:iCs/>
+        </w:rPr>
+        <w:t>output_folder</w:t>
+      </w:r>
+      <w:proofErr w:type="spellEnd"/>
+      <w:r>
+        <w:rPr>
+          <w:rFonts w:ascii="Times New Roman" w:hAnsi="Times New Roman" w:cs="Times New Roman"/>
+          <w:b/>
+          <w:bCs/>
+          <w:i/>
+          <w:iCs/>
+        </w:rPr>
+        <w:t xml:space="preserve">=None, </w:t>
+      </w:r>
+      <w:proofErr w:type="spellStart"/>
+      <w:r>
+        <w:rPr>
+          <w:rFonts w:ascii="Times New Roman" w:hAnsi="Times New Roman" w:cs="Times New Roman"/>
+          <w:b/>
+          <w:bCs/>
+          <w:i/>
+          <w:iCs/>
+        </w:rPr>
+        <w:t>update_freq</w:t>
+      </w:r>
+      <w:proofErr w:type="spellEnd"/>
+      <w:r>
+        <w:rPr>
+          <w:rFonts w:ascii="Times New Roman" w:hAnsi="Times New Roman" w:cs="Times New Roman"/>
+          <w:b/>
+          <w:bCs/>
+          <w:i/>
+          <w:iCs/>
+        </w:rPr>
+        <w:t>=10):</w:t>
+      </w:r>
+      <w:r>
+        <w:rPr>
+          <w:rFonts w:ascii="Times New Roman" w:hAnsi="Times New Roman" w:cs="Times New Roman"/>
+          <w:b/>
+          <w:bCs/>
+          <w:i/>
+          <w:iCs/>
+        </w:rPr>
+        <w:t xml:space="preserve"> </w:t>
+      </w:r>
+      <w:r>
+        <w:rPr>
+          <w:rFonts w:ascii="Times New Roman" w:hAnsi="Times New Roman" w:cs="Times New Roman"/>
+        </w:rPr>
+        <w:t xml:space="preserve">here you type the path to your audio file, and the </w:t>
+      </w:r>
+      <w:proofErr w:type="spellStart"/>
+      <w:r>
+        <w:rPr>
+          <w:rFonts w:ascii="Times New Roman" w:hAnsi="Times New Roman" w:cs="Times New Roman"/>
+        </w:rPr>
+        <w:t>kwargs</w:t>
+      </w:r>
+      <w:proofErr w:type="spellEnd"/>
+      <w:r>
+        <w:rPr>
+          <w:rFonts w:ascii="Times New Roman" w:hAnsi="Times New Roman" w:cs="Times New Roman"/>
+        </w:rPr>
+        <w:t xml:space="preserve"> if you need them. As you see, </w:t>
+      </w:r>
+      <w:proofErr w:type="spellStart"/>
+      <w:r>
+        <w:rPr>
+          <w:rFonts w:ascii="Times New Roman" w:hAnsi="Times New Roman" w:cs="Times New Roman"/>
+        </w:rPr>
+        <w:t>snippet_duration</w:t>
+      </w:r>
+      <w:proofErr w:type="spellEnd"/>
+      <w:r>
+        <w:rPr>
+          <w:rFonts w:ascii="Times New Roman" w:hAnsi="Times New Roman" w:cs="Times New Roman"/>
+        </w:rPr>
+        <w:t xml:space="preserve"> defaults to 2 seconds, and </w:t>
+      </w:r>
+      <w:proofErr w:type="spellStart"/>
+      <w:r>
+        <w:rPr>
+          <w:rFonts w:ascii="Times New Roman" w:hAnsi="Times New Roman" w:cs="Times New Roman"/>
+        </w:rPr>
+        <w:t>output_folder</w:t>
+      </w:r>
+      <w:proofErr w:type="spellEnd"/>
+      <w:r>
+        <w:rPr>
+          <w:rFonts w:ascii="Times New Roman" w:hAnsi="Times New Roman" w:cs="Times New Roman"/>
+        </w:rPr>
+        <w:t xml:space="preserve"> to none, which should create a folder with the name of the sound file and store things there. That folder will be filled in with 2 subfolders, one with the snippets, and one with the spectrograms.</w:t>
+      </w:r>
+      <w:r>
+        <w:rPr>
+          <w:rFonts w:ascii="Times New Roman" w:hAnsi="Times New Roman" w:cs="Times New Roman"/>
+        </w:rPr>
+        <w:t xml:space="preserve"> I have just now added ad labels toggle, make it true for visualization, but keep it off for AI training purposes. You can also change the spectrogram type between the three options available (</w:t>
+      </w:r>
+      <w:proofErr w:type="spellStart"/>
+      <w:r>
+        <w:rPr>
+          <w:rFonts w:ascii="Times New Roman" w:hAnsi="Times New Roman" w:cs="Times New Roman"/>
+        </w:rPr>
+        <w:t>fft</w:t>
+      </w:r>
+      <w:proofErr w:type="spellEnd"/>
+      <w:r>
+        <w:rPr>
+          <w:rFonts w:ascii="Times New Roman" w:hAnsi="Times New Roman" w:cs="Times New Roman"/>
+        </w:rPr>
+        <w:t xml:space="preserve">, mel, or Hilbert, but be aware Hilbert can be very slow). And since I was at it, I added a </w:t>
+      </w:r>
+      <w:proofErr w:type="spellStart"/>
+      <w:r>
+        <w:rPr>
+          <w:rFonts w:ascii="Times New Roman" w:hAnsi="Times New Roman" w:cs="Times New Roman"/>
+        </w:rPr>
+        <w:t>color</w:t>
+      </w:r>
+      <w:proofErr w:type="spellEnd"/>
+      <w:r>
+        <w:rPr>
+          <w:rFonts w:ascii="Times New Roman" w:hAnsi="Times New Roman" w:cs="Times New Roman"/>
+        </w:rPr>
+        <w:t xml:space="preserve"> option. It will draw colormaps from matplotlib, so you can use </w:t>
+      </w:r>
+      <w:proofErr w:type="spellStart"/>
       <w:proofErr w:type="gramStart"/>
       <w:r>
         <w:rPr>
           <w:rFonts w:ascii="Times New Roman" w:hAnsi="Times New Roman" w:cs="Times New Roman"/>
-        </w:rPr>
-        <w:t>well,</w:t>
-      </w:r>
+          <w:b/>
+          <w:bCs/>
+        </w:rPr>
+        <w:t>plt.colormaps</w:t>
+      </w:r>
+      <w:proofErr w:type="spellEnd"/>
       <w:proofErr w:type="gramEnd"/>
       <w:r>
         <w:rPr>
           <w:rFonts w:ascii="Times New Roman" w:hAnsi="Times New Roman" w:cs="Times New Roman"/>
-        </w:rPr>
-        <w:t xml:space="preserve"> that’s in the to do pile.</w:t>
-      </w:r>
-    </w:p>
-    <w:p>
-      <w:pPr>
-        <w:pStyle w:val="Ttulo2"/>
-      </w:pPr>
-      <w:r>
-        <w:t>Spectrograms</w:t>
-      </w:r>
-    </w:p>
-    <w:p>
-      <w:pPr>
-        <w:spacing w:after="0"/>
-        <w:rPr>
-          <w:rFonts w:ascii="Times New Roman" w:hAnsi="Times New Roman" w:cs="Times New Roman"/>
-        </w:rPr>
-      </w:pPr>
-      <w:r>
-        <w:rPr>
-          <w:rFonts w:ascii="Times New Roman" w:hAnsi="Times New Roman" w:cs="Times New Roman"/>
-        </w:rPr>
-        <w:t xml:space="preserve">Spectrograms </w:t>
-      </w:r>
-      <w:r>
-        <w:rPr>
-          <w:rFonts w:ascii="Times New Roman" w:hAnsi="Times New Roman" w:cs="Times New Roman"/>
-        </w:rPr>
-        <w:t>are a bit easier than snippets in the sense that they have less functions, but their usage is the same.</w:t>
-      </w:r>
-    </w:p>
-    <w:p>
-      <w:pPr>
-        <w:spacing w:after="0"/>
-        <w:rPr>
-          <w:rFonts w:ascii="Times New Roman" w:hAnsi="Times New Roman" w:cs="Times New Roman"/>
-        </w:rPr>
-      </w:pPr>
-      <w:r>
-        <w:rPr>
-          <w:rFonts w:ascii="Times New Roman" w:hAnsi="Times New Roman" w:cs="Times New Roman"/>
-        </w:rPr>
-        <w:t xml:space="preserve">1.- you can visualize it with </w:t>
-      </w:r>
-      <w:r>
-        <w:rPr>
-          <w:rFonts w:ascii="Times New Roman" w:hAnsi="Times New Roman" w:cs="Times New Roman"/>
-          <w:b/>
-          <w:bCs/>
-          <w:i/>
-          <w:iCs/>
-        </w:rPr>
-        <w:t>spectrogram_</w:t>
-      </w:r>
+          <w:b/>
+          <w:bCs/>
+        </w:rPr>
+        <w:t>()</w:t>
+      </w:r>
+      <w:r>
+        <w:rPr>
+          <w:rFonts w:ascii="Times New Roman" w:hAnsi="Times New Roman" w:cs="Times New Roman"/>
+          <w:b/>
+          <w:bCs/>
+        </w:rPr>
+        <w:t xml:space="preserve"> </w:t>
+      </w:r>
+      <w:r>
+        <w:rPr>
+          <w:rFonts w:ascii="Times New Roman" w:hAnsi="Times New Roman" w:cs="Times New Roman"/>
+        </w:rPr>
+        <w:t>to</w:t>
+      </w:r>
+      <w:r>
+        <w:rPr>
+          <w:rFonts w:ascii="Times New Roman" w:hAnsi="Times New Roman" w:cs="Times New Roman"/>
+        </w:rPr>
+        <w:t xml:space="preserve"> see your options.</w:t>
+      </w:r>
+    </w:p>
+    <w:p>
+      <w:pPr>
+        <w:rPr>
+          <w:rFonts w:ascii="Times New Roman" w:hAnsi="Times New Roman" w:cs="Times New Roman"/>
+        </w:rPr>
+      </w:pPr>
+      <w:proofErr w:type="spellStart"/>
       <w:proofErr w:type="gramStart"/>
       <w:r>
         <w:rPr>
@@ -1670,7 +3056,7 @@
           <w:i/>
           <w:iCs/>
         </w:rPr>
-        <w:t>1.plot</w:t>
+        <w:t>st.annotate</w:t>
       </w:r>
       <w:proofErr w:type="gramEnd"/>
       <w:r>
@@ -1681,65 +3067,198 @@
           <w:i/>
           <w:iCs/>
         </w:rPr>
+        <w:t>_</w:t>
+      </w:r>
+      <w:proofErr w:type="gramStart"/>
+      <w:r>
+        <w:rPr>
+          <w:rFonts w:ascii="Times New Roman" w:hAnsi="Times New Roman" w:cs="Times New Roman"/>
+          <w:b/>
+          <w:bCs/>
+          <w:i/>
+          <w:iCs/>
+        </w:rPr>
+        <w:t>data</w:t>
+      </w:r>
+      <w:proofErr w:type="spellEnd"/>
+      <w:r>
+        <w:rPr>
+          <w:rFonts w:ascii="Times New Roman" w:hAnsi="Times New Roman" w:cs="Times New Roman"/>
+          <w:b/>
+          <w:bCs/>
+          <w:i/>
+          <w:iCs/>
+        </w:rPr>
         <w:t>(</w:t>
       </w:r>
-      <w:proofErr w:type="spellStart"/>
-      <w:r>
-        <w:rPr>
-          <w:rFonts w:ascii="Times New Roman" w:hAnsi="Times New Roman" w:cs="Times New Roman"/>
-          <w:b/>
-          <w:bCs/>
-          <w:i/>
-          <w:iCs/>
-        </w:rPr>
-        <w:t>color</w:t>
-      </w:r>
-      <w:proofErr w:type="spellEnd"/>
-      <w:r>
-        <w:rPr>
-          <w:rFonts w:ascii="Times New Roman" w:hAnsi="Times New Roman" w:cs="Times New Roman"/>
-          <w:b/>
-          <w:bCs/>
-          <w:i/>
-          <w:iCs/>
-        </w:rPr>
-        <w:t xml:space="preserve"> = “inferno”</w:t>
-      </w:r>
-      <w:r>
-        <w:rPr>
-          <w:rFonts w:ascii="Times New Roman" w:hAnsi="Times New Roman" w:cs="Times New Roman"/>
-          <w:b/>
-          <w:bCs/>
-          <w:i/>
-          <w:iCs/>
-        </w:rPr>
-        <w:t>)</w:t>
-      </w:r>
-      <w:r>
-        <w:rPr>
-          <w:rFonts w:ascii="Times New Roman" w:hAnsi="Times New Roman" w:cs="Times New Roman"/>
-        </w:rPr>
-        <w:t>. This will only show it on screen for you to inspect.</w:t>
-      </w:r>
-      <w:r>
-        <w:rPr>
-          <w:rFonts w:ascii="Times New Roman" w:hAnsi="Times New Roman" w:cs="Times New Roman"/>
-        </w:rPr>
-        <w:t xml:space="preserve"> I have added a </w:t>
-      </w:r>
-      <w:proofErr w:type="spellStart"/>
-      <w:r>
-        <w:rPr>
-          <w:rFonts w:ascii="Times New Roman" w:hAnsi="Times New Roman" w:cs="Times New Roman"/>
-        </w:rPr>
-        <w:t>color</w:t>
-      </w:r>
-      <w:proofErr w:type="spellEnd"/>
-      <w:r>
-        <w:rPr>
-          <w:rFonts w:ascii="Times New Roman" w:hAnsi="Times New Roman" w:cs="Times New Roman"/>
-        </w:rPr>
-        <w:t xml:space="preserve"> argument because I got sick of looking at the base one and thought you might too. Use </w:t>
+      <w:proofErr w:type="gramEnd"/>
+      <w:r>
+        <w:rPr>
+          <w:rFonts w:ascii="Times New Roman" w:hAnsi="Times New Roman" w:cs="Times New Roman"/>
+          <w:b/>
+          <w:bCs/>
+          <w:i/>
+          <w:iCs/>
+        </w:rPr>
+        <w:t xml:space="preserve">notes, </w:t>
+      </w:r>
+      <w:proofErr w:type="spellStart"/>
+      <w:r>
+        <w:rPr>
+          <w:rFonts w:ascii="Times New Roman" w:hAnsi="Times New Roman" w:cs="Times New Roman"/>
+          <w:b/>
+          <w:bCs/>
+          <w:i/>
+          <w:iCs/>
+        </w:rPr>
+        <w:t>snip</w:t>
+      </w:r>
+      <w:r>
+        <w:rPr>
+          <w:rFonts w:ascii="Times New Roman" w:hAnsi="Times New Roman" w:cs="Times New Roman"/>
+          <w:b/>
+          <w:bCs/>
+          <w:i/>
+          <w:iCs/>
+        </w:rPr>
+        <w:t>_path</w:t>
+      </w:r>
+      <w:proofErr w:type="spellEnd"/>
+      <w:r>
+        <w:rPr>
+          <w:rFonts w:ascii="Times New Roman" w:hAnsi="Times New Roman" w:cs="Times New Roman"/>
+          <w:b/>
+          <w:bCs/>
+          <w:i/>
+          <w:iCs/>
+        </w:rPr>
+        <w:t xml:space="preserve">, </w:t>
+      </w:r>
+      <w:proofErr w:type="spellStart"/>
+      <w:r>
+        <w:rPr>
+          <w:rFonts w:ascii="Times New Roman" w:hAnsi="Times New Roman" w:cs="Times New Roman"/>
+          <w:b/>
+          <w:bCs/>
+          <w:i/>
+          <w:iCs/>
+        </w:rPr>
+        <w:t>spec</w:t>
+      </w:r>
+      <w:r>
+        <w:rPr>
+          <w:rFonts w:ascii="Times New Roman" w:hAnsi="Times New Roman" w:cs="Times New Roman"/>
+          <w:b/>
+          <w:bCs/>
+          <w:i/>
+          <w:iCs/>
+        </w:rPr>
+        <w:t>_path</w:t>
+      </w:r>
+      <w:proofErr w:type="spellEnd"/>
+      <w:r>
+        <w:rPr>
+          <w:rFonts w:ascii="Times New Roman" w:hAnsi="Times New Roman" w:cs="Times New Roman"/>
+          <w:b/>
+          <w:bCs/>
+          <w:i/>
+          <w:iCs/>
+        </w:rPr>
+        <w:t xml:space="preserve">, </w:t>
+      </w:r>
+      <w:proofErr w:type="spellStart"/>
+      <w:r>
+        <w:rPr>
+          <w:rFonts w:ascii="Times New Roman" w:hAnsi="Times New Roman" w:cs="Times New Roman"/>
+          <w:b/>
+          <w:bCs/>
+          <w:i/>
+          <w:iCs/>
+        </w:rPr>
+        <w:t>snippet_duration</w:t>
+      </w:r>
+      <w:proofErr w:type="spellEnd"/>
+      <w:r>
+        <w:rPr>
+          <w:rFonts w:ascii="Times New Roman" w:hAnsi="Times New Roman" w:cs="Times New Roman"/>
+          <w:b/>
+          <w:bCs/>
+          <w:i/>
+          <w:iCs/>
+        </w:rPr>
+        <w:t xml:space="preserve">=2.0, </w:t>
+      </w:r>
+      <w:proofErr w:type="spellStart"/>
+      <w:r>
+        <w:rPr>
+          <w:rFonts w:ascii="Times New Roman" w:hAnsi="Times New Roman" w:cs="Times New Roman"/>
+          <w:b/>
+          <w:bCs/>
+          <w:i/>
+          <w:iCs/>
+        </w:rPr>
+        <w:t>csv_delim</w:t>
+      </w:r>
+      <w:proofErr w:type="spellEnd"/>
+      <w:r>
+        <w:rPr>
+          <w:rFonts w:ascii="Times New Roman" w:hAnsi="Times New Roman" w:cs="Times New Roman"/>
+          <w:b/>
+          <w:bCs/>
+          <w:i/>
+          <w:iCs/>
+        </w:rPr>
+        <w:t>='\t')</w:t>
+      </w:r>
+      <w:r>
+        <w:rPr>
+          <w:rFonts w:ascii="Times New Roman" w:hAnsi="Times New Roman" w:cs="Times New Roman"/>
+          <w:b/>
+          <w:bCs/>
+          <w:i/>
+          <w:iCs/>
+        </w:rPr>
+        <w:t xml:space="preserve"> </w:t>
+      </w:r>
+      <w:r>
+        <w:rPr>
+          <w:rFonts w:ascii="Times New Roman" w:hAnsi="Times New Roman" w:cs="Times New Roman"/>
+        </w:rPr>
+        <w:t>once</w:t>
+      </w:r>
+      <w:r>
+        <w:rPr>
+          <w:rFonts w:ascii="Times New Roman" w:hAnsi="Times New Roman" w:cs="Times New Roman"/>
+        </w:rPr>
+        <w:t xml:space="preserve"> you have processed a file, in the case you are working on training data, you can use your annotations to automatically distribute your files for training. These part of the logic is incomplete for the moment and will change soon, for now it is best for you to run it from the pipeline script. You will use the notes, which is a .txt file saved as tab delimited, path to the snippets and spectrograms that belong with that set of notes, and the snippet duration that you used (defaulted to 2, so use as </w:t>
+      </w:r>
+      <w:proofErr w:type="spellStart"/>
+      <w:r>
+        <w:rPr>
+          <w:rFonts w:ascii="Times New Roman" w:hAnsi="Times New Roman" w:cs="Times New Roman"/>
+        </w:rPr>
+        <w:t>kwarg</w:t>
+      </w:r>
+      <w:proofErr w:type="spellEnd"/>
+      <w:r>
+        <w:rPr>
+          <w:rFonts w:ascii="Times New Roman" w:hAnsi="Times New Roman" w:cs="Times New Roman"/>
+        </w:rPr>
+        <w:t xml:space="preserve">). The last </w:t>
+      </w:r>
+      <w:proofErr w:type="spellStart"/>
+      <w:r>
+        <w:rPr>
+          <w:rFonts w:ascii="Times New Roman" w:hAnsi="Times New Roman" w:cs="Times New Roman"/>
+        </w:rPr>
+        <w:t>kwarg</w:t>
+      </w:r>
+      <w:proofErr w:type="spellEnd"/>
+      <w:r>
+        <w:rPr>
+          <w:rFonts w:ascii="Times New Roman" w:hAnsi="Times New Roman" w:cs="Times New Roman"/>
+        </w:rPr>
+        <w:t xml:space="preserve"> is not necessary if you saved your txt as tab delimited, but can be used in case you used comma. This function makes a split into positives </w:t>
       </w:r>
       <w:proofErr w:type="spellStart"/>
       <w:proofErr w:type="gramStart"/>
@@ -1747,7 +3266,7 @@
         <w:rPr>
           <w:rFonts w:ascii="Times New Roman" w:hAnsi="Times New Roman" w:cs="Times New Roman"/>
         </w:rPr>
-        <w:t>plt.colormaps</w:t>
+        <w:t>an</w:t>
       </w:r>
       <w:proofErr w:type="spellEnd"/>
       <w:proofErr w:type="gramEnd"/>
@@ -1755,32 +3274,44 @@
         <w:rPr>
           <w:rFonts w:ascii="Times New Roman" w:hAnsi="Times New Roman" w:cs="Times New Roman"/>
         </w:rPr>
-        <w:t>() to see options</w:t>
-      </w:r>
-    </w:p>
-    <w:p>
-      <w:pPr>
-        <w:spacing w:after="0"/>
-        <w:rPr>
-          <w:rFonts w:ascii="Times New Roman" w:hAnsi="Times New Roman" w:cs="Times New Roman"/>
-        </w:rPr>
-      </w:pPr>
-      <w:r>
-        <w:rPr>
-          <w:rFonts w:ascii="Times New Roman" w:hAnsi="Times New Roman" w:cs="Times New Roman"/>
-        </w:rPr>
-        <w:t xml:space="preserve">2.- you can save it with </w:t>
-      </w:r>
-      <w:r>
-        <w:rPr>
-          <w:rFonts w:ascii="Times New Roman" w:hAnsi="Times New Roman" w:cs="Times New Roman"/>
-          <w:b/>
-          <w:bCs/>
-          <w:i/>
-          <w:iCs/>
-        </w:rPr>
-        <w:t>spectrogram_</w:t>
-      </w:r>
+        <w:t xml:space="preserve"> negatives, from there you could use data augmentation, or go into training.</w:t>
+      </w:r>
+      <w:r>
+        <w:rPr>
+          <w:rFonts w:ascii="Times New Roman" w:hAnsi="Times New Roman" w:cs="Times New Roman"/>
+        </w:rPr>
+        <w:t xml:space="preserve"> It will split all the files on each of the separate files directories and (using the pipeline logic) create merged folders for training.</w:t>
+      </w:r>
+      <w:r>
+        <w:rPr>
+          <w:rFonts w:ascii="Times New Roman" w:hAnsi="Times New Roman" w:cs="Times New Roman"/>
+        </w:rPr>
+        <w:t xml:space="preserve"> </w:t>
+      </w:r>
+      <w:r>
+        <w:rPr>
+          <w:rFonts w:ascii="Times New Roman" w:hAnsi="Times New Roman" w:cs="Times New Roman"/>
+          <w:b/>
+          <w:bCs/>
+        </w:rPr>
+        <w:t>WARNING!</w:t>
+      </w:r>
+      <w:r>
+        <w:rPr>
+          <w:rFonts w:ascii="Times New Roman" w:hAnsi="Times New Roman" w:cs="Times New Roman"/>
+        </w:rPr>
+        <w:t xml:space="preserve"> This function assumes all that is not positive is negative. That is, for simplicity of the annotation, you only have to annotate positives. Be careful to add and filter out (if needed) dubious things so you don’t have positives on the negative training set.</w:t>
+      </w:r>
+    </w:p>
+    <w:p>
+      <w:pPr>
+        <w:rPr>
+          <w:rFonts w:ascii="Times New Roman" w:hAnsi="Times New Roman" w:cs="Times New Roman"/>
+          <w:bCs/>
+          <w:iCs/>
+        </w:rPr>
+      </w:pPr>
+      <w:proofErr w:type="spellStart"/>
       <w:proofErr w:type="gramStart"/>
       <w:r>
         <w:rPr>
@@ -1790,7 +3321,17 @@
           <w:i/>
           <w:iCs/>
         </w:rPr>
-        <w:t>1.save</w:t>
+        <w:t>st.n</w:t>
+      </w:r>
+      <w:r>
+        <w:rPr>
+          <w:rFonts w:ascii="Times New Roman" w:hAnsi="Times New Roman" w:cs="Times New Roman"/>
+          <w:b/>
+          <w:bCs/>
+          <w:i/>
+          <w:iCs/>
+        </w:rPr>
+        <w:t>ormalize</w:t>
       </w:r>
       <w:proofErr w:type="gramEnd"/>
       <w:r>
@@ -1812,8 +3353,9 @@
           <w:i/>
           <w:iCs/>
         </w:rPr>
-        <w:t>img</w:t>
-      </w:r>
+        <w:t>global</w:t>
+      </w:r>
+      <w:proofErr w:type="spellEnd"/>
       <w:r>
         <w:rPr>
           <w:rFonts w:ascii="Times New Roman" w:hAnsi="Times New Roman" w:cs="Times New Roman"/>
@@ -1824,6 +3366,7 @@
         </w:rPr>
         <w:t>(</w:t>
       </w:r>
+      <w:proofErr w:type="spellStart"/>
       <w:proofErr w:type="gramEnd"/>
       <w:r>
         <w:rPr>
@@ -1833,18 +3376,7 @@
           <w:i/>
           <w:iCs/>
         </w:rPr>
-        <w:t xml:space="preserve">name, </w:t>
-      </w:r>
-      <w:proofErr w:type="spellStart"/>
-      <w:r>
-        <w:rPr>
-          <w:rFonts w:ascii="Times New Roman" w:hAnsi="Times New Roman" w:cs="Times New Roman"/>
-          <w:b/>
-          <w:bCs/>
-          <w:i/>
-          <w:iCs/>
-        </w:rPr>
-        <w:t>dir</w:t>
+        <w:t>input_dir</w:t>
       </w:r>
       <w:proofErr w:type="spellEnd"/>
       <w:r>
@@ -1866,157 +3398,16 @@
           <w:i/>
           <w:iCs/>
         </w:rPr>
-        <w:t>with_labels</w:t>
-      </w:r>
-      <w:proofErr w:type="spellEnd"/>
-      <w:r>
-        <w:rPr>
-          <w:rFonts w:ascii="Times New Roman" w:hAnsi="Times New Roman" w:cs="Times New Roman"/>
-          <w:b/>
-          <w:bCs/>
-          <w:i/>
-          <w:iCs/>
-        </w:rPr>
-        <w:t xml:space="preserve"> = False</w:t>
-      </w:r>
-      <w:r>
-        <w:rPr>
-          <w:rFonts w:ascii="Times New Roman" w:hAnsi="Times New Roman" w:cs="Times New Roman"/>
-          <w:b/>
-          <w:bCs/>
-          <w:i/>
-          <w:iCs/>
-        </w:rPr>
-        <w:t>)</w:t>
-      </w:r>
-      <w:r>
-        <w:rPr>
-          <w:rFonts w:ascii="Times New Roman" w:hAnsi="Times New Roman" w:cs="Times New Roman"/>
-        </w:rPr>
-        <w:t xml:space="preserve">. I suggest you follow the same naming conventions explained for snippets. The spectrogram will automatically receive time stamps and other flags from the snippet they come from. The </w:t>
-      </w:r>
-      <w:proofErr w:type="spellStart"/>
-      <w:r>
-        <w:rPr>
-          <w:rFonts w:ascii="Times New Roman" w:hAnsi="Times New Roman" w:cs="Times New Roman"/>
-        </w:rPr>
-        <w:t>with_labels</w:t>
-      </w:r>
-      <w:proofErr w:type="spellEnd"/>
-      <w:r>
-        <w:rPr>
-          <w:rFonts w:ascii="Times New Roman" w:hAnsi="Times New Roman" w:cs="Times New Roman"/>
-        </w:rPr>
-        <w:t xml:space="preserve"> </w:t>
-      </w:r>
-      <w:proofErr w:type="spellStart"/>
-      <w:r>
-        <w:rPr>
-          <w:rFonts w:ascii="Times New Roman" w:hAnsi="Times New Roman" w:cs="Times New Roman"/>
-        </w:rPr>
-        <w:t>kwarg</w:t>
-      </w:r>
-      <w:proofErr w:type="spellEnd"/>
-      <w:r>
-        <w:rPr>
-          <w:rFonts w:ascii="Times New Roman" w:hAnsi="Times New Roman" w:cs="Times New Roman"/>
-        </w:rPr>
-        <w:t xml:space="preserve"> will default to false (you don’t have write it unless you want it True). This means that the spectrogram will be saved without axis colour codes or other things. That is the way you want them to be in your AI models, but for presentations or papers, you can turn it </w:t>
-      </w:r>
-      <w:proofErr w:type="gramStart"/>
-      <w:r>
-        <w:rPr>
-          <w:rFonts w:ascii="Times New Roman" w:hAnsi="Times New Roman" w:cs="Times New Roman"/>
-        </w:rPr>
-        <w:t>true</w:t>
-      </w:r>
-      <w:proofErr w:type="gramEnd"/>
-      <w:r>
-        <w:rPr>
-          <w:rFonts w:ascii="Times New Roman" w:hAnsi="Times New Roman" w:cs="Times New Roman"/>
-        </w:rPr>
-        <w:t xml:space="preserve"> and it will give you something more human readable.</w:t>
-      </w:r>
-      <w:r>
-        <w:rPr>
-          <w:rFonts w:ascii="Times New Roman" w:hAnsi="Times New Roman" w:cs="Times New Roman"/>
-        </w:rPr>
-        <w:t xml:space="preserve"> As with the plot, now you can choose a colormap. See plot function for details.</w:t>
-      </w:r>
-    </w:p>
-    <w:p>
-      <w:pPr>
-        <w:spacing w:after="0"/>
-        <w:rPr>
-          <w:rFonts w:ascii="Times New Roman" w:hAnsi="Times New Roman" w:cs="Times New Roman"/>
-        </w:rPr>
-      </w:pPr>
-      <w:r>
-        <w:rPr>
-          <w:rFonts w:ascii="Times New Roman" w:hAnsi="Times New Roman" w:cs="Times New Roman"/>
-        </w:rPr>
-        <w:t xml:space="preserve">3.- you can now save a table with the spectrogram data too with </w:t>
-      </w:r>
-      <w:proofErr w:type="spellStart"/>
-      <w:proofErr w:type="gramStart"/>
-      <w:r>
-        <w:rPr>
-          <w:rFonts w:ascii="Times New Roman" w:hAnsi="Times New Roman" w:cs="Times New Roman"/>
-          <w:b/>
-        </w:rPr>
-        <w:t>spectrogram.s</w:t>
-      </w:r>
-      <w:r>
-        <w:rPr>
-          <w:rFonts w:ascii="Times New Roman" w:hAnsi="Times New Roman" w:cs="Times New Roman"/>
-          <w:b/>
-          <w:i/>
-        </w:rPr>
-        <w:t>ave</w:t>
-      </w:r>
-      <w:proofErr w:type="gramEnd"/>
-      <w:r>
-        <w:rPr>
-          <w:rFonts w:ascii="Times New Roman" w:hAnsi="Times New Roman" w:cs="Times New Roman"/>
-          <w:b/>
-          <w:i/>
-        </w:rPr>
-        <w:t>_</w:t>
-      </w:r>
-      <w:proofErr w:type="gramStart"/>
-      <w:r>
-        <w:rPr>
-          <w:rFonts w:ascii="Times New Roman" w:hAnsi="Times New Roman" w:cs="Times New Roman"/>
-          <w:b/>
-          <w:i/>
-        </w:rPr>
-        <w:t>table</w:t>
-      </w:r>
-      <w:proofErr w:type="spellEnd"/>
-      <w:r>
-        <w:rPr>
-          <w:rFonts w:ascii="Times New Roman" w:hAnsi="Times New Roman" w:cs="Times New Roman"/>
-          <w:b/>
-          <w:i/>
-        </w:rPr>
-        <w:t>(</w:t>
-      </w:r>
-      <w:proofErr w:type="spellStart"/>
-      <w:proofErr w:type="gramEnd"/>
-      <w:r>
-        <w:rPr>
-          <w:rFonts w:ascii="Times New Roman" w:hAnsi="Times New Roman" w:cs="Times New Roman"/>
-          <w:b/>
-          <w:i/>
-        </w:rPr>
-        <w:t>source_name</w:t>
-      </w:r>
-      <w:proofErr w:type="spellEnd"/>
-      <w:r>
-        <w:rPr>
-          <w:rFonts w:ascii="Times New Roman" w:hAnsi="Times New Roman" w:cs="Times New Roman"/>
-          <w:b/>
-          <w:i/>
+        <w:t>output_dir</w:t>
+      </w:r>
+      <w:proofErr w:type="spellEnd"/>
+      <w:r>
+        <w:rPr>
+          <w:rFonts w:ascii="Times New Roman" w:hAnsi="Times New Roman" w:cs="Times New Roman"/>
+          <w:b/>
+          <w:bCs/>
+          <w:i/>
+          <w:iCs/>
         </w:rPr>
         <w:t xml:space="preserve">, </w:t>
       </w:r>
@@ -2025,964 +3416,39 @@
         <w:rPr>
           <w:rFonts w:ascii="Times New Roman" w:hAnsi="Times New Roman" w:cs="Times New Roman"/>
           <w:b/>
-          <w:i/>
-        </w:rPr>
-        <w:t>output_dir</w:t>
-      </w:r>
-      <w:proofErr w:type="spellEnd"/>
-      <w:r>
-        <w:rPr>
-          <w:rFonts w:ascii="Times New Roman" w:hAnsi="Times New Roman" w:cs="Times New Roman"/>
-          <w:b/>
-          <w:i/>
-        </w:rPr>
-        <w:t>)</w:t>
-      </w:r>
-      <w:r>
-        <w:rPr>
-          <w:rFonts w:ascii="Times New Roman" w:hAnsi="Times New Roman" w:cs="Times New Roman"/>
-        </w:rPr>
-        <w:t xml:space="preserve"> I suggest using the same naming convention, although this, for the moment at least, can’t be loaded, so it is not so critical.</w:t>
-      </w:r>
-    </w:p>
-    <w:p>
-      <w:pPr>
-        <w:rPr>
-          <w:rFonts w:ascii="Times New Roman" w:hAnsi="Times New Roman" w:cs="Times New Roman"/>
-        </w:rPr>
-      </w:pPr>
-      <w:r>
-        <w:rPr>
-          <w:rFonts w:ascii="Times New Roman" w:hAnsi="Times New Roman" w:cs="Times New Roman"/>
-        </w:rPr>
-        <w:t xml:space="preserve">4.- get average power and peak power densities with </w:t>
-      </w:r>
-      <w:proofErr w:type="spellStart"/>
-      <w:proofErr w:type="gramStart"/>
-      <w:r>
-        <w:rPr>
-          <w:rFonts w:ascii="Times New Roman" w:hAnsi="Times New Roman" w:cs="Times New Roman"/>
-          <w:b/>
-        </w:rPr>
-        <w:t>spectrogram.compute</w:t>
-      </w:r>
-      <w:proofErr w:type="gramEnd"/>
-      <w:r>
-        <w:rPr>
-          <w:rFonts w:ascii="Times New Roman" w:hAnsi="Times New Roman" w:cs="Times New Roman"/>
-          <w:b/>
-        </w:rPr>
-        <w:t>_power_</w:t>
-      </w:r>
-      <w:proofErr w:type="gramStart"/>
-      <w:r>
-        <w:rPr>
-          <w:rFonts w:ascii="Times New Roman" w:hAnsi="Times New Roman" w:cs="Times New Roman"/>
-          <w:b/>
-        </w:rPr>
-        <w:t>metrics</w:t>
-      </w:r>
-      <w:proofErr w:type="spellEnd"/>
-      <w:r>
-        <w:rPr>
-          <w:rFonts w:ascii="Times New Roman" w:hAnsi="Times New Roman" w:cs="Times New Roman"/>
-          <w:b/>
-        </w:rPr>
-        <w:t>(</w:t>
-      </w:r>
-      <w:proofErr w:type="gramEnd"/>
-      <w:r>
-        <w:rPr>
-          <w:rFonts w:ascii="Times New Roman" w:hAnsi="Times New Roman" w:cs="Times New Roman"/>
-          <w:b/>
-        </w:rPr>
-        <w:t>)</w:t>
-      </w:r>
-      <w:r>
-        <w:rPr>
-          <w:rFonts w:ascii="Times New Roman" w:hAnsi="Times New Roman" w:cs="Times New Roman"/>
-          <w:b/>
-        </w:rPr>
-        <w:t xml:space="preserve">. </w:t>
-      </w:r>
-      <w:r>
-        <w:rPr>
-          <w:rFonts w:ascii="Times New Roman" w:hAnsi="Times New Roman" w:cs="Times New Roman"/>
-        </w:rPr>
-        <w:t xml:space="preserve">This will return APD and PPD and return them on that order. Units currently are </w:t>
-      </w:r>
-      <w:proofErr w:type="spellStart"/>
-      <w:r>
-        <w:rPr>
-          <w:rFonts w:ascii="Times New Roman" w:hAnsi="Times New Roman" w:cs="Times New Roman"/>
-        </w:rPr>
-        <w:t>dB.</w:t>
-      </w:r>
-      <w:proofErr w:type="spellEnd"/>
-    </w:p>
-    <w:p>
-      <w:pPr>
-        <w:rPr>
-          <w:rFonts w:ascii="Times New Roman" w:hAnsi="Times New Roman" w:cs="Times New Roman"/>
-        </w:rPr>
-      </w:pPr>
-      <w:r>
-        <w:rPr>
-          <w:rFonts w:ascii="Times New Roman" w:hAnsi="Times New Roman" w:cs="Times New Roman"/>
-        </w:rPr>
-        <w:t>With these functions, you should be able to cut, your own stridulations, just remember the time frame is important. You must make a decision at the beginning, how long will snippets be for the model? Then stick to that length to preserve proportions. Then, it is technically possible to just do this by hand and create all the data by yourself. But later on I will explain how to automatically batch-process big files. However this part of the tutorial is relevant for you to understand how your pipeline works and what is happening on the backstage. Also, to sometimes manually cut one particular stridulation or make some more augmentations.</w:t>
-      </w:r>
-    </w:p>
-    <w:p>
-      <w:pPr>
-        <w:spacing w:after="0"/>
-        <w:rPr>
-          <w:rFonts w:ascii="Times New Roman" w:hAnsi="Times New Roman" w:cs="Times New Roman"/>
-        </w:rPr>
-      </w:pPr>
-      <w:r>
-        <w:rPr>
-          <w:rFonts w:ascii="Times New Roman" w:hAnsi="Times New Roman" w:cs="Times New Roman"/>
-        </w:rPr>
-        <w:t>Finally, if you are working on already saved snippets, I have added a loading function for them so you don’t have to be cutting the same snippet once and again.</w:t>
-      </w:r>
-    </w:p>
-    <w:p>
-      <w:pPr>
-        <w:spacing w:after="0"/>
-        <w:rPr>
-          <w:rFonts w:ascii="Times New Roman" w:hAnsi="Times New Roman" w:cs="Times New Roman"/>
-        </w:rPr>
-      </w:pPr>
-      <w:r>
-        <w:rPr>
-          <w:rFonts w:ascii="Times New Roman" w:hAnsi="Times New Roman" w:cs="Times New Roman"/>
-          <w:b/>
-          <w:bCs/>
-          <w:i/>
-          <w:iCs/>
-        </w:rPr>
-        <w:t xml:space="preserve">Snippet = </w:t>
-      </w:r>
-      <w:proofErr w:type="spellStart"/>
-      <w:r>
-        <w:rPr>
-          <w:rFonts w:ascii="Times New Roman" w:hAnsi="Times New Roman" w:cs="Times New Roman"/>
-          <w:b/>
-          <w:bCs/>
-          <w:i/>
-          <w:iCs/>
-        </w:rPr>
-        <w:t>st.</w:t>
-      </w:r>
-      <w:r>
-        <w:rPr>
-          <w:rFonts w:ascii="Times New Roman" w:hAnsi="Times New Roman" w:cs="Times New Roman"/>
-          <w:b/>
-          <w:bCs/>
-          <w:i/>
-          <w:iCs/>
-        </w:rPr>
-        <w:t>load_snippet</w:t>
-      </w:r>
-      <w:proofErr w:type="spellEnd"/>
-      <w:r>
-        <w:rPr>
-          <w:rFonts w:ascii="Times New Roman" w:hAnsi="Times New Roman" w:cs="Times New Roman"/>
-          <w:b/>
-          <w:bCs/>
-          <w:i/>
-          <w:iCs/>
-        </w:rPr>
-        <w:t>(</w:t>
-      </w:r>
-      <w:proofErr w:type="spellStart"/>
-      <w:r>
-        <w:rPr>
-          <w:rFonts w:ascii="Times New Roman" w:hAnsi="Times New Roman" w:cs="Times New Roman"/>
-          <w:b/>
-          <w:bCs/>
-          <w:i/>
-          <w:iCs/>
-        </w:rPr>
-        <w:t>file_path</w:t>
-      </w:r>
-      <w:proofErr w:type="spellEnd"/>
-      <w:r>
-        <w:rPr>
-          <w:rFonts w:ascii="Times New Roman" w:hAnsi="Times New Roman" w:cs="Times New Roman"/>
-          <w:b/>
-          <w:bCs/>
-          <w:i/>
-          <w:iCs/>
-        </w:rPr>
-        <w:t>)</w:t>
-      </w:r>
-      <w:r>
-        <w:rPr>
-          <w:rFonts w:ascii="Times New Roman" w:hAnsi="Times New Roman" w:cs="Times New Roman"/>
-        </w:rPr>
-        <w:t xml:space="preserve"> will load the audio snippet file as a snippet already, and will catch from the name the length and other attributes, so you can resume your work on a snippet without loading the file and cutting it again.</w:t>
-      </w:r>
-    </w:p>
-    <w:p>
-      <w:pPr>
-        <w:rPr>
-          <w:rFonts w:ascii="Times New Roman" w:hAnsi="Times New Roman" w:cs="Times New Roman"/>
-          <w:b/>
-          <w:bCs/>
-        </w:rPr>
-      </w:pPr>
-    </w:p>
-    <w:p>
-      <w:pPr>
-        <w:pStyle w:val="Ttulo1"/>
-      </w:pPr>
-      <w:r>
-        <w:t>Batch processing files</w:t>
-      </w:r>
-    </w:p>
-    <w:p>
-      <w:pPr>
-        <w:rPr>
-          <w:rFonts w:ascii="Times New Roman" w:hAnsi="Times New Roman" w:cs="Times New Roman"/>
-        </w:rPr>
-      </w:pPr>
-      <w:r>
-        <w:rPr>
-          <w:rFonts w:ascii="Times New Roman" w:hAnsi="Times New Roman" w:cs="Times New Roman"/>
-        </w:rPr>
-        <w:t>When you work on big data files, it would be too time consuming to do all of the above manually. So I have given you some functions that will, using the above methodology, process long files and create the adequate folder structures so everything keeps paired. Bear in mind these functions create big amounts of files and quickly go into the GB size folders, you may want to keep it civilized and not have enormous amounts of these on your hard drive. In the pipeline script you will find an easy to reuse code for doing these, although some of the logic of that code will over time become part of the package, for now that is your best way to do all of this. But generally speaking, you have two functions.</w:t>
-      </w:r>
-    </w:p>
-    <w:p>
-      <w:pPr>
-        <w:rPr>
-          <w:rFonts w:ascii="Times New Roman" w:hAnsi="Times New Roman" w:cs="Times New Roman"/>
-        </w:rPr>
-      </w:pPr>
-      <w:proofErr w:type="spellStart"/>
-      <w:r>
-        <w:rPr>
-          <w:rFonts w:ascii="Times New Roman" w:hAnsi="Times New Roman" w:cs="Times New Roman"/>
-          <w:b/>
-          <w:bCs/>
-          <w:i/>
-          <w:iCs/>
-        </w:rPr>
-        <w:t>process_audio_</w:t>
-      </w:r>
-      <w:proofErr w:type="gramStart"/>
-      <w:r>
-        <w:rPr>
-          <w:rFonts w:ascii="Times New Roman" w:hAnsi="Times New Roman" w:cs="Times New Roman"/>
-          <w:b/>
-          <w:bCs/>
-          <w:i/>
-          <w:iCs/>
-        </w:rPr>
-        <w:t>file</w:t>
-      </w:r>
-      <w:proofErr w:type="spellEnd"/>
-      <w:r>
-        <w:rPr>
-          <w:rFonts w:ascii="Times New Roman" w:hAnsi="Times New Roman" w:cs="Times New Roman"/>
-          <w:b/>
-          <w:bCs/>
-          <w:i/>
-          <w:iCs/>
-        </w:rPr>
-        <w:t>(</w:t>
-      </w:r>
-      <w:proofErr w:type="spellStart"/>
-      <w:proofErr w:type="gramEnd"/>
-      <w:r>
-        <w:rPr>
-          <w:rFonts w:ascii="Times New Roman" w:hAnsi="Times New Roman" w:cs="Times New Roman"/>
-          <w:b/>
-          <w:bCs/>
-          <w:i/>
-          <w:iCs/>
-        </w:rPr>
-        <w:t>audio_path</w:t>
-      </w:r>
-      <w:proofErr w:type="spellEnd"/>
-      <w:r>
-        <w:rPr>
-          <w:rFonts w:ascii="Times New Roman" w:hAnsi="Times New Roman" w:cs="Times New Roman"/>
-          <w:b/>
-          <w:bCs/>
-          <w:i/>
-          <w:iCs/>
-        </w:rPr>
-        <w:t xml:space="preserve">, </w:t>
-      </w:r>
-      <w:proofErr w:type="spellStart"/>
-      <w:r>
-        <w:rPr>
-          <w:rFonts w:ascii="Times New Roman" w:hAnsi="Times New Roman" w:cs="Times New Roman"/>
-          <w:b/>
-          <w:bCs/>
-          <w:i/>
-          <w:iCs/>
-        </w:rPr>
-        <w:t>snippet_duration</w:t>
-      </w:r>
-      <w:proofErr w:type="spellEnd"/>
-      <w:r>
-        <w:rPr>
-          <w:rFonts w:ascii="Times New Roman" w:hAnsi="Times New Roman" w:cs="Times New Roman"/>
-          <w:b/>
-          <w:bCs/>
-          <w:i/>
-          <w:iCs/>
-        </w:rPr>
-        <w:t xml:space="preserve">=2, </w:t>
-      </w:r>
-      <w:proofErr w:type="spellStart"/>
-      <w:r>
-        <w:rPr>
-          <w:rFonts w:ascii="Times New Roman" w:hAnsi="Times New Roman" w:cs="Times New Roman"/>
-          <w:b/>
-          <w:bCs/>
-          <w:i/>
-          <w:iCs/>
-        </w:rPr>
-        <w:t>with_labels</w:t>
-      </w:r>
-      <w:proofErr w:type="spellEnd"/>
-      <w:r>
-        <w:rPr>
-          <w:rFonts w:ascii="Times New Roman" w:hAnsi="Times New Roman" w:cs="Times New Roman"/>
-          <w:b/>
-          <w:bCs/>
-          <w:i/>
-          <w:iCs/>
-        </w:rPr>
-        <w:t xml:space="preserve">=False, </w:t>
-      </w:r>
-      <w:proofErr w:type="spellStart"/>
-      <w:r>
-        <w:rPr>
-          <w:rFonts w:ascii="Times New Roman" w:hAnsi="Times New Roman" w:cs="Times New Roman"/>
-          <w:b/>
-          <w:bCs/>
-          <w:i/>
-          <w:iCs/>
-        </w:rPr>
-        <w:t>spec_type</w:t>
-      </w:r>
-      <w:proofErr w:type="spellEnd"/>
-      <w:r>
-        <w:rPr>
-          <w:rFonts w:ascii="Times New Roman" w:hAnsi="Times New Roman" w:cs="Times New Roman"/>
-          <w:b/>
-          <w:bCs/>
-          <w:i/>
-          <w:iCs/>
-        </w:rPr>
-        <w:t xml:space="preserve">="mel", </w:t>
-      </w:r>
-      <w:proofErr w:type="spellStart"/>
-      <w:r>
-        <w:rPr>
-          <w:rFonts w:ascii="Times New Roman" w:hAnsi="Times New Roman" w:cs="Times New Roman"/>
-          <w:b/>
-          <w:bCs/>
-          <w:i/>
-          <w:iCs/>
-        </w:rPr>
-        <w:t>color</w:t>
-      </w:r>
-      <w:proofErr w:type="spellEnd"/>
-      <w:r>
-        <w:rPr>
-          <w:rFonts w:ascii="Times New Roman" w:hAnsi="Times New Roman" w:cs="Times New Roman"/>
-          <w:b/>
-          <w:bCs/>
-          <w:i/>
-          <w:iCs/>
-        </w:rPr>
-        <w:t xml:space="preserve"> = "inferno", </w:t>
-      </w:r>
-      <w:proofErr w:type="spellStart"/>
-      <w:r>
-        <w:rPr>
-          <w:rFonts w:ascii="Times New Roman" w:hAnsi="Times New Roman" w:cs="Times New Roman"/>
-          <w:b/>
-          <w:bCs/>
-          <w:i/>
-          <w:iCs/>
-        </w:rPr>
-        <w:t>output_folder</w:t>
-      </w:r>
-      <w:proofErr w:type="spellEnd"/>
-      <w:r>
-        <w:rPr>
-          <w:rFonts w:ascii="Times New Roman" w:hAnsi="Times New Roman" w:cs="Times New Roman"/>
-          <w:b/>
-          <w:bCs/>
-          <w:i/>
-          <w:iCs/>
-        </w:rPr>
-        <w:t xml:space="preserve">=None, </w:t>
-      </w:r>
-      <w:proofErr w:type="spellStart"/>
-      <w:r>
-        <w:rPr>
-          <w:rFonts w:ascii="Times New Roman" w:hAnsi="Times New Roman" w:cs="Times New Roman"/>
-          <w:b/>
-          <w:bCs/>
-          <w:i/>
-          <w:iCs/>
-        </w:rPr>
-        <w:t>update_freq</w:t>
-      </w:r>
-      <w:proofErr w:type="spellEnd"/>
-      <w:r>
-        <w:rPr>
-          <w:rFonts w:ascii="Times New Roman" w:hAnsi="Times New Roman" w:cs="Times New Roman"/>
-          <w:b/>
-          <w:bCs/>
-          <w:i/>
-          <w:iCs/>
-        </w:rPr>
-        <w:t>=10):</w:t>
-      </w:r>
-      <w:r>
-        <w:rPr>
-          <w:rFonts w:ascii="Times New Roman" w:hAnsi="Times New Roman" w:cs="Times New Roman"/>
-          <w:b/>
-          <w:bCs/>
-          <w:i/>
-          <w:iCs/>
-        </w:rPr>
-        <w:t xml:space="preserve"> </w:t>
-      </w:r>
-      <w:r>
-        <w:rPr>
-          <w:rFonts w:ascii="Times New Roman" w:hAnsi="Times New Roman" w:cs="Times New Roman"/>
-        </w:rPr>
-        <w:t xml:space="preserve">here you type the path to your audio file, and the </w:t>
-      </w:r>
-      <w:proofErr w:type="spellStart"/>
-      <w:r>
-        <w:rPr>
-          <w:rFonts w:ascii="Times New Roman" w:hAnsi="Times New Roman" w:cs="Times New Roman"/>
-        </w:rPr>
-        <w:t>kwargs</w:t>
-      </w:r>
-      <w:proofErr w:type="spellEnd"/>
-      <w:r>
-        <w:rPr>
-          <w:rFonts w:ascii="Times New Roman" w:hAnsi="Times New Roman" w:cs="Times New Roman"/>
-        </w:rPr>
-        <w:t xml:space="preserve"> if you need them. As you see, </w:t>
-      </w:r>
-      <w:proofErr w:type="spellStart"/>
-      <w:r>
-        <w:rPr>
-          <w:rFonts w:ascii="Times New Roman" w:hAnsi="Times New Roman" w:cs="Times New Roman"/>
-        </w:rPr>
-        <w:t>snippet_duration</w:t>
-      </w:r>
-      <w:proofErr w:type="spellEnd"/>
-      <w:r>
-        <w:rPr>
-          <w:rFonts w:ascii="Times New Roman" w:hAnsi="Times New Roman" w:cs="Times New Roman"/>
-        </w:rPr>
-        <w:t xml:space="preserve"> defaults to 2 seconds, and </w:t>
-      </w:r>
-      <w:proofErr w:type="spellStart"/>
-      <w:r>
-        <w:rPr>
-          <w:rFonts w:ascii="Times New Roman" w:hAnsi="Times New Roman" w:cs="Times New Roman"/>
+          <w:bCs/>
+          <w:i/>
+          <w:iCs/>
+        </w:rPr>
+        <w:t>target_max</w:t>
+      </w:r>
+      <w:proofErr w:type="spellEnd"/>
+      <w:r>
+        <w:rPr>
+          <w:rFonts w:ascii="Times New Roman" w:hAnsi="Times New Roman" w:cs="Times New Roman"/>
+          <w:b/>
+          <w:bCs/>
+          <w:i/>
+          <w:iCs/>
+        </w:rPr>
+        <w:t xml:space="preserve"> = 0.75):</w:t>
+      </w:r>
+      <w:r>
+        <w:rPr>
+          <w:rFonts w:ascii="Times New Roman" w:hAnsi="Times New Roman" w:cs="Times New Roman"/>
+          <w:bCs/>
+          <w:iCs/>
+        </w:rPr>
+        <w:t xml:space="preserve"> this allows for normalization of several files to one single peak. So, if you wanted to normalize a whole set of files to their </w:t>
+      </w:r>
+      <w:r>
+        <w:rPr>
+          <w:rFonts w:ascii="Times New Roman" w:hAnsi="Times New Roman" w:cs="Times New Roman"/>
+          <w:bCs/>
+          <w:iCs/>
         </w:rPr>
         <w:lastRenderedPageBreak/>
-        <w:t>output_folder</w:t>
-      </w:r>
-      <w:proofErr w:type="spellEnd"/>
-      <w:r>
-        <w:rPr>
-          <w:rFonts w:ascii="Times New Roman" w:hAnsi="Times New Roman" w:cs="Times New Roman"/>
-        </w:rPr>
-        <w:t xml:space="preserve"> to none, which should create a folder with the name of the sound file and store things there. That folder will be filled in with 2 subfolders, one with the snippets, and one with the spectrograms.</w:t>
-      </w:r>
-      <w:r>
-        <w:rPr>
-          <w:rFonts w:ascii="Times New Roman" w:hAnsi="Times New Roman" w:cs="Times New Roman"/>
-        </w:rPr>
-        <w:t xml:space="preserve"> I have just now added ad labels toggle, make it true for visualization, but keep it off for AI training purposes. You can also change the spectrogram type between the three options available (</w:t>
-      </w:r>
-      <w:proofErr w:type="spellStart"/>
-      <w:r>
-        <w:rPr>
-          <w:rFonts w:ascii="Times New Roman" w:hAnsi="Times New Roman" w:cs="Times New Roman"/>
-        </w:rPr>
-        <w:t>fft</w:t>
-      </w:r>
-      <w:proofErr w:type="spellEnd"/>
-      <w:r>
-        <w:rPr>
-          <w:rFonts w:ascii="Times New Roman" w:hAnsi="Times New Roman" w:cs="Times New Roman"/>
-        </w:rPr>
-        <w:t xml:space="preserve">, mel, or Hilbert, but be aware Hilbert can be very slow). And since I was at it, I added a </w:t>
-      </w:r>
-      <w:proofErr w:type="spellStart"/>
-      <w:r>
-        <w:rPr>
-          <w:rFonts w:ascii="Times New Roman" w:hAnsi="Times New Roman" w:cs="Times New Roman"/>
-        </w:rPr>
-        <w:t>color</w:t>
-      </w:r>
-      <w:proofErr w:type="spellEnd"/>
-      <w:r>
-        <w:rPr>
-          <w:rFonts w:ascii="Times New Roman" w:hAnsi="Times New Roman" w:cs="Times New Roman"/>
-        </w:rPr>
-        <w:t xml:space="preserve"> option. It will draw colormaps from matplotlib, so you can use </w:t>
-      </w:r>
-      <w:proofErr w:type="spellStart"/>
-      <w:proofErr w:type="gramStart"/>
-      <w:r>
-        <w:rPr>
-          <w:rFonts w:ascii="Times New Roman" w:hAnsi="Times New Roman" w:cs="Times New Roman"/>
-          <w:b/>
-          <w:bCs/>
-        </w:rPr>
-        <w:t>plt.colormaps</w:t>
-      </w:r>
-      <w:proofErr w:type="spellEnd"/>
-      <w:proofErr w:type="gramEnd"/>
-      <w:r>
-        <w:rPr>
-          <w:rFonts w:ascii="Times New Roman" w:hAnsi="Times New Roman" w:cs="Times New Roman"/>
-          <w:b/>
-          <w:bCs/>
-        </w:rPr>
-        <w:t>()</w:t>
-      </w:r>
-      <w:r>
-        <w:rPr>
-          <w:rFonts w:ascii="Times New Roman" w:hAnsi="Times New Roman" w:cs="Times New Roman"/>
-          <w:b/>
-          <w:bCs/>
-        </w:rPr>
-        <w:t xml:space="preserve"> </w:t>
-      </w:r>
-      <w:r>
-        <w:rPr>
-          <w:rFonts w:ascii="Times New Roman" w:hAnsi="Times New Roman" w:cs="Times New Roman"/>
-        </w:rPr>
-        <w:t>to</w:t>
-      </w:r>
-      <w:r>
-        <w:rPr>
-          <w:rFonts w:ascii="Times New Roman" w:hAnsi="Times New Roman" w:cs="Times New Roman"/>
-        </w:rPr>
-        <w:t xml:space="preserve"> see your options.</w:t>
-      </w:r>
-    </w:p>
-    <w:p>
-      <w:pPr>
-        <w:rPr>
-          <w:rFonts w:ascii="Times New Roman" w:hAnsi="Times New Roman" w:cs="Times New Roman"/>
-        </w:rPr>
-      </w:pPr>
-      <w:proofErr w:type="spellStart"/>
-      <w:proofErr w:type="gramStart"/>
-      <w:r>
-        <w:rPr>
-          <w:rFonts w:ascii="Times New Roman" w:hAnsi="Times New Roman" w:cs="Times New Roman"/>
-          <w:b/>
-          <w:bCs/>
-          <w:i/>
-          <w:iCs/>
-        </w:rPr>
-        <w:t>st.annotate</w:t>
-      </w:r>
-      <w:proofErr w:type="gramEnd"/>
-      <w:r>
-        <w:rPr>
-          <w:rFonts w:ascii="Times New Roman" w:hAnsi="Times New Roman" w:cs="Times New Roman"/>
-          <w:b/>
-          <w:bCs/>
-          <w:i/>
-          <w:iCs/>
-        </w:rPr>
-        <w:t>_</w:t>
-      </w:r>
-      <w:proofErr w:type="gramStart"/>
-      <w:r>
-        <w:rPr>
-          <w:rFonts w:ascii="Times New Roman" w:hAnsi="Times New Roman" w:cs="Times New Roman"/>
-          <w:b/>
-          <w:bCs/>
-          <w:i/>
-          <w:iCs/>
-        </w:rPr>
-        <w:t>data</w:t>
-      </w:r>
-      <w:proofErr w:type="spellEnd"/>
-      <w:r>
-        <w:rPr>
-          <w:rFonts w:ascii="Times New Roman" w:hAnsi="Times New Roman" w:cs="Times New Roman"/>
-          <w:b/>
-          <w:bCs/>
-          <w:i/>
-          <w:iCs/>
-        </w:rPr>
-        <w:t>(</w:t>
-      </w:r>
-      <w:proofErr w:type="gramEnd"/>
-      <w:r>
-        <w:rPr>
-          <w:rFonts w:ascii="Times New Roman" w:hAnsi="Times New Roman" w:cs="Times New Roman"/>
-          <w:b/>
-          <w:bCs/>
-          <w:i/>
-          <w:iCs/>
-        </w:rPr>
-        <w:t xml:space="preserve">notes, </w:t>
-      </w:r>
-      <w:proofErr w:type="spellStart"/>
-      <w:r>
-        <w:rPr>
-          <w:rFonts w:ascii="Times New Roman" w:hAnsi="Times New Roman" w:cs="Times New Roman"/>
-          <w:b/>
-          <w:bCs/>
-          <w:i/>
-          <w:iCs/>
-        </w:rPr>
-        <w:t>snip</w:t>
-      </w:r>
-      <w:r>
-        <w:rPr>
-          <w:rFonts w:ascii="Times New Roman" w:hAnsi="Times New Roman" w:cs="Times New Roman"/>
-          <w:b/>
-          <w:bCs/>
-          <w:i/>
-          <w:iCs/>
-        </w:rPr>
-        <w:t>_path</w:t>
-      </w:r>
-      <w:proofErr w:type="spellEnd"/>
-      <w:r>
-        <w:rPr>
-          <w:rFonts w:ascii="Times New Roman" w:hAnsi="Times New Roman" w:cs="Times New Roman"/>
-          <w:b/>
-          <w:bCs/>
-          <w:i/>
-          <w:iCs/>
-        </w:rPr>
-        <w:t xml:space="preserve">, </w:t>
-      </w:r>
-      <w:proofErr w:type="spellStart"/>
-      <w:r>
-        <w:rPr>
-          <w:rFonts w:ascii="Times New Roman" w:hAnsi="Times New Roman" w:cs="Times New Roman"/>
-          <w:b/>
-          <w:bCs/>
-          <w:i/>
-          <w:iCs/>
-        </w:rPr>
-        <w:t>spec</w:t>
-      </w:r>
-      <w:r>
-        <w:rPr>
-          <w:rFonts w:ascii="Times New Roman" w:hAnsi="Times New Roman" w:cs="Times New Roman"/>
-          <w:b/>
-          <w:bCs/>
-          <w:i/>
-          <w:iCs/>
-        </w:rPr>
-        <w:t>_path</w:t>
-      </w:r>
-      <w:proofErr w:type="spellEnd"/>
-      <w:r>
-        <w:rPr>
-          <w:rFonts w:ascii="Times New Roman" w:hAnsi="Times New Roman" w:cs="Times New Roman"/>
-          <w:b/>
-          <w:bCs/>
-          <w:i/>
-          <w:iCs/>
-        </w:rPr>
-        <w:t xml:space="preserve">, </w:t>
-      </w:r>
-      <w:proofErr w:type="spellStart"/>
-      <w:r>
-        <w:rPr>
-          <w:rFonts w:ascii="Times New Roman" w:hAnsi="Times New Roman" w:cs="Times New Roman"/>
-          <w:b/>
-          <w:bCs/>
-          <w:i/>
-          <w:iCs/>
-        </w:rPr>
-        <w:t>snippet_duration</w:t>
-      </w:r>
-      <w:proofErr w:type="spellEnd"/>
-      <w:r>
-        <w:rPr>
-          <w:rFonts w:ascii="Times New Roman" w:hAnsi="Times New Roman" w:cs="Times New Roman"/>
-          <w:b/>
-          <w:bCs/>
-          <w:i/>
-          <w:iCs/>
-        </w:rPr>
-        <w:t xml:space="preserve">=2.0, </w:t>
-      </w:r>
-      <w:proofErr w:type="spellStart"/>
-      <w:r>
-        <w:rPr>
-          <w:rFonts w:ascii="Times New Roman" w:hAnsi="Times New Roman" w:cs="Times New Roman"/>
-          <w:b/>
-          <w:bCs/>
-          <w:i/>
-          <w:iCs/>
-        </w:rPr>
-        <w:t>csv_delim</w:t>
-      </w:r>
-      <w:proofErr w:type="spellEnd"/>
-      <w:r>
-        <w:rPr>
-          <w:rFonts w:ascii="Times New Roman" w:hAnsi="Times New Roman" w:cs="Times New Roman"/>
-          <w:b/>
-          <w:bCs/>
-          <w:i/>
-          <w:iCs/>
-        </w:rPr>
-        <w:t>='\t')</w:t>
-      </w:r>
-      <w:r>
-        <w:rPr>
-          <w:rFonts w:ascii="Times New Roman" w:hAnsi="Times New Roman" w:cs="Times New Roman"/>
-          <w:b/>
-          <w:bCs/>
-          <w:i/>
-          <w:iCs/>
-        </w:rPr>
-        <w:t xml:space="preserve"> </w:t>
-      </w:r>
-      <w:r>
-        <w:rPr>
-          <w:rFonts w:ascii="Times New Roman" w:hAnsi="Times New Roman" w:cs="Times New Roman"/>
-        </w:rPr>
-        <w:t>once</w:t>
-      </w:r>
-      <w:r>
-        <w:rPr>
-          <w:rFonts w:ascii="Times New Roman" w:hAnsi="Times New Roman" w:cs="Times New Roman"/>
-        </w:rPr>
-        <w:t xml:space="preserve"> you have processed a file, in the case you are working on training data, you can use your annotations to automatically distribute your files for training. These part of the logic is incomplete for the moment and will change soon, for now it is best for you to run it from the pipeline script. You will use the notes, which is a .txt file saved as tab delimited, path to the snippets and spectrograms that belong with that set of notes, and the snippet duration that you used (defaulted to 2, so use as </w:t>
-      </w:r>
-      <w:proofErr w:type="spellStart"/>
-      <w:r>
-        <w:rPr>
-          <w:rFonts w:ascii="Times New Roman" w:hAnsi="Times New Roman" w:cs="Times New Roman"/>
-        </w:rPr>
-        <w:t>kwarg</w:t>
-      </w:r>
-      <w:proofErr w:type="spellEnd"/>
-      <w:r>
-        <w:rPr>
-          <w:rFonts w:ascii="Times New Roman" w:hAnsi="Times New Roman" w:cs="Times New Roman"/>
-        </w:rPr>
-        <w:t xml:space="preserve">). The last </w:t>
-      </w:r>
-      <w:proofErr w:type="spellStart"/>
-      <w:r>
-        <w:rPr>
-          <w:rFonts w:ascii="Times New Roman" w:hAnsi="Times New Roman" w:cs="Times New Roman"/>
-        </w:rPr>
-        <w:t>kwarg</w:t>
-      </w:r>
-      <w:proofErr w:type="spellEnd"/>
-      <w:r>
-        <w:rPr>
-          <w:rFonts w:ascii="Times New Roman" w:hAnsi="Times New Roman" w:cs="Times New Roman"/>
-        </w:rPr>
-        <w:t xml:space="preserve"> is not necessary if you saved your txt as tab delimited, but can be used in case you used comma. This function makes a split into positives </w:t>
-      </w:r>
-      <w:proofErr w:type="spellStart"/>
-      <w:proofErr w:type="gramStart"/>
-      <w:r>
-        <w:rPr>
-          <w:rFonts w:ascii="Times New Roman" w:hAnsi="Times New Roman" w:cs="Times New Roman"/>
-        </w:rPr>
-        <w:t>an</w:t>
-      </w:r>
-      <w:proofErr w:type="spellEnd"/>
-      <w:proofErr w:type="gramEnd"/>
-      <w:r>
-        <w:rPr>
-          <w:rFonts w:ascii="Times New Roman" w:hAnsi="Times New Roman" w:cs="Times New Roman"/>
-        </w:rPr>
-        <w:t xml:space="preserve"> negatives, from there you could use data augmentation, or go into training.</w:t>
-      </w:r>
-      <w:r>
-        <w:rPr>
-          <w:rFonts w:ascii="Times New Roman" w:hAnsi="Times New Roman" w:cs="Times New Roman"/>
-        </w:rPr>
-        <w:t xml:space="preserve"> It will split all the files on each of the separate files directories and (using the pipeline logic) create merged folders for training.</w:t>
-      </w:r>
-      <w:r>
-        <w:rPr>
-          <w:rFonts w:ascii="Times New Roman" w:hAnsi="Times New Roman" w:cs="Times New Roman"/>
-        </w:rPr>
-        <w:t xml:space="preserve"> </w:t>
-      </w:r>
-      <w:r>
-        <w:rPr>
-          <w:rFonts w:ascii="Times New Roman" w:hAnsi="Times New Roman" w:cs="Times New Roman"/>
-          <w:b/>
-          <w:bCs/>
-        </w:rPr>
-        <w:t>WARNING!</w:t>
-      </w:r>
-      <w:r>
-        <w:rPr>
-          <w:rFonts w:ascii="Times New Roman" w:hAnsi="Times New Roman" w:cs="Times New Roman"/>
-        </w:rPr>
-        <w:t xml:space="preserve"> This function assumes all that is not positive is negative. That is, for simplicity of the annotation, you only have to annotate positives. Be careful to add and filter out (if needed) dubious things so you don’t have positives on the negative training set.</w:t>
-      </w:r>
-    </w:p>
-    <w:p>
-      <w:pPr>
-        <w:rPr>
-          <w:rFonts w:ascii="Times New Roman" w:hAnsi="Times New Roman" w:cs="Times New Roman"/>
-          <w:bCs/>
-          <w:iCs/>
-        </w:rPr>
-      </w:pPr>
-      <w:proofErr w:type="spellStart"/>
-      <w:proofErr w:type="gramStart"/>
-      <w:r>
-        <w:rPr>
-          <w:rFonts w:ascii="Times New Roman" w:hAnsi="Times New Roman" w:cs="Times New Roman"/>
-          <w:b/>
-          <w:bCs/>
-          <w:i/>
-          <w:iCs/>
-        </w:rPr>
-        <w:t>st.n</w:t>
-      </w:r>
-      <w:r>
-        <w:rPr>
-          <w:rFonts w:ascii="Times New Roman" w:hAnsi="Times New Roman" w:cs="Times New Roman"/>
-          <w:b/>
-          <w:bCs/>
-          <w:i/>
-          <w:iCs/>
-        </w:rPr>
-        <w:t>ormalize</w:t>
-      </w:r>
-      <w:proofErr w:type="gramEnd"/>
-      <w:r>
-        <w:rPr>
-          <w:rFonts w:ascii="Times New Roman" w:hAnsi="Times New Roman" w:cs="Times New Roman"/>
-          <w:b/>
-          <w:bCs/>
-          <w:i/>
-          <w:iCs/>
-        </w:rPr>
-        <w:t>_</w:t>
-      </w:r>
-      <w:proofErr w:type="gramStart"/>
-      <w:r>
-        <w:rPr>
-          <w:rFonts w:ascii="Times New Roman" w:hAnsi="Times New Roman" w:cs="Times New Roman"/>
-          <w:b/>
-          <w:bCs/>
-          <w:i/>
-          <w:iCs/>
-        </w:rPr>
-        <w:t>global</w:t>
-      </w:r>
-      <w:proofErr w:type="spellEnd"/>
-      <w:r>
-        <w:rPr>
-          <w:rFonts w:ascii="Times New Roman" w:hAnsi="Times New Roman" w:cs="Times New Roman"/>
-          <w:b/>
-          <w:bCs/>
-          <w:i/>
-          <w:iCs/>
-        </w:rPr>
-        <w:t>(</w:t>
-      </w:r>
-      <w:proofErr w:type="spellStart"/>
-      <w:proofErr w:type="gramEnd"/>
-      <w:r>
-        <w:rPr>
-          <w:rFonts w:ascii="Times New Roman" w:hAnsi="Times New Roman" w:cs="Times New Roman"/>
-          <w:b/>
-          <w:bCs/>
-          <w:i/>
-          <w:iCs/>
-        </w:rPr>
-        <w:t>input_dir</w:t>
-      </w:r>
-      <w:proofErr w:type="spellEnd"/>
-      <w:r>
-        <w:rPr>
-          <w:rFonts w:ascii="Times New Roman" w:hAnsi="Times New Roman" w:cs="Times New Roman"/>
-          <w:b/>
-          <w:bCs/>
-          <w:i/>
-          <w:iCs/>
-        </w:rPr>
-        <w:t xml:space="preserve">, </w:t>
-      </w:r>
-      <w:proofErr w:type="spellStart"/>
-      <w:r>
-        <w:rPr>
-          <w:rFonts w:ascii="Times New Roman" w:hAnsi="Times New Roman" w:cs="Times New Roman"/>
-          <w:b/>
-          <w:bCs/>
-          <w:i/>
-          <w:iCs/>
-        </w:rPr>
-        <w:t>output_dir</w:t>
-      </w:r>
-      <w:proofErr w:type="spellEnd"/>
-      <w:r>
-        <w:rPr>
-          <w:rFonts w:ascii="Times New Roman" w:hAnsi="Times New Roman" w:cs="Times New Roman"/>
-          <w:b/>
-          <w:bCs/>
-          <w:i/>
-          <w:iCs/>
-        </w:rPr>
-        <w:t xml:space="preserve">, </w:t>
-      </w:r>
-      <w:proofErr w:type="spellStart"/>
-      <w:r>
-        <w:rPr>
-          <w:rFonts w:ascii="Times New Roman" w:hAnsi="Times New Roman" w:cs="Times New Roman"/>
-          <w:b/>
-          <w:bCs/>
-          <w:i/>
-          <w:iCs/>
-        </w:rPr>
-        <w:t>target_max</w:t>
-      </w:r>
-      <w:proofErr w:type="spellEnd"/>
-      <w:r>
-        <w:rPr>
-          <w:rFonts w:ascii="Times New Roman" w:hAnsi="Times New Roman" w:cs="Times New Roman"/>
-          <w:b/>
-          <w:bCs/>
-          <w:i/>
-          <w:iCs/>
-        </w:rPr>
-        <w:t xml:space="preserve"> = 0.75):</w:t>
-      </w:r>
-      <w:r>
-        <w:rPr>
-          <w:rFonts w:ascii="Times New Roman" w:hAnsi="Times New Roman" w:cs="Times New Roman"/>
-          <w:bCs/>
-          <w:iCs/>
-        </w:rPr>
-        <w:t xml:space="preserve"> this allows for normalization of several files to one single peak. So, if you wanted to normalize a whole set of files to their overall maximum, you put them in a folder and run this. It should create a new folder with all files normalized. It might be useful to normalize by microphone or whole experiments. We will see what Sara thinks later.</w:t>
+        <w:t>overall maximum, you put them in a folder and run this. It should create a new folder with all files normalized. It might be useful to normalize by microphone or whole experiments. We will see what Sara thinks later.</w:t>
       </w:r>
     </w:p>
     <w:p>

</xml_diff>

<commit_message>
Added instructions to correctly import the tensor flow dependent functionality
</commit_message>
<xml_diff>
--- a/Users_manual.docx
+++ b/Users_manual.docx
@@ -2069,16 +2069,93 @@
     </w:p>
     <w:p>
       <w:pPr>
-        <w:spacing w:after="0"/>
-        <w:rPr>
-          <w:rFonts w:ascii="Times New Roman" w:hAnsi="Times New Roman" w:cs="Times New Roman"/>
-        </w:rPr>
-      </w:pPr>
-      <w:r>
-        <w:rPr>
-          <w:rFonts w:ascii="Times New Roman" w:hAnsi="Times New Roman" w:cs="Times New Roman"/>
-        </w:rPr>
-        <w:t>First and foremost, basic training is done through a code like this:</w:t>
+        <w:rPr>
+          <w:rFonts w:ascii="Times New Roman" w:hAnsi="Times New Roman" w:cs="Times New Roman"/>
+        </w:rPr>
+      </w:pPr>
+      <w:r>
+        <w:rPr>
+          <w:rFonts w:ascii="Times New Roman" w:hAnsi="Times New Roman" w:cs="Times New Roman"/>
+        </w:rPr>
+        <w:t>In a recent patch, I decided to delay the loading of these functions because of the Tensor flow dependencie. It is heavy and takes a lot to load it. So now they are not loaded with the rest of the package, but only when needed. That means, assuming you have imported stridulant already, you still have to import the functions like this.</w:t>
+      </w:r>
+    </w:p>
+    <w:p>
+      <w:pPr>
+        <w:rPr>
+          <w:rFonts w:ascii="Times New Roman" w:hAnsi="Times New Roman" w:cs="Times New Roman"/>
+          <w:b/>
+          <w:bCs/>
+          <w:i/>
+          <w:iCs/>
+        </w:rPr>
+      </w:pPr>
+      <w:r>
+        <w:rPr>
+          <w:rFonts w:ascii="Times New Roman" w:hAnsi="Times New Roman" w:cs="Times New Roman"/>
+          <w:b/>
+          <w:bCs/>
+          <w:i/>
+          <w:iCs/>
+        </w:rPr>
+        <w:t>from stridulant load train_model, classify_spectrograms</w:t>
+      </w:r>
+    </w:p>
+    <w:p>
+      <w:pPr>
+        <w:rPr>
+          <w:rFonts w:ascii="Times New Roman" w:hAnsi="Times New Roman" w:cs="Times New Roman"/>
+        </w:rPr>
+      </w:pPr>
+      <w:r>
+        <w:rPr>
+          <w:rFonts w:ascii="Times New Roman" w:hAnsi="Times New Roman" w:cs="Times New Roman"/>
+        </w:rPr>
+        <w:t>T</w:t>
+      </w:r>
+      <w:r>
+        <w:rPr>
+          <w:rFonts w:ascii="Times New Roman" w:hAnsi="Times New Roman" w:cs="Times New Roman"/>
+        </w:rPr>
+        <w:t>hat l</w:t>
+      </w:r>
+      <w:r>
+        <w:rPr>
+          <w:rFonts w:ascii="Times New Roman" w:hAnsi="Times New Roman" w:cs="Times New Roman"/>
+        </w:rPr>
+        <w:t>ine will add the functions to your name space as part of stridulant.</w:t>
+      </w:r>
+    </w:p>
+    <w:p>
+      <w:pPr>
+        <w:spacing w:after="0"/>
+        <w:rPr>
+          <w:rFonts w:ascii="Times New Roman" w:hAnsi="Times New Roman" w:cs="Times New Roman"/>
+        </w:rPr>
+      </w:pPr>
+      <w:r>
+        <w:rPr>
+          <w:rFonts w:ascii="Times New Roman" w:hAnsi="Times New Roman" w:cs="Times New Roman"/>
+        </w:rPr>
+        <w:t>Now you can go on with the</w:t>
+      </w:r>
+      <w:r>
+        <w:rPr>
+          <w:rFonts w:ascii="Times New Roman" w:hAnsi="Times New Roman" w:cs="Times New Roman"/>
+        </w:rPr>
+        <w:t xml:space="preserve"> basic training</w:t>
+      </w:r>
+      <w:r>
+        <w:rPr>
+          <w:rFonts w:ascii="Times New Roman" w:hAnsi="Times New Roman" w:cs="Times New Roman"/>
+        </w:rPr>
+        <w:t xml:space="preserve">, </w:t>
+      </w:r>
+      <w:r>
+        <w:rPr>
+          <w:rFonts w:ascii="Times New Roman" w:hAnsi="Times New Roman" w:cs="Times New Roman"/>
+        </w:rPr>
+        <w:t>done through a code like this:</w:t>
       </w:r>
     </w:p>
     <w:p>
@@ -2505,6 +2582,7 @@
           <w:i/>
           <w:iCs/>
         </w:rPr>
+        <w:lastRenderedPageBreak/>
         <w:t xml:space="preserve">        Conv2D(128, (3, 3), activation='relu'),</w:t>
       </w:r>
     </w:p>
@@ -2665,7 +2743,6 @@
         <w:rPr>
           <w:rFonts w:ascii="Times New Roman" w:hAnsi="Times New Roman" w:cs="Times New Roman"/>
         </w:rPr>
-        <w:lastRenderedPageBreak/>
         <w:t xml:space="preserve">The model is </w:t>
       </w:r>
       <w:r>

</xml_diff>

<commit_message>
Added a smooth parameter to all the stages of the searching algorithms as a initial step to adapt their use for the cavitations.
</commit_message>
<xml_diff>
--- a/Users_manual.docx
+++ b/Users_manual.docx
@@ -1495,13 +1495,55 @@
           <w:i/>
           <w:iCs/>
         </w:rPr>
-        <w:t>min_event_duration=0.2, threshold_percentile=25):</w:t>
-      </w:r>
-      <w:r>
-        <w:rPr>
-          <w:rFonts w:ascii="Times New Roman" w:hAnsi="Times New Roman" w:cs="Times New Roman"/>
-        </w:rPr>
-        <w:t xml:space="preserve"> this function creates a smooth version of the Hilbert envelope and finds event with a duration over </w:t>
+        <w:t>min_event_duration=0.2, threshold_percentile=25</w:t>
+      </w:r>
+      <w:r>
+        <w:rPr>
+          <w:rFonts w:ascii="Times New Roman" w:hAnsi="Times New Roman" w:cs="Times New Roman"/>
+          <w:b/>
+          <w:bCs/>
+          <w:i/>
+          <w:iCs/>
+        </w:rPr>
+        <w:t xml:space="preserve">, </w:t>
+      </w:r>
+      <w:r>
+        <w:rPr>
+          <w:rFonts w:ascii="Times New Roman" w:hAnsi="Times New Roman" w:cs="Times New Roman"/>
+          <w:b/>
+          <w:bCs/>
+          <w:i/>
+          <w:iCs/>
+        </w:rPr>
+        <w:t>env_smooth = 10</w:t>
+      </w:r>
+      <w:r>
+        <w:rPr>
+          <w:rFonts w:ascii="Times New Roman" w:hAnsi="Times New Roman" w:cs="Times New Roman"/>
+          <w:b/>
+          <w:bCs/>
+          <w:i/>
+          <w:iCs/>
+        </w:rPr>
+        <w:t>):</w:t>
+      </w:r>
+      <w:r>
+        <w:rPr>
+          <w:rFonts w:ascii="Times New Roman" w:hAnsi="Times New Roman" w:cs="Times New Roman"/>
+        </w:rPr>
+        <w:t xml:space="preserve"> this function creates a smooth version of the Hilbert envelope</w:t>
+      </w:r>
+      <w:r>
+        <w:rPr>
+          <w:rFonts w:ascii="Times New Roman" w:hAnsi="Times New Roman" w:cs="Times New Roman"/>
+        </w:rPr>
+        <w:t xml:space="preserve"> (env_smooth to change the smoother, see Hilbert spectrogram for more info on this)</w:t>
+      </w:r>
+      <w:r>
+        <w:rPr>
+          <w:rFonts w:ascii="Times New Roman" w:hAnsi="Times New Roman" w:cs="Times New Roman"/>
+        </w:rPr>
+        <w:t xml:space="preserve"> and finds event with a duration over </w:t>
       </w:r>
       <w:r>
         <w:rPr>
@@ -1525,7 +1567,7 @@
         <w:rPr>
           <w:rFonts w:ascii="Times New Roman" w:hAnsi="Times New Roman" w:cs="Times New Roman"/>
         </w:rPr>
-        <w:t xml:space="preserve"> (default 25%) . It will return a list of such events within the snippet. Importantly, these events are regions of high sustained energy</w:t>
+        <w:t xml:space="preserve"> (default 25%). It will return a list of such events within the snippet. Importantly, these events are regions of high sustained energy</w:t>
       </w:r>
       <w:r>
         <w:rPr>
@@ -1540,29 +1582,89 @@
         <w:lastRenderedPageBreak/>
         <w:t>certain duration and are over a certain energy percentile. Obviously, with the right adjustments can be used to find regions of interest not only for stridulations, but for anything.</w:t>
       </w:r>
-    </w:p>
-    <w:p>
-      <w:pPr>
-        <w:spacing w:after="0"/>
-        <w:rPr>
-          <w:rFonts w:ascii="Times New Roman" w:hAnsi="Times New Roman" w:cs="Times New Roman"/>
-        </w:rPr>
-      </w:pPr>
-      <w:r>
-        <w:rPr>
-          <w:rFonts w:ascii="Times New Roman" w:hAnsi="Times New Roman" w:cs="Times New Roman"/>
-          <w:b/>
-          <w:bCs/>
-          <w:i/>
-          <w:iCs/>
-        </w:rPr>
-        <w:t>Snippet_1.extract_features(event, pulse_dist = 20):</w:t>
-      </w:r>
-      <w:r>
-        <w:rPr>
-          <w:rFonts w:ascii="Times New Roman" w:hAnsi="Times New Roman" w:cs="Times New Roman"/>
-        </w:rPr>
-        <w:t xml:space="preserve"> This function extracts a list of features of one of the events of the function above. It analyses several properties of the event and returns them. This means, if you use this function on some sounds you are interested in, you can find boundaries on these characteristics. With that characterization, you can </w:t>
+      <w:r>
+        <w:rPr>
+          <w:rFonts w:ascii="Times New Roman" w:hAnsi="Times New Roman" w:cs="Times New Roman"/>
+        </w:rPr>
+        <w:t xml:space="preserve"> It defaults to stridulations patterns as that was the initial reason to develop it, but can be adjusted with the kwargs.</w:t>
+      </w:r>
+    </w:p>
+    <w:p>
+      <w:pPr>
+        <w:spacing w:after="0"/>
+        <w:rPr>
+          <w:rFonts w:ascii="Times New Roman" w:hAnsi="Times New Roman" w:cs="Times New Roman"/>
+        </w:rPr>
+      </w:pPr>
+      <w:r>
+        <w:rPr>
+          <w:rFonts w:ascii="Times New Roman" w:hAnsi="Times New Roman" w:cs="Times New Roman"/>
+          <w:b/>
+          <w:bCs/>
+          <w:i/>
+          <w:iCs/>
+        </w:rPr>
+        <w:t>Snippet_1.extract_features(event, pulse_dist = 20</w:t>
+      </w:r>
+      <w:r>
+        <w:rPr>
+          <w:rFonts w:ascii="Times New Roman" w:hAnsi="Times New Roman" w:cs="Times New Roman"/>
+          <w:b/>
+          <w:bCs/>
+          <w:i/>
+          <w:iCs/>
+        </w:rPr>
+        <w:t xml:space="preserve">, </w:t>
+      </w:r>
+      <w:r>
+        <w:rPr>
+          <w:rFonts w:ascii="Times New Roman" w:hAnsi="Times New Roman" w:cs="Times New Roman"/>
+          <w:b/>
+          <w:bCs/>
+          <w:i/>
+          <w:iCs/>
+        </w:rPr>
+        <w:t>env_smooth = 10</w:t>
+      </w:r>
+      <w:r>
+        <w:rPr>
+          <w:rFonts w:ascii="Times New Roman" w:hAnsi="Times New Roman" w:cs="Times New Roman"/>
+          <w:b/>
+          <w:bCs/>
+          <w:i/>
+          <w:iCs/>
+        </w:rPr>
+        <w:t>):</w:t>
+      </w:r>
+      <w:r>
+        <w:rPr>
+          <w:rFonts w:ascii="Times New Roman" w:hAnsi="Times New Roman" w:cs="Times New Roman"/>
+        </w:rPr>
+        <w:t xml:space="preserve"> This function extracts a list of features of one of the events of the function above</w:t>
+      </w:r>
+      <w:r>
+        <w:rPr>
+          <w:rFonts w:ascii="Times New Roman" w:hAnsi="Times New Roman" w:cs="Times New Roman"/>
+        </w:rPr>
+        <w:t>. Min_pulse_dist is the minimum time between pulses to be considered different and not part of the same (one single pulse can have several local maxima, this parameters makes the counter ignore some in a certain time). Env_smooth is the smoother for the Hilbert spectrogram (see Hilber spectrogram for more info)</w:t>
+      </w:r>
+      <w:r>
+        <w:rPr>
+          <w:rFonts w:ascii="Times New Roman" w:hAnsi="Times New Roman" w:cs="Times New Roman"/>
+        </w:rPr>
+        <w:t xml:space="preserve">. </w:t>
+      </w:r>
+      <w:r>
+        <w:rPr>
+          <w:rFonts w:ascii="Times New Roman" w:hAnsi="Times New Roman" w:cs="Times New Roman"/>
+        </w:rPr>
+        <w:t xml:space="preserve">Defaults are for stridulations. </w:t>
+      </w:r>
+      <w:r>
+        <w:rPr>
+          <w:rFonts w:ascii="Times New Roman" w:hAnsi="Times New Roman" w:cs="Times New Roman"/>
+        </w:rPr>
+        <w:t xml:space="preserve">It analyses several properties of the event and returns them. This means, if you use this function on some sounds you are interested in, you can find boundaries on these characteristics. With that characterization, you can </w:t>
       </w:r>
       <w:r>
         <w:rPr>
@@ -1984,162 +2086,1472 @@
           <w:i/>
           <w:iCs/>
         </w:rPr>
-        <w:t>is_stridulation(min_pulses=6, min_regularity=10, min_duration=0.5,  max_duration=1, sustain=0.5, pulse_dist = 20, sp_range=(5500, 15000)</w:t>
-      </w:r>
-      <w:r>
+        <w:t>is_stridulation(</w:t>
+      </w:r>
+      <w:r>
+        <w:rPr>
+          <w:rFonts w:ascii="Times New Roman" w:hAnsi="Times New Roman" w:cs="Times New Roman"/>
+          <w:b/>
+          <w:bCs/>
+          <w:i/>
+          <w:iCs/>
+        </w:rPr>
+        <w:t>min_event_duration=0.2, threshold_percentile=25, min_pulses=6, min_regularity=10, min_duration=0.5, max_duration=1, sustain=0.5, pulse_dist=20, sp_range=(5500, 15000), env_smooth = 10</w:t>
+      </w:r>
+      <w:r>
+        <w:rPr>
+          <w:rFonts w:ascii="Times New Roman" w:hAnsi="Times New Roman" w:cs="Times New Roman"/>
+          <w:b/>
+          <w:bCs/>
+          <w:i/>
+          <w:iCs/>
+        </w:rPr>
+        <w:t>, enable_coupled=True, coupled_min_duration=0.2, coupled_gap=0.6</w:t>
+      </w:r>
+      <w:r>
+        <w:rPr>
+          <w:rFonts w:ascii="Times New Roman" w:hAnsi="Times New Roman" w:cs="Times New Roman"/>
+          <w:b/>
+          <w:bCs/>
+          <w:i/>
+          <w:iCs/>
+        </w:rPr>
+        <w:t>):</w:t>
+      </w:r>
+      <w:r>
+        <w:rPr>
+          <w:rFonts w:ascii="Times New Roman" w:hAnsi="Times New Roman" w:cs="Times New Roman"/>
+        </w:rPr>
+        <w:t xml:space="preserve"> This function evaluates whether a sound is or not a good candidate for a stridulation based on the features above</w:t>
+      </w:r>
+      <w:r>
+        <w:rPr>
+          <w:rFonts w:ascii="Times New Roman" w:hAnsi="Times New Roman" w:cs="Times New Roman"/>
+        </w:rPr>
+        <w:t xml:space="preserve"> (see the find_events and extract_features for more info, part of the parameters are for those two)</w:t>
+      </w:r>
+      <w:r>
+        <w:rPr>
+          <w:rFonts w:ascii="Times New Roman" w:hAnsi="Times New Roman" w:cs="Times New Roman"/>
+        </w:rPr>
+        <w:t>. I figured out the relevant information to define a stridulation is: Number of pulses, at least 6, regularity, at least 10, duration 0.5-1 second, sustain 50%, pulse distance at least 20 ms, and energy concentrated between 5</w:t>
+      </w:r>
+      <w:r>
+        <w:rPr>
+          <w:rFonts w:ascii="Times New Roman" w:hAnsi="Times New Roman" w:cs="Times New Roman"/>
+        </w:rPr>
+        <w:t>.5 and 15 kHzs</w:t>
+      </w:r>
+      <w:r>
+        <w:rPr>
+          <w:rFonts w:ascii="Times New Roman" w:hAnsi="Times New Roman" w:cs="Times New Roman"/>
+        </w:rPr>
+        <w:t>. In addition, I allow for elements with less pulses to be coupled to form a larger event, where similar bur shorter (min_pulses -2, and down to 0.2 seconds) events are considered and if they are close to each other (less than cupled_gap) then they are also added to the list of candidates</w:t>
+      </w:r>
+      <w:r>
+        <w:rPr>
+          <w:rFonts w:ascii="Times New Roman" w:hAnsi="Times New Roman" w:cs="Times New Roman"/>
+        </w:rPr>
+        <w:t>. Now, of course that is for a stridulation, and it is a loose definition on top, but it works well in the lab</w:t>
+      </w:r>
+      <w:r>
+        <w:rPr>
+          <w:rFonts w:ascii="Times New Roman" w:hAnsi="Times New Roman" w:cs="Times New Roman"/>
+        </w:rPr>
+        <w:t xml:space="preserve"> sound files</w:t>
+      </w:r>
+      <w:r>
+        <w:rPr>
+          <w:rFonts w:ascii="Times New Roman" w:hAnsi="Times New Roman" w:cs="Times New Roman"/>
+        </w:rPr>
+        <w:t>. But then the only thing that the finder does is search all events in a file, calculate the features, and decide if they meet the criteria. Which allows to shortlist the number of candidates to a small fraction of the possible ones.</w:t>
+      </w:r>
+      <w:r>
+        <w:rPr>
+          <w:rFonts w:ascii="Times New Roman" w:hAnsi="Times New Roman" w:cs="Times New Roman"/>
+        </w:rPr>
+        <w:t xml:space="preserve"> In </w:t>
+      </w:r>
+      <w:r>
+        <w:rPr>
+          <w:rFonts w:ascii="Times New Roman" w:hAnsi="Times New Roman" w:cs="Times New Roman"/>
+        </w:rPr>
+        <w:lastRenderedPageBreak/>
+        <w:t>my trials it has a 100% accuracy compared to the previous annotations (finds all known stridulations) and less than 50% false positivity. Which is kinda ok in my opinion.</w:t>
+      </w:r>
+    </w:p>
+    <w:p>
+      <w:pPr>
+        <w:rPr>
+          <w:rFonts w:ascii="Times New Roman" w:hAnsi="Times New Roman" w:cs="Times New Roman"/>
+        </w:rPr>
+      </w:pPr>
+      <w:r>
+        <w:rPr>
+          <w:rFonts w:ascii="Times New Roman" w:hAnsi="Times New Roman" w:cs="Times New Roman"/>
+        </w:rPr>
+        <w:t>This needs very fine tuning, but it can give amazing results.</w:t>
+      </w:r>
+      <w:r>
+        <w:rPr>
+          <w:rFonts w:ascii="Times New Roman" w:hAnsi="Times New Roman" w:cs="Times New Roman"/>
+        </w:rPr>
+        <w:t xml:space="preserve"> If you find the key features of your target between the multiple options, you can copy or tweak this function to work for about anything, but you may also contact me and I can develop new variations to resolve different sounds.</w:t>
+      </w:r>
+    </w:p>
+    <w:p>
+      <w:pPr>
+        <w:pStyle w:val="Ttulo2"/>
+      </w:pPr>
+      <w:r>
+        <w:t>Spectrograms</w:t>
+      </w:r>
+    </w:p>
+    <w:p>
+      <w:pPr>
+        <w:spacing w:after="0"/>
+        <w:rPr>
+          <w:rFonts w:ascii="Times New Roman" w:hAnsi="Times New Roman" w:cs="Times New Roman"/>
+        </w:rPr>
+      </w:pPr>
+      <w:r>
+        <w:rPr>
+          <w:rFonts w:ascii="Times New Roman" w:hAnsi="Times New Roman" w:cs="Times New Roman"/>
+        </w:rPr>
+        <w:t xml:space="preserve">Spectrograms </w:t>
+      </w:r>
+      <w:r>
+        <w:rPr>
+          <w:rFonts w:ascii="Times New Roman" w:hAnsi="Times New Roman" w:cs="Times New Roman"/>
+        </w:rPr>
+        <w:t>are a bit easier than snippets in the sense that they have less functions, but their usage is the same.</w:t>
+      </w:r>
+    </w:p>
+    <w:p>
+      <w:pPr>
+        <w:spacing w:after="0"/>
+        <w:rPr>
+          <w:rFonts w:ascii="Times New Roman" w:hAnsi="Times New Roman" w:cs="Times New Roman"/>
+        </w:rPr>
+      </w:pPr>
+      <w:r>
+        <w:rPr>
+          <w:rFonts w:ascii="Times New Roman" w:hAnsi="Times New Roman" w:cs="Times New Roman"/>
+        </w:rPr>
+        <w:t xml:space="preserve">1.- you can visualize it with </w:t>
+      </w:r>
+      <w:r>
+        <w:rPr>
+          <w:rFonts w:ascii="Times New Roman" w:hAnsi="Times New Roman" w:cs="Times New Roman"/>
+          <w:b/>
+          <w:bCs/>
+          <w:i/>
+          <w:iCs/>
+        </w:rPr>
+        <w:t>spectrogram_1.plot(</w:t>
+      </w:r>
+      <w:r>
+        <w:rPr>
+          <w:rFonts w:ascii="Times New Roman" w:hAnsi="Times New Roman" w:cs="Times New Roman"/>
+          <w:b/>
+          <w:bCs/>
+          <w:i/>
+          <w:iCs/>
+        </w:rPr>
+        <w:t>color = “inferno”</w:t>
+      </w:r>
+      <w:r>
+        <w:rPr>
+          <w:rFonts w:ascii="Times New Roman" w:hAnsi="Times New Roman" w:cs="Times New Roman"/>
+          <w:b/>
+          <w:bCs/>
+          <w:i/>
+          <w:iCs/>
+        </w:rPr>
+        <w:t>)</w:t>
+      </w:r>
+      <w:r>
+        <w:rPr>
+          <w:rFonts w:ascii="Times New Roman" w:hAnsi="Times New Roman" w:cs="Times New Roman"/>
+        </w:rPr>
+        <w:t>. This will only show it on screen for you to inspect.</w:t>
+      </w:r>
+      <w:r>
+        <w:rPr>
+          <w:rFonts w:ascii="Times New Roman" w:hAnsi="Times New Roman" w:cs="Times New Roman"/>
+        </w:rPr>
+        <w:t xml:space="preserve"> I have added a color argument because I got sick of looking at the base one and thought you might too. Use plt.colormaps() to see options</w:t>
+      </w:r>
+    </w:p>
+    <w:p>
+      <w:pPr>
+        <w:spacing w:after="0"/>
+        <w:rPr>
+          <w:rFonts w:ascii="Times New Roman" w:hAnsi="Times New Roman" w:cs="Times New Roman"/>
+        </w:rPr>
+      </w:pPr>
+      <w:r>
+        <w:rPr>
+          <w:rFonts w:ascii="Times New Roman" w:hAnsi="Times New Roman" w:cs="Times New Roman"/>
+        </w:rPr>
+        <w:t xml:space="preserve">2.- you can save it with </w:t>
+      </w:r>
+      <w:r>
+        <w:rPr>
+          <w:rFonts w:ascii="Times New Roman" w:hAnsi="Times New Roman" w:cs="Times New Roman"/>
+          <w:b/>
+          <w:bCs/>
+          <w:i/>
+          <w:iCs/>
+        </w:rPr>
+        <w:t>spectrogram_1.save</w:t>
+      </w:r>
+      <w:r>
+        <w:rPr>
+          <w:rFonts w:ascii="Times New Roman" w:hAnsi="Times New Roman" w:cs="Times New Roman"/>
+          <w:b/>
+          <w:bCs/>
+          <w:i/>
+          <w:iCs/>
+        </w:rPr>
+        <w:t>_img</w:t>
+      </w:r>
+      <w:r>
+        <w:rPr>
+          <w:rFonts w:ascii="Times New Roman" w:hAnsi="Times New Roman" w:cs="Times New Roman"/>
+          <w:b/>
+          <w:bCs/>
+          <w:i/>
+          <w:iCs/>
+        </w:rPr>
+        <w:t>(name, dir, with_labels</w:t>
+      </w:r>
+      <w:r>
+        <w:rPr>
+          <w:rFonts w:ascii="Times New Roman" w:hAnsi="Times New Roman" w:cs="Times New Roman"/>
+          <w:b/>
+          <w:bCs/>
+          <w:i/>
+          <w:iCs/>
+        </w:rPr>
+        <w:t xml:space="preserve"> = False</w:t>
+      </w:r>
+      <w:r>
+        <w:rPr>
+          <w:rFonts w:ascii="Times New Roman" w:hAnsi="Times New Roman" w:cs="Times New Roman"/>
+          <w:b/>
+          <w:bCs/>
+          <w:i/>
+          <w:iCs/>
+        </w:rPr>
+        <w:t>)</w:t>
+      </w:r>
+      <w:r>
+        <w:rPr>
+          <w:rFonts w:ascii="Times New Roman" w:hAnsi="Times New Roman" w:cs="Times New Roman"/>
+        </w:rPr>
+        <w:t>. I suggest you follow the same naming conventions explained for snippets. The spectrogram will automatically receive time stamps and other flags from the snippet they come from. The with_labels kwarg will default to false (you don’t have write it unless you want it True). This means that the spectrogram will be saved without axis colour codes or other things. That is the way you want them to be in your AI models, but for presentations or papers, you can turn it true and it will give you something more human readable.</w:t>
+      </w:r>
+      <w:r>
+        <w:rPr>
+          <w:rFonts w:ascii="Times New Roman" w:hAnsi="Times New Roman" w:cs="Times New Roman"/>
+        </w:rPr>
+        <w:t xml:space="preserve"> As with the plot, now you can choose a colormap. See plot function for details.</w:t>
+      </w:r>
+    </w:p>
+    <w:p>
+      <w:pPr>
+        <w:spacing w:after="0"/>
+        <w:rPr>
+          <w:rFonts w:ascii="Times New Roman" w:hAnsi="Times New Roman" w:cs="Times New Roman"/>
+        </w:rPr>
+      </w:pPr>
+      <w:r>
+        <w:rPr>
+          <w:rFonts w:ascii="Times New Roman" w:hAnsi="Times New Roman" w:cs="Times New Roman"/>
+        </w:rPr>
+        <w:t xml:space="preserve">3.- you can now save a table with the spectrogram data too with </w:t>
+      </w:r>
+      <w:r>
+        <w:rPr>
+          <w:rFonts w:ascii="Times New Roman" w:hAnsi="Times New Roman" w:cs="Times New Roman"/>
+          <w:b/>
+        </w:rPr>
+        <w:t>spectrogram.s</w:t>
+      </w:r>
+      <w:r>
+        <w:rPr>
+          <w:rFonts w:ascii="Times New Roman" w:hAnsi="Times New Roman" w:cs="Times New Roman"/>
+          <w:b/>
+          <w:i/>
+        </w:rPr>
+        <w:t>ave</w:t>
+      </w:r>
+      <w:r>
+        <w:rPr>
+          <w:rFonts w:ascii="Times New Roman" w:hAnsi="Times New Roman" w:cs="Times New Roman"/>
+          <w:b/>
+          <w:i/>
+        </w:rPr>
+        <w:t>_table(source_name, output_dir)</w:t>
+      </w:r>
+      <w:r>
+        <w:rPr>
+          <w:rFonts w:ascii="Times New Roman" w:hAnsi="Times New Roman" w:cs="Times New Roman"/>
+        </w:rPr>
+        <w:t xml:space="preserve"> I suggest using the same naming convention, although this, for the moment at least, can’t be loaded, so it is not so critical.</w:t>
+      </w:r>
+    </w:p>
+    <w:p>
+      <w:pPr>
+        <w:rPr>
+          <w:rFonts w:ascii="Times New Roman" w:hAnsi="Times New Roman" w:cs="Times New Roman"/>
+        </w:rPr>
+      </w:pPr>
+      <w:r>
+        <w:rPr>
+          <w:rFonts w:ascii="Times New Roman" w:hAnsi="Times New Roman" w:cs="Times New Roman"/>
+        </w:rPr>
+        <w:t xml:space="preserve">4.- get average power and peak power densities with </w:t>
+      </w:r>
+      <w:r>
+        <w:rPr>
+          <w:rFonts w:ascii="Times New Roman" w:hAnsi="Times New Roman" w:cs="Times New Roman"/>
+          <w:b/>
+        </w:rPr>
+        <w:t>spectrogram.compute_power_metrics()</w:t>
+      </w:r>
+      <w:r>
+        <w:rPr>
+          <w:rFonts w:ascii="Times New Roman" w:hAnsi="Times New Roman" w:cs="Times New Roman"/>
+          <w:b/>
+        </w:rPr>
+        <w:t xml:space="preserve">. </w:t>
+      </w:r>
+      <w:r>
+        <w:rPr>
+          <w:rFonts w:ascii="Times New Roman" w:hAnsi="Times New Roman" w:cs="Times New Roman"/>
+        </w:rPr>
+        <w:t>This will return APD and PPD and return them on that order. Units currently are dB.</w:t>
+      </w:r>
+    </w:p>
+    <w:p>
+      <w:pPr>
+        <w:rPr>
+          <w:rFonts w:ascii="Times New Roman" w:hAnsi="Times New Roman" w:cs="Times New Roman"/>
+        </w:rPr>
+      </w:pPr>
+      <w:r>
+        <w:rPr>
+          <w:rFonts w:ascii="Times New Roman" w:hAnsi="Times New Roman" w:cs="Times New Roman"/>
+        </w:rPr>
+        <w:t>With these functions, you should be able to cut, your own stridulations, just remember the time frame is important. You must make a decision at the beginning, how long will snippets be for the model? Then stick to that length to preserve proportions. Then, it is technically possible to just do this by hand and create all the data by yourself. But later on I will explain how to automatically batch-process big files. However this part of the tutorial is relevant for you to understand how your pipeline works and what is happening on the backstage. Also, to sometimes manually cut one particular stridulation or make some more augmentations.</w:t>
+      </w:r>
+    </w:p>
+    <w:p>
+      <w:pPr>
+        <w:spacing w:after="0"/>
+        <w:rPr>
+          <w:rFonts w:ascii="Times New Roman" w:hAnsi="Times New Roman" w:cs="Times New Roman"/>
+        </w:rPr>
+      </w:pPr>
+      <w:r>
+        <w:rPr>
+          <w:rFonts w:ascii="Times New Roman" w:hAnsi="Times New Roman" w:cs="Times New Roman"/>
+        </w:rPr>
+        <w:t>Finally, if you are working on already saved snippets, I have added a loading function for them so you don’t have to be cutting the same snippet once and again.</w:t>
+      </w:r>
+    </w:p>
+    <w:p>
+      <w:pPr>
+        <w:spacing w:after="0"/>
+        <w:rPr>
+          <w:rFonts w:ascii="Times New Roman" w:hAnsi="Times New Roman" w:cs="Times New Roman"/>
+        </w:rPr>
+      </w:pPr>
+      <w:r>
+        <w:rPr>
+          <w:rFonts w:ascii="Times New Roman" w:hAnsi="Times New Roman" w:cs="Times New Roman"/>
+          <w:b/>
+          <w:bCs/>
+          <w:i/>
+          <w:iCs/>
+        </w:rPr>
+        <w:t xml:space="preserve">Snippet = </w:t>
+      </w:r>
+      <w:r>
+        <w:rPr>
+          <w:rFonts w:ascii="Times New Roman" w:hAnsi="Times New Roman" w:cs="Times New Roman"/>
+          <w:b/>
+          <w:bCs/>
+          <w:i/>
+          <w:iCs/>
+        </w:rPr>
+        <w:t>st.</w:t>
+      </w:r>
+      <w:r>
+        <w:rPr>
+          <w:rFonts w:ascii="Times New Roman" w:hAnsi="Times New Roman" w:cs="Times New Roman"/>
+          <w:b/>
+          <w:bCs/>
+          <w:i/>
+          <w:iCs/>
+        </w:rPr>
+        <w:t>load_snippet(file_path)</w:t>
+      </w:r>
+      <w:r>
+        <w:rPr>
+          <w:rFonts w:ascii="Times New Roman" w:hAnsi="Times New Roman" w:cs="Times New Roman"/>
+        </w:rPr>
+        <w:t xml:space="preserve"> will load the audio snippet file as a snippet already, and will catch from the name the length and other attributes, so you can resume your work on a snippet without loading the file and cutting it again.</w:t>
+      </w:r>
+    </w:p>
+    <w:p>
+      <w:pPr>
+        <w:rPr>
+          <w:rFonts w:ascii="Times New Roman" w:hAnsi="Times New Roman" w:cs="Times New Roman"/>
+          <w:b/>
+          <w:bCs/>
+        </w:rPr>
+      </w:pPr>
+    </w:p>
+    <w:p>
+      <w:pPr>
+        <w:pStyle w:val="Ttulo1"/>
+      </w:pPr>
+      <w:r>
+        <w:t>Batch processing files</w:t>
+      </w:r>
+    </w:p>
+    <w:p>
+      <w:pPr>
+        <w:rPr>
+          <w:rFonts w:ascii="Times New Roman" w:hAnsi="Times New Roman" w:cs="Times New Roman"/>
+        </w:rPr>
+      </w:pPr>
+      <w:r>
+        <w:rPr>
+          <w:rFonts w:ascii="Times New Roman" w:hAnsi="Times New Roman" w:cs="Times New Roman"/>
+        </w:rPr>
+        <w:t xml:space="preserve">When you work on big data files, it would be too time consuming to do all of the above manually. So I have given you some functions that will, using the above methodology, process long files and create the adequate folder structures so everything keeps paired. Bear in mind these functions create big amounts of files and quickly go into the GB size folders, you may want to keep it civilized and not have enormous amounts of these on your hard drive. In the pipeline script you will find an easy to reuse code for doing these, although some of the logic of </w:t>
+      </w:r>
+      <w:r>
+        <w:rPr>
+          <w:rFonts w:ascii="Times New Roman" w:hAnsi="Times New Roman" w:cs="Times New Roman"/>
+        </w:rPr>
+        <w:lastRenderedPageBreak/>
+        <w:t>that code will over time become part of the package, for now that is your best way to do all of this. But generally speaking, you have two functions.</w:t>
+      </w:r>
+    </w:p>
+    <w:p>
+      <w:pPr>
+        <w:rPr>
+          <w:rFonts w:ascii="Times New Roman" w:hAnsi="Times New Roman" w:cs="Times New Roman"/>
+        </w:rPr>
+      </w:pPr>
+      <w:r>
+        <w:rPr>
+          <w:rFonts w:ascii="Times New Roman" w:hAnsi="Times New Roman" w:cs="Times New Roman"/>
+          <w:b/>
+          <w:bCs/>
+          <w:i/>
+          <w:iCs/>
+        </w:rPr>
+        <w:t>process_audio_file(audio_path, snippet_duration=2, with_labels=False</w:t>
+      </w:r>
+      <w:r>
+        <w:rPr>
+          <w:rFonts w:ascii="Times New Roman" w:hAnsi="Times New Roman" w:cs="Times New Roman"/>
+          <w:b/>
+          <w:bCs/>
+          <w:i/>
+          <w:iCs/>
+        </w:rPr>
+        <w:t xml:space="preserve">, </w:t>
+      </w:r>
+      <w:r>
+        <w:rPr>
+          <w:rFonts w:ascii="Times New Roman" w:hAnsi="Times New Roman" w:cs="Times New Roman"/>
+          <w:b/>
+          <w:bCs/>
+          <w:i/>
+          <w:iCs/>
+        </w:rPr>
+        <w:t>spec_type="mel",n_fft = 256, hop_length = 224, window = "boxcar", color = "inferno", output_folder=None, update_freq=10):</w:t>
+      </w:r>
+      <w:r>
+        <w:rPr>
+          <w:rFonts w:ascii="Times New Roman" w:hAnsi="Times New Roman" w:cs="Times New Roman"/>
+          <w:b/>
+          <w:bCs/>
+          <w:i/>
+          <w:iCs/>
+        </w:rPr>
         <w:t xml:space="preserve"> </w:t>
       </w:r>
       <w:r>
         <w:rPr>
           <w:rFonts w:ascii="Times New Roman" w:hAnsi="Times New Roman" w:cs="Times New Roman"/>
-          <w:b/>
-          <w:bCs/>
-          <w:i/>
-          <w:iCs/>
-        </w:rPr>
-        <w:t>, enable_coupled=True, coupled_min_duration=0.2, coupled_gap=0.6</w:t>
-      </w:r>
-      <w:r>
-        <w:rPr>
-          <w:rFonts w:ascii="Times New Roman" w:hAnsi="Times New Roman" w:cs="Times New Roman"/>
-          <w:b/>
-          <w:bCs/>
-          <w:i/>
-          <w:iCs/>
-        </w:rPr>
-        <w:t>):</w:t>
-      </w:r>
-      <w:r>
-        <w:rPr>
-          <w:rFonts w:ascii="Times New Roman" w:hAnsi="Times New Roman" w:cs="Times New Roman"/>
-        </w:rPr>
-        <w:t xml:space="preserve"> This function evaluates whether a sound is or not a good candidate for a stridulation based on the features above. I figured out the relevant information to define a stridulation is: Number of pulses, at least 6, regularity, at least 10, duration 0.5-1 second, sustain 50%, pulse distance at least 20 ms, and energy concentrated between 5</w:t>
-      </w:r>
-      <w:r>
-        <w:rPr>
-          <w:rFonts w:ascii="Times New Roman" w:hAnsi="Times New Roman" w:cs="Times New Roman"/>
-        </w:rPr>
-        <w:t>.5 and 15 kHzs</w:t>
-      </w:r>
-      <w:r>
-        <w:rPr>
-          <w:rFonts w:ascii="Times New Roman" w:hAnsi="Times New Roman" w:cs="Times New Roman"/>
-        </w:rPr>
-        <w:t>. In addition, I allow for elements with less pulses to be coupled to form a larger event, where similar bur shorter (min_pulses -2, and down to 0.2 seconds) events are considered and if they are close to each other (less than cupled_gap) then they are also added to the list of candidates</w:t>
-      </w:r>
-      <w:r>
-        <w:rPr>
-          <w:rFonts w:ascii="Times New Roman" w:hAnsi="Times New Roman" w:cs="Times New Roman"/>
-        </w:rPr>
-        <w:t>. Now, of course that is for a stridulation, and it is a loose definition on top, but it works well in the lab</w:t>
-      </w:r>
-      <w:r>
-        <w:rPr>
-          <w:rFonts w:ascii="Times New Roman" w:hAnsi="Times New Roman" w:cs="Times New Roman"/>
-        </w:rPr>
-        <w:t xml:space="preserve"> sound files</w:t>
-      </w:r>
-      <w:r>
-        <w:rPr>
-          <w:rFonts w:ascii="Times New Roman" w:hAnsi="Times New Roman" w:cs="Times New Roman"/>
-        </w:rPr>
-        <w:t>. But then the only thing that the finder does is search all events in a file, calculate the features, and decide if they meet the criteria. Which allows to shortlist the number of candidates to a small fraction of the possible ones.</w:t>
-      </w:r>
-      <w:r>
-        <w:rPr>
-          <w:rFonts w:ascii="Times New Roman" w:hAnsi="Times New Roman" w:cs="Times New Roman"/>
-        </w:rPr>
-        <w:t xml:space="preserve"> In my trials it has a 100% accuracy compared to the previous annotations (finds all known stridulations) and less than 50% false positivity. Which is kinda ok in my opinion.</w:t>
-      </w:r>
-    </w:p>
-    <w:p>
-      <w:pPr>
-        <w:rPr>
-          <w:rFonts w:ascii="Times New Roman" w:hAnsi="Times New Roman" w:cs="Times New Roman"/>
-        </w:rPr>
-      </w:pPr>
-      <w:r>
-        <w:rPr>
-          <w:rFonts w:ascii="Times New Roman" w:hAnsi="Times New Roman" w:cs="Times New Roman"/>
-        </w:rPr>
-        <w:t>This needs very fine tuning, but it can give amazing results.</w:t>
-      </w:r>
-      <w:r>
-        <w:rPr>
-          <w:rFonts w:ascii="Times New Roman" w:hAnsi="Times New Roman" w:cs="Times New Roman"/>
-        </w:rPr>
-        <w:t xml:space="preserve"> If you find the key features of your target between the multiple options, you can copy or tweak this function to work for about anything, but you may also contact me and I can develop new variations to resolve different sounds.</w:t>
-      </w:r>
-    </w:p>
-    <w:p>
-      <w:pPr>
-        <w:pStyle w:val="Ttulo2"/>
-      </w:pPr>
-      <w:r>
+        </w:rPr>
+        <w:t>here you type the path to your audio file, and the kwargs if you need them. As you see, snippet_duration defaults to 2 seconds, and output_folder to none, which should create a folder with the name of the sound file and store things there. That folder will be filled in with 2 subfolders, one with the snippets, and one with the spectrograms.</w:t>
+      </w:r>
+      <w:r>
+        <w:rPr>
+          <w:rFonts w:ascii="Times New Roman" w:hAnsi="Times New Roman" w:cs="Times New Roman"/>
+        </w:rPr>
+        <w:t xml:space="preserve"> I have just now added ad labels toggle, make it true for visualization, but keep it off for AI training purposes. You can also change the spectrogram type between the three options available (fft, mel, or Hilbert, but be aware Hilbert can be very slow). And since I was at it, I added a color option. It will draw colormaps from matplotlib, so you can use </w:t>
+      </w:r>
+      <w:r>
+        <w:rPr>
+          <w:rFonts w:ascii="Times New Roman" w:hAnsi="Times New Roman" w:cs="Times New Roman"/>
+          <w:b/>
+          <w:bCs/>
+        </w:rPr>
+        <w:t>plt.colormaps()</w:t>
+      </w:r>
+      <w:r>
+        <w:rPr>
+          <w:rFonts w:ascii="Times New Roman" w:hAnsi="Times New Roman" w:cs="Times New Roman"/>
+          <w:b/>
+          <w:bCs/>
+        </w:rPr>
+        <w:t xml:space="preserve"> </w:t>
+      </w:r>
+      <w:r>
+        <w:rPr>
+          <w:rFonts w:ascii="Times New Roman" w:hAnsi="Times New Roman" w:cs="Times New Roman"/>
+        </w:rPr>
+        <w:t>to</w:t>
+      </w:r>
+      <w:r>
+        <w:rPr>
+          <w:rFonts w:ascii="Times New Roman" w:hAnsi="Times New Roman" w:cs="Times New Roman"/>
+        </w:rPr>
+        <w:t xml:space="preserve"> see your options.</w:t>
+      </w:r>
+      <w:r>
+        <w:rPr>
+          <w:rFonts w:ascii="Times New Roman" w:hAnsi="Times New Roman" w:cs="Times New Roman"/>
+        </w:rPr>
+        <w:t xml:space="preserve"> I have also included the custom parameters for the fft (n_fft, hop_length and window). Please, refer to the spectrogram function in the class audio snippet where the FFT is handled for more details on how to use these.</w:t>
+      </w:r>
+    </w:p>
+    <w:p>
+      <w:pPr>
+        <w:rPr>
+          <w:rFonts w:ascii="Times New Roman" w:hAnsi="Times New Roman" w:cs="Times New Roman"/>
+        </w:rPr>
+      </w:pPr>
+      <w:r>
+        <w:rPr>
+          <w:rFonts w:ascii="Times New Roman" w:hAnsi="Times New Roman" w:cs="Times New Roman"/>
+          <w:b/>
+          <w:bCs/>
+          <w:i/>
+          <w:iCs/>
+        </w:rPr>
+        <w:t>st.annotate_data(notes, snip</w:t>
+      </w:r>
+      <w:r>
+        <w:rPr>
+          <w:rFonts w:ascii="Times New Roman" w:hAnsi="Times New Roman" w:cs="Times New Roman"/>
+          <w:b/>
+          <w:bCs/>
+          <w:i/>
+          <w:iCs/>
+        </w:rPr>
+        <w:t>_path</w:t>
+      </w:r>
+      <w:r>
+        <w:rPr>
+          <w:rFonts w:ascii="Times New Roman" w:hAnsi="Times New Roman" w:cs="Times New Roman"/>
+          <w:b/>
+          <w:bCs/>
+          <w:i/>
+          <w:iCs/>
+        </w:rPr>
+        <w:t>, spec</w:t>
+      </w:r>
+      <w:r>
+        <w:rPr>
+          <w:rFonts w:ascii="Times New Roman" w:hAnsi="Times New Roman" w:cs="Times New Roman"/>
+          <w:b/>
+          <w:bCs/>
+          <w:i/>
+          <w:iCs/>
+        </w:rPr>
+        <w:t>_path</w:t>
+      </w:r>
+      <w:r>
+        <w:rPr>
+          <w:rFonts w:ascii="Times New Roman" w:hAnsi="Times New Roman" w:cs="Times New Roman"/>
+          <w:b/>
+          <w:bCs/>
+          <w:i/>
+          <w:iCs/>
+        </w:rPr>
+        <w:t>, snippet_duration=2.0, csv_delim='\t')</w:t>
+      </w:r>
+      <w:r>
+        <w:rPr>
+          <w:rFonts w:ascii="Times New Roman" w:hAnsi="Times New Roman" w:cs="Times New Roman"/>
+          <w:b/>
+          <w:bCs/>
+          <w:i/>
+          <w:iCs/>
+        </w:rPr>
+        <w:t xml:space="preserve"> </w:t>
+      </w:r>
+      <w:r>
+        <w:rPr>
+          <w:rFonts w:ascii="Times New Roman" w:hAnsi="Times New Roman" w:cs="Times New Roman"/>
+        </w:rPr>
+        <w:t>once</w:t>
+      </w:r>
+      <w:r>
+        <w:rPr>
+          <w:rFonts w:ascii="Times New Roman" w:hAnsi="Times New Roman" w:cs="Times New Roman"/>
+        </w:rPr>
+        <w:t xml:space="preserve"> you have processed a file, in the case you are working on training data, you can use your annotations to automatically distribute your files for training. These part of the logic is incomplete for the moment and will change soon, for now it is best for you to run it from the pipeline script. You will use the notes, which is a .txt file saved as tab delimited, path to the snippets and spectrograms that belong with that set of notes, and the snippet duration that you used (defaulted to 2, so use as kwarg). The last kwarg is not necessary if you saved your txt as tab delimited, but can be used in case you used comma. This function makes a split into positives an negatives, from there you could use data augmentation, or go into training.</w:t>
+      </w:r>
+      <w:r>
+        <w:rPr>
+          <w:rFonts w:ascii="Times New Roman" w:hAnsi="Times New Roman" w:cs="Times New Roman"/>
+        </w:rPr>
+        <w:t xml:space="preserve"> It will split all the files on each of the separate files directories and (using the pipeline logic) create merged folders for training.</w:t>
+      </w:r>
+      <w:r>
+        <w:rPr>
+          <w:rFonts w:ascii="Times New Roman" w:hAnsi="Times New Roman" w:cs="Times New Roman"/>
+        </w:rPr>
+        <w:t xml:space="preserve"> </w:t>
+      </w:r>
+      <w:r>
+        <w:rPr>
+          <w:rFonts w:ascii="Times New Roman" w:hAnsi="Times New Roman" w:cs="Times New Roman"/>
+          <w:b/>
+          <w:bCs/>
+        </w:rPr>
+        <w:t>WARNING!</w:t>
+      </w:r>
+      <w:r>
+        <w:rPr>
+          <w:rFonts w:ascii="Times New Roman" w:hAnsi="Times New Roman" w:cs="Times New Roman"/>
+        </w:rPr>
+        <w:t xml:space="preserve"> This function assumes all that is not positive is negative. That is, for simplicity of the annotation, you only have to annotate positives. Be careful to add and filter out (if needed) dubious things so you don’t have positives on the negative training set.</w:t>
+      </w:r>
+    </w:p>
+    <w:p>
+      <w:pPr>
+        <w:rPr>
+          <w:rFonts w:ascii="Times New Roman" w:hAnsi="Times New Roman" w:cs="Times New Roman"/>
+          <w:bCs/>
+          <w:iCs/>
+        </w:rPr>
+      </w:pPr>
+      <w:r>
+        <w:rPr>
+          <w:rFonts w:ascii="Times New Roman" w:hAnsi="Times New Roman" w:cs="Times New Roman"/>
+          <w:b/>
+          <w:bCs/>
+          <w:i/>
+          <w:iCs/>
+        </w:rPr>
+        <w:t>st.n</w:t>
+      </w:r>
+      <w:r>
+        <w:rPr>
+          <w:rFonts w:ascii="Times New Roman" w:hAnsi="Times New Roman" w:cs="Times New Roman"/>
+          <w:b/>
+          <w:bCs/>
+          <w:i/>
+          <w:iCs/>
+        </w:rPr>
+        <w:t>ormalize_global(input_dir, output_dir, target_max = 0.75):</w:t>
+      </w:r>
+      <w:r>
+        <w:rPr>
+          <w:rFonts w:ascii="Times New Roman" w:hAnsi="Times New Roman" w:cs="Times New Roman"/>
+          <w:bCs/>
+          <w:iCs/>
+        </w:rPr>
+        <w:t xml:space="preserve"> this allows for normalization of several files to one single peak. So, if you wanted to normalize a whole set of files to their overall maximum, you put them in a folder and run this. It should create a new folder with all files normalized. It might be useful to normalize by microphone or whole experiments. We will see what Sara thinks later.</w:t>
+      </w:r>
+    </w:p>
+    <w:p>
+      <w:pPr>
+        <w:rPr>
+          <w:rFonts w:ascii="Times New Roman" w:hAnsi="Times New Roman" w:cs="Times New Roman"/>
+        </w:rPr>
+      </w:pPr>
+      <w:r>
+        <w:rPr>
+          <w:rFonts w:ascii="Times New Roman" w:hAnsi="Times New Roman" w:cs="Times New Roman"/>
+          <w:b/>
+          <w:bCs/>
+          <w:i/>
+          <w:iCs/>
+        </w:rPr>
+        <w:t>st.</w:t>
+      </w:r>
+      <w:r>
+        <w:t xml:space="preserve"> </w:t>
+      </w:r>
+      <w:r>
+        <w:rPr>
+          <w:rFonts w:ascii="Times New Roman" w:hAnsi="Times New Roman" w:cs="Times New Roman"/>
+          <w:b/>
+          <w:bCs/>
+          <w:i/>
+          <w:iCs/>
+        </w:rPr>
+        <w:t>highpass_filter(audio, sr, cutoff=3000, order=8):</w:t>
+      </w:r>
+      <w:r>
+        <w:rPr>
+          <w:rFonts w:ascii="Times New Roman" w:hAnsi="Times New Roman" w:cs="Times New Roman"/>
+        </w:rPr>
+        <w:t xml:space="preserve"> on Jeremy’s request, I added a function to apply a high pass filter to audio files. The default is Mario’s anti-rain filter. H</w:t>
+      </w:r>
+      <w:r>
+        <w:rPr>
+          <w:rFonts w:ascii="Times New Roman" w:hAnsi="Times New Roman" w:cs="Times New Roman"/>
+        </w:rPr>
+        <w:t xml:space="preserve">ere you can use the kwargs cutoff to set the </w:t>
+      </w:r>
+      <w:r>
+        <w:rPr>
+          <w:rFonts w:ascii="Times New Roman" w:hAnsi="Times New Roman" w:cs="Times New Roman"/>
+        </w:rPr>
+        <w:t>level below which you want to apply the filter (will remove freqs below this threshold)</w:t>
+      </w:r>
+      <w:r>
+        <w:rPr>
+          <w:rFonts w:ascii="Times New Roman" w:hAnsi="Times New Roman" w:cs="Times New Roman"/>
+        </w:rPr>
+        <w:t xml:space="preserve"> and order for the roll-off</w:t>
+      </w:r>
+      <w:r>
+        <w:rPr>
+          <w:rFonts w:ascii="Times New Roman" w:hAnsi="Times New Roman" w:cs="Times New Roman"/>
+        </w:rPr>
+        <w:t xml:space="preserve"> (which is how hard you want the filter to be, higher order, harder removal)</w:t>
+      </w:r>
+      <w:r>
+        <w:rPr>
+          <w:rFonts w:ascii="Times New Roman" w:hAnsi="Times New Roman" w:cs="Times New Roman"/>
+        </w:rPr>
+        <w:t xml:space="preserve">. </w:t>
+      </w:r>
+      <w:r>
+        <w:rPr>
+          <w:rFonts w:ascii="Times New Roman" w:hAnsi="Times New Roman" w:cs="Times New Roman"/>
+        </w:rPr>
+        <w:t>The</w:t>
+      </w:r>
+      <w:r>
+        <w:rPr>
+          <w:rFonts w:ascii="Times New Roman" w:hAnsi="Times New Roman" w:cs="Times New Roman"/>
+        </w:rPr>
+        <w:t xml:space="preserve"> order of the filter adds 6dB per octave, so 8 is 48dB per octave. you can safely omit those kwargs in your code if you don't want to change them.</w:t>
+      </w:r>
+      <w:r>
+        <w:rPr>
+          <w:rFonts w:ascii="Times New Roman" w:hAnsi="Times New Roman" w:cs="Times New Roman"/>
+        </w:rPr>
+        <w:t xml:space="preserve"> </w:t>
+      </w:r>
+      <w:r>
+        <w:rPr>
+          <w:rFonts w:ascii="Times New Roman" w:hAnsi="Times New Roman" w:cs="Times New Roman"/>
+          <w:b/>
+          <w:bCs/>
+        </w:rPr>
+        <w:t>IMPORTANT:</w:t>
+      </w:r>
+      <w:r>
+        <w:rPr>
+          <w:rFonts w:ascii="Times New Roman" w:hAnsi="Times New Roman" w:cs="Times New Roman"/>
+        </w:rPr>
+        <w:t xml:space="preserve"> this filter is meant to be used outside the snippets logic, it is applied to the audio loaded with the normal load function. After that, you can start creating snippets from there or save the new audio, be careful to not overwrite files.</w:t>
+      </w:r>
+    </w:p>
+    <w:p>
+      <w:pPr>
+        <w:rPr>
+          <w:rFonts w:ascii="Times New Roman" w:hAnsi="Times New Roman" w:cs="Times New Roman"/>
+        </w:rPr>
+      </w:pPr>
+      <w:r>
+        <w:rPr>
+          <w:rFonts w:ascii="Times New Roman" w:hAnsi="Times New Roman" w:cs="Times New Roman"/>
+          <w:b/>
+          <w:bCs/>
+          <w:i/>
+          <w:iCs/>
+        </w:rPr>
+        <w:t>st.</w:t>
+      </w:r>
+      <w:r>
+        <w:t xml:space="preserve"> </w:t>
+      </w:r>
+      <w:r>
+        <w:rPr>
+          <w:rFonts w:ascii="Times New Roman" w:hAnsi="Times New Roman" w:cs="Times New Roman"/>
+          <w:b/>
+          <w:bCs/>
+          <w:i/>
+          <w:iCs/>
+        </w:rPr>
+        <w:t>low</w:t>
+      </w:r>
+      <w:r>
+        <w:rPr>
+          <w:rFonts w:ascii="Times New Roman" w:hAnsi="Times New Roman" w:cs="Times New Roman"/>
+          <w:b/>
+          <w:bCs/>
+          <w:i/>
+          <w:iCs/>
+        </w:rPr>
+        <w:t>pass_filter(audio, sr, cutoff=</w:t>
+      </w:r>
+      <w:r>
+        <w:rPr>
+          <w:rFonts w:ascii="Times New Roman" w:hAnsi="Times New Roman" w:cs="Times New Roman"/>
+          <w:b/>
+          <w:bCs/>
+          <w:i/>
+          <w:iCs/>
+        </w:rPr>
+        <w:t>20</w:t>
+      </w:r>
+      <w:r>
+        <w:rPr>
+          <w:rFonts w:ascii="Times New Roman" w:hAnsi="Times New Roman" w:cs="Times New Roman"/>
+          <w:b/>
+          <w:bCs/>
+          <w:i/>
+          <w:iCs/>
+        </w:rPr>
+        <w:t>000, order=8):</w:t>
+      </w:r>
+      <w:r>
+        <w:rPr>
+          <w:rFonts w:ascii="Times New Roman" w:hAnsi="Times New Roman" w:cs="Times New Roman"/>
+          <w:b/>
+          <w:bCs/>
+          <w:i/>
+          <w:iCs/>
+        </w:rPr>
+        <w:t xml:space="preserve"> </w:t>
+      </w:r>
+      <w:r>
+        <w:rPr>
+          <w:rFonts w:ascii="Times New Roman" w:hAnsi="Times New Roman" w:cs="Times New Roman"/>
+        </w:rPr>
+        <w:t>similar to the highpass, I have now added a new lowpass filter. The working system is the same so I won’t repeat it here. Just so you know there is a way to cut upper frequencies when needed.</w:t>
+      </w:r>
+    </w:p>
+    <w:p>
+      <w:pPr>
+        <w:rPr>
+          <w:rFonts w:ascii="Times New Roman" w:hAnsi="Times New Roman" w:cs="Times New Roman"/>
+        </w:rPr>
+      </w:pPr>
+      <w:r>
+        <w:rPr>
+          <w:rFonts w:ascii="Times New Roman" w:hAnsi="Times New Roman" w:cs="Times New Roman"/>
+          <w:b/>
+          <w:bCs/>
+          <w:i/>
+          <w:iCs/>
+        </w:rPr>
+        <w:t>st.</w:t>
+      </w:r>
+      <w:r>
+        <w:rPr>
+          <w:rFonts w:ascii="Times New Roman" w:hAnsi="Times New Roman" w:cs="Times New Roman"/>
+          <w:b/>
+          <w:bCs/>
+          <w:i/>
+          <w:iCs/>
+        </w:rPr>
+        <w:t>save_audio(audio, sr, path, overwrite=False):</w:t>
+      </w:r>
+      <w:r>
+        <w:rPr>
+          <w:rFonts w:ascii="Times New Roman" w:hAnsi="Times New Roman" w:cs="Times New Roman"/>
+        </w:rPr>
+        <w:t xml:space="preserve"> that means I have also added a saving function for audios as it is. This function has an overwrite kwarg, so it should never overwrite data unless </w:t>
+      </w:r>
+      <w:r>
+        <w:rPr>
+          <w:rFonts w:ascii="Times New Roman" w:hAnsi="Times New Roman" w:cs="Times New Roman"/>
+        </w:rPr>
         <w:lastRenderedPageBreak/>
-        <w:t>Spectrograms</w:t>
-      </w:r>
-    </w:p>
-    <w:p>
-      <w:pPr>
-        <w:spacing w:after="0"/>
-        <w:rPr>
-          <w:rFonts w:ascii="Times New Roman" w:hAnsi="Times New Roman" w:cs="Times New Roman"/>
-        </w:rPr>
-      </w:pPr>
-      <w:r>
-        <w:rPr>
-          <w:rFonts w:ascii="Times New Roman" w:hAnsi="Times New Roman" w:cs="Times New Roman"/>
-        </w:rPr>
-        <w:t xml:space="preserve">Spectrograms </w:t>
-      </w:r>
-      <w:r>
-        <w:rPr>
-          <w:rFonts w:ascii="Times New Roman" w:hAnsi="Times New Roman" w:cs="Times New Roman"/>
-        </w:rPr>
-        <w:t>are a bit easier than snippets in the sense that they have less functions, but their usage is the same.</w:t>
-      </w:r>
-    </w:p>
-    <w:p>
-      <w:pPr>
-        <w:spacing w:after="0"/>
-        <w:rPr>
-          <w:rFonts w:ascii="Times New Roman" w:hAnsi="Times New Roman" w:cs="Times New Roman"/>
-        </w:rPr>
-      </w:pPr>
-      <w:r>
-        <w:rPr>
-          <w:rFonts w:ascii="Times New Roman" w:hAnsi="Times New Roman" w:cs="Times New Roman"/>
-        </w:rPr>
-        <w:t xml:space="preserve">1.- you can visualize it with </w:t>
-      </w:r>
-      <w:r>
-        <w:rPr>
-          <w:rFonts w:ascii="Times New Roman" w:hAnsi="Times New Roman" w:cs="Times New Roman"/>
-          <w:b/>
-          <w:bCs/>
-          <w:i/>
-          <w:iCs/>
-        </w:rPr>
-        <w:t>spectrogram_1.plot(</w:t>
-      </w:r>
-      <w:r>
-        <w:rPr>
-          <w:rFonts w:ascii="Times New Roman" w:hAnsi="Times New Roman" w:cs="Times New Roman"/>
-          <w:b/>
-          <w:bCs/>
-          <w:i/>
-          <w:iCs/>
-        </w:rPr>
-        <w:t>color = “inferno”</w:t>
-      </w:r>
-      <w:r>
-        <w:rPr>
-          <w:rFonts w:ascii="Times New Roman" w:hAnsi="Times New Roman" w:cs="Times New Roman"/>
-          <w:b/>
-          <w:bCs/>
-          <w:i/>
-          <w:iCs/>
+        <w:t>specifically told by you, but be extremely cautious when using. Again, it works on audio and sr taken from the load_audio function (or modified versions like normalized or filtered)</w:t>
+      </w:r>
+      <w:r>
+        <w:rPr>
+          <w:rFonts w:ascii="Times New Roman" w:hAnsi="Times New Roman" w:cs="Times New Roman"/>
+        </w:rPr>
+        <w:t>.</w:t>
+      </w:r>
+    </w:p>
+    <w:p>
+      <w:pPr>
+        <w:rPr>
+          <w:rFonts w:ascii="Times New Roman" w:hAnsi="Times New Roman" w:cs="Times New Roman"/>
+        </w:rPr>
+      </w:pPr>
+      <w:r>
+        <w:rPr>
+          <w:rFonts w:ascii="Times New Roman" w:hAnsi="Times New Roman" w:cs="Times New Roman"/>
+        </w:rPr>
+        <w:t>NEW AND SHINY, PART 2.</w:t>
+      </w:r>
+    </w:p>
+    <w:p>
+      <w:pPr>
+        <w:rPr>
+          <w:rFonts w:ascii="Times New Roman" w:hAnsi="Times New Roman" w:cs="Times New Roman"/>
+        </w:rPr>
+      </w:pPr>
+      <w:r>
+        <w:rPr>
+          <w:rFonts w:ascii="Times New Roman" w:hAnsi="Times New Roman" w:cs="Times New Roman"/>
+        </w:rPr>
+        <w:t>In the snippet section I explained a bit how I am searching for stridulations as in figuring out events of high relative energy and classifying them by their acoustic features. I promised a wrapper and here it is. This function will read through a file and find you potential stridulations. It needs a lot of fine tuning that you may want to redo eventually, but this basic start is already highly promising with the default settings. Let’s look at it.</w:t>
+      </w:r>
+    </w:p>
+    <w:p>
+      <w:pPr>
+        <w:rPr>
+          <w:rFonts w:ascii="Times New Roman" w:hAnsi="Times New Roman" w:cs="Times New Roman"/>
+        </w:rPr>
+      </w:pPr>
+    </w:p>
+    <w:p>
+      <w:pPr>
+        <w:rPr>
+          <w:rFonts w:ascii="Times New Roman" w:hAnsi="Times New Roman" w:cs="Times New Roman"/>
+        </w:rPr>
+      </w:pPr>
+      <w:r>
+        <w:rPr>
+          <w:rFonts w:ascii="Times New Roman" w:hAnsi="Times New Roman" w:cs="Times New Roman"/>
+          <w:b/>
+          <w:bCs/>
+          <w:i/>
+          <w:iCs/>
+        </w:rPr>
+        <w:t>times</w:t>
+      </w:r>
+      <w:r>
+        <w:rPr>
+          <w:rFonts w:ascii="Times New Roman" w:hAnsi="Times New Roman" w:cs="Times New Roman"/>
+          <w:b/>
+          <w:bCs/>
+          <w:i/>
+          <w:iCs/>
+        </w:rPr>
+        <w:t>,</w:t>
+      </w:r>
+      <w:r>
+        <w:rPr>
+          <w:rFonts w:ascii="Times New Roman" w:hAnsi="Times New Roman" w:cs="Times New Roman"/>
+          <w:b/>
+          <w:bCs/>
+          <w:i/>
+          <w:iCs/>
+        </w:rPr>
+        <w:t xml:space="preserve"> </w:t>
+      </w:r>
+      <w:r>
+        <w:rPr>
+          <w:rFonts w:ascii="Times New Roman" w:hAnsi="Times New Roman" w:cs="Times New Roman"/>
+          <w:b/>
+          <w:bCs/>
+          <w:i/>
+          <w:iCs/>
+        </w:rPr>
+        <w:t>info</w:t>
+      </w:r>
+      <w:r>
+        <w:rPr>
+          <w:rFonts w:ascii="Times New Roman" w:hAnsi="Times New Roman" w:cs="Times New Roman"/>
+          <w:b/>
+          <w:bCs/>
+          <w:i/>
+          <w:iCs/>
+        </w:rPr>
+        <w:t>=st.quick_scan(audio_path, snippet_duration</w:t>
+      </w:r>
+      <w:r>
+        <w:rPr>
+          <w:rFonts w:ascii="Times New Roman" w:hAnsi="Times New Roman" w:cs="Times New Roman"/>
+          <w:b/>
+          <w:bCs/>
+          <w:i/>
+          <w:iCs/>
+        </w:rPr>
+        <w:t xml:space="preserve"> </w:t>
+      </w:r>
+      <w:r>
+        <w:rPr>
+          <w:rFonts w:ascii="Times New Roman" w:hAnsi="Times New Roman" w:cs="Times New Roman"/>
+          <w:b/>
+          <w:bCs/>
+          <w:i/>
+          <w:iCs/>
+        </w:rPr>
+        <w:t>=</w:t>
+      </w:r>
+      <w:r>
+        <w:rPr>
+          <w:rFonts w:ascii="Times New Roman" w:hAnsi="Times New Roman" w:cs="Times New Roman"/>
+          <w:b/>
+          <w:bCs/>
+          <w:i/>
+          <w:iCs/>
+        </w:rPr>
+        <w:t xml:space="preserve"> </w:t>
+      </w:r>
+      <w:r>
+        <w:rPr>
+          <w:rFonts w:ascii="Times New Roman" w:hAnsi="Times New Roman" w:cs="Times New Roman"/>
+          <w:b/>
+          <w:bCs/>
+          <w:i/>
+          <w:iCs/>
+        </w:rPr>
+        <w:t>2.0, overlap</w:t>
+      </w:r>
+      <w:r>
+        <w:rPr>
+          <w:rFonts w:ascii="Times New Roman" w:hAnsi="Times New Roman" w:cs="Times New Roman"/>
+          <w:b/>
+          <w:bCs/>
+          <w:i/>
+          <w:iCs/>
+        </w:rPr>
+        <w:t xml:space="preserve"> </w:t>
+      </w:r>
+      <w:r>
+        <w:rPr>
+          <w:rFonts w:ascii="Times New Roman" w:hAnsi="Times New Roman" w:cs="Times New Roman"/>
+          <w:b/>
+          <w:bCs/>
+          <w:i/>
+          <w:iCs/>
+        </w:rPr>
+        <w:t>=</w:t>
+      </w:r>
+      <w:r>
+        <w:rPr>
+          <w:rFonts w:ascii="Times New Roman" w:hAnsi="Times New Roman" w:cs="Times New Roman"/>
+          <w:b/>
+          <w:bCs/>
+          <w:i/>
+          <w:iCs/>
+        </w:rPr>
+        <w:t xml:space="preserve"> </w:t>
+      </w:r>
+      <w:r>
+        <w:rPr>
+          <w:rFonts w:ascii="Times New Roman" w:hAnsi="Times New Roman" w:cs="Times New Roman"/>
+          <w:b/>
+          <w:bCs/>
+          <w:i/>
+          <w:iCs/>
+        </w:rPr>
+        <w:t>0, min_pulses</w:t>
+      </w:r>
+      <w:r>
+        <w:rPr>
+          <w:rFonts w:ascii="Times New Roman" w:hAnsi="Times New Roman" w:cs="Times New Roman"/>
+          <w:b/>
+          <w:bCs/>
+          <w:i/>
+          <w:iCs/>
+        </w:rPr>
+        <w:t xml:space="preserve"> </w:t>
+      </w:r>
+      <w:r>
+        <w:rPr>
+          <w:rFonts w:ascii="Times New Roman" w:hAnsi="Times New Roman" w:cs="Times New Roman"/>
+          <w:b/>
+          <w:bCs/>
+          <w:i/>
+          <w:iCs/>
+        </w:rPr>
+        <w:t>=</w:t>
+      </w:r>
+      <w:r>
+        <w:rPr>
+          <w:rFonts w:ascii="Times New Roman" w:hAnsi="Times New Roman" w:cs="Times New Roman"/>
+          <w:b/>
+          <w:bCs/>
+          <w:i/>
+          <w:iCs/>
+        </w:rPr>
+        <w:t xml:space="preserve"> </w:t>
+      </w:r>
+      <w:r>
+        <w:rPr>
+          <w:rFonts w:ascii="Times New Roman" w:hAnsi="Times New Roman" w:cs="Times New Roman"/>
+          <w:b/>
+          <w:bCs/>
+          <w:i/>
+          <w:iCs/>
+        </w:rPr>
+        <w:t>6, min_regularity</w:t>
+      </w:r>
+      <w:r>
+        <w:rPr>
+          <w:rFonts w:ascii="Times New Roman" w:hAnsi="Times New Roman" w:cs="Times New Roman"/>
+          <w:b/>
+          <w:bCs/>
+          <w:i/>
+          <w:iCs/>
+        </w:rPr>
+        <w:t xml:space="preserve"> </w:t>
+      </w:r>
+      <w:r>
+        <w:rPr>
+          <w:rFonts w:ascii="Times New Roman" w:hAnsi="Times New Roman" w:cs="Times New Roman"/>
+          <w:b/>
+          <w:bCs/>
+          <w:i/>
+          <w:iCs/>
+        </w:rPr>
+        <w:t>=</w:t>
+      </w:r>
+      <w:r>
+        <w:rPr>
+          <w:rFonts w:ascii="Times New Roman" w:hAnsi="Times New Roman" w:cs="Times New Roman"/>
+          <w:b/>
+          <w:bCs/>
+          <w:i/>
+          <w:iCs/>
+        </w:rPr>
+        <w:t xml:space="preserve"> </w:t>
+      </w:r>
+      <w:r>
+        <w:rPr>
+          <w:rFonts w:ascii="Times New Roman" w:hAnsi="Times New Roman" w:cs="Times New Roman"/>
+          <w:b/>
+          <w:bCs/>
+          <w:i/>
+          <w:iCs/>
+        </w:rPr>
+        <w:t>10, min_duration</w:t>
+      </w:r>
+      <w:r>
+        <w:rPr>
+          <w:rFonts w:ascii="Times New Roman" w:hAnsi="Times New Roman" w:cs="Times New Roman"/>
+          <w:b/>
+          <w:bCs/>
+          <w:i/>
+          <w:iCs/>
+        </w:rPr>
+        <w:t xml:space="preserve"> </w:t>
+      </w:r>
+      <w:r>
+        <w:rPr>
+          <w:rFonts w:ascii="Times New Roman" w:hAnsi="Times New Roman" w:cs="Times New Roman"/>
+          <w:b/>
+          <w:bCs/>
+          <w:i/>
+          <w:iCs/>
+        </w:rPr>
+        <w:t>=</w:t>
+      </w:r>
+      <w:r>
+        <w:rPr>
+          <w:rFonts w:ascii="Times New Roman" w:hAnsi="Times New Roman" w:cs="Times New Roman"/>
+          <w:b/>
+          <w:bCs/>
+          <w:i/>
+          <w:iCs/>
+        </w:rPr>
+        <w:t xml:space="preserve"> </w:t>
+      </w:r>
+      <w:r>
+        <w:rPr>
+          <w:rFonts w:ascii="Times New Roman" w:hAnsi="Times New Roman" w:cs="Times New Roman"/>
+          <w:b/>
+          <w:bCs/>
+          <w:i/>
+          <w:iCs/>
+        </w:rPr>
+        <w:t>0.5, max_duration=1, sustain</w:t>
+      </w:r>
+      <w:r>
+        <w:rPr>
+          <w:rFonts w:ascii="Times New Roman" w:hAnsi="Times New Roman" w:cs="Times New Roman"/>
+          <w:b/>
+          <w:bCs/>
+          <w:i/>
+          <w:iCs/>
+        </w:rPr>
+        <w:t xml:space="preserve"> </w:t>
+      </w:r>
+      <w:r>
+        <w:rPr>
+          <w:rFonts w:ascii="Times New Roman" w:hAnsi="Times New Roman" w:cs="Times New Roman"/>
+          <w:b/>
+          <w:bCs/>
+          <w:i/>
+          <w:iCs/>
+        </w:rPr>
+        <w:t>=</w:t>
+      </w:r>
+      <w:r>
+        <w:rPr>
+          <w:rFonts w:ascii="Times New Roman" w:hAnsi="Times New Roman" w:cs="Times New Roman"/>
+          <w:b/>
+          <w:bCs/>
+          <w:i/>
+          <w:iCs/>
+        </w:rPr>
+        <w:t xml:space="preserve"> </w:t>
+      </w:r>
+      <w:r>
+        <w:rPr>
+          <w:rFonts w:ascii="Times New Roman" w:hAnsi="Times New Roman" w:cs="Times New Roman"/>
+          <w:b/>
+          <w:bCs/>
+          <w:i/>
+          <w:iCs/>
+        </w:rPr>
+        <w:t>0.5, pulse_dist</w:t>
+      </w:r>
+      <w:r>
+        <w:rPr>
+          <w:rFonts w:ascii="Times New Roman" w:hAnsi="Times New Roman" w:cs="Times New Roman"/>
+          <w:b/>
+          <w:bCs/>
+          <w:i/>
+          <w:iCs/>
+        </w:rPr>
+        <w:t xml:space="preserve"> </w:t>
+      </w:r>
+      <w:r>
+        <w:rPr>
+          <w:rFonts w:ascii="Times New Roman" w:hAnsi="Times New Roman" w:cs="Times New Roman"/>
+          <w:b/>
+          <w:bCs/>
+          <w:i/>
+          <w:iCs/>
+        </w:rPr>
+        <w:t>=</w:t>
+      </w:r>
+      <w:r>
+        <w:rPr>
+          <w:rFonts w:ascii="Times New Roman" w:hAnsi="Times New Roman" w:cs="Times New Roman"/>
+          <w:b/>
+          <w:bCs/>
+          <w:i/>
+          <w:iCs/>
+        </w:rPr>
+        <w:t xml:space="preserve"> </w:t>
+      </w:r>
+      <w:r>
+        <w:rPr>
+          <w:rFonts w:ascii="Times New Roman" w:hAnsi="Times New Roman" w:cs="Times New Roman"/>
+          <w:b/>
+          <w:bCs/>
+          <w:i/>
+          <w:iCs/>
+        </w:rPr>
+        <w:t>20,  sp_range</w:t>
+      </w:r>
+      <w:r>
+        <w:rPr>
+          <w:rFonts w:ascii="Times New Roman" w:hAnsi="Times New Roman" w:cs="Times New Roman"/>
+          <w:b/>
+          <w:bCs/>
+          <w:i/>
+          <w:iCs/>
+        </w:rPr>
+        <w:t xml:space="preserve"> </w:t>
+      </w:r>
+      <w:r>
+        <w:rPr>
+          <w:rFonts w:ascii="Times New Roman" w:hAnsi="Times New Roman" w:cs="Times New Roman"/>
+          <w:b/>
+          <w:bCs/>
+          <w:i/>
+          <w:iCs/>
+        </w:rPr>
+        <w:t>=</w:t>
+      </w:r>
+      <w:r>
+        <w:rPr>
+          <w:rFonts w:ascii="Times New Roman" w:hAnsi="Times New Roman" w:cs="Times New Roman"/>
+          <w:b/>
+          <w:bCs/>
+          <w:i/>
+          <w:iCs/>
+        </w:rPr>
+        <w:t xml:space="preserve"> </w:t>
+      </w:r>
+      <w:r>
+        <w:rPr>
+          <w:rFonts w:ascii="Times New Roman" w:hAnsi="Times New Roman" w:cs="Times New Roman"/>
+          <w:b/>
+          <w:bCs/>
+          <w:i/>
+          <w:iCs/>
+        </w:rPr>
+        <w:t>(5500, 15000), enable_coupled</w:t>
+      </w:r>
+      <w:r>
+        <w:rPr>
+          <w:rFonts w:ascii="Times New Roman" w:hAnsi="Times New Roman" w:cs="Times New Roman"/>
+          <w:b/>
+          <w:bCs/>
+          <w:i/>
+          <w:iCs/>
+        </w:rPr>
+        <w:t xml:space="preserve"> </w:t>
+      </w:r>
+      <w:r>
+        <w:rPr>
+          <w:rFonts w:ascii="Times New Roman" w:hAnsi="Times New Roman" w:cs="Times New Roman"/>
+          <w:b/>
+          <w:bCs/>
+          <w:i/>
+          <w:iCs/>
+        </w:rPr>
+        <w:t>=</w:t>
+      </w:r>
+      <w:r>
+        <w:rPr>
+          <w:rFonts w:ascii="Times New Roman" w:hAnsi="Times New Roman" w:cs="Times New Roman"/>
+          <w:b/>
+          <w:bCs/>
+          <w:i/>
+          <w:iCs/>
+        </w:rPr>
+        <w:t xml:space="preserve"> </w:t>
+      </w:r>
+      <w:r>
+        <w:rPr>
+          <w:rFonts w:ascii="Times New Roman" w:hAnsi="Times New Roman" w:cs="Times New Roman"/>
+          <w:b/>
+          <w:bCs/>
+          <w:i/>
+          <w:iCs/>
+        </w:rPr>
+        <w:t>True, coupled_min_duration</w:t>
+      </w:r>
+      <w:r>
+        <w:rPr>
+          <w:rFonts w:ascii="Times New Roman" w:hAnsi="Times New Roman" w:cs="Times New Roman"/>
+          <w:b/>
+          <w:bCs/>
+          <w:i/>
+          <w:iCs/>
+        </w:rPr>
+        <w:t xml:space="preserve"> </w:t>
+      </w:r>
+      <w:r>
+        <w:rPr>
+          <w:rFonts w:ascii="Times New Roman" w:hAnsi="Times New Roman" w:cs="Times New Roman"/>
+          <w:b/>
+          <w:bCs/>
+          <w:i/>
+          <w:iCs/>
+        </w:rPr>
+        <w:t>=</w:t>
+      </w:r>
+      <w:r>
+        <w:rPr>
+          <w:rFonts w:ascii="Times New Roman" w:hAnsi="Times New Roman" w:cs="Times New Roman"/>
+          <w:b/>
+          <w:bCs/>
+          <w:i/>
+          <w:iCs/>
+        </w:rPr>
+        <w:t xml:space="preserve"> </w:t>
+      </w:r>
+      <w:r>
+        <w:rPr>
+          <w:rFonts w:ascii="Times New Roman" w:hAnsi="Times New Roman" w:cs="Times New Roman"/>
+          <w:b/>
+          <w:bCs/>
+          <w:i/>
+          <w:iCs/>
+        </w:rPr>
+        <w:t>0.2, coupled_gap</w:t>
+      </w:r>
+      <w:r>
+        <w:rPr>
+          <w:rFonts w:ascii="Times New Roman" w:hAnsi="Times New Roman" w:cs="Times New Roman"/>
+          <w:b/>
+          <w:bCs/>
+          <w:i/>
+          <w:iCs/>
+        </w:rPr>
+        <w:t xml:space="preserve"> </w:t>
+      </w:r>
+      <w:r>
+        <w:rPr>
+          <w:rFonts w:ascii="Times New Roman" w:hAnsi="Times New Roman" w:cs="Times New Roman"/>
+          <w:b/>
+          <w:bCs/>
+          <w:i/>
+          <w:iCs/>
+        </w:rPr>
+        <w:t>=</w:t>
+      </w:r>
+      <w:r>
+        <w:rPr>
+          <w:rFonts w:ascii="Times New Roman" w:hAnsi="Times New Roman" w:cs="Times New Roman"/>
+          <w:b/>
+          <w:bCs/>
+          <w:i/>
+          <w:iCs/>
+        </w:rPr>
+        <w:t xml:space="preserve"> </w:t>
+      </w:r>
+      <w:r>
+        <w:rPr>
+          <w:rFonts w:ascii="Times New Roman" w:hAnsi="Times New Roman" w:cs="Times New Roman"/>
+          <w:b/>
+          <w:bCs/>
+          <w:i/>
+          <w:iCs/>
+        </w:rPr>
+        <w:t>1)</w:t>
+      </w:r>
+      <w:r>
+        <w:rPr>
+          <w:rFonts w:ascii="Times New Roman" w:hAnsi="Times New Roman" w:cs="Times New Roman"/>
+          <w:b/>
+          <w:bCs/>
+          <w:i/>
+          <w:iCs/>
+        </w:rPr>
+        <w:t xml:space="preserve">: </w:t>
+      </w:r>
+      <w:r>
+        <w:rPr>
+          <w:rFonts w:ascii="Times New Roman" w:hAnsi="Times New Roman" w:cs="Times New Roman"/>
+        </w:rPr>
+        <w:t xml:space="preserve">this is a complex function, but most of the arguments are the same as the is_stridulation function explained in the snippet logic a few pages above. The only new things here are, a path to the file you want to analyse and an overlap if you want to have any (I have tried with some </w:t>
+      </w:r>
+      <w:r>
+        <w:rPr>
+          <w:rFonts w:ascii="Times New Roman" w:hAnsi="Times New Roman" w:cs="Times New Roman"/>
+        </w:rPr>
+        <w:t>overlap and it finds more candidates and some are actually good ones</w:t>
+      </w:r>
+      <w:r>
+        <w:rPr>
+          <w:rFonts w:ascii="Times New Roman" w:hAnsi="Times New Roman" w:cs="Times New Roman"/>
         </w:rPr>
         <w:t>)</w:t>
       </w:r>
@@ -2147,340 +3559,21 @@
         <w:rPr>
           <w:rFonts w:ascii="Times New Roman" w:hAnsi="Times New Roman" w:cs="Times New Roman"/>
         </w:rPr>
-        <w:t>. This will only show it on screen for you to inspect.</w:t>
-      </w:r>
-      <w:r>
-        <w:rPr>
-          <w:rFonts w:ascii="Times New Roman" w:hAnsi="Times New Roman" w:cs="Times New Roman"/>
-        </w:rPr>
-        <w:t xml:space="preserve"> I have added a color argument because I got sick of looking at the base one and thought you might too. Use plt.colormaps() to see options</w:t>
-      </w:r>
-    </w:p>
-    <w:p>
-      <w:pPr>
-        <w:spacing w:after="0"/>
-        <w:rPr>
-          <w:rFonts w:ascii="Times New Roman" w:hAnsi="Times New Roman" w:cs="Times New Roman"/>
-        </w:rPr>
-      </w:pPr>
-      <w:r>
-        <w:rPr>
-          <w:rFonts w:ascii="Times New Roman" w:hAnsi="Times New Roman" w:cs="Times New Roman"/>
-        </w:rPr>
-        <w:t xml:space="preserve">2.- you can save it with </w:t>
-      </w:r>
-      <w:r>
-        <w:rPr>
-          <w:rFonts w:ascii="Times New Roman" w:hAnsi="Times New Roman" w:cs="Times New Roman"/>
-          <w:b/>
-          <w:bCs/>
-          <w:i/>
-          <w:iCs/>
-        </w:rPr>
-        <w:t>spectrogram_1.save</w:t>
-      </w:r>
-      <w:r>
-        <w:rPr>
-          <w:rFonts w:ascii="Times New Roman" w:hAnsi="Times New Roman" w:cs="Times New Roman"/>
-          <w:b/>
-          <w:bCs/>
-          <w:i/>
-          <w:iCs/>
-        </w:rPr>
-        <w:t>_img</w:t>
-      </w:r>
-      <w:r>
-        <w:rPr>
-          <w:rFonts w:ascii="Times New Roman" w:hAnsi="Times New Roman" w:cs="Times New Roman"/>
-          <w:b/>
-          <w:bCs/>
-          <w:i/>
-          <w:iCs/>
-        </w:rPr>
-        <w:t>(name, dir, with_labels</w:t>
-      </w:r>
-      <w:r>
-        <w:rPr>
-          <w:rFonts w:ascii="Times New Roman" w:hAnsi="Times New Roman" w:cs="Times New Roman"/>
-          <w:b/>
-          <w:bCs/>
-          <w:i/>
-          <w:iCs/>
-        </w:rPr>
-        <w:t xml:space="preserve"> = False</w:t>
-      </w:r>
-      <w:r>
-        <w:rPr>
-          <w:rFonts w:ascii="Times New Roman" w:hAnsi="Times New Roman" w:cs="Times New Roman"/>
-          <w:b/>
-          <w:bCs/>
-          <w:i/>
-          <w:iCs/>
-        </w:rPr>
-        <w:t>)</w:t>
-      </w:r>
-      <w:r>
-        <w:rPr>
-          <w:rFonts w:ascii="Times New Roman" w:hAnsi="Times New Roman" w:cs="Times New Roman"/>
-        </w:rPr>
-        <w:t>. I suggest you follow the same naming conventions explained for snippets. The spectrogram will automatically receive time stamps and other flags from the snippet they come from. The with_labels kwarg will default to false (you don’t have write it unless you want it True). This means that the spectrogram will be saved without axis colour codes or other things. That is the way you want them to be in your AI models, but for presentations or papers, you can turn it true and it will give you something more human readable.</w:t>
-      </w:r>
-      <w:r>
-        <w:rPr>
-          <w:rFonts w:ascii="Times New Roman" w:hAnsi="Times New Roman" w:cs="Times New Roman"/>
-        </w:rPr>
-        <w:t xml:space="preserve"> As with the plot, now you can choose a colormap. See plot function for details.</w:t>
-      </w:r>
-    </w:p>
-    <w:p>
-      <w:pPr>
-        <w:spacing w:after="0"/>
-        <w:rPr>
-          <w:rFonts w:ascii="Times New Roman" w:hAnsi="Times New Roman" w:cs="Times New Roman"/>
-        </w:rPr>
-      </w:pPr>
-      <w:r>
-        <w:rPr>
-          <w:rFonts w:ascii="Times New Roman" w:hAnsi="Times New Roman" w:cs="Times New Roman"/>
-        </w:rPr>
-        <w:t xml:space="preserve">3.- you can now save a table with the spectrogram data too with </w:t>
-      </w:r>
-      <w:r>
-        <w:rPr>
-          <w:rFonts w:ascii="Times New Roman" w:hAnsi="Times New Roman" w:cs="Times New Roman"/>
-          <w:b/>
-        </w:rPr>
-        <w:t>spectrogram.s</w:t>
-      </w:r>
-      <w:r>
-        <w:rPr>
-          <w:rFonts w:ascii="Times New Roman" w:hAnsi="Times New Roman" w:cs="Times New Roman"/>
-          <w:b/>
-          <w:i/>
-        </w:rPr>
-        <w:t>ave</w:t>
-      </w:r>
-      <w:r>
-        <w:rPr>
-          <w:rFonts w:ascii="Times New Roman" w:hAnsi="Times New Roman" w:cs="Times New Roman"/>
-          <w:b/>
-          <w:i/>
-        </w:rPr>
-        <w:t>_table(source_name, output_dir)</w:t>
-      </w:r>
-      <w:r>
-        <w:rPr>
-          <w:rFonts w:ascii="Times New Roman" w:hAnsi="Times New Roman" w:cs="Times New Roman"/>
-        </w:rPr>
-        <w:t xml:space="preserve"> I suggest using the same naming convention, although this, for the moment at least, can’t be loaded, so it is not so critical.</w:t>
-      </w:r>
-    </w:p>
-    <w:p>
-      <w:pPr>
-        <w:rPr>
-          <w:rFonts w:ascii="Times New Roman" w:hAnsi="Times New Roman" w:cs="Times New Roman"/>
-        </w:rPr>
-      </w:pPr>
-      <w:r>
-        <w:rPr>
-          <w:rFonts w:ascii="Times New Roman" w:hAnsi="Times New Roman" w:cs="Times New Roman"/>
-        </w:rPr>
-        <w:t xml:space="preserve">4.- get average power and peak power densities with </w:t>
-      </w:r>
-      <w:r>
-        <w:rPr>
-          <w:rFonts w:ascii="Times New Roman" w:hAnsi="Times New Roman" w:cs="Times New Roman"/>
-          <w:b/>
-        </w:rPr>
-        <w:t>spectrogram.compute_power_metrics()</w:t>
-      </w:r>
-      <w:r>
-        <w:rPr>
-          <w:rFonts w:ascii="Times New Roman" w:hAnsi="Times New Roman" w:cs="Times New Roman"/>
-          <w:b/>
-        </w:rPr>
-        <w:t xml:space="preserve">. </w:t>
-      </w:r>
-      <w:r>
-        <w:rPr>
-          <w:rFonts w:ascii="Times New Roman" w:hAnsi="Times New Roman" w:cs="Times New Roman"/>
-        </w:rPr>
-        <w:t>This will return APD and PPD and return them on that order. Units currently are dB.</w:t>
-      </w:r>
-    </w:p>
-    <w:p>
-      <w:pPr>
-        <w:rPr>
-          <w:rFonts w:ascii="Times New Roman" w:hAnsi="Times New Roman" w:cs="Times New Roman"/>
-        </w:rPr>
-      </w:pPr>
-      <w:r>
-        <w:rPr>
-          <w:rFonts w:ascii="Times New Roman" w:hAnsi="Times New Roman" w:cs="Times New Roman"/>
-        </w:rPr>
-        <w:t>With these functions, you should be able to cut, your own stridulations, just remember the time frame is important. You must make a decision at the beginning, how long will snippets be for the model? Then stick to that length to preserve proportions. Then, it is technically possible to just do this by hand and create all the data by yourself. But later on I will explain how to automatically batch-process big files. However this part of the tutorial is relevant for you to understand how your pipeline works and what is happening on the backstage. Also, to sometimes manually cut one particular stridulation or make some more augmentations.</w:t>
-      </w:r>
-    </w:p>
-    <w:p>
-      <w:pPr>
-        <w:spacing w:after="0"/>
-        <w:rPr>
-          <w:rFonts w:ascii="Times New Roman" w:hAnsi="Times New Roman" w:cs="Times New Roman"/>
-        </w:rPr>
-      </w:pPr>
-      <w:r>
-        <w:rPr>
-          <w:rFonts w:ascii="Times New Roman" w:hAnsi="Times New Roman" w:cs="Times New Roman"/>
-        </w:rPr>
-        <w:t>Finally, if you are working on already saved snippets, I have added a loading function for them so you don’t have to be cutting the same snippet once and again.</w:t>
-      </w:r>
-    </w:p>
-    <w:p>
-      <w:pPr>
-        <w:spacing w:after="0"/>
-        <w:rPr>
-          <w:rFonts w:ascii="Times New Roman" w:hAnsi="Times New Roman" w:cs="Times New Roman"/>
-        </w:rPr>
-      </w:pPr>
-      <w:r>
-        <w:rPr>
-          <w:rFonts w:ascii="Times New Roman" w:hAnsi="Times New Roman" w:cs="Times New Roman"/>
-          <w:b/>
-          <w:bCs/>
-          <w:i/>
-          <w:iCs/>
-        </w:rPr>
-        <w:t xml:space="preserve">Snippet = </w:t>
-      </w:r>
-      <w:r>
-        <w:rPr>
-          <w:rFonts w:ascii="Times New Roman" w:hAnsi="Times New Roman" w:cs="Times New Roman"/>
-          <w:b/>
-          <w:bCs/>
-          <w:i/>
-          <w:iCs/>
-        </w:rPr>
-        <w:t>st.</w:t>
-      </w:r>
-      <w:r>
-        <w:rPr>
-          <w:rFonts w:ascii="Times New Roman" w:hAnsi="Times New Roman" w:cs="Times New Roman"/>
-          <w:b/>
-          <w:bCs/>
-          <w:i/>
-          <w:iCs/>
-        </w:rPr>
-        <w:t>load_snippet(file_path)</w:t>
-      </w:r>
-      <w:r>
-        <w:rPr>
-          <w:rFonts w:ascii="Times New Roman" w:hAnsi="Times New Roman" w:cs="Times New Roman"/>
-        </w:rPr>
-        <w:t xml:space="preserve"> will load the audio snippet file as a snippet already, and will catch from the name the length and other attributes, so you can resume your work on a snippet without loading the file and cutting it again.</w:t>
-      </w:r>
-    </w:p>
-    <w:p>
-      <w:pPr>
-        <w:rPr>
-          <w:rFonts w:ascii="Times New Roman" w:hAnsi="Times New Roman" w:cs="Times New Roman"/>
-          <w:b/>
-          <w:bCs/>
-        </w:rPr>
-      </w:pPr>
-    </w:p>
-    <w:p>
-      <w:pPr>
-        <w:pStyle w:val="Ttulo1"/>
-      </w:pPr>
-      <w:r>
-        <w:t>Batch processing files</w:t>
-      </w:r>
-    </w:p>
-    <w:p>
-      <w:pPr>
-        <w:rPr>
-          <w:rFonts w:ascii="Times New Roman" w:hAnsi="Times New Roman" w:cs="Times New Roman"/>
-        </w:rPr>
-      </w:pPr>
-      <w:r>
-        <w:rPr>
-          <w:rFonts w:ascii="Times New Roman" w:hAnsi="Times New Roman" w:cs="Times New Roman"/>
-        </w:rPr>
-        <w:t>When you work on big data files, it would be too time consuming to do all of the above manually. So I have given you some functions that will, using the above methodology, process long files and create the adequate folder structures so everything keeps paired. Bear in mind these functions create big amounts of files and quickly go into the GB size folders, you may want to keep it civilized and not have enormous amounts of these on your hard drive. In the pipeline script you will find an easy to reuse code for doing these, although some of the logic of that code will over time become part of the package, for now that is your best way to do all of this. But generally speaking, you have two functions.</w:t>
-      </w:r>
-    </w:p>
-    <w:p>
-      <w:pPr>
-        <w:rPr>
-          <w:rFonts w:ascii="Times New Roman" w:hAnsi="Times New Roman" w:cs="Times New Roman"/>
-        </w:rPr>
-      </w:pPr>
-      <w:r>
-        <w:rPr>
-          <w:rFonts w:ascii="Times New Roman" w:hAnsi="Times New Roman" w:cs="Times New Roman"/>
-          <w:b/>
-          <w:bCs/>
-          <w:i/>
-          <w:iCs/>
-        </w:rPr>
-        <w:t>process_audio_file(audio_path, snippet_duration=2, with_labels=False</w:t>
-      </w:r>
-      <w:r>
-        <w:rPr>
-          <w:rFonts w:ascii="Times New Roman" w:hAnsi="Times New Roman" w:cs="Times New Roman"/>
-          <w:b/>
-          <w:bCs/>
-          <w:i/>
-          <w:iCs/>
-        </w:rPr>
-        <w:t xml:space="preserve">, </w:t>
-      </w:r>
-      <w:r>
-        <w:rPr>
-          <w:rFonts w:ascii="Times New Roman" w:hAnsi="Times New Roman" w:cs="Times New Roman"/>
-          <w:b/>
-          <w:bCs/>
-          <w:i/>
-          <w:iCs/>
-        </w:rPr>
-        <w:t>spec_type="mel",n_fft = 256, hop_length = 224, window = "boxcar", color = "inferno", output_folder=None, update_freq=10):</w:t>
-      </w:r>
-      <w:r>
-        <w:rPr>
-          <w:rFonts w:ascii="Times New Roman" w:hAnsi="Times New Roman" w:cs="Times New Roman"/>
-          <w:b/>
-          <w:bCs/>
-          <w:i/>
-          <w:iCs/>
+        <w:t>. The overlap is in seconds, so make sure is not bigger than the snippet duration.</w:t>
+      </w:r>
+      <w:r>
+        <w:rPr>
+          <w:rFonts w:ascii="Times New Roman" w:hAnsi="Times New Roman" w:cs="Times New Roman"/>
         </w:rPr>
         <w:t xml:space="preserve"> </w:t>
       </w:r>
       <w:r>
         <w:rPr>
           <w:rFonts w:ascii="Times New Roman" w:hAnsi="Times New Roman" w:cs="Times New Roman"/>
-        </w:rPr>
-        <w:t>here you type the path to your audio file, and the kwargs if you need them. As you see, snippet_duration defaults to 2 seconds, and output_folder to none, which should create a folder with the name of the sound file and store things there. That folder will be filled in with 2 subfolders, one with the snippets, and one with the spectrograms.</w:t>
-      </w:r>
-      <w:r>
-        <w:rPr>
-          <w:rFonts w:ascii="Times New Roman" w:hAnsi="Times New Roman" w:cs="Times New Roman"/>
-        </w:rPr>
-        <w:t xml:space="preserve"> I </w:t>
-      </w:r>
-      <w:r>
-        <w:rPr>
-          <w:rFonts w:ascii="Times New Roman" w:hAnsi="Times New Roman" w:cs="Times New Roman"/>
-        </w:rPr>
-        <w:lastRenderedPageBreak/>
-        <w:t xml:space="preserve">have just now added ad labels toggle, make it true for visualization, but keep it off for AI training purposes. You can also change the spectrogram type between the three options available (fft, mel, or Hilbert, but be aware Hilbert can be very slow). And since I was at it, I added a color option. It will draw colormaps from matplotlib, so you can use </w:t>
-      </w:r>
-      <w:r>
-        <w:rPr>
-          <w:rFonts w:ascii="Times New Roman" w:hAnsi="Times New Roman" w:cs="Times New Roman"/>
-          <w:b/>
-          <w:bCs/>
-        </w:rPr>
-        <w:t>plt.colormaps()</w:t>
+          <w:b/>
+          <w:bCs/>
+        </w:rPr>
+        <w:t>IMPORTANT:</w:t>
       </w:r>
       <w:r>
         <w:rPr>
@@ -2494,938 +3587,7 @@
         <w:rPr>
           <w:rFonts w:ascii="Times New Roman" w:hAnsi="Times New Roman" w:cs="Times New Roman"/>
         </w:rPr>
-        <w:t>to</w:t>
-      </w:r>
-      <w:r>
-        <w:rPr>
-          <w:rFonts w:ascii="Times New Roman" w:hAnsi="Times New Roman" w:cs="Times New Roman"/>
-        </w:rPr>
-        <w:t xml:space="preserve"> see your options.</w:t>
-      </w:r>
-      <w:r>
-        <w:rPr>
-          <w:rFonts w:ascii="Times New Roman" w:hAnsi="Times New Roman" w:cs="Times New Roman"/>
-        </w:rPr>
-        <w:t xml:space="preserve"> I have also included the custom parameters for the fft (n_fft, hop_length and window). Please, refer to the spectrogram function in the class audio snippet where the FFT is handled for more details on how to use these.</w:t>
-      </w:r>
-    </w:p>
-    <w:p>
-      <w:pPr>
-        <w:rPr>
-          <w:rFonts w:ascii="Times New Roman" w:hAnsi="Times New Roman" w:cs="Times New Roman"/>
-        </w:rPr>
-      </w:pPr>
-      <w:r>
-        <w:rPr>
-          <w:rFonts w:ascii="Times New Roman" w:hAnsi="Times New Roman" w:cs="Times New Roman"/>
-          <w:b/>
-          <w:bCs/>
-          <w:i/>
-          <w:iCs/>
-        </w:rPr>
-        <w:t>st.annotate_data(notes, snip</w:t>
-      </w:r>
-      <w:r>
-        <w:rPr>
-          <w:rFonts w:ascii="Times New Roman" w:hAnsi="Times New Roman" w:cs="Times New Roman"/>
-          <w:b/>
-          <w:bCs/>
-          <w:i/>
-          <w:iCs/>
-        </w:rPr>
-        <w:t>_path</w:t>
-      </w:r>
-      <w:r>
-        <w:rPr>
-          <w:rFonts w:ascii="Times New Roman" w:hAnsi="Times New Roman" w:cs="Times New Roman"/>
-          <w:b/>
-          <w:bCs/>
-          <w:i/>
-          <w:iCs/>
-        </w:rPr>
-        <w:t>, spec</w:t>
-      </w:r>
-      <w:r>
-        <w:rPr>
-          <w:rFonts w:ascii="Times New Roman" w:hAnsi="Times New Roman" w:cs="Times New Roman"/>
-          <w:b/>
-          <w:bCs/>
-          <w:i/>
-          <w:iCs/>
-        </w:rPr>
-        <w:t>_path</w:t>
-      </w:r>
-      <w:r>
-        <w:rPr>
-          <w:rFonts w:ascii="Times New Roman" w:hAnsi="Times New Roman" w:cs="Times New Roman"/>
-          <w:b/>
-          <w:bCs/>
-          <w:i/>
-          <w:iCs/>
-        </w:rPr>
-        <w:t>, snippet_duration=2.0, csv_delim='\t')</w:t>
-      </w:r>
-      <w:r>
-        <w:rPr>
-          <w:rFonts w:ascii="Times New Roman" w:hAnsi="Times New Roman" w:cs="Times New Roman"/>
-          <w:b/>
-          <w:bCs/>
-          <w:i/>
-          <w:iCs/>
-        </w:rPr>
-        <w:t xml:space="preserve"> </w:t>
-      </w:r>
-      <w:r>
-        <w:rPr>
-          <w:rFonts w:ascii="Times New Roman" w:hAnsi="Times New Roman" w:cs="Times New Roman"/>
-        </w:rPr>
-        <w:t>once</w:t>
-      </w:r>
-      <w:r>
-        <w:rPr>
-          <w:rFonts w:ascii="Times New Roman" w:hAnsi="Times New Roman" w:cs="Times New Roman"/>
-        </w:rPr>
-        <w:t xml:space="preserve"> you have processed a file, in the case you are working on training data, you can use your annotations to automatically distribute your files for training. These part of the logic is incomplete for the moment and will change soon, for now it is best for you to run it from the pipeline script. You will use the notes, which is a .txt file saved as tab delimited, path to the snippets and spectrograms that belong with that set of notes, and the snippet duration that you used (defaulted to 2, so use as kwarg). The last kwarg is not necessary if you saved your txt as tab delimited, but can be used in case you used comma. This function makes a split into positives an negatives, from there you could use data augmentation, or go into training.</w:t>
-      </w:r>
-      <w:r>
-        <w:rPr>
-          <w:rFonts w:ascii="Times New Roman" w:hAnsi="Times New Roman" w:cs="Times New Roman"/>
-        </w:rPr>
-        <w:t xml:space="preserve"> It will split all the files on each of the separate files directories and (using the pipeline logic) create merged folders for training.</w:t>
-      </w:r>
-      <w:r>
-        <w:rPr>
-          <w:rFonts w:ascii="Times New Roman" w:hAnsi="Times New Roman" w:cs="Times New Roman"/>
-        </w:rPr>
-        <w:t xml:space="preserve"> </w:t>
-      </w:r>
-      <w:r>
-        <w:rPr>
-          <w:rFonts w:ascii="Times New Roman" w:hAnsi="Times New Roman" w:cs="Times New Roman"/>
-          <w:b/>
-          <w:bCs/>
-        </w:rPr>
-        <w:t>WARNING!</w:t>
-      </w:r>
-      <w:r>
-        <w:rPr>
-          <w:rFonts w:ascii="Times New Roman" w:hAnsi="Times New Roman" w:cs="Times New Roman"/>
-        </w:rPr>
-        <w:t xml:space="preserve"> This function assumes all that is not positive is negative. That is, for simplicity of the annotation, you only have to annotate positives. Be careful to add and filter out (if needed) dubious things so you don’t have positives on the negative training set.</w:t>
-      </w:r>
-    </w:p>
-    <w:p>
-      <w:pPr>
-        <w:rPr>
-          <w:rFonts w:ascii="Times New Roman" w:hAnsi="Times New Roman" w:cs="Times New Roman"/>
-          <w:bCs/>
-          <w:iCs/>
-        </w:rPr>
-      </w:pPr>
-      <w:r>
-        <w:rPr>
-          <w:rFonts w:ascii="Times New Roman" w:hAnsi="Times New Roman" w:cs="Times New Roman"/>
-          <w:b/>
-          <w:bCs/>
-          <w:i/>
-          <w:iCs/>
-        </w:rPr>
-        <w:t>st.n</w:t>
-      </w:r>
-      <w:r>
-        <w:rPr>
-          <w:rFonts w:ascii="Times New Roman" w:hAnsi="Times New Roman" w:cs="Times New Roman"/>
-          <w:b/>
-          <w:bCs/>
-          <w:i/>
-          <w:iCs/>
-        </w:rPr>
-        <w:t>ormalize_global(input_dir, output_dir, target_max = 0.75):</w:t>
-      </w:r>
-      <w:r>
-        <w:rPr>
-          <w:rFonts w:ascii="Times New Roman" w:hAnsi="Times New Roman" w:cs="Times New Roman"/>
-          <w:bCs/>
-          <w:iCs/>
-        </w:rPr>
-        <w:t xml:space="preserve"> this allows for normalization of several files to one single peak. So, if you wanted to normalize a whole set of files to their overall maximum, you put them in a folder and run this. It should create a new folder with all files normalized. It might be useful to normalize by microphone or whole experiments. We will see what Sara thinks later.</w:t>
-      </w:r>
-    </w:p>
-    <w:p>
-      <w:pPr>
-        <w:rPr>
-          <w:rFonts w:ascii="Times New Roman" w:hAnsi="Times New Roman" w:cs="Times New Roman"/>
-        </w:rPr>
-      </w:pPr>
-      <w:r>
-        <w:rPr>
-          <w:rFonts w:ascii="Times New Roman" w:hAnsi="Times New Roman" w:cs="Times New Roman"/>
-          <w:b/>
-          <w:bCs/>
-          <w:i/>
-          <w:iCs/>
-        </w:rPr>
-        <w:t>st.</w:t>
-      </w:r>
-      <w:r>
-        <w:t xml:space="preserve"> </w:t>
-      </w:r>
-      <w:r>
-        <w:rPr>
-          <w:rFonts w:ascii="Times New Roman" w:hAnsi="Times New Roman" w:cs="Times New Roman"/>
-          <w:b/>
-          <w:bCs/>
-          <w:i/>
-          <w:iCs/>
-        </w:rPr>
-        <w:t>highpass_filter(audio, sr, cutoff=3000, order=8):</w:t>
-      </w:r>
-      <w:r>
-        <w:rPr>
-          <w:rFonts w:ascii="Times New Roman" w:hAnsi="Times New Roman" w:cs="Times New Roman"/>
-        </w:rPr>
-        <w:t xml:space="preserve"> on Jeremy’s request, I added a function to apply a high pass filter to audio files. The default is Mario’s anti-rain filter. H</w:t>
-      </w:r>
-      <w:r>
-        <w:rPr>
-          <w:rFonts w:ascii="Times New Roman" w:hAnsi="Times New Roman" w:cs="Times New Roman"/>
-        </w:rPr>
-        <w:t xml:space="preserve">ere you can use the kwargs cutoff to set the </w:t>
-      </w:r>
-      <w:r>
-        <w:rPr>
-          <w:rFonts w:ascii="Times New Roman" w:hAnsi="Times New Roman" w:cs="Times New Roman"/>
-        </w:rPr>
-        <w:t>level below which you want to apply the filter (will remove freqs below this threshold)</w:t>
-      </w:r>
-      <w:r>
-        <w:rPr>
-          <w:rFonts w:ascii="Times New Roman" w:hAnsi="Times New Roman" w:cs="Times New Roman"/>
-        </w:rPr>
-        <w:t xml:space="preserve"> and order for the roll-off</w:t>
-      </w:r>
-      <w:r>
-        <w:rPr>
-          <w:rFonts w:ascii="Times New Roman" w:hAnsi="Times New Roman" w:cs="Times New Roman"/>
-        </w:rPr>
-        <w:t xml:space="preserve"> (which is how hard you want the filter to be, higher order, harder removal)</w:t>
-      </w:r>
-      <w:r>
-        <w:rPr>
-          <w:rFonts w:ascii="Times New Roman" w:hAnsi="Times New Roman" w:cs="Times New Roman"/>
-        </w:rPr>
-        <w:t xml:space="preserve">. </w:t>
-      </w:r>
-      <w:r>
-        <w:rPr>
-          <w:rFonts w:ascii="Times New Roman" w:hAnsi="Times New Roman" w:cs="Times New Roman"/>
-        </w:rPr>
-        <w:t>The</w:t>
-      </w:r>
-      <w:r>
-        <w:rPr>
-          <w:rFonts w:ascii="Times New Roman" w:hAnsi="Times New Roman" w:cs="Times New Roman"/>
-        </w:rPr>
-        <w:t xml:space="preserve"> order of the filter adds 6dB per octave, so 8 is 48dB per octave. you can safely omit those kwargs in your code if you don't want to change them.</w:t>
-      </w:r>
-      <w:r>
-        <w:rPr>
-          <w:rFonts w:ascii="Times New Roman" w:hAnsi="Times New Roman" w:cs="Times New Roman"/>
-        </w:rPr>
-        <w:t xml:space="preserve"> </w:t>
-      </w:r>
-      <w:r>
-        <w:rPr>
-          <w:rFonts w:ascii="Times New Roman" w:hAnsi="Times New Roman" w:cs="Times New Roman"/>
-          <w:b/>
-          <w:bCs/>
-        </w:rPr>
-        <w:t>IMPORTANT:</w:t>
-      </w:r>
-      <w:r>
-        <w:rPr>
-          <w:rFonts w:ascii="Times New Roman" w:hAnsi="Times New Roman" w:cs="Times New Roman"/>
-        </w:rPr>
-        <w:t xml:space="preserve"> this filter is meant to be used outside the snippets logic, it is applied to the audio loaded with the normal load function. After that, you can start creating snippets from there or save the new audio, be careful to not overwrite files.</w:t>
-      </w:r>
-    </w:p>
-    <w:p>
-      <w:pPr>
-        <w:rPr>
-          <w:rFonts w:ascii="Times New Roman" w:hAnsi="Times New Roman" w:cs="Times New Roman"/>
-        </w:rPr>
-      </w:pPr>
-      <w:r>
-        <w:rPr>
-          <w:rFonts w:ascii="Times New Roman" w:hAnsi="Times New Roman" w:cs="Times New Roman"/>
-          <w:b/>
-          <w:bCs/>
-          <w:i/>
-          <w:iCs/>
-        </w:rPr>
-        <w:t>st.</w:t>
-      </w:r>
-      <w:r>
-        <w:t xml:space="preserve"> </w:t>
-      </w:r>
-      <w:r>
-        <w:rPr>
-          <w:rFonts w:ascii="Times New Roman" w:hAnsi="Times New Roman" w:cs="Times New Roman"/>
-          <w:b/>
-          <w:bCs/>
-          <w:i/>
-          <w:iCs/>
-        </w:rPr>
-        <w:t>low</w:t>
-      </w:r>
-      <w:r>
-        <w:rPr>
-          <w:rFonts w:ascii="Times New Roman" w:hAnsi="Times New Roman" w:cs="Times New Roman"/>
-          <w:b/>
-          <w:bCs/>
-          <w:i/>
-          <w:iCs/>
-        </w:rPr>
-        <w:t>pass_filter(audio, sr, cutoff=</w:t>
-      </w:r>
-      <w:r>
-        <w:rPr>
-          <w:rFonts w:ascii="Times New Roman" w:hAnsi="Times New Roman" w:cs="Times New Roman"/>
-          <w:b/>
-          <w:bCs/>
-          <w:i/>
-          <w:iCs/>
-        </w:rPr>
-        <w:t>20</w:t>
-      </w:r>
-      <w:r>
-        <w:rPr>
-          <w:rFonts w:ascii="Times New Roman" w:hAnsi="Times New Roman" w:cs="Times New Roman"/>
-          <w:b/>
-          <w:bCs/>
-          <w:i/>
-          <w:iCs/>
-        </w:rPr>
-        <w:t>000, order=8):</w:t>
-      </w:r>
-      <w:r>
-        <w:rPr>
-          <w:rFonts w:ascii="Times New Roman" w:hAnsi="Times New Roman" w:cs="Times New Roman"/>
-          <w:b/>
-          <w:bCs/>
-          <w:i/>
-          <w:iCs/>
-        </w:rPr>
-        <w:t xml:space="preserve"> </w:t>
-      </w:r>
-      <w:r>
-        <w:rPr>
-          <w:rFonts w:ascii="Times New Roman" w:hAnsi="Times New Roman" w:cs="Times New Roman"/>
-        </w:rPr>
-        <w:t>similar to the highpass, I have now added a new lowpass filter. The working system is the same so I won’t repeat it here. Just so you know there is a way to cut upper frequencies when needed.</w:t>
-      </w:r>
-    </w:p>
-    <w:p>
-      <w:pPr>
-        <w:rPr>
-          <w:rFonts w:ascii="Times New Roman" w:hAnsi="Times New Roman" w:cs="Times New Roman"/>
-        </w:rPr>
-      </w:pPr>
-      <w:r>
-        <w:rPr>
-          <w:rFonts w:ascii="Times New Roman" w:hAnsi="Times New Roman" w:cs="Times New Roman"/>
-          <w:b/>
-          <w:bCs/>
-          <w:i/>
-          <w:iCs/>
-        </w:rPr>
-        <w:t>st.</w:t>
-      </w:r>
-      <w:r>
-        <w:rPr>
-          <w:rFonts w:ascii="Times New Roman" w:hAnsi="Times New Roman" w:cs="Times New Roman"/>
-          <w:b/>
-          <w:bCs/>
-          <w:i/>
-          <w:iCs/>
-        </w:rPr>
-        <w:t>save_audio(audio, sr, path, overwrite=False):</w:t>
-      </w:r>
-      <w:r>
-        <w:rPr>
-          <w:rFonts w:ascii="Times New Roman" w:hAnsi="Times New Roman" w:cs="Times New Roman"/>
-        </w:rPr>
-        <w:t xml:space="preserve"> that means I have also added a saving function for audios as it is. This function has an overwrite kwarg, so it should never overwrite data unless specifically told by you, but be extremely cautious when using. Again, it works on audio and sr taken from the load_audio function (or modified versions like normalized or filtered)</w:t>
-      </w:r>
-      <w:r>
-        <w:rPr>
-          <w:rFonts w:ascii="Times New Roman" w:hAnsi="Times New Roman" w:cs="Times New Roman"/>
-        </w:rPr>
-        <w:t>.</w:t>
-      </w:r>
-    </w:p>
-    <w:p>
-      <w:pPr>
-        <w:rPr>
-          <w:rFonts w:ascii="Times New Roman" w:hAnsi="Times New Roman" w:cs="Times New Roman"/>
-        </w:rPr>
-      </w:pPr>
-      <w:r>
-        <w:rPr>
-          <w:rFonts w:ascii="Times New Roman" w:hAnsi="Times New Roman" w:cs="Times New Roman"/>
-        </w:rPr>
-        <w:t>NEW AND SHINY, PART 2.</w:t>
-      </w:r>
-    </w:p>
-    <w:p>
-      <w:pPr>
-        <w:rPr>
-          <w:rFonts w:ascii="Times New Roman" w:hAnsi="Times New Roman" w:cs="Times New Roman"/>
-        </w:rPr>
-      </w:pPr>
-      <w:r>
-        <w:rPr>
-          <w:rFonts w:ascii="Times New Roman" w:hAnsi="Times New Roman" w:cs="Times New Roman"/>
-        </w:rPr>
-        <w:t>In the snippet section I explained a bit how I am searching for stridulations as in figuring out events of high relative energy and classifying them by their acoustic features. I promised a wrapper and here it is. This function will read through a file and find you potential stridulations. It needs a lot of fine tuning that you may want to redo eventually, but this basic start is already highly promising with the default settings. Let’s look at it.</w:t>
-      </w:r>
-    </w:p>
-    <w:p>
-      <w:pPr>
-        <w:rPr>
-          <w:rFonts w:ascii="Times New Roman" w:hAnsi="Times New Roman" w:cs="Times New Roman"/>
-        </w:rPr>
-      </w:pPr>
-    </w:p>
-    <w:p>
-      <w:pPr>
-        <w:rPr>
-          <w:rFonts w:ascii="Times New Roman" w:hAnsi="Times New Roman" w:cs="Times New Roman"/>
-        </w:rPr>
-      </w:pPr>
-      <w:r>
-        <w:rPr>
-          <w:rFonts w:ascii="Times New Roman" w:hAnsi="Times New Roman" w:cs="Times New Roman"/>
-          <w:b/>
-          <w:bCs/>
-          <w:i/>
-          <w:iCs/>
-        </w:rPr>
-        <w:t>times</w:t>
-      </w:r>
-      <w:r>
-        <w:rPr>
-          <w:rFonts w:ascii="Times New Roman" w:hAnsi="Times New Roman" w:cs="Times New Roman"/>
-          <w:b/>
-          <w:bCs/>
-          <w:i/>
-          <w:iCs/>
-        </w:rPr>
-        <w:t>,</w:t>
-      </w:r>
-      <w:r>
-        <w:rPr>
-          <w:rFonts w:ascii="Times New Roman" w:hAnsi="Times New Roman" w:cs="Times New Roman"/>
-          <w:b/>
-          <w:bCs/>
-          <w:i/>
-          <w:iCs/>
-        </w:rPr>
-        <w:t xml:space="preserve"> </w:t>
-      </w:r>
-      <w:r>
-        <w:rPr>
-          <w:rFonts w:ascii="Times New Roman" w:hAnsi="Times New Roman" w:cs="Times New Roman"/>
-          <w:b/>
-          <w:bCs/>
-          <w:i/>
-          <w:iCs/>
-        </w:rPr>
-        <w:t>info</w:t>
-      </w:r>
-      <w:r>
-        <w:rPr>
-          <w:rFonts w:ascii="Times New Roman" w:hAnsi="Times New Roman" w:cs="Times New Roman"/>
-          <w:b/>
-          <w:bCs/>
-          <w:i/>
-          <w:iCs/>
-        </w:rPr>
-        <w:t>=st.quick_scan(audio_path, snippet_duration</w:t>
-      </w:r>
-      <w:r>
-        <w:rPr>
-          <w:rFonts w:ascii="Times New Roman" w:hAnsi="Times New Roman" w:cs="Times New Roman"/>
-          <w:b/>
-          <w:bCs/>
-          <w:i/>
-          <w:iCs/>
-        </w:rPr>
-        <w:t xml:space="preserve"> </w:t>
-      </w:r>
-      <w:r>
-        <w:rPr>
-          <w:rFonts w:ascii="Times New Roman" w:hAnsi="Times New Roman" w:cs="Times New Roman"/>
-          <w:b/>
-          <w:bCs/>
-          <w:i/>
-          <w:iCs/>
-        </w:rPr>
-        <w:t>=</w:t>
-      </w:r>
-      <w:r>
-        <w:rPr>
-          <w:rFonts w:ascii="Times New Roman" w:hAnsi="Times New Roman" w:cs="Times New Roman"/>
-          <w:b/>
-          <w:bCs/>
-          <w:i/>
-          <w:iCs/>
-        </w:rPr>
-        <w:t xml:space="preserve"> </w:t>
-      </w:r>
-      <w:r>
-        <w:rPr>
-          <w:rFonts w:ascii="Times New Roman" w:hAnsi="Times New Roman" w:cs="Times New Roman"/>
-          <w:b/>
-          <w:bCs/>
-          <w:i/>
-          <w:iCs/>
-        </w:rPr>
-        <w:t>2.0, overlap</w:t>
-      </w:r>
-      <w:r>
-        <w:rPr>
-          <w:rFonts w:ascii="Times New Roman" w:hAnsi="Times New Roman" w:cs="Times New Roman"/>
-          <w:b/>
-          <w:bCs/>
-          <w:i/>
-          <w:iCs/>
-        </w:rPr>
-        <w:t xml:space="preserve"> </w:t>
-      </w:r>
-      <w:r>
-        <w:rPr>
-          <w:rFonts w:ascii="Times New Roman" w:hAnsi="Times New Roman" w:cs="Times New Roman"/>
-          <w:b/>
-          <w:bCs/>
-          <w:i/>
-          <w:iCs/>
-        </w:rPr>
-        <w:t>=</w:t>
-      </w:r>
-      <w:r>
-        <w:rPr>
-          <w:rFonts w:ascii="Times New Roman" w:hAnsi="Times New Roman" w:cs="Times New Roman"/>
-          <w:b/>
-          <w:bCs/>
-          <w:i/>
-          <w:iCs/>
-        </w:rPr>
-        <w:t xml:space="preserve"> </w:t>
-      </w:r>
-      <w:r>
-        <w:rPr>
-          <w:rFonts w:ascii="Times New Roman" w:hAnsi="Times New Roman" w:cs="Times New Roman"/>
-          <w:b/>
-          <w:bCs/>
-          <w:i/>
-          <w:iCs/>
-        </w:rPr>
-        <w:t>0, min_pulses</w:t>
-      </w:r>
-      <w:r>
-        <w:rPr>
-          <w:rFonts w:ascii="Times New Roman" w:hAnsi="Times New Roman" w:cs="Times New Roman"/>
-          <w:b/>
-          <w:bCs/>
-          <w:i/>
-          <w:iCs/>
-        </w:rPr>
-        <w:t xml:space="preserve"> </w:t>
-      </w:r>
-      <w:r>
-        <w:rPr>
-          <w:rFonts w:ascii="Times New Roman" w:hAnsi="Times New Roman" w:cs="Times New Roman"/>
-          <w:b/>
-          <w:bCs/>
-          <w:i/>
-          <w:iCs/>
-        </w:rPr>
-        <w:t>=</w:t>
-      </w:r>
-      <w:r>
-        <w:rPr>
-          <w:rFonts w:ascii="Times New Roman" w:hAnsi="Times New Roman" w:cs="Times New Roman"/>
-          <w:b/>
-          <w:bCs/>
-          <w:i/>
-          <w:iCs/>
-        </w:rPr>
-        <w:t xml:space="preserve"> </w:t>
-      </w:r>
-      <w:r>
-        <w:rPr>
-          <w:rFonts w:ascii="Times New Roman" w:hAnsi="Times New Roman" w:cs="Times New Roman"/>
-          <w:b/>
-          <w:bCs/>
-          <w:i/>
-          <w:iCs/>
-        </w:rPr>
-        <w:t>6, min_regularity</w:t>
-      </w:r>
-      <w:r>
-        <w:rPr>
-          <w:rFonts w:ascii="Times New Roman" w:hAnsi="Times New Roman" w:cs="Times New Roman"/>
-          <w:b/>
-          <w:bCs/>
-          <w:i/>
-          <w:iCs/>
-        </w:rPr>
-        <w:t xml:space="preserve"> </w:t>
-      </w:r>
-      <w:r>
-        <w:rPr>
-          <w:rFonts w:ascii="Times New Roman" w:hAnsi="Times New Roman" w:cs="Times New Roman"/>
-          <w:b/>
-          <w:bCs/>
-          <w:i/>
-          <w:iCs/>
-        </w:rPr>
-        <w:t>=</w:t>
-      </w:r>
-      <w:r>
-        <w:rPr>
-          <w:rFonts w:ascii="Times New Roman" w:hAnsi="Times New Roman" w:cs="Times New Roman"/>
-          <w:b/>
-          <w:bCs/>
-          <w:i/>
-          <w:iCs/>
-        </w:rPr>
-        <w:t xml:space="preserve"> </w:t>
-      </w:r>
-      <w:r>
-        <w:rPr>
-          <w:rFonts w:ascii="Times New Roman" w:hAnsi="Times New Roman" w:cs="Times New Roman"/>
-          <w:b/>
-          <w:bCs/>
-          <w:i/>
-          <w:iCs/>
-        </w:rPr>
-        <w:t>10, min_duration</w:t>
-      </w:r>
-      <w:r>
-        <w:rPr>
-          <w:rFonts w:ascii="Times New Roman" w:hAnsi="Times New Roman" w:cs="Times New Roman"/>
-          <w:b/>
-          <w:bCs/>
-          <w:i/>
-          <w:iCs/>
-        </w:rPr>
-        <w:t xml:space="preserve"> </w:t>
-      </w:r>
-      <w:r>
-        <w:rPr>
-          <w:rFonts w:ascii="Times New Roman" w:hAnsi="Times New Roman" w:cs="Times New Roman"/>
-          <w:b/>
-          <w:bCs/>
-          <w:i/>
-          <w:iCs/>
-        </w:rPr>
-        <w:t>=</w:t>
-      </w:r>
-      <w:r>
-        <w:rPr>
-          <w:rFonts w:ascii="Times New Roman" w:hAnsi="Times New Roman" w:cs="Times New Roman"/>
-          <w:b/>
-          <w:bCs/>
-          <w:i/>
-          <w:iCs/>
-        </w:rPr>
-        <w:t xml:space="preserve"> </w:t>
-      </w:r>
-      <w:r>
-        <w:rPr>
-          <w:rFonts w:ascii="Times New Roman" w:hAnsi="Times New Roman" w:cs="Times New Roman"/>
-          <w:b/>
-          <w:bCs/>
-          <w:i/>
-          <w:iCs/>
-        </w:rPr>
-        <w:t>0.5, max_duration=1, sustain</w:t>
-      </w:r>
-      <w:r>
-        <w:rPr>
-          <w:rFonts w:ascii="Times New Roman" w:hAnsi="Times New Roman" w:cs="Times New Roman"/>
-          <w:b/>
-          <w:bCs/>
-          <w:i/>
-          <w:iCs/>
-        </w:rPr>
-        <w:t xml:space="preserve"> </w:t>
-      </w:r>
-      <w:r>
-        <w:rPr>
-          <w:rFonts w:ascii="Times New Roman" w:hAnsi="Times New Roman" w:cs="Times New Roman"/>
-          <w:b/>
-          <w:bCs/>
-          <w:i/>
-          <w:iCs/>
-        </w:rPr>
-        <w:t>=</w:t>
-      </w:r>
-      <w:r>
-        <w:rPr>
-          <w:rFonts w:ascii="Times New Roman" w:hAnsi="Times New Roman" w:cs="Times New Roman"/>
-          <w:b/>
-          <w:bCs/>
-          <w:i/>
-          <w:iCs/>
-        </w:rPr>
-        <w:t xml:space="preserve"> </w:t>
-      </w:r>
-      <w:r>
-        <w:rPr>
-          <w:rFonts w:ascii="Times New Roman" w:hAnsi="Times New Roman" w:cs="Times New Roman"/>
-          <w:b/>
-          <w:bCs/>
-          <w:i/>
-          <w:iCs/>
-        </w:rPr>
-        <w:t>0.5, pulse_dist</w:t>
-      </w:r>
-      <w:r>
-        <w:rPr>
-          <w:rFonts w:ascii="Times New Roman" w:hAnsi="Times New Roman" w:cs="Times New Roman"/>
-          <w:b/>
-          <w:bCs/>
-          <w:i/>
-          <w:iCs/>
-        </w:rPr>
-        <w:t xml:space="preserve"> </w:t>
-      </w:r>
-      <w:r>
-        <w:rPr>
-          <w:rFonts w:ascii="Times New Roman" w:hAnsi="Times New Roman" w:cs="Times New Roman"/>
-          <w:b/>
-          <w:bCs/>
-          <w:i/>
-          <w:iCs/>
-        </w:rPr>
-        <w:t>=</w:t>
-      </w:r>
-      <w:r>
-        <w:rPr>
-          <w:rFonts w:ascii="Times New Roman" w:hAnsi="Times New Roman" w:cs="Times New Roman"/>
-          <w:b/>
-          <w:bCs/>
-          <w:i/>
-          <w:iCs/>
-        </w:rPr>
-        <w:t xml:space="preserve"> </w:t>
-      </w:r>
-      <w:r>
-        <w:rPr>
-          <w:rFonts w:ascii="Times New Roman" w:hAnsi="Times New Roman" w:cs="Times New Roman"/>
-          <w:b/>
-          <w:bCs/>
-          <w:i/>
-          <w:iCs/>
-        </w:rPr>
-        <w:t>20,  sp_range</w:t>
-      </w:r>
-      <w:r>
-        <w:rPr>
-          <w:rFonts w:ascii="Times New Roman" w:hAnsi="Times New Roman" w:cs="Times New Roman"/>
-          <w:b/>
-          <w:bCs/>
-          <w:i/>
-          <w:iCs/>
-        </w:rPr>
-        <w:t xml:space="preserve"> </w:t>
-      </w:r>
-      <w:r>
-        <w:rPr>
-          <w:rFonts w:ascii="Times New Roman" w:hAnsi="Times New Roman" w:cs="Times New Roman"/>
-          <w:b/>
-          <w:bCs/>
-          <w:i/>
-          <w:iCs/>
-        </w:rPr>
-        <w:t>=</w:t>
-      </w:r>
-      <w:r>
-        <w:rPr>
-          <w:rFonts w:ascii="Times New Roman" w:hAnsi="Times New Roman" w:cs="Times New Roman"/>
-          <w:b/>
-          <w:bCs/>
-          <w:i/>
-          <w:iCs/>
-        </w:rPr>
-        <w:t xml:space="preserve"> </w:t>
-      </w:r>
-      <w:r>
-        <w:rPr>
-          <w:rFonts w:ascii="Times New Roman" w:hAnsi="Times New Roman" w:cs="Times New Roman"/>
-          <w:b/>
-          <w:bCs/>
-          <w:i/>
-          <w:iCs/>
-        </w:rPr>
-        <w:t>(5500, 15000), enable_coupled</w:t>
-      </w:r>
-      <w:r>
-        <w:rPr>
-          <w:rFonts w:ascii="Times New Roman" w:hAnsi="Times New Roman" w:cs="Times New Roman"/>
-          <w:b/>
-          <w:bCs/>
-          <w:i/>
-          <w:iCs/>
-        </w:rPr>
-        <w:t xml:space="preserve"> </w:t>
-      </w:r>
-      <w:r>
-        <w:rPr>
-          <w:rFonts w:ascii="Times New Roman" w:hAnsi="Times New Roman" w:cs="Times New Roman"/>
-          <w:b/>
-          <w:bCs/>
-          <w:i/>
-          <w:iCs/>
-        </w:rPr>
-        <w:t>=</w:t>
-      </w:r>
-      <w:r>
-        <w:rPr>
-          <w:rFonts w:ascii="Times New Roman" w:hAnsi="Times New Roman" w:cs="Times New Roman"/>
-          <w:b/>
-          <w:bCs/>
-          <w:i/>
-          <w:iCs/>
-        </w:rPr>
-        <w:t xml:space="preserve"> </w:t>
-      </w:r>
-      <w:r>
-        <w:rPr>
-          <w:rFonts w:ascii="Times New Roman" w:hAnsi="Times New Roman" w:cs="Times New Roman"/>
-          <w:b/>
-          <w:bCs/>
-          <w:i/>
-          <w:iCs/>
-        </w:rPr>
-        <w:t>True, coupled_min_duration</w:t>
-      </w:r>
-      <w:r>
-        <w:rPr>
-          <w:rFonts w:ascii="Times New Roman" w:hAnsi="Times New Roman" w:cs="Times New Roman"/>
-          <w:b/>
-          <w:bCs/>
-          <w:i/>
-          <w:iCs/>
-        </w:rPr>
-        <w:t xml:space="preserve"> </w:t>
-      </w:r>
-      <w:r>
-        <w:rPr>
-          <w:rFonts w:ascii="Times New Roman" w:hAnsi="Times New Roman" w:cs="Times New Roman"/>
-          <w:b/>
-          <w:bCs/>
-          <w:i/>
-          <w:iCs/>
-        </w:rPr>
-        <w:t>=</w:t>
-      </w:r>
-      <w:r>
-        <w:rPr>
-          <w:rFonts w:ascii="Times New Roman" w:hAnsi="Times New Roman" w:cs="Times New Roman"/>
-          <w:b/>
-          <w:bCs/>
-          <w:i/>
-          <w:iCs/>
-        </w:rPr>
-        <w:t xml:space="preserve"> </w:t>
-      </w:r>
-      <w:r>
-        <w:rPr>
-          <w:rFonts w:ascii="Times New Roman" w:hAnsi="Times New Roman" w:cs="Times New Roman"/>
-          <w:b/>
-          <w:bCs/>
-          <w:i/>
-          <w:iCs/>
-        </w:rPr>
-        <w:t>0.2, coupled_gap</w:t>
-      </w:r>
-      <w:r>
-        <w:rPr>
-          <w:rFonts w:ascii="Times New Roman" w:hAnsi="Times New Roman" w:cs="Times New Roman"/>
-          <w:b/>
-          <w:bCs/>
-          <w:i/>
-          <w:iCs/>
-        </w:rPr>
-        <w:t xml:space="preserve"> </w:t>
-      </w:r>
-      <w:r>
-        <w:rPr>
-          <w:rFonts w:ascii="Times New Roman" w:hAnsi="Times New Roman" w:cs="Times New Roman"/>
-          <w:b/>
-          <w:bCs/>
-          <w:i/>
-          <w:iCs/>
-        </w:rPr>
-        <w:t>=</w:t>
-      </w:r>
-      <w:r>
-        <w:rPr>
-          <w:rFonts w:ascii="Times New Roman" w:hAnsi="Times New Roman" w:cs="Times New Roman"/>
-          <w:b/>
-          <w:bCs/>
-          <w:i/>
-          <w:iCs/>
-        </w:rPr>
-        <w:t xml:space="preserve"> </w:t>
-      </w:r>
-      <w:r>
-        <w:rPr>
-          <w:rFonts w:ascii="Times New Roman" w:hAnsi="Times New Roman" w:cs="Times New Roman"/>
-          <w:b/>
-          <w:bCs/>
-          <w:i/>
-          <w:iCs/>
-        </w:rPr>
-        <w:t>1)</w:t>
-      </w:r>
-      <w:r>
-        <w:rPr>
-          <w:rFonts w:ascii="Times New Roman" w:hAnsi="Times New Roman" w:cs="Times New Roman"/>
-          <w:b/>
-          <w:bCs/>
-          <w:i/>
-          <w:iCs/>
-        </w:rPr>
-        <w:t xml:space="preserve">: </w:t>
-      </w:r>
-      <w:r>
-        <w:rPr>
-          <w:rFonts w:ascii="Times New Roman" w:hAnsi="Times New Roman" w:cs="Times New Roman"/>
-        </w:rPr>
-        <w:t xml:space="preserve">this is a complex function, but most of the arguments are the same as the is_stridulation function explained in the snippet logic a few pages above. The only new things here are, a path to the file you want to analyse and an overlap if you want to have any (I have tried with some </w:t>
-      </w:r>
-      <w:r>
-        <w:rPr>
-          <w:rFonts w:ascii="Times New Roman" w:hAnsi="Times New Roman" w:cs="Times New Roman"/>
-        </w:rPr>
-        <w:t>overlap and it finds more candidates and some are actually good ones</w:t>
-      </w:r>
-      <w:r>
-        <w:rPr>
-          <w:rFonts w:ascii="Times New Roman" w:hAnsi="Times New Roman" w:cs="Times New Roman"/>
-        </w:rPr>
-        <w:t>)</w:t>
-      </w:r>
-      <w:r>
-        <w:rPr>
-          <w:rFonts w:ascii="Times New Roman" w:hAnsi="Times New Roman" w:cs="Times New Roman"/>
-        </w:rPr>
-        <w:t>. The overlap is in seconds, so make sure is not bigger than the snippet duration.</w:t>
+        <w:t>the function that searches the events uses an energy threshold based on percentiles. If you used longer snippets, these percentiles would change solely on the base of the sound being mostly no stridulations. In other words, the longer time windows will make it so the percentile 50 includes most of the sound itself. I made this thinking of 2 seconds snippets, if you wish to use a very different length, that might mean revisiting a number of parameters.</w:t>
       </w:r>
     </w:p>
     <w:p>

</xml_diff>

<commit_message>
Added function to export features to csv file.
</commit_message>
<xml_diff>
--- a/Users_manual.docx
+++ b/Users_manual.docx
@@ -6,14 +6,14 @@
       <w:pPr>
         <w:jc w:val="center"/>
         <w:rPr>
-          <w:rStyle w:val="Textoennegrita"/>
+          <w:rStyle w:val="Fuerte"/>
           <w:sz w:val="56"/>
           <w:szCs w:val="56"/>
         </w:rPr>
       </w:pPr>
       <w:r>
         <w:rPr>
-          <w:rStyle w:val="Textoennegrita"/>
+          <w:rStyle w:val="Fuerte"/>
           <w:sz w:val="56"/>
           <w:szCs w:val="56"/>
         </w:rPr>
@@ -2213,77 +2213,7 @@
           <w:i/>
           <w:iCs/>
         </w:rPr>
-        <w:t>Snippet_1.</w:t>
-      </w:r>
-      <w:r>
-        <w:rPr>
-          <w:rFonts w:ascii="Times New Roman" w:hAnsi="Times New Roman" w:cs="Times New Roman"/>
-          <w:b/>
-          <w:bCs/>
-          <w:i/>
-          <w:iCs/>
-        </w:rPr>
-        <w:t>is_cavitation(energy_threshold = 0.001, min_event_duration=0.0005,</w:t>
-      </w:r>
-      <w:r>
-        <w:rPr>
-          <w:rFonts w:ascii="Times New Roman" w:hAnsi="Times New Roman" w:cs="Times New Roman"/>
-          <w:b/>
-          <w:bCs/>
-          <w:i/>
-          <w:iCs/>
-        </w:rPr>
-        <w:t xml:space="preserve"> </w:t>
-      </w:r>
-      <w:r>
-        <w:rPr>
-          <w:rFonts w:ascii="Times New Roman" w:hAnsi="Times New Roman" w:cs="Times New Roman"/>
-          <w:b/>
-          <w:bCs/>
-          <w:i/>
-          <w:iCs/>
-        </w:rPr>
-        <w:t>threshold_percentile</w:t>
-      </w:r>
-      <w:r>
-        <w:rPr>
-          <w:rFonts w:ascii="Times New Roman" w:hAnsi="Times New Roman" w:cs="Times New Roman"/>
-          <w:b/>
-          <w:bCs/>
-          <w:i/>
-          <w:iCs/>
-        </w:rPr>
-        <w:t xml:space="preserve"> </w:t>
-      </w:r>
-      <w:r>
-        <w:rPr>
-          <w:rFonts w:ascii="Times New Roman" w:hAnsi="Times New Roman" w:cs="Times New Roman"/>
-          <w:b/>
-          <w:bCs/>
-          <w:i/>
-          <w:iCs/>
-        </w:rPr>
-        <w:t>=</w:t>
-      </w:r>
-      <w:r>
-        <w:rPr>
-          <w:rFonts w:ascii="Times New Roman" w:hAnsi="Times New Roman" w:cs="Times New Roman"/>
-          <w:b/>
-          <w:bCs/>
-          <w:i/>
-          <w:iCs/>
-        </w:rPr>
-        <w:t xml:space="preserve"> </w:t>
-      </w:r>
-      <w:r>
-        <w:rPr>
-          <w:rFonts w:ascii="Times New Roman" w:hAnsi="Times New Roman" w:cs="Times New Roman"/>
-          <w:b/>
-          <w:bCs/>
-          <w:i/>
-          <w:iCs/>
-        </w:rPr>
-        <w:t>85, env_smooth = 1, pulse_dist = 1):</w:t>
+        <w:t>Snippet_1.is_cavitation(energy_threshold = 0.001, min_event_duration=0.0005, threshold_percentile = 85, env_smooth = 1, pulse_dist = 1):</w:t>
       </w:r>
       <w:r>
         <w:rPr>
@@ -3358,6 +3288,29 @@
       <w:r>
         <w:rPr>
           <w:rFonts w:ascii="Times New Roman" w:hAnsi="Times New Roman" w:cs="Times New Roman"/>
+          <w:b/>
+          <w:bCs/>
+          <w:i/>
+          <w:iCs/>
+        </w:rPr>
+        <w:t>save_features(features, output_path):</w:t>
+      </w:r>
+      <w:r>
+        <w:rPr>
+          <w:rFonts w:ascii="Times New Roman" w:hAnsi="Times New Roman" w:cs="Times New Roman"/>
+        </w:rPr>
+        <w:t xml:space="preserve"> This function saves features dictionaries to csv files. It works with both the individual extract features function and the scans. It takes the features and a path to store the csv and it will not overwrite but add if you use the same file path.</w:t>
+      </w:r>
+    </w:p>
+    <w:p>
+      <w:pPr>
+        <w:rPr>
+          <w:rFonts w:ascii="Times New Roman" w:hAnsi="Times New Roman" w:cs="Times New Roman"/>
+        </w:rPr>
+      </w:pPr>
+      <w:r>
+        <w:rPr>
+          <w:rFonts w:ascii="Times New Roman" w:hAnsi="Times New Roman" w:cs="Times New Roman"/>
         </w:rPr>
         <w:t>NEW AND SHINY, PART 2.</w:t>
       </w:r>
@@ -3389,6 +3342,7 @@
           <w:b/>
           <w:bCs/>
         </w:rPr>
+        <w:lastRenderedPageBreak/>
         <w:t>Notice!</w:t>
       </w:r>
       <w:r>
@@ -3414,724 +3368,714 @@
           <w:i/>
           <w:iCs/>
         </w:rPr>
+        <w:t>times</w:t>
+      </w:r>
+      <w:r>
+        <w:rPr>
+          <w:rFonts w:ascii="Times New Roman" w:hAnsi="Times New Roman" w:cs="Times New Roman"/>
+          <w:b/>
+          <w:bCs/>
+          <w:i/>
+          <w:iCs/>
+        </w:rPr>
+        <w:t>,</w:t>
+      </w:r>
+      <w:r>
+        <w:rPr>
+          <w:rFonts w:ascii="Times New Roman" w:hAnsi="Times New Roman" w:cs="Times New Roman"/>
+          <w:b/>
+          <w:bCs/>
+          <w:i/>
+          <w:iCs/>
+        </w:rPr>
+        <w:t xml:space="preserve"> </w:t>
+      </w:r>
+      <w:r>
+        <w:rPr>
+          <w:rFonts w:ascii="Times New Roman" w:hAnsi="Times New Roman" w:cs="Times New Roman"/>
+          <w:b/>
+          <w:bCs/>
+          <w:i/>
+          <w:iCs/>
+        </w:rPr>
+        <w:t>info</w:t>
+      </w:r>
+      <w:r>
+        <w:rPr>
+          <w:rFonts w:ascii="Times New Roman" w:hAnsi="Times New Roman" w:cs="Times New Roman"/>
+          <w:b/>
+          <w:bCs/>
+          <w:i/>
+          <w:iCs/>
+        </w:rPr>
+        <w:t>=st.</w:t>
+      </w:r>
+      <w:r>
+        <w:rPr>
+          <w:rFonts w:ascii="Times New Roman" w:hAnsi="Times New Roman" w:cs="Times New Roman"/>
+          <w:b/>
+          <w:bCs/>
+          <w:i/>
+          <w:iCs/>
+        </w:rPr>
+        <w:t>stridulation</w:t>
+      </w:r>
+      <w:r>
+        <w:rPr>
+          <w:rFonts w:ascii="Times New Roman" w:hAnsi="Times New Roman" w:cs="Times New Roman"/>
+          <w:b/>
+          <w:bCs/>
+          <w:i/>
+          <w:iCs/>
+        </w:rPr>
+        <w:t>_scan(audio_path, snippet_duration</w:t>
+      </w:r>
+      <w:r>
+        <w:rPr>
+          <w:rFonts w:ascii="Times New Roman" w:hAnsi="Times New Roman" w:cs="Times New Roman"/>
+          <w:b/>
+          <w:bCs/>
+          <w:i/>
+          <w:iCs/>
+        </w:rPr>
+        <w:t xml:space="preserve"> </w:t>
+      </w:r>
+      <w:r>
+        <w:rPr>
+          <w:rFonts w:ascii="Times New Roman" w:hAnsi="Times New Roman" w:cs="Times New Roman"/>
+          <w:b/>
+          <w:bCs/>
+          <w:i/>
+          <w:iCs/>
+        </w:rPr>
+        <w:t>=</w:t>
+      </w:r>
+      <w:r>
+        <w:rPr>
+          <w:rFonts w:ascii="Times New Roman" w:hAnsi="Times New Roman" w:cs="Times New Roman"/>
+          <w:b/>
+          <w:bCs/>
+          <w:i/>
+          <w:iCs/>
+        </w:rPr>
+        <w:t xml:space="preserve"> </w:t>
+      </w:r>
+      <w:r>
+        <w:rPr>
+          <w:rFonts w:ascii="Times New Roman" w:hAnsi="Times New Roman" w:cs="Times New Roman"/>
+          <w:b/>
+          <w:bCs/>
+          <w:i/>
+          <w:iCs/>
+        </w:rPr>
+        <w:t>2.0, overlap</w:t>
+      </w:r>
+      <w:r>
+        <w:rPr>
+          <w:rFonts w:ascii="Times New Roman" w:hAnsi="Times New Roman" w:cs="Times New Roman"/>
+          <w:b/>
+          <w:bCs/>
+          <w:i/>
+          <w:iCs/>
+        </w:rPr>
+        <w:t xml:space="preserve"> </w:t>
+      </w:r>
+      <w:r>
+        <w:rPr>
+          <w:rFonts w:ascii="Times New Roman" w:hAnsi="Times New Roman" w:cs="Times New Roman"/>
+          <w:b/>
+          <w:bCs/>
+          <w:i/>
+          <w:iCs/>
+        </w:rPr>
+        <w:t>=</w:t>
+      </w:r>
+      <w:r>
+        <w:rPr>
+          <w:rFonts w:ascii="Times New Roman" w:hAnsi="Times New Roman" w:cs="Times New Roman"/>
+          <w:b/>
+          <w:bCs/>
+          <w:i/>
+          <w:iCs/>
+        </w:rPr>
+        <w:t xml:space="preserve"> </w:t>
+      </w:r>
+      <w:r>
+        <w:rPr>
+          <w:rFonts w:ascii="Times New Roman" w:hAnsi="Times New Roman" w:cs="Times New Roman"/>
+          <w:b/>
+          <w:bCs/>
+          <w:i/>
+          <w:iCs/>
+        </w:rPr>
+        <w:t>0, min_pulses</w:t>
+      </w:r>
+      <w:r>
+        <w:rPr>
+          <w:rFonts w:ascii="Times New Roman" w:hAnsi="Times New Roman" w:cs="Times New Roman"/>
+          <w:b/>
+          <w:bCs/>
+          <w:i/>
+          <w:iCs/>
+        </w:rPr>
+        <w:t xml:space="preserve"> </w:t>
+      </w:r>
+      <w:r>
+        <w:rPr>
+          <w:rFonts w:ascii="Times New Roman" w:hAnsi="Times New Roman" w:cs="Times New Roman"/>
+          <w:b/>
+          <w:bCs/>
+          <w:i/>
+          <w:iCs/>
+        </w:rPr>
+        <w:t>=</w:t>
+      </w:r>
+      <w:r>
+        <w:rPr>
+          <w:rFonts w:ascii="Times New Roman" w:hAnsi="Times New Roman" w:cs="Times New Roman"/>
+          <w:b/>
+          <w:bCs/>
+          <w:i/>
+          <w:iCs/>
+        </w:rPr>
+        <w:t xml:space="preserve"> </w:t>
+      </w:r>
+      <w:r>
+        <w:rPr>
+          <w:rFonts w:ascii="Times New Roman" w:hAnsi="Times New Roman" w:cs="Times New Roman"/>
+          <w:b/>
+          <w:bCs/>
+          <w:i/>
+          <w:iCs/>
+        </w:rPr>
+        <w:t>6, min_regularity</w:t>
+      </w:r>
+      <w:r>
+        <w:rPr>
+          <w:rFonts w:ascii="Times New Roman" w:hAnsi="Times New Roman" w:cs="Times New Roman"/>
+          <w:b/>
+          <w:bCs/>
+          <w:i/>
+          <w:iCs/>
+        </w:rPr>
+        <w:t xml:space="preserve"> </w:t>
+      </w:r>
+      <w:r>
+        <w:rPr>
+          <w:rFonts w:ascii="Times New Roman" w:hAnsi="Times New Roman" w:cs="Times New Roman"/>
+          <w:b/>
+          <w:bCs/>
+          <w:i/>
+          <w:iCs/>
+        </w:rPr>
+        <w:t>=</w:t>
+      </w:r>
+      <w:r>
+        <w:rPr>
+          <w:rFonts w:ascii="Times New Roman" w:hAnsi="Times New Roman" w:cs="Times New Roman"/>
+          <w:b/>
+          <w:bCs/>
+          <w:i/>
+          <w:iCs/>
+        </w:rPr>
+        <w:t xml:space="preserve"> </w:t>
+      </w:r>
+      <w:r>
+        <w:rPr>
+          <w:rFonts w:ascii="Times New Roman" w:hAnsi="Times New Roman" w:cs="Times New Roman"/>
+          <w:b/>
+          <w:bCs/>
+          <w:i/>
+          <w:iCs/>
+        </w:rPr>
+        <w:t>10, min_duration</w:t>
+      </w:r>
+      <w:r>
+        <w:rPr>
+          <w:rFonts w:ascii="Times New Roman" w:hAnsi="Times New Roman" w:cs="Times New Roman"/>
+          <w:b/>
+          <w:bCs/>
+          <w:i/>
+          <w:iCs/>
+        </w:rPr>
+        <w:t xml:space="preserve"> </w:t>
+      </w:r>
+      <w:r>
+        <w:rPr>
+          <w:rFonts w:ascii="Times New Roman" w:hAnsi="Times New Roman" w:cs="Times New Roman"/>
+          <w:b/>
+          <w:bCs/>
+          <w:i/>
+          <w:iCs/>
+        </w:rPr>
+        <w:t>=</w:t>
+      </w:r>
+      <w:r>
+        <w:rPr>
+          <w:rFonts w:ascii="Times New Roman" w:hAnsi="Times New Roman" w:cs="Times New Roman"/>
+          <w:b/>
+          <w:bCs/>
+          <w:i/>
+          <w:iCs/>
+        </w:rPr>
+        <w:t xml:space="preserve"> </w:t>
+      </w:r>
+      <w:r>
+        <w:rPr>
+          <w:rFonts w:ascii="Times New Roman" w:hAnsi="Times New Roman" w:cs="Times New Roman"/>
+          <w:b/>
+          <w:bCs/>
+          <w:i/>
+          <w:iCs/>
+        </w:rPr>
+        <w:t>0.5, max_duration=1, sustain</w:t>
+      </w:r>
+      <w:r>
+        <w:rPr>
+          <w:rFonts w:ascii="Times New Roman" w:hAnsi="Times New Roman" w:cs="Times New Roman"/>
+          <w:b/>
+          <w:bCs/>
+          <w:i/>
+          <w:iCs/>
+        </w:rPr>
+        <w:t xml:space="preserve"> </w:t>
+      </w:r>
+      <w:r>
+        <w:rPr>
+          <w:rFonts w:ascii="Times New Roman" w:hAnsi="Times New Roman" w:cs="Times New Roman"/>
+          <w:b/>
+          <w:bCs/>
+          <w:i/>
+          <w:iCs/>
+        </w:rPr>
+        <w:t>=</w:t>
+      </w:r>
+      <w:r>
+        <w:rPr>
+          <w:rFonts w:ascii="Times New Roman" w:hAnsi="Times New Roman" w:cs="Times New Roman"/>
+          <w:b/>
+          <w:bCs/>
+          <w:i/>
+          <w:iCs/>
+        </w:rPr>
+        <w:t xml:space="preserve"> </w:t>
+      </w:r>
+      <w:r>
+        <w:rPr>
+          <w:rFonts w:ascii="Times New Roman" w:hAnsi="Times New Roman" w:cs="Times New Roman"/>
+          <w:b/>
+          <w:bCs/>
+          <w:i/>
+          <w:iCs/>
+        </w:rPr>
+        <w:t>0.5, pulse_dist</w:t>
+      </w:r>
+      <w:r>
+        <w:rPr>
+          <w:rFonts w:ascii="Times New Roman" w:hAnsi="Times New Roman" w:cs="Times New Roman"/>
+          <w:b/>
+          <w:bCs/>
+          <w:i/>
+          <w:iCs/>
+        </w:rPr>
+        <w:t xml:space="preserve"> </w:t>
+      </w:r>
+      <w:r>
+        <w:rPr>
+          <w:rFonts w:ascii="Times New Roman" w:hAnsi="Times New Roman" w:cs="Times New Roman"/>
+          <w:b/>
+          <w:bCs/>
+          <w:i/>
+          <w:iCs/>
+        </w:rPr>
+        <w:t>=</w:t>
+      </w:r>
+      <w:r>
+        <w:rPr>
+          <w:rFonts w:ascii="Times New Roman" w:hAnsi="Times New Roman" w:cs="Times New Roman"/>
+          <w:b/>
+          <w:bCs/>
+          <w:i/>
+          <w:iCs/>
+        </w:rPr>
+        <w:t xml:space="preserve"> </w:t>
+      </w:r>
+      <w:r>
+        <w:rPr>
+          <w:rFonts w:ascii="Times New Roman" w:hAnsi="Times New Roman" w:cs="Times New Roman"/>
+          <w:b/>
+          <w:bCs/>
+          <w:i/>
+          <w:iCs/>
+        </w:rPr>
+        <w:t>20,  sp_range</w:t>
+      </w:r>
+      <w:r>
+        <w:rPr>
+          <w:rFonts w:ascii="Times New Roman" w:hAnsi="Times New Roman" w:cs="Times New Roman"/>
+          <w:b/>
+          <w:bCs/>
+          <w:i/>
+          <w:iCs/>
+        </w:rPr>
+        <w:t xml:space="preserve"> </w:t>
+      </w:r>
+      <w:r>
+        <w:rPr>
+          <w:rFonts w:ascii="Times New Roman" w:hAnsi="Times New Roman" w:cs="Times New Roman"/>
+          <w:b/>
+          <w:bCs/>
+          <w:i/>
+          <w:iCs/>
+        </w:rPr>
+        <w:t>=</w:t>
+      </w:r>
+      <w:r>
+        <w:rPr>
+          <w:rFonts w:ascii="Times New Roman" w:hAnsi="Times New Roman" w:cs="Times New Roman"/>
+          <w:b/>
+          <w:bCs/>
+          <w:i/>
+          <w:iCs/>
+        </w:rPr>
+        <w:t xml:space="preserve"> </w:t>
+      </w:r>
+      <w:r>
+        <w:rPr>
+          <w:rFonts w:ascii="Times New Roman" w:hAnsi="Times New Roman" w:cs="Times New Roman"/>
+          <w:b/>
+          <w:bCs/>
+          <w:i/>
+          <w:iCs/>
+        </w:rPr>
+        <w:t>(5500, 15000), enable_coupled</w:t>
+      </w:r>
+      <w:r>
+        <w:rPr>
+          <w:rFonts w:ascii="Times New Roman" w:hAnsi="Times New Roman" w:cs="Times New Roman"/>
+          <w:b/>
+          <w:bCs/>
+          <w:i/>
+          <w:iCs/>
+        </w:rPr>
+        <w:t xml:space="preserve"> </w:t>
+      </w:r>
+      <w:r>
+        <w:rPr>
+          <w:rFonts w:ascii="Times New Roman" w:hAnsi="Times New Roman" w:cs="Times New Roman"/>
+          <w:b/>
+          <w:bCs/>
+          <w:i/>
+          <w:iCs/>
+        </w:rPr>
+        <w:t>=</w:t>
+      </w:r>
+      <w:r>
+        <w:rPr>
+          <w:rFonts w:ascii="Times New Roman" w:hAnsi="Times New Roman" w:cs="Times New Roman"/>
+          <w:b/>
+          <w:bCs/>
+          <w:i/>
+          <w:iCs/>
+        </w:rPr>
+        <w:t xml:space="preserve"> </w:t>
+      </w:r>
+      <w:r>
+        <w:rPr>
+          <w:rFonts w:ascii="Times New Roman" w:hAnsi="Times New Roman" w:cs="Times New Roman"/>
+          <w:b/>
+          <w:bCs/>
+          <w:i/>
+          <w:iCs/>
+        </w:rPr>
+        <w:t>True, coupled_min_duration</w:t>
+      </w:r>
+      <w:r>
+        <w:rPr>
+          <w:rFonts w:ascii="Times New Roman" w:hAnsi="Times New Roman" w:cs="Times New Roman"/>
+          <w:b/>
+          <w:bCs/>
+          <w:i/>
+          <w:iCs/>
+        </w:rPr>
+        <w:t xml:space="preserve"> </w:t>
+      </w:r>
+      <w:r>
+        <w:rPr>
+          <w:rFonts w:ascii="Times New Roman" w:hAnsi="Times New Roman" w:cs="Times New Roman"/>
+          <w:b/>
+          <w:bCs/>
+          <w:i/>
+          <w:iCs/>
+        </w:rPr>
+        <w:t>=</w:t>
+      </w:r>
+      <w:r>
+        <w:rPr>
+          <w:rFonts w:ascii="Times New Roman" w:hAnsi="Times New Roman" w:cs="Times New Roman"/>
+          <w:b/>
+          <w:bCs/>
+          <w:i/>
+          <w:iCs/>
+        </w:rPr>
+        <w:t xml:space="preserve"> </w:t>
+      </w:r>
+      <w:r>
+        <w:rPr>
+          <w:rFonts w:ascii="Times New Roman" w:hAnsi="Times New Roman" w:cs="Times New Roman"/>
+          <w:b/>
+          <w:bCs/>
+          <w:i/>
+          <w:iCs/>
+        </w:rPr>
+        <w:t>0.2, coupled_gap</w:t>
+      </w:r>
+      <w:r>
+        <w:rPr>
+          <w:rFonts w:ascii="Times New Roman" w:hAnsi="Times New Roman" w:cs="Times New Roman"/>
+          <w:b/>
+          <w:bCs/>
+          <w:i/>
+          <w:iCs/>
+        </w:rPr>
+        <w:t xml:space="preserve"> </w:t>
+      </w:r>
+      <w:r>
+        <w:rPr>
+          <w:rFonts w:ascii="Times New Roman" w:hAnsi="Times New Roman" w:cs="Times New Roman"/>
+          <w:b/>
+          <w:bCs/>
+          <w:i/>
+          <w:iCs/>
+        </w:rPr>
+        <w:t>=</w:t>
+      </w:r>
+      <w:r>
+        <w:rPr>
+          <w:rFonts w:ascii="Times New Roman" w:hAnsi="Times New Roman" w:cs="Times New Roman"/>
+          <w:b/>
+          <w:bCs/>
+          <w:i/>
+          <w:iCs/>
+        </w:rPr>
+        <w:t xml:space="preserve"> </w:t>
+      </w:r>
+      <w:r>
+        <w:rPr>
+          <w:rFonts w:ascii="Times New Roman" w:hAnsi="Times New Roman" w:cs="Times New Roman"/>
+          <w:b/>
+          <w:bCs/>
+          <w:i/>
+          <w:iCs/>
+        </w:rPr>
+        <w:t>1)</w:t>
+      </w:r>
+      <w:r>
+        <w:rPr>
+          <w:rFonts w:ascii="Times New Roman" w:hAnsi="Times New Roman" w:cs="Times New Roman"/>
+          <w:b/>
+          <w:bCs/>
+          <w:i/>
+          <w:iCs/>
+        </w:rPr>
+        <w:t xml:space="preserve">: </w:t>
+      </w:r>
+      <w:r>
+        <w:rPr>
+          <w:rFonts w:ascii="Times New Roman" w:hAnsi="Times New Roman" w:cs="Times New Roman"/>
+        </w:rPr>
+        <w:t xml:space="preserve">this is a complex function, but most of the arguments are the same as the is_stridulation function explained in the snippet logic a few pages above. The only new things here are, a path to the file you want to analyse and an overlap if you want to have any (I have tried with some </w:t>
+      </w:r>
+      <w:r>
+        <w:rPr>
+          <w:rFonts w:ascii="Times New Roman" w:hAnsi="Times New Roman" w:cs="Times New Roman"/>
+        </w:rPr>
+        <w:t>overlap and it finds more candidates and some are actually good ones</w:t>
+      </w:r>
+      <w:r>
+        <w:rPr>
+          <w:rFonts w:ascii="Times New Roman" w:hAnsi="Times New Roman" w:cs="Times New Roman"/>
+        </w:rPr>
+        <w:t>)</w:t>
+      </w:r>
+      <w:r>
+        <w:rPr>
+          <w:rFonts w:ascii="Times New Roman" w:hAnsi="Times New Roman" w:cs="Times New Roman"/>
+        </w:rPr>
+        <w:t>. The overlap is in seconds, so make sure is not bigger than the snippet duration.</w:t>
+      </w:r>
+      <w:r>
+        <w:rPr>
+          <w:rFonts w:ascii="Times New Roman" w:hAnsi="Times New Roman" w:cs="Times New Roman"/>
+        </w:rPr>
+        <w:t xml:space="preserve"> </w:t>
+      </w:r>
+      <w:r>
+        <w:rPr>
+          <w:rFonts w:ascii="Times New Roman" w:hAnsi="Times New Roman" w:cs="Times New Roman"/>
+          <w:b/>
+          <w:bCs/>
+        </w:rPr>
+        <w:t>IMPORTANT:</w:t>
+      </w:r>
+      <w:r>
+        <w:rPr>
+          <w:rFonts w:ascii="Times New Roman" w:hAnsi="Times New Roman" w:cs="Times New Roman"/>
+          <w:b/>
+          <w:bCs/>
+        </w:rPr>
+        <w:t xml:space="preserve"> </w:t>
+      </w:r>
+      <w:r>
+        <w:rPr>
+          <w:rFonts w:ascii="Times New Roman" w:hAnsi="Times New Roman" w:cs="Times New Roman"/>
+        </w:rPr>
+        <w:t>the function that searches the events uses an energy threshold based on percentiles. If you used longer snippets, these percentiles would change solely on the base of the sound being mostly no stridulations. In other words, the longer time windows will make it so the percentile 50 includes most of the sound itself. I made this thinking of 2 seconds snippets, if you wish to use a very different length, that might mean revisiting a number of parameters.</w:t>
+      </w:r>
+    </w:p>
+    <w:p>
+      <w:pPr>
+        <w:rPr>
+          <w:rFonts w:ascii="Times New Roman" w:hAnsi="Times New Roman" w:cs="Times New Roman"/>
+        </w:rPr>
+      </w:pPr>
+      <w:r>
+        <w:rPr>
+          <w:rFonts w:ascii="Times New Roman" w:hAnsi="Times New Roman" w:cs="Times New Roman"/>
+        </w:rPr>
+        <w:t>The return is double, times is just a list of the times where each stridulation candidate is in the file, info is a list of dictionaries of expanded information including all the features (times and info are dummy names, you can name variables the way you want). But for god sake, what is a list of dictionaries. Good question. It is a way to store information that results more comprehensive. To access it you use code like this:</w:t>
+      </w:r>
+    </w:p>
+    <w:p>
+      <w:pPr>
+        <w:rPr>
+          <w:rFonts w:ascii="Times New Roman" w:hAnsi="Times New Roman" w:cs="Times New Roman"/>
+        </w:rPr>
+      </w:pPr>
+      <w:r>
+        <w:rPr>
+          <w:rFonts w:ascii="Times New Roman" w:hAnsi="Times New Roman" w:cs="Times New Roman"/>
+        </w:rPr>
+        <w:t>info[0]: fist dictionary of the list (remember python lists start in 0). Pay attention to the names there, you can use them to access individual elements like this</w:t>
+      </w:r>
+    </w:p>
+    <w:p>
+      <w:pPr>
+        <w:rPr>
+          <w:rFonts w:ascii="Times New Roman" w:hAnsi="Times New Roman" w:cs="Times New Roman"/>
+        </w:rPr>
+      </w:pPr>
+      <w:r>
+        <w:rPr>
+          <w:rFonts w:ascii="Times New Roman" w:hAnsi="Times New Roman" w:cs="Times New Roman"/>
+        </w:rPr>
+        <w:t>info[0][“absolute_timestamp”]: from that dictionary, the element called absolute timestamp (which is big words for where the stridulation is in the file)</w:t>
+      </w:r>
+    </w:p>
+    <w:p>
+      <w:pPr>
+        <w:rPr>
+          <w:rFonts w:ascii="Times New Roman" w:hAnsi="Times New Roman" w:cs="Times New Roman"/>
+        </w:rPr>
+      </w:pPr>
+      <w:r>
+        <w:rPr>
+          <w:rFonts w:ascii="Times New Roman" w:hAnsi="Times New Roman" w:cs="Times New Roman"/>
+        </w:rPr>
+        <w:t>info[1][“features”]: this gives you all the features from the second candidate.</w:t>
+      </w:r>
+    </w:p>
+    <w:p>
+      <w:pPr>
+        <w:rPr>
+          <w:rFonts w:ascii="Times New Roman" w:hAnsi="Times New Roman" w:cs="Times New Roman"/>
+        </w:rPr>
+      </w:pPr>
+      <w:r>
+        <w:rPr>
+          <w:rFonts w:ascii="Times New Roman" w:hAnsi="Times New Roman" w:cs="Times New Roman"/>
+        </w:rPr>
+        <w:t>info[1][“features”][“duty_cycle”]: the duty cycle, which is a feature, from the second candidate.</w:t>
+      </w:r>
+    </w:p>
+    <w:p>
+      <w:pPr>
+        <w:rPr>
+          <w:rFonts w:ascii="Times New Roman" w:hAnsi="Times New Roman" w:cs="Times New Roman"/>
+        </w:rPr>
+      </w:pPr>
+      <w:r>
+        <w:rPr>
+          <w:rFonts w:ascii="Times New Roman" w:hAnsi="Times New Roman" w:cs="Times New Roman"/>
+        </w:rPr>
+        <w:t xml:space="preserve">I understand this function is kind of cumbersome, I can see this ain’t easy to grasp and even that it looks I made it too complicated… and that might be true, but I couldn’t figure out how to make this simpler while giving you all the info and flexibility </w:t>
+      </w:r>
+      <w:r>
+        <w:rPr>
+          <w:rFonts w:ascii="Times New Roman" w:hAnsi="Times New Roman" w:cs="Times New Roman"/>
+        </w:rPr>
+        <w:t>that I think might be needed for your projects</w:t>
+      </w:r>
+      <w:r>
+        <w:rPr>
+          <w:rFonts w:ascii="Times New Roman" w:hAnsi="Times New Roman" w:cs="Times New Roman"/>
+        </w:rPr>
+        <w:t xml:space="preserve">… </w:t>
+      </w:r>
+    </w:p>
+    <w:p>
+      <w:pPr>
+        <w:rPr>
+          <w:rFonts w:ascii="Times New Roman" w:hAnsi="Times New Roman" w:cs="Times New Roman"/>
+        </w:rPr>
+      </w:pPr>
+      <w:r>
+        <w:rPr>
+          <w:rFonts w:ascii="Times New Roman" w:hAnsi="Times New Roman" w:cs="Times New Roman"/>
+        </w:rPr>
+        <w:t xml:space="preserve">On the bright side, I made it so it will create a folder next to your audio file with the same name. This folder contains some spectrograms and snippets of candidates for you to work with. The snippets are ready to load as snippets or audio. The spectrograms include a FFT spectrum and a Hilbert envelope with the section identified marked for you. </w:t>
+      </w:r>
+    </w:p>
+    <w:p>
+      <w:pPr>
+        <w:rPr>
+          <w:rFonts w:ascii="Times New Roman" w:hAnsi="Times New Roman" w:cs="Times New Roman"/>
+        </w:rPr>
+      </w:pPr>
+      <w:r>
+        <w:rPr>
+          <w:rFonts w:ascii="Times New Roman" w:hAnsi="Times New Roman" w:cs="Times New Roman"/>
+          <w:b/>
+          <w:bCs/>
+          <w:i/>
+          <w:iCs/>
+        </w:rPr>
+        <w:t>Times, info = St.cavitation_scan(audio_path, snippet_duration=2.0, overlap=0, energy_threshold = 0.001, min_event_duration=0.0005, threshold_percentile=80, env_smooth = 1, pulse_dist=1):</w:t>
+      </w:r>
+      <w:r>
+        <w:rPr>
+          <w:rFonts w:ascii="Times New Roman" w:hAnsi="Times New Roman" w:cs="Times New Roman"/>
+        </w:rPr>
+        <w:t xml:space="preserve"> this function runs over a complete file and cuts snippets and spectrograms with potential cavitation events. The arguments are the file path, the snippet duration, the overlap in seconds in case you want any and the rest you can find in the is_cavitation function below the snippet logic (please, read there to understand what this does and the caveats).</w:t>
+      </w:r>
+      <w:r>
+        <w:rPr>
+          <w:rFonts w:ascii="Times New Roman" w:hAnsi="Times New Roman" w:cs="Times New Roman"/>
+        </w:rPr>
+        <w:t xml:space="preserve"> And since you are going to read on the snippets, you may want to check the find_event and extract_features functions there, as they are the background workers for this one and will give you more insight on what is going on.</w:t>
+      </w:r>
+    </w:p>
+    <w:p>
+      <w:pPr>
+        <w:rPr>
+          <w:rFonts w:ascii="Times New Roman" w:hAnsi="Times New Roman" w:cs="Times New Roman"/>
+        </w:rPr>
+      </w:pPr>
+      <w:r>
+        <w:rPr>
+          <w:rFonts w:ascii="Times New Roman" w:hAnsi="Times New Roman" w:cs="Times New Roman"/>
+        </w:rPr>
         <w:lastRenderedPageBreak/>
-        <w:t>times</w:t>
-      </w:r>
-      <w:r>
-        <w:rPr>
-          <w:rFonts w:ascii="Times New Roman" w:hAnsi="Times New Roman" w:cs="Times New Roman"/>
-          <w:b/>
-          <w:bCs/>
-          <w:i/>
-          <w:iCs/>
-        </w:rPr>
-        <w:t>,</w:t>
-      </w:r>
-      <w:r>
-        <w:rPr>
-          <w:rFonts w:ascii="Times New Roman" w:hAnsi="Times New Roman" w:cs="Times New Roman"/>
-          <w:b/>
-          <w:bCs/>
-          <w:i/>
-          <w:iCs/>
-        </w:rPr>
-        <w:t xml:space="preserve"> </w:t>
-      </w:r>
-      <w:r>
-        <w:rPr>
-          <w:rFonts w:ascii="Times New Roman" w:hAnsi="Times New Roman" w:cs="Times New Roman"/>
-          <w:b/>
-          <w:bCs/>
-          <w:i/>
-          <w:iCs/>
-        </w:rPr>
-        <w:t>info</w:t>
-      </w:r>
-      <w:r>
-        <w:rPr>
-          <w:rFonts w:ascii="Times New Roman" w:hAnsi="Times New Roman" w:cs="Times New Roman"/>
-          <w:b/>
-          <w:bCs/>
-          <w:i/>
-          <w:iCs/>
-        </w:rPr>
-        <w:t>=st.</w:t>
-      </w:r>
-      <w:r>
-        <w:rPr>
-          <w:rFonts w:ascii="Times New Roman" w:hAnsi="Times New Roman" w:cs="Times New Roman"/>
-          <w:b/>
-          <w:bCs/>
-          <w:i/>
-          <w:iCs/>
-        </w:rPr>
-        <w:t>stridulation</w:t>
-      </w:r>
-      <w:r>
-        <w:rPr>
-          <w:rFonts w:ascii="Times New Roman" w:hAnsi="Times New Roman" w:cs="Times New Roman"/>
-          <w:b/>
-          <w:bCs/>
-          <w:i/>
-          <w:iCs/>
-        </w:rPr>
-        <w:t>_scan(audio_path, snippet_duration</w:t>
-      </w:r>
-      <w:r>
-        <w:rPr>
-          <w:rFonts w:ascii="Times New Roman" w:hAnsi="Times New Roman" w:cs="Times New Roman"/>
-          <w:b/>
-          <w:bCs/>
-          <w:i/>
-          <w:iCs/>
-        </w:rPr>
-        <w:t xml:space="preserve"> </w:t>
-      </w:r>
-      <w:r>
-        <w:rPr>
-          <w:rFonts w:ascii="Times New Roman" w:hAnsi="Times New Roman" w:cs="Times New Roman"/>
-          <w:b/>
-          <w:bCs/>
-          <w:i/>
-          <w:iCs/>
-        </w:rPr>
-        <w:t>=</w:t>
-      </w:r>
-      <w:r>
-        <w:rPr>
-          <w:rFonts w:ascii="Times New Roman" w:hAnsi="Times New Roman" w:cs="Times New Roman"/>
-          <w:b/>
-          <w:bCs/>
-          <w:i/>
-          <w:iCs/>
-        </w:rPr>
-        <w:t xml:space="preserve"> </w:t>
-      </w:r>
-      <w:r>
-        <w:rPr>
-          <w:rFonts w:ascii="Times New Roman" w:hAnsi="Times New Roman" w:cs="Times New Roman"/>
-          <w:b/>
-          <w:bCs/>
-          <w:i/>
-          <w:iCs/>
-        </w:rPr>
-        <w:t>2.0, overlap</w:t>
-      </w:r>
-      <w:r>
-        <w:rPr>
-          <w:rFonts w:ascii="Times New Roman" w:hAnsi="Times New Roman" w:cs="Times New Roman"/>
-          <w:b/>
-          <w:bCs/>
-          <w:i/>
-          <w:iCs/>
-        </w:rPr>
-        <w:t xml:space="preserve"> </w:t>
-      </w:r>
-      <w:r>
-        <w:rPr>
-          <w:rFonts w:ascii="Times New Roman" w:hAnsi="Times New Roman" w:cs="Times New Roman"/>
-          <w:b/>
-          <w:bCs/>
-          <w:i/>
-          <w:iCs/>
-        </w:rPr>
-        <w:t>=</w:t>
-      </w:r>
-      <w:r>
-        <w:rPr>
-          <w:rFonts w:ascii="Times New Roman" w:hAnsi="Times New Roman" w:cs="Times New Roman"/>
-          <w:b/>
-          <w:bCs/>
-          <w:i/>
-          <w:iCs/>
-        </w:rPr>
-        <w:t xml:space="preserve"> </w:t>
-      </w:r>
-      <w:r>
-        <w:rPr>
-          <w:rFonts w:ascii="Times New Roman" w:hAnsi="Times New Roman" w:cs="Times New Roman"/>
-          <w:b/>
-          <w:bCs/>
-          <w:i/>
-          <w:iCs/>
-        </w:rPr>
-        <w:t>0, min_pulses</w:t>
-      </w:r>
-      <w:r>
-        <w:rPr>
-          <w:rFonts w:ascii="Times New Roman" w:hAnsi="Times New Roman" w:cs="Times New Roman"/>
-          <w:b/>
-          <w:bCs/>
-          <w:i/>
-          <w:iCs/>
-        </w:rPr>
-        <w:t xml:space="preserve"> </w:t>
-      </w:r>
-      <w:r>
-        <w:rPr>
-          <w:rFonts w:ascii="Times New Roman" w:hAnsi="Times New Roman" w:cs="Times New Roman"/>
-          <w:b/>
-          <w:bCs/>
-          <w:i/>
-          <w:iCs/>
-        </w:rPr>
-        <w:t>=</w:t>
-      </w:r>
-      <w:r>
-        <w:rPr>
-          <w:rFonts w:ascii="Times New Roman" w:hAnsi="Times New Roman" w:cs="Times New Roman"/>
-          <w:b/>
-          <w:bCs/>
-          <w:i/>
-          <w:iCs/>
-        </w:rPr>
-        <w:t xml:space="preserve"> </w:t>
-      </w:r>
-      <w:r>
-        <w:rPr>
-          <w:rFonts w:ascii="Times New Roman" w:hAnsi="Times New Roman" w:cs="Times New Roman"/>
-          <w:b/>
-          <w:bCs/>
-          <w:i/>
-          <w:iCs/>
-        </w:rPr>
-        <w:t>6, min_regularity</w:t>
-      </w:r>
-      <w:r>
-        <w:rPr>
-          <w:rFonts w:ascii="Times New Roman" w:hAnsi="Times New Roman" w:cs="Times New Roman"/>
-          <w:b/>
-          <w:bCs/>
-          <w:i/>
-          <w:iCs/>
-        </w:rPr>
-        <w:t xml:space="preserve"> </w:t>
-      </w:r>
-      <w:r>
-        <w:rPr>
-          <w:rFonts w:ascii="Times New Roman" w:hAnsi="Times New Roman" w:cs="Times New Roman"/>
-          <w:b/>
-          <w:bCs/>
-          <w:i/>
-          <w:iCs/>
-        </w:rPr>
-        <w:t>=</w:t>
-      </w:r>
-      <w:r>
-        <w:rPr>
-          <w:rFonts w:ascii="Times New Roman" w:hAnsi="Times New Roman" w:cs="Times New Roman"/>
-          <w:b/>
-          <w:bCs/>
-          <w:i/>
-          <w:iCs/>
-        </w:rPr>
-        <w:t xml:space="preserve"> </w:t>
-      </w:r>
-      <w:r>
-        <w:rPr>
-          <w:rFonts w:ascii="Times New Roman" w:hAnsi="Times New Roman" w:cs="Times New Roman"/>
-          <w:b/>
-          <w:bCs/>
-          <w:i/>
-          <w:iCs/>
-        </w:rPr>
-        <w:t>10, min_duration</w:t>
-      </w:r>
-      <w:r>
-        <w:rPr>
-          <w:rFonts w:ascii="Times New Roman" w:hAnsi="Times New Roman" w:cs="Times New Roman"/>
-          <w:b/>
-          <w:bCs/>
-          <w:i/>
-          <w:iCs/>
-        </w:rPr>
-        <w:t xml:space="preserve"> </w:t>
-      </w:r>
-      <w:r>
-        <w:rPr>
-          <w:rFonts w:ascii="Times New Roman" w:hAnsi="Times New Roman" w:cs="Times New Roman"/>
-          <w:b/>
-          <w:bCs/>
-          <w:i/>
-          <w:iCs/>
-        </w:rPr>
-        <w:t>=</w:t>
-      </w:r>
-      <w:r>
-        <w:rPr>
-          <w:rFonts w:ascii="Times New Roman" w:hAnsi="Times New Roman" w:cs="Times New Roman"/>
-          <w:b/>
-          <w:bCs/>
-          <w:i/>
-          <w:iCs/>
-        </w:rPr>
-        <w:t xml:space="preserve"> </w:t>
-      </w:r>
-      <w:r>
-        <w:rPr>
-          <w:rFonts w:ascii="Times New Roman" w:hAnsi="Times New Roman" w:cs="Times New Roman"/>
-          <w:b/>
-          <w:bCs/>
-          <w:i/>
-          <w:iCs/>
-        </w:rPr>
-        <w:t>0.5, max_duration=1, sustain</w:t>
-      </w:r>
-      <w:r>
-        <w:rPr>
-          <w:rFonts w:ascii="Times New Roman" w:hAnsi="Times New Roman" w:cs="Times New Roman"/>
-          <w:b/>
-          <w:bCs/>
-          <w:i/>
-          <w:iCs/>
-        </w:rPr>
-        <w:t xml:space="preserve"> </w:t>
-      </w:r>
-      <w:r>
-        <w:rPr>
-          <w:rFonts w:ascii="Times New Roman" w:hAnsi="Times New Roman" w:cs="Times New Roman"/>
-          <w:b/>
-          <w:bCs/>
-          <w:i/>
-          <w:iCs/>
-        </w:rPr>
-        <w:t>=</w:t>
-      </w:r>
-      <w:r>
-        <w:rPr>
-          <w:rFonts w:ascii="Times New Roman" w:hAnsi="Times New Roman" w:cs="Times New Roman"/>
-          <w:b/>
-          <w:bCs/>
-          <w:i/>
-          <w:iCs/>
-        </w:rPr>
-        <w:t xml:space="preserve"> </w:t>
-      </w:r>
-      <w:r>
-        <w:rPr>
-          <w:rFonts w:ascii="Times New Roman" w:hAnsi="Times New Roman" w:cs="Times New Roman"/>
-          <w:b/>
-          <w:bCs/>
-          <w:i/>
-          <w:iCs/>
-        </w:rPr>
-        <w:t>0.5, pulse_dist</w:t>
-      </w:r>
-      <w:r>
-        <w:rPr>
-          <w:rFonts w:ascii="Times New Roman" w:hAnsi="Times New Roman" w:cs="Times New Roman"/>
-          <w:b/>
-          <w:bCs/>
-          <w:i/>
-          <w:iCs/>
-        </w:rPr>
-        <w:t xml:space="preserve"> </w:t>
-      </w:r>
-      <w:r>
-        <w:rPr>
-          <w:rFonts w:ascii="Times New Roman" w:hAnsi="Times New Roman" w:cs="Times New Roman"/>
-          <w:b/>
-          <w:bCs/>
-          <w:i/>
-          <w:iCs/>
-        </w:rPr>
-        <w:t>=</w:t>
-      </w:r>
-      <w:r>
-        <w:rPr>
-          <w:rFonts w:ascii="Times New Roman" w:hAnsi="Times New Roman" w:cs="Times New Roman"/>
-          <w:b/>
-          <w:bCs/>
-          <w:i/>
-          <w:iCs/>
-        </w:rPr>
-        <w:t xml:space="preserve"> </w:t>
-      </w:r>
-      <w:r>
-        <w:rPr>
-          <w:rFonts w:ascii="Times New Roman" w:hAnsi="Times New Roman" w:cs="Times New Roman"/>
-          <w:b/>
-          <w:bCs/>
-          <w:i/>
-          <w:iCs/>
-        </w:rPr>
-        <w:t>20,  sp_range</w:t>
-      </w:r>
-      <w:r>
-        <w:rPr>
-          <w:rFonts w:ascii="Times New Roman" w:hAnsi="Times New Roman" w:cs="Times New Roman"/>
-          <w:b/>
-          <w:bCs/>
-          <w:i/>
-          <w:iCs/>
-        </w:rPr>
-        <w:t xml:space="preserve"> </w:t>
-      </w:r>
-      <w:r>
-        <w:rPr>
-          <w:rFonts w:ascii="Times New Roman" w:hAnsi="Times New Roman" w:cs="Times New Roman"/>
-          <w:b/>
-          <w:bCs/>
-          <w:i/>
-          <w:iCs/>
-        </w:rPr>
-        <w:t>=</w:t>
-      </w:r>
-      <w:r>
-        <w:rPr>
-          <w:rFonts w:ascii="Times New Roman" w:hAnsi="Times New Roman" w:cs="Times New Roman"/>
-          <w:b/>
-          <w:bCs/>
-          <w:i/>
-          <w:iCs/>
-        </w:rPr>
-        <w:t xml:space="preserve"> </w:t>
-      </w:r>
-      <w:r>
-        <w:rPr>
-          <w:rFonts w:ascii="Times New Roman" w:hAnsi="Times New Roman" w:cs="Times New Roman"/>
-          <w:b/>
-          <w:bCs/>
-          <w:i/>
-          <w:iCs/>
-        </w:rPr>
-        <w:t>(5500, 15000), enable_coupled</w:t>
-      </w:r>
-      <w:r>
-        <w:rPr>
-          <w:rFonts w:ascii="Times New Roman" w:hAnsi="Times New Roman" w:cs="Times New Roman"/>
-          <w:b/>
-          <w:bCs/>
-          <w:i/>
-          <w:iCs/>
-        </w:rPr>
-        <w:t xml:space="preserve"> </w:t>
-      </w:r>
-      <w:r>
-        <w:rPr>
-          <w:rFonts w:ascii="Times New Roman" w:hAnsi="Times New Roman" w:cs="Times New Roman"/>
-          <w:b/>
-          <w:bCs/>
-          <w:i/>
-          <w:iCs/>
-        </w:rPr>
-        <w:t>=</w:t>
-      </w:r>
-      <w:r>
-        <w:rPr>
-          <w:rFonts w:ascii="Times New Roman" w:hAnsi="Times New Roman" w:cs="Times New Roman"/>
-          <w:b/>
-          <w:bCs/>
-          <w:i/>
-          <w:iCs/>
-        </w:rPr>
-        <w:t xml:space="preserve"> </w:t>
-      </w:r>
-      <w:r>
-        <w:rPr>
-          <w:rFonts w:ascii="Times New Roman" w:hAnsi="Times New Roman" w:cs="Times New Roman"/>
-          <w:b/>
-          <w:bCs/>
-          <w:i/>
-          <w:iCs/>
-        </w:rPr>
-        <w:t>True, coupled_min_duration</w:t>
-      </w:r>
-      <w:r>
-        <w:rPr>
-          <w:rFonts w:ascii="Times New Roman" w:hAnsi="Times New Roman" w:cs="Times New Roman"/>
-          <w:b/>
-          <w:bCs/>
-          <w:i/>
-          <w:iCs/>
-        </w:rPr>
-        <w:t xml:space="preserve"> </w:t>
-      </w:r>
-      <w:r>
-        <w:rPr>
-          <w:rFonts w:ascii="Times New Roman" w:hAnsi="Times New Roman" w:cs="Times New Roman"/>
-          <w:b/>
-          <w:bCs/>
-          <w:i/>
-          <w:iCs/>
-        </w:rPr>
-        <w:t>=</w:t>
-      </w:r>
-      <w:r>
-        <w:rPr>
-          <w:rFonts w:ascii="Times New Roman" w:hAnsi="Times New Roman" w:cs="Times New Roman"/>
-          <w:b/>
-          <w:bCs/>
-          <w:i/>
-          <w:iCs/>
-        </w:rPr>
-        <w:t xml:space="preserve"> </w:t>
-      </w:r>
-      <w:r>
-        <w:rPr>
-          <w:rFonts w:ascii="Times New Roman" w:hAnsi="Times New Roman" w:cs="Times New Roman"/>
-          <w:b/>
-          <w:bCs/>
-          <w:i/>
-          <w:iCs/>
-        </w:rPr>
-        <w:t>0.2, coupled_gap</w:t>
-      </w:r>
-      <w:r>
-        <w:rPr>
-          <w:rFonts w:ascii="Times New Roman" w:hAnsi="Times New Roman" w:cs="Times New Roman"/>
-          <w:b/>
-          <w:bCs/>
-          <w:i/>
-          <w:iCs/>
-        </w:rPr>
-        <w:t xml:space="preserve"> </w:t>
-      </w:r>
-      <w:r>
-        <w:rPr>
-          <w:rFonts w:ascii="Times New Roman" w:hAnsi="Times New Roman" w:cs="Times New Roman"/>
-          <w:b/>
-          <w:bCs/>
-          <w:i/>
-          <w:iCs/>
-        </w:rPr>
-        <w:t>=</w:t>
-      </w:r>
-      <w:r>
-        <w:rPr>
-          <w:rFonts w:ascii="Times New Roman" w:hAnsi="Times New Roman" w:cs="Times New Roman"/>
-          <w:b/>
-          <w:bCs/>
-          <w:i/>
-          <w:iCs/>
-        </w:rPr>
-        <w:t xml:space="preserve"> </w:t>
-      </w:r>
-      <w:r>
-        <w:rPr>
-          <w:rFonts w:ascii="Times New Roman" w:hAnsi="Times New Roman" w:cs="Times New Roman"/>
-          <w:b/>
-          <w:bCs/>
-          <w:i/>
-          <w:iCs/>
-        </w:rPr>
-        <w:t>1)</w:t>
-      </w:r>
-      <w:r>
-        <w:rPr>
-          <w:rFonts w:ascii="Times New Roman" w:hAnsi="Times New Roman" w:cs="Times New Roman"/>
-          <w:b/>
-          <w:bCs/>
-          <w:i/>
-          <w:iCs/>
-        </w:rPr>
-        <w:t xml:space="preserve">: </w:t>
-      </w:r>
-      <w:r>
-        <w:rPr>
-          <w:rFonts w:ascii="Times New Roman" w:hAnsi="Times New Roman" w:cs="Times New Roman"/>
-        </w:rPr>
-        <w:t xml:space="preserve">this is a complex function, but most of the arguments are the same as the is_stridulation function explained in the snippet logic a few pages above. The only new things here are, a path to the file you want to analyse and an overlap if you want to have any (I have tried with some </w:t>
-      </w:r>
-      <w:r>
-        <w:rPr>
-          <w:rFonts w:ascii="Times New Roman" w:hAnsi="Times New Roman" w:cs="Times New Roman"/>
-        </w:rPr>
-        <w:t>overlap and it finds more candidates and some are actually good ones</w:t>
-      </w:r>
-      <w:r>
-        <w:rPr>
-          <w:rFonts w:ascii="Times New Roman" w:hAnsi="Times New Roman" w:cs="Times New Roman"/>
-        </w:rPr>
-        <w:t>)</w:t>
-      </w:r>
-      <w:r>
-        <w:rPr>
-          <w:rFonts w:ascii="Times New Roman" w:hAnsi="Times New Roman" w:cs="Times New Roman"/>
-        </w:rPr>
-        <w:t>. The overlap is in seconds, so make sure is not bigger than the snippet duration.</w:t>
-      </w:r>
-      <w:r>
-        <w:rPr>
-          <w:rFonts w:ascii="Times New Roman" w:hAnsi="Times New Roman" w:cs="Times New Roman"/>
-        </w:rPr>
-        <w:t xml:space="preserve"> </w:t>
-      </w:r>
-      <w:r>
-        <w:rPr>
-          <w:rFonts w:ascii="Times New Roman" w:hAnsi="Times New Roman" w:cs="Times New Roman"/>
-          <w:b/>
-          <w:bCs/>
-        </w:rPr>
-        <w:t>IMPORTANT:</w:t>
-      </w:r>
-      <w:r>
-        <w:rPr>
-          <w:rFonts w:ascii="Times New Roman" w:hAnsi="Times New Roman" w:cs="Times New Roman"/>
-          <w:b/>
-          <w:bCs/>
-        </w:rPr>
-        <w:t xml:space="preserve"> </w:t>
-      </w:r>
-      <w:r>
-        <w:rPr>
-          <w:rFonts w:ascii="Times New Roman" w:hAnsi="Times New Roman" w:cs="Times New Roman"/>
-        </w:rPr>
-        <w:t>the function that searches the events uses an energy threshold based on percentiles. If you used longer snippets, these percentiles would change solely on the base of the sound being mostly no stridulations. In other words, the longer time windows will make it so the percentile 50 includes most of the sound itself. I made this thinking of 2 seconds snippets, if you wish to use a very different length, that might mean revisiting a number of parameters.</w:t>
-      </w:r>
-    </w:p>
-    <w:p>
-      <w:pPr>
-        <w:rPr>
-          <w:rFonts w:ascii="Times New Roman" w:hAnsi="Times New Roman" w:cs="Times New Roman"/>
-        </w:rPr>
-      </w:pPr>
-      <w:r>
-        <w:rPr>
-          <w:rFonts w:ascii="Times New Roman" w:hAnsi="Times New Roman" w:cs="Times New Roman"/>
-        </w:rPr>
-        <w:t>The return is double, times is just a list of the times where each stridulation candidate is in the file, info is a list of dictionaries of expanded information including all the features (times and info are dummy names, you can name variables the way you want). But for god sake, what is a list of dictionaries. Good question. It is a way to store information that results more comprehensive. To access it you use code like this:</w:t>
-      </w:r>
-    </w:p>
-    <w:p>
-      <w:pPr>
-        <w:rPr>
-          <w:rFonts w:ascii="Times New Roman" w:hAnsi="Times New Roman" w:cs="Times New Roman"/>
-        </w:rPr>
-      </w:pPr>
-      <w:r>
-        <w:rPr>
-          <w:rFonts w:ascii="Times New Roman" w:hAnsi="Times New Roman" w:cs="Times New Roman"/>
-        </w:rPr>
-        <w:t>info[0]: fist dictionary of the list (remember python lists start in 0). Pay attention to the names there, you can use them to access individual elements like this</w:t>
-      </w:r>
-    </w:p>
-    <w:p>
-      <w:pPr>
-        <w:rPr>
-          <w:rFonts w:ascii="Times New Roman" w:hAnsi="Times New Roman" w:cs="Times New Roman"/>
-        </w:rPr>
-      </w:pPr>
-      <w:r>
-        <w:rPr>
-          <w:rFonts w:ascii="Times New Roman" w:hAnsi="Times New Roman" w:cs="Times New Roman"/>
-        </w:rPr>
-        <w:t>info[0][“absolute_timestamp”]: from that dictionary, the element called absolute timestamp (which is big words for where the stridulation is in the file)</w:t>
-      </w:r>
-    </w:p>
-    <w:p>
-      <w:pPr>
-        <w:rPr>
-          <w:rFonts w:ascii="Times New Roman" w:hAnsi="Times New Roman" w:cs="Times New Roman"/>
-        </w:rPr>
-      </w:pPr>
-      <w:r>
-        <w:rPr>
-          <w:rFonts w:ascii="Times New Roman" w:hAnsi="Times New Roman" w:cs="Times New Roman"/>
-        </w:rPr>
-        <w:t>info[1][“features”]: this gives you all the features from the second candidate.</w:t>
-      </w:r>
-    </w:p>
-    <w:p>
-      <w:pPr>
-        <w:rPr>
-          <w:rFonts w:ascii="Times New Roman" w:hAnsi="Times New Roman" w:cs="Times New Roman"/>
-        </w:rPr>
-      </w:pPr>
-      <w:r>
-        <w:rPr>
-          <w:rFonts w:ascii="Times New Roman" w:hAnsi="Times New Roman" w:cs="Times New Roman"/>
-        </w:rPr>
-        <w:t>info[1][“features”][“duty_cycle”]: the duty cycle, which is a feature, from the second candidate.</w:t>
-      </w:r>
-    </w:p>
-    <w:p>
-      <w:pPr>
-        <w:rPr>
-          <w:rFonts w:ascii="Times New Roman" w:hAnsi="Times New Roman" w:cs="Times New Roman"/>
-        </w:rPr>
-      </w:pPr>
-      <w:r>
-        <w:rPr>
-          <w:rFonts w:ascii="Times New Roman" w:hAnsi="Times New Roman" w:cs="Times New Roman"/>
-        </w:rPr>
-        <w:t xml:space="preserve">I understand this function is kind of cumbersome, I can see this ain’t easy to grasp and even that it looks I made it too complicated… and that might be true, but I couldn’t figure out how to make this simpler while giving you all the info and flexibility </w:t>
-      </w:r>
-      <w:r>
-        <w:rPr>
-          <w:rFonts w:ascii="Times New Roman" w:hAnsi="Times New Roman" w:cs="Times New Roman"/>
-        </w:rPr>
-        <w:t>that I think might be needed for your projects</w:t>
-      </w:r>
-      <w:r>
-        <w:rPr>
-          <w:rFonts w:ascii="Times New Roman" w:hAnsi="Times New Roman" w:cs="Times New Roman"/>
-        </w:rPr>
-        <w:t xml:space="preserve">… </w:t>
-      </w:r>
-    </w:p>
-    <w:p>
-      <w:pPr>
-        <w:rPr>
-          <w:rFonts w:ascii="Times New Roman" w:hAnsi="Times New Roman" w:cs="Times New Roman"/>
-        </w:rPr>
-      </w:pPr>
-      <w:r>
-        <w:rPr>
-          <w:rFonts w:ascii="Times New Roman" w:hAnsi="Times New Roman" w:cs="Times New Roman"/>
-        </w:rPr>
-        <w:t xml:space="preserve">On the bright side, I made it so it will create a folder next to your audio file with the same name. This folder contains some spectrograms and snippets of candidates for you to work with. The snippets are ready to load as snippets or audio. The spectrograms include a FFT spectrum and a Hilbert envelope with the section identified marked for you. </w:t>
-      </w:r>
-    </w:p>
-    <w:p>
-      <w:pPr>
-        <w:rPr>
-          <w:rFonts w:ascii="Times New Roman" w:hAnsi="Times New Roman" w:cs="Times New Roman"/>
-        </w:rPr>
-      </w:pPr>
-      <w:r>
-        <w:rPr>
-          <w:rFonts w:ascii="Times New Roman" w:hAnsi="Times New Roman" w:cs="Times New Roman"/>
-          <w:b/>
-          <w:bCs/>
-          <w:i/>
-          <w:iCs/>
-        </w:rPr>
-        <w:t>Times, info = St.</w:t>
-      </w:r>
-      <w:r>
-        <w:rPr>
-          <w:rFonts w:ascii="Times New Roman" w:hAnsi="Times New Roman" w:cs="Times New Roman"/>
-          <w:b/>
-          <w:bCs/>
-          <w:i/>
-          <w:iCs/>
-        </w:rPr>
-        <w:t>cavitation_scan(audio_path, snippet_duration=2.0, overlap=0, energy_threshold = 0.001, min_event_duration=0.0005, threshold_percentile=80, env_smooth = 1, pulse_dist=1):</w:t>
-      </w:r>
-      <w:r>
-        <w:rPr>
-          <w:rFonts w:ascii="Times New Roman" w:hAnsi="Times New Roman" w:cs="Times New Roman"/>
-        </w:rPr>
-        <w:t xml:space="preserve"> this function runs over a complete file and cuts snippets and spectrograms with potential cavitation events. The arguments are the file path, the snippet duration, the overlap in seconds in case you want any and the rest you can find in the is_cavitation function below the snippet logic (please, read there to understand what this does and the caveats).</w:t>
-      </w:r>
-      <w:r>
-        <w:rPr>
-          <w:rFonts w:ascii="Times New Roman" w:hAnsi="Times New Roman" w:cs="Times New Roman"/>
-        </w:rPr>
-        <w:t xml:space="preserve"> And since you are going to read on the snippets, you may want to check the find_event and extract_features functions there, as they are the background workers for this one and will give you more insight on what is going on.</w:t>
-      </w:r>
-    </w:p>
-    <w:p>
-      <w:pPr>
-        <w:rPr>
-          <w:rFonts w:ascii="Times New Roman" w:hAnsi="Times New Roman" w:cs="Times New Roman"/>
-        </w:rPr>
-      </w:pPr>
-      <w:r>
-        <w:rPr>
-          <w:rFonts w:ascii="Times New Roman" w:hAnsi="Times New Roman" w:cs="Times New Roman"/>
-        </w:rPr>
         <w:t xml:space="preserve">The return is double, times are the absolute times in the file for your candidates, and info is a list of dictionaries… and in the function just above this one you have a description and usage of such a thing. </w:t>
       </w:r>
       <w:r>
@@ -6278,7 +6222,7 @@
       <w:spacing w:val="5"/>
     </w:rPr>
   </w:style>
-  <w:style w:type="character" w:styleId="Textoennegrita">
+  <w:style w:type="character" w:styleId="Fuerte">
     <w:name w:val="Strong"/>
     <w:basedOn w:val="Fuentedeprrafopredeter"/>
     <w:uiPriority w:val="22"/>
@@ -6608,4 +6552,10 @@
     </a:ext>
   </a:extLst>
 </a:theme>
+</file>
+
+<file path=docMetadata/LabelInfo.xml><?xml version="1.0" encoding="utf-8"?>
+<clbl:labelList xmlns:clbl="http://schemas.microsoft.com/office/2020/mipLabelMetadata">
+  <clbl:label id="{1a2630c0-a840-4b55-9584-2aa7070ffc9b}" enabled="1" method="Privileged" siteId="{70a6eba4-9671-45d2-b83e-432e06502242}" contentBits="0" removed="0"/>
+</clbl:labelList>
 </file>
</xml_diff>